<commit_message>
Update DOCX and Markdown files for final qualifying work, including revisions to practice report content, enhancements to figures and tables, and adjustments to title page formatting. Refine experiment documentation and ensure compliance with formatting standards.
</commit_message>
<xml_diff>
--- a/build/docx/practice-report-draft-1.docx
+++ b/build/docx/practice-report-draft-1.docx
@@ -15,7 +15,7 @@
           <w:i w:val="0"/>
           <w:sz w:val="22"/>
         </w:rPr>
-        <w:t>МИНИСТЕРСТВО НАУКИ И ВЫСШЕГО ОБРАЗОВАНИЯ РОССИЙСКОЙ ФЕДЕРАЦИИ</w:t>
+        <w:t>МИНИСТЕРСТВО ОБРАЗОВАНИЯ И НАУКИ РОССИЙСКОЙ ФЕДЕРАЦИИ</w:t>
       </w:r>
     </w:p>
     <w:p>
@@ -47,7 +47,7 @@
           <w:i w:val="0"/>
           <w:sz w:val="22"/>
         </w:rPr>
-        <w:t>«САНКТ-ПЕТЕРБУРГСКИЙ ГОСУДАРСТВЕННЫЙ УНИВЕРСИТЕТ</w:t>
+        <w:t>«Санкт-Петербургский государственный университет</w:t>
       </w:r>
     </w:p>
     <w:p>
@@ -63,12 +63,12 @@
           <w:i w:val="0"/>
           <w:sz w:val="22"/>
         </w:rPr>
-        <w:t>АЭРОКОСМИЧЕСКОГО ПРИБОРОСТРОЕНИЯ»</w:t>
-      </w:r>
-    </w:p>
-    <w:p>
-      <w:pPr>
-        <w:spacing w:line="276" w:lineRule="auto" w:after="160"/>
+        <w:t>аэрокосмического приборостроения»</w:t>
+      </w:r>
+    </w:p>
+    <w:p>
+      <w:pPr>
+        <w:spacing w:line="276" w:lineRule="auto" w:after="360"/>
         <w:ind w:firstLine="0"/>
         <w:jc w:val="center"/>
       </w:pPr>
@@ -124,7 +124,7 @@
               <w:rPr>
                 <w:rFonts w:ascii="Times New Roman" w:hAnsi="Times New Roman" w:eastAsia="Times New Roman"/>
                 <w:b/>
-                <w:sz w:val="20"/>
+                <w:sz w:val="22"/>
               </w:rPr>
               <w:t>ОТЧЕТ ПО ПРАКТИКЕ</w:t>
             </w:r>
@@ -160,7 +160,7 @@
               <w:rPr>
                 <w:rFonts w:ascii="Times New Roman" w:hAnsi="Times New Roman" w:eastAsia="Times New Roman"/>
                 <w:b w:val="0"/>
-                <w:sz w:val="20"/>
+                <w:sz w:val="22"/>
               </w:rPr>
               <w:t>ЗАЩИЩЕН С ОЦЕНКОЙ</w:t>
             </w:r>
@@ -407,72 +407,10 @@
           </w:p>
         </w:tc>
       </w:tr>
-      <w:tr>
-        <w:tc>
-          <w:tcPr>
-            <w:tcW w:type="dxa" w:w="3969"/>
-            <w:tcBorders>
-              <w:top w:val="nil"/>
-              <w:left w:val="nil"/>
-              <w:bottom w:val="nil"/>
-              <w:right w:val="nil"/>
-              <w:insideH w:val="nil"/>
-              <w:insideV w:val="nil"/>
-            </w:tcBorders>
-            <w:tcMar>
-              <w:top w:w="0" w:type="dxa"/>
-              <w:left w:w="0" w:type="dxa"/>
-              <w:bottom w:w="0" w:type="dxa"/>
-              <w:right w:w="0" w:type="dxa"/>
-            </w:tcMar>
-          </w:tcPr>
-          <w:p/>
-        </w:tc>
-        <w:tc>
-          <w:tcPr>
-            <w:tcW w:type="dxa" w:w="2268"/>
-            <w:tcBorders>
-              <w:top w:val="nil"/>
-              <w:left w:val="nil"/>
-              <w:bottom w:val="nil"/>
-              <w:right w:val="nil"/>
-              <w:insideH w:val="nil"/>
-              <w:insideV w:val="nil"/>
-            </w:tcBorders>
-            <w:tcMar>
-              <w:top w:w="0" w:type="dxa"/>
-              <w:left w:w="0" w:type="dxa"/>
-              <w:bottom w:w="0" w:type="dxa"/>
-              <w:right w:w="0" w:type="dxa"/>
-            </w:tcMar>
-          </w:tcPr>
-          <w:p/>
-        </w:tc>
-        <w:tc>
-          <w:tcPr>
-            <w:tcW w:type="dxa" w:w="2835"/>
-            <w:tcBorders>
-              <w:top w:val="nil"/>
-              <w:left w:val="nil"/>
-              <w:bottom w:val="nil"/>
-              <w:right w:val="nil"/>
-              <w:insideH w:val="nil"/>
-              <w:insideV w:val="nil"/>
-            </w:tcBorders>
-            <w:tcMar>
-              <w:top w:w="0" w:type="dxa"/>
-              <w:left w:w="0" w:type="dxa"/>
-              <w:bottom w:w="0" w:type="dxa"/>
-              <w:right w:w="0" w:type="dxa"/>
-            </w:tcMar>
-          </w:tcPr>
-          <w:p/>
-        </w:tc>
-      </w:tr>
     </w:tbl>
     <w:p>
       <w:pPr>
-        <w:spacing w:line="240" w:lineRule="auto" w:before="0" w:after="240"/>
+        <w:spacing w:line="240" w:lineRule="auto" w:before="0" w:after="480"/>
         <w:ind w:firstLine="0"/>
       </w:pPr>
     </w:p>
@@ -533,7 +471,7 @@
               <w:rPr>
                 <w:rFonts w:ascii="Times New Roman" w:hAnsi="Times New Roman" w:eastAsia="Times New Roman"/>
                 <w:b w:val="0"/>
-                <w:sz w:val="16"/>
+                <w:sz w:val="20"/>
               </w:rPr>
               <w:t>вид практики</w:t>
             </w:r>
@@ -642,7 +580,115 @@
               <w:rPr>
                 <w:rFonts w:ascii="Times New Roman" w:hAnsi="Times New Roman" w:eastAsia="Times New Roman"/>
                 <w:b w:val="0"/>
-                <w:sz w:val="16"/>
+                <w:sz w:val="14"/>
+              </w:rPr>
+            </w:r>
+          </w:p>
+        </w:tc>
+        <w:tc>
+          <w:tcPr>
+            <w:tcW w:type="dxa" w:w="2948"/>
+            <w:tcBorders>
+              <w:top w:val="nil"/>
+              <w:left w:val="nil"/>
+              <w:bottom w:val="nil"/>
+              <w:right w:val="nil"/>
+              <w:insideH w:val="nil"/>
+              <w:insideV w:val="nil"/>
+            </w:tcBorders>
+            <w:tcMar>
+              <w:top w:w="0" w:type="dxa"/>
+              <w:left w:w="0" w:type="dxa"/>
+              <w:bottom w:w="0" w:type="dxa"/>
+              <w:right w:w="0" w:type="dxa"/>
+            </w:tcMar>
+            <w:vAlign w:val="center"/>
+          </w:tcPr>
+          <w:p>
+            <w:pPr>
+              <w:spacing w:line="240" w:lineRule="auto" w:before="0" w:after="0"/>
+              <w:ind w:firstLine="0"/>
+              <w:jc w:val="center"/>
+            </w:pPr>
+            <w:r/>
+            <w:r>
+              <w:rPr>
+                <w:rFonts w:ascii="Times New Roman" w:hAnsi="Times New Roman" w:eastAsia="Times New Roman"/>
+                <w:b w:val="0"/>
+                <w:sz w:val="14"/>
+              </w:rPr>
+              <w:t>вид практики</w:t>
+            </w:r>
+          </w:p>
+        </w:tc>
+        <w:tc>
+          <w:tcPr>
+            <w:tcW w:type="dxa" w:w="2948"/>
+            <w:tcBorders>
+              <w:top w:val="nil"/>
+              <w:left w:val="nil"/>
+              <w:bottom w:val="nil"/>
+              <w:right w:val="nil"/>
+              <w:insideH w:val="nil"/>
+              <w:insideV w:val="nil"/>
+            </w:tcBorders>
+            <w:tcMar>
+              <w:top w:w="0" w:type="dxa"/>
+              <w:left w:w="0" w:type="dxa"/>
+              <w:bottom w:w="0" w:type="dxa"/>
+              <w:right w:w="0" w:type="dxa"/>
+            </w:tcMar>
+            <w:vAlign w:val="center"/>
+          </w:tcPr>
+          <w:p>
+            <w:pPr>
+              <w:spacing w:line="240" w:lineRule="auto" w:before="0" w:after="0"/>
+              <w:ind w:firstLine="0"/>
+              <w:jc w:val="center"/>
+            </w:pPr>
+            <w:r/>
+            <w:r>
+              <w:rPr>
+                <w:rFonts w:ascii="Times New Roman" w:hAnsi="Times New Roman" w:eastAsia="Times New Roman"/>
+                <w:b w:val="0"/>
+                <w:sz w:val="14"/>
+              </w:rPr>
+            </w:r>
+          </w:p>
+        </w:tc>
+      </w:tr>
+      <w:tr>
+        <w:tc>
+          <w:tcPr>
+            <w:tcW w:type="dxa" w:w="2948"/>
+            <w:tcBorders>
+              <w:top w:val="nil"/>
+              <w:left w:val="nil"/>
+              <w:bottom w:val="nil"/>
+              <w:right w:val="nil"/>
+              <w:insideH w:val="nil"/>
+              <w:insideV w:val="nil"/>
+            </w:tcBorders>
+            <w:tcMar>
+              <w:top w:w="0" w:type="dxa"/>
+              <w:left w:w="0" w:type="dxa"/>
+              <w:bottom w:w="0" w:type="dxa"/>
+              <w:right w:w="0" w:type="dxa"/>
+            </w:tcMar>
+            <w:vAlign w:val="center"/>
+          </w:tcPr>
+          <w:p>
+            <w:pPr>
+              <w:spacing w:line="240" w:lineRule="auto" w:before="0" w:after="0"/>
+              <w:ind w:firstLine="0"/>
+              <w:jc w:val="center"/>
+            </w:pPr>
+            <w:r/>
+            <w:r>
+              <w:rPr>
+                <w:rFonts w:ascii="Times New Roman" w:hAnsi="Times New Roman" w:eastAsia="Times New Roman"/>
+                <w:b w:val="0"/>
+                <w:sz w:val="20"/>
               </w:rPr>
               <w:t>тип практики</w:t>
             </w:r>
@@ -751,7 +797,115 @@
               <w:rPr>
                 <w:rFonts w:ascii="Times New Roman" w:hAnsi="Times New Roman" w:eastAsia="Times New Roman"/>
                 <w:b w:val="0"/>
-                <w:sz w:val="16"/>
+                <w:sz w:val="14"/>
+              </w:rPr>
+            </w:r>
+          </w:p>
+        </w:tc>
+        <w:tc>
+          <w:tcPr>
+            <w:tcW w:type="dxa" w:w="2948"/>
+            <w:tcBorders>
+              <w:top w:val="nil"/>
+              <w:left w:val="nil"/>
+              <w:bottom w:val="nil"/>
+              <w:right w:val="nil"/>
+              <w:insideH w:val="nil"/>
+              <w:insideV w:val="nil"/>
+            </w:tcBorders>
+            <w:tcMar>
+              <w:top w:w="0" w:type="dxa"/>
+              <w:left w:w="0" w:type="dxa"/>
+              <w:bottom w:w="0" w:type="dxa"/>
+              <w:right w:w="0" w:type="dxa"/>
+            </w:tcMar>
+            <w:vAlign w:val="center"/>
+          </w:tcPr>
+          <w:p>
+            <w:pPr>
+              <w:spacing w:line="240" w:lineRule="auto" w:before="0" w:after="0"/>
+              <w:ind w:firstLine="0"/>
+              <w:jc w:val="center"/>
+            </w:pPr>
+            <w:r/>
+            <w:r>
+              <w:rPr>
+                <w:rFonts w:ascii="Times New Roman" w:hAnsi="Times New Roman" w:eastAsia="Times New Roman"/>
+                <w:b w:val="0"/>
+                <w:sz w:val="14"/>
+              </w:rPr>
+              <w:t>тип практики</w:t>
+            </w:r>
+          </w:p>
+        </w:tc>
+        <w:tc>
+          <w:tcPr>
+            <w:tcW w:type="dxa" w:w="2948"/>
+            <w:tcBorders>
+              <w:top w:val="nil"/>
+              <w:left w:val="nil"/>
+              <w:bottom w:val="nil"/>
+              <w:right w:val="nil"/>
+              <w:insideH w:val="nil"/>
+              <w:insideV w:val="nil"/>
+            </w:tcBorders>
+            <w:tcMar>
+              <w:top w:w="0" w:type="dxa"/>
+              <w:left w:w="0" w:type="dxa"/>
+              <w:bottom w:w="0" w:type="dxa"/>
+              <w:right w:w="0" w:type="dxa"/>
+            </w:tcMar>
+            <w:vAlign w:val="center"/>
+          </w:tcPr>
+          <w:p>
+            <w:pPr>
+              <w:spacing w:line="240" w:lineRule="auto" w:before="0" w:after="0"/>
+              <w:ind w:firstLine="0"/>
+              <w:jc w:val="center"/>
+            </w:pPr>
+            <w:r/>
+            <w:r>
+              <w:rPr>
+                <w:rFonts w:ascii="Times New Roman" w:hAnsi="Times New Roman" w:eastAsia="Times New Roman"/>
+                <w:b w:val="0"/>
+                <w:sz w:val="14"/>
+              </w:rPr>
+            </w:r>
+          </w:p>
+        </w:tc>
+      </w:tr>
+      <w:tr>
+        <w:tc>
+          <w:tcPr>
+            <w:tcW w:type="dxa" w:w="2948"/>
+            <w:tcBorders>
+              <w:top w:val="nil"/>
+              <w:left w:val="nil"/>
+              <w:bottom w:val="nil"/>
+              <w:right w:val="nil"/>
+              <w:insideH w:val="nil"/>
+              <w:insideV w:val="nil"/>
+            </w:tcBorders>
+            <w:tcMar>
+              <w:top w:w="0" w:type="dxa"/>
+              <w:left w:w="0" w:type="dxa"/>
+              <w:bottom w:w="0" w:type="dxa"/>
+              <w:right w:w="0" w:type="dxa"/>
+            </w:tcMar>
+            <w:vAlign w:val="center"/>
+          </w:tcPr>
+          <w:p>
+            <w:pPr>
+              <w:spacing w:line="240" w:lineRule="auto" w:before="0" w:after="0"/>
+              <w:ind w:firstLine="0"/>
+              <w:jc w:val="center"/>
+            </w:pPr>
+            <w:r/>
+            <w:r>
+              <w:rPr>
+                <w:rFonts w:ascii="Times New Roman" w:hAnsi="Times New Roman" w:eastAsia="Times New Roman"/>
+                <w:b w:val="0"/>
+                <w:sz w:val="20"/>
               </w:rPr>
               <w:t>на тему индивидуального задания</w:t>
             </w:r>
@@ -793,6 +947,28 @@
               <w:t>Разработка real-time интерфейса с поддержкой горизонтального масштабирования WebSocket-соединений для системы отслеживания задач</w:t>
             </w:r>
           </w:p>
+        </w:tc>
+      </w:tr>
+      <w:tr>
+        <w:tc>
+          <w:tcPr>
+            <w:tcW w:type="dxa" w:w="2948"/>
+            <w:tcBorders>
+              <w:top w:val="nil"/>
+              <w:left w:val="nil"/>
+              <w:bottom w:val="nil"/>
+              <w:right w:val="nil"/>
+              <w:insideH w:val="nil"/>
+              <w:insideV w:val="nil"/>
+            </w:tcBorders>
+            <w:tcMar>
+              <w:top w:w="0" w:type="dxa"/>
+              <w:left w:w="0" w:type="dxa"/>
+              <w:bottom w:w="0" w:type="dxa"/>
+              <w:right w:w="0" w:type="dxa"/>
+            </w:tcMar>
+            <w:vAlign w:val="center"/>
+          </w:tcPr>
           <w:p>
             <w:pPr>
               <w:spacing w:line="240" w:lineRule="auto" w:before="0" w:after="0"/>
@@ -804,7 +980,78 @@
               <w:rPr>
                 <w:rFonts w:ascii="Times New Roman" w:hAnsi="Times New Roman" w:eastAsia="Times New Roman"/>
                 <w:b w:val="0"/>
-                <w:sz w:val="20"/>
+                <w:sz w:val="14"/>
+              </w:rPr>
+            </w:r>
+          </w:p>
+        </w:tc>
+        <w:tc>
+          <w:tcPr>
+            <w:tcW w:type="dxa" w:w="2948"/>
+            <w:tcBorders>
+              <w:top w:val="nil"/>
+              <w:left w:val="nil"/>
+              <w:bottom w:val="nil"/>
+              <w:right w:val="nil"/>
+              <w:insideH w:val="nil"/>
+              <w:insideV w:val="nil"/>
+            </w:tcBorders>
+            <w:tcMar>
+              <w:top w:w="0" w:type="dxa"/>
+              <w:left w:w="0" w:type="dxa"/>
+              <w:bottom w:w="0" w:type="dxa"/>
+              <w:right w:w="0" w:type="dxa"/>
+            </w:tcMar>
+            <w:vAlign w:val="center"/>
+          </w:tcPr>
+          <w:p>
+            <w:pPr>
+              <w:spacing w:line="240" w:lineRule="auto" w:before="0" w:after="0"/>
+              <w:ind w:firstLine="0"/>
+              <w:jc w:val="center"/>
+            </w:pPr>
+            <w:r/>
+            <w:r>
+              <w:rPr>
+                <w:rFonts w:ascii="Times New Roman" w:hAnsi="Times New Roman" w:eastAsia="Times New Roman"/>
+                <w:b w:val="0"/>
+                <w:sz w:val="14"/>
+              </w:rPr>
+              <w:t>на тему индивидуального задания</w:t>
+            </w:r>
+          </w:p>
+        </w:tc>
+        <w:tc>
+          <w:tcPr>
+            <w:tcW w:type="dxa" w:w="2948"/>
+            <w:tcBorders>
+              <w:top w:val="nil"/>
+              <w:left w:val="nil"/>
+              <w:bottom w:val="nil"/>
+              <w:right w:val="nil"/>
+              <w:insideH w:val="nil"/>
+              <w:insideV w:val="nil"/>
+            </w:tcBorders>
+            <w:tcMar>
+              <w:top w:w="0" w:type="dxa"/>
+              <w:left w:w="0" w:type="dxa"/>
+              <w:bottom w:w="0" w:type="dxa"/>
+              <w:right w:w="0" w:type="dxa"/>
+            </w:tcMar>
+            <w:vAlign w:val="center"/>
+          </w:tcPr>
+          <w:p>
+            <w:pPr>
+              <w:spacing w:line="240" w:lineRule="auto" w:before="0" w:after="0"/>
+              <w:ind w:firstLine="0"/>
+              <w:jc w:val="center"/>
+            </w:pPr>
+            <w:r/>
+            <w:r>
+              <w:rPr>
+                <w:rFonts w:ascii="Times New Roman" w:hAnsi="Times New Roman" w:eastAsia="Times New Roman"/>
+                <w:b w:val="0"/>
+                <w:sz w:val="14"/>
               </w:rPr>
             </w:r>
           </w:p>
@@ -914,6 +1161,114 @@
                 <w:rFonts w:ascii="Times New Roman" w:hAnsi="Times New Roman" w:eastAsia="Times New Roman"/>
                 <w:b w:val="0"/>
                 <w:sz w:val="20"/>
+              </w:rPr>
+            </w:r>
+          </w:p>
+        </w:tc>
+      </w:tr>
+      <w:tr>
+        <w:tc>
+          <w:tcPr>
+            <w:tcW w:type="dxa" w:w="2948"/>
+            <w:tcBorders>
+              <w:top w:val="nil"/>
+              <w:left w:val="nil"/>
+              <w:bottom w:val="nil"/>
+              <w:right w:val="nil"/>
+              <w:insideH w:val="nil"/>
+              <w:insideV w:val="nil"/>
+            </w:tcBorders>
+            <w:tcMar>
+              <w:top w:w="0" w:type="dxa"/>
+              <w:left w:w="0" w:type="dxa"/>
+              <w:bottom w:w="0" w:type="dxa"/>
+              <w:right w:w="0" w:type="dxa"/>
+            </w:tcMar>
+            <w:vAlign w:val="center"/>
+          </w:tcPr>
+          <w:p>
+            <w:pPr>
+              <w:spacing w:line="240" w:lineRule="auto" w:before="0" w:after="0"/>
+              <w:ind w:firstLine="0"/>
+              <w:jc w:val="center"/>
+            </w:pPr>
+            <w:r/>
+            <w:r>
+              <w:rPr>
+                <w:rFonts w:ascii="Times New Roman" w:hAnsi="Times New Roman" w:eastAsia="Times New Roman"/>
+                <w:b w:val="0"/>
+                <w:sz w:val="14"/>
+              </w:rPr>
+            </w:r>
+          </w:p>
+        </w:tc>
+        <w:tc>
+          <w:tcPr>
+            <w:tcW w:type="dxa" w:w="2948"/>
+            <w:tcBorders>
+              <w:top w:val="nil"/>
+              <w:left w:val="nil"/>
+              <w:bottom w:val="nil"/>
+              <w:right w:val="nil"/>
+              <w:insideH w:val="nil"/>
+              <w:insideV w:val="nil"/>
+            </w:tcBorders>
+            <w:tcMar>
+              <w:top w:w="0" w:type="dxa"/>
+              <w:left w:w="0" w:type="dxa"/>
+              <w:bottom w:w="0" w:type="dxa"/>
+              <w:right w:w="0" w:type="dxa"/>
+            </w:tcMar>
+            <w:vAlign w:val="center"/>
+          </w:tcPr>
+          <w:p>
+            <w:pPr>
+              <w:spacing w:line="240" w:lineRule="auto" w:before="0" w:after="0"/>
+              <w:ind w:firstLine="0"/>
+              <w:jc w:val="center"/>
+            </w:pPr>
+            <w:r/>
+            <w:r>
+              <w:rPr>
+                <w:rFonts w:ascii="Times New Roman" w:hAnsi="Times New Roman" w:eastAsia="Times New Roman"/>
+                <w:b w:val="0"/>
+                <w:sz w:val="14"/>
+              </w:rPr>
+              <w:t>фамилия, имя, отчество обучающегося в творительном падеже</w:t>
+            </w:r>
+          </w:p>
+        </w:tc>
+        <w:tc>
+          <w:tcPr>
+            <w:tcW w:type="dxa" w:w="2948"/>
+            <w:tcBorders>
+              <w:top w:val="nil"/>
+              <w:left w:val="nil"/>
+              <w:bottom w:val="nil"/>
+              <w:right w:val="nil"/>
+              <w:insideH w:val="nil"/>
+              <w:insideV w:val="nil"/>
+            </w:tcBorders>
+            <w:tcMar>
+              <w:top w:w="0" w:type="dxa"/>
+              <w:left w:w="0" w:type="dxa"/>
+              <w:bottom w:w="0" w:type="dxa"/>
+              <w:right w:w="0" w:type="dxa"/>
+            </w:tcMar>
+            <w:vAlign w:val="center"/>
+          </w:tcPr>
+          <w:p>
+            <w:pPr>
+              <w:spacing w:line="240" w:lineRule="auto" w:before="0" w:after="0"/>
+              <w:ind w:firstLine="0"/>
+              <w:jc w:val="center"/>
+            </w:pPr>
+            <w:r/>
+            <w:r>
+              <w:rPr>
+                <w:rFonts w:ascii="Times New Roman" w:hAnsi="Times New Roman" w:eastAsia="Times New Roman"/>
+                <w:b w:val="0"/>
+                <w:sz w:val="14"/>
               </w:rPr>
             </w:r>
           </w:p>
@@ -1060,6 +1415,115 @@
               <w:rPr>
                 <w:rFonts w:ascii="Times New Roman" w:hAnsi="Times New Roman" w:eastAsia="Times New Roman"/>
                 <w:b w:val="0"/>
+                <w:sz w:val="14"/>
+              </w:rPr>
+            </w:r>
+          </w:p>
+        </w:tc>
+        <w:tc>
+          <w:tcPr>
+            <w:tcW w:type="dxa" w:w="2948"/>
+            <w:tcBorders>
+              <w:top w:val="nil"/>
+              <w:left w:val="nil"/>
+              <w:bottom w:val="nil"/>
+              <w:right w:val="nil"/>
+              <w:insideH w:val="nil"/>
+              <w:insideV w:val="nil"/>
+            </w:tcBorders>
+            <w:tcMar>
+              <w:top w:w="0" w:type="dxa"/>
+              <w:left w:w="0" w:type="dxa"/>
+              <w:bottom w:w="0" w:type="dxa"/>
+              <w:right w:w="0" w:type="dxa"/>
+            </w:tcMar>
+            <w:vAlign w:val="center"/>
+          </w:tcPr>
+          <w:p>
+            <w:pPr>
+              <w:spacing w:line="240" w:lineRule="auto" w:before="0" w:after="0"/>
+              <w:ind w:firstLine="0"/>
+              <w:jc w:val="center"/>
+            </w:pPr>
+            <w:r/>
+            <w:r>
+              <w:rPr>
+                <w:rFonts w:ascii="Times New Roman" w:hAnsi="Times New Roman" w:eastAsia="Times New Roman"/>
+                <w:b w:val="0"/>
+                <w:sz w:val="14"/>
+              </w:rPr>
+              <w:t>код</w:t>
+            </w:r>
+          </w:p>
+        </w:tc>
+        <w:tc>
+          <w:tcPr>
+            <w:tcW w:type="dxa" w:w="2948"/>
+            <w:tcBorders>
+              <w:top w:val="nil"/>
+              <w:left w:val="nil"/>
+              <w:bottom w:val="nil"/>
+              <w:right w:val="nil"/>
+              <w:insideH w:val="nil"/>
+              <w:insideV w:val="nil"/>
+            </w:tcBorders>
+            <w:tcMar>
+              <w:top w:w="0" w:type="dxa"/>
+              <w:left w:w="0" w:type="dxa"/>
+              <w:bottom w:w="0" w:type="dxa"/>
+              <w:right w:w="0" w:type="dxa"/>
+            </w:tcMar>
+            <w:vAlign w:val="center"/>
+          </w:tcPr>
+          <w:p>
+            <w:pPr>
+              <w:spacing w:line="240" w:lineRule="auto" w:before="0" w:after="0"/>
+              <w:ind w:firstLine="0"/>
+              <w:jc w:val="center"/>
+            </w:pPr>
+            <w:r/>
+            <w:r>
+              <w:rPr>
+                <w:rFonts w:ascii="Times New Roman" w:hAnsi="Times New Roman" w:eastAsia="Times New Roman"/>
+                <w:b w:val="0"/>
+                <w:sz w:val="14"/>
+              </w:rPr>
+              <w:t>наименование направления</w:t>
+            </w:r>
+          </w:p>
+        </w:tc>
+      </w:tr>
+      <w:tr>
+        <w:tc>
+          <w:tcPr>
+            <w:tcW w:type="dxa" w:w="2948"/>
+            <w:tcBorders>
+              <w:top w:val="nil"/>
+              <w:left w:val="nil"/>
+              <w:bottom w:val="nil"/>
+              <w:right w:val="nil"/>
+              <w:insideH w:val="nil"/>
+              <w:insideV w:val="nil"/>
+            </w:tcBorders>
+            <w:tcMar>
+              <w:top w:w="0" w:type="dxa"/>
+              <w:left w:w="0" w:type="dxa"/>
+              <w:bottom w:w="0" w:type="dxa"/>
+              <w:right w:w="0" w:type="dxa"/>
+            </w:tcMar>
+            <w:vAlign w:val="center"/>
+          </w:tcPr>
+          <w:p>
+            <w:pPr>
+              <w:spacing w:line="240" w:lineRule="auto" w:before="0" w:after="0"/>
+              <w:ind w:firstLine="0"/>
+              <w:jc w:val="center"/>
+            </w:pPr>
+            <w:r/>
+            <w:r>
+              <w:rPr>
+                <w:rFonts w:ascii="Times New Roman" w:hAnsi="Times New Roman" w:eastAsia="Times New Roman"/>
+                <w:b w:val="0"/>
                 <w:sz w:val="20"/>
               </w:rPr>
               <w:t>направленности</w:t>
@@ -1170,6 +1634,115 @@
               <w:rPr>
                 <w:rFonts w:ascii="Times New Roman" w:hAnsi="Times New Roman" w:eastAsia="Times New Roman"/>
                 <w:b w:val="0"/>
+                <w:sz w:val="14"/>
+              </w:rPr>
+            </w:r>
+          </w:p>
+        </w:tc>
+        <w:tc>
+          <w:tcPr>
+            <w:tcW w:type="dxa" w:w="2948"/>
+            <w:tcBorders>
+              <w:top w:val="nil"/>
+              <w:left w:val="nil"/>
+              <w:bottom w:val="nil"/>
+              <w:right w:val="nil"/>
+              <w:insideH w:val="nil"/>
+              <w:insideV w:val="nil"/>
+            </w:tcBorders>
+            <w:tcMar>
+              <w:top w:w="0" w:type="dxa"/>
+              <w:left w:w="0" w:type="dxa"/>
+              <w:bottom w:w="0" w:type="dxa"/>
+              <w:right w:w="0" w:type="dxa"/>
+            </w:tcMar>
+            <w:vAlign w:val="center"/>
+          </w:tcPr>
+          <w:p>
+            <w:pPr>
+              <w:spacing w:line="240" w:lineRule="auto" w:before="0" w:after="0"/>
+              <w:ind w:firstLine="0"/>
+              <w:jc w:val="center"/>
+            </w:pPr>
+            <w:r/>
+            <w:r>
+              <w:rPr>
+                <w:rFonts w:ascii="Times New Roman" w:hAnsi="Times New Roman" w:eastAsia="Times New Roman"/>
+                <w:b w:val="0"/>
+                <w:sz w:val="14"/>
+              </w:rPr>
+              <w:t>код</w:t>
+            </w:r>
+          </w:p>
+        </w:tc>
+        <w:tc>
+          <w:tcPr>
+            <w:tcW w:type="dxa" w:w="2948"/>
+            <w:tcBorders>
+              <w:top w:val="nil"/>
+              <w:left w:val="nil"/>
+              <w:bottom w:val="nil"/>
+              <w:right w:val="nil"/>
+              <w:insideH w:val="nil"/>
+              <w:insideV w:val="nil"/>
+            </w:tcBorders>
+            <w:tcMar>
+              <w:top w:w="0" w:type="dxa"/>
+              <w:left w:w="0" w:type="dxa"/>
+              <w:bottom w:w="0" w:type="dxa"/>
+              <w:right w:w="0" w:type="dxa"/>
+            </w:tcMar>
+            <w:vAlign w:val="center"/>
+          </w:tcPr>
+          <w:p>
+            <w:pPr>
+              <w:spacing w:line="240" w:lineRule="auto" w:before="0" w:after="0"/>
+              <w:ind w:firstLine="0"/>
+              <w:jc w:val="center"/>
+            </w:pPr>
+            <w:r/>
+            <w:r>
+              <w:rPr>
+                <w:rFonts w:ascii="Times New Roman" w:hAnsi="Times New Roman" w:eastAsia="Times New Roman"/>
+                <w:b w:val="0"/>
+                <w:sz w:val="14"/>
+              </w:rPr>
+              <w:t>наименование направленности</w:t>
+            </w:r>
+          </w:p>
+        </w:tc>
+      </w:tr>
+      <w:tr>
+        <w:tc>
+          <w:tcPr>
+            <w:tcW w:type="dxa" w:w="2948"/>
+            <w:tcBorders>
+              <w:top w:val="nil"/>
+              <w:left w:val="nil"/>
+              <w:bottom w:val="nil"/>
+              <w:right w:val="nil"/>
+              <w:insideH w:val="nil"/>
+              <w:insideV w:val="nil"/>
+            </w:tcBorders>
+            <w:tcMar>
+              <w:top w:w="0" w:type="dxa"/>
+              <w:left w:w="0" w:type="dxa"/>
+              <w:bottom w:w="0" w:type="dxa"/>
+              <w:right w:w="0" w:type="dxa"/>
+            </w:tcMar>
+            <w:vAlign w:val="center"/>
+          </w:tcPr>
+          <w:p>
+            <w:pPr>
+              <w:spacing w:line="240" w:lineRule="auto" w:before="0" w:after="0"/>
+              <w:ind w:firstLine="0"/>
+              <w:jc w:val="center"/>
+            </w:pPr>
+            <w:r/>
+            <w:r>
+              <w:rPr>
+                <w:rFonts w:ascii="Times New Roman" w:hAnsi="Times New Roman" w:eastAsia="Times New Roman"/>
+                <w:b w:val="0"/>
                 <w:sz w:val="20"/>
               </w:rPr>
               <w:t>Обучающийся группы №</w:t>
@@ -1244,18 +1817,121 @@
                 <w:b w:val="0"/>
                 <w:sz w:val="20"/>
               </w:rPr>
-              <w:t>А.С. Зайцев</w:t>
+              <w:t>____________________</w:t>
+            </w:r>
+          </w:p>
+        </w:tc>
+      </w:tr>
+      <w:tr>
+        <w:tc>
+          <w:tcPr>
+            <w:tcW w:type="dxa" w:w="2948"/>
+            <w:tcBorders>
+              <w:top w:val="nil"/>
+              <w:left w:val="nil"/>
+              <w:bottom w:val="nil"/>
+              <w:right w:val="nil"/>
+              <w:insideH w:val="nil"/>
+              <w:insideV w:val="nil"/>
+            </w:tcBorders>
+            <w:tcMar>
+              <w:top w:w="0" w:type="dxa"/>
+              <w:left w:w="0" w:type="dxa"/>
+              <w:bottom w:w="0" w:type="dxa"/>
+              <w:right w:w="0" w:type="dxa"/>
+            </w:tcMar>
+            <w:vAlign w:val="center"/>
+          </w:tcPr>
+          <w:p>
+            <w:pPr>
+              <w:spacing w:line="240" w:lineRule="auto" w:before="0" w:after="0"/>
+              <w:ind w:firstLine="0"/>
+              <w:jc w:val="center"/>
+            </w:pPr>
+            <w:r/>
+            <w:r>
+              <w:rPr>
+                <w:rFonts w:ascii="Times New Roman" w:hAnsi="Times New Roman" w:eastAsia="Times New Roman"/>
+                <w:b w:val="0"/>
+                <w:sz w:val="14"/>
+              </w:rPr>
+            </w:r>
+          </w:p>
+        </w:tc>
+        <w:tc>
+          <w:tcPr>
+            <w:tcW w:type="dxa" w:w="2948"/>
+            <w:tcBorders>
+              <w:top w:val="nil"/>
+              <w:left w:val="nil"/>
+              <w:bottom w:val="nil"/>
+              <w:right w:val="nil"/>
+              <w:insideH w:val="nil"/>
+              <w:insideV w:val="nil"/>
+            </w:tcBorders>
+            <w:tcMar>
+              <w:top w:w="0" w:type="dxa"/>
+              <w:left w:w="0" w:type="dxa"/>
+              <w:bottom w:w="0" w:type="dxa"/>
+              <w:right w:w="0" w:type="dxa"/>
+            </w:tcMar>
+            <w:vAlign w:val="center"/>
+          </w:tcPr>
+          <w:p>
+            <w:pPr>
+              <w:spacing w:line="240" w:lineRule="auto" w:before="0" w:after="0"/>
+              <w:ind w:firstLine="0"/>
+              <w:jc w:val="center"/>
+            </w:pPr>
+            <w:r/>
+            <w:r>
+              <w:rPr>
+                <w:rFonts w:ascii="Times New Roman" w:hAnsi="Times New Roman" w:eastAsia="Times New Roman"/>
+                <w:b w:val="0"/>
+                <w:sz w:val="14"/>
+              </w:rPr>
+              <w:t>номер</w:t>
+            </w:r>
+          </w:p>
+        </w:tc>
+        <w:tc>
+          <w:tcPr>
+            <w:tcW w:type="dxa" w:w="2948"/>
+            <w:tcBorders>
+              <w:top w:val="nil"/>
+              <w:left w:val="nil"/>
+              <w:bottom w:val="nil"/>
+              <w:right w:val="nil"/>
+              <w:insideH w:val="nil"/>
+              <w:insideV w:val="nil"/>
+            </w:tcBorders>
+            <w:tcMar>
+              <w:top w:w="0" w:type="dxa"/>
+              <w:left w:w="0" w:type="dxa"/>
+              <w:bottom w:w="0" w:type="dxa"/>
+              <w:right w:w="0" w:type="dxa"/>
+            </w:tcMar>
+            <w:vAlign w:val="center"/>
+          </w:tcPr>
+          <w:p>
+            <w:pPr>
+              <w:spacing w:line="240" w:lineRule="auto" w:before="0" w:after="0"/>
+              <w:ind w:firstLine="0"/>
+              <w:jc w:val="center"/>
+            </w:pPr>
+            <w:r/>
+            <w:r>
+              <w:rPr>
+                <w:rFonts w:ascii="Times New Roman" w:hAnsi="Times New Roman" w:eastAsia="Times New Roman"/>
+                <w:b w:val="0"/>
+                <w:sz w:val="14"/>
+              </w:rPr>
+              <w:t>подпись, дата</w:t>
             </w:r>
           </w:p>
         </w:tc>
       </w:tr>
     </w:tbl>
-    <w:p>
-      <w:pPr>
-        <w:spacing w:line="240" w:lineRule="auto" w:before="0" w:after="120"/>
-        <w:ind w:firstLine="0"/>
-      </w:pPr>
-    </w:p>
     <w:tbl>
       <w:tblPr>
         <w:tblW w:type="auto" w:w="0"/>
@@ -1299,7 +1975,6 @@
                 <w:b w:val="0"/>
                 <w:sz w:val="14"/>
               </w:rPr>
-              <w:t>номер</w:t>
             </w:r>
           </w:p>
         </w:tc>
@@ -1335,7 +2010,6 @@
                 <w:b w:val="0"/>
                 <w:sz w:val="14"/>
               </w:rPr>
-              <w:t>подпись, дата</w:t>
             </w:r>
           </w:p>
         </w:tc>
@@ -1383,7 +2057,7 @@
             <w:tcBorders>
               <w:top w:val="nil"/>
               <w:left w:val="nil"/>
-              <w:bottom w:val="single" w:sz="6" w:space="0" w:color="000000"/>
+              <w:bottom w:val="nil"/>
               <w:right w:val="nil"/>
               <w:insideH w:val="nil"/>
               <w:insideV w:val="nil"/>
@@ -1409,7 +2083,6 @@
                 <w:b w:val="0"/>
                 <w:sz w:val="20"/>
               </w:rPr>
-              <w:t>4131з</w:t>
             </w:r>
           </w:p>
         </w:tc>
@@ -1419,7 +2092,7 @@
             <w:tcBorders>
               <w:top w:val="nil"/>
               <w:left w:val="nil"/>
-              <w:bottom w:val="single" w:sz="6" w:space="0" w:color="000000"/>
+              <w:bottom w:val="nil"/>
               <w:right w:val="nil"/>
               <w:insideH w:val="nil"/>
               <w:insideV w:val="nil"/>
@@ -1445,7 +2118,6 @@
                 <w:b w:val="0"/>
                 <w:sz w:val="20"/>
               </w:rPr>
-              <w:t>____________________</w:t>
             </w:r>
           </w:p>
         </w:tc>
@@ -1489,7 +2161,7 @@
     </w:tbl>
     <w:p>
       <w:pPr>
-        <w:spacing w:line="240" w:lineRule="auto" w:before="0" w:after="280"/>
+        <w:spacing w:line="240" w:lineRule="auto" w:before="0" w:after="400"/>
         <w:ind w:firstLine="0"/>
       </w:pPr>
     </w:p>
@@ -1536,8 +2208,11 @@
     </w:p>
     <w:p>
       <w:pPr>
+        <w:tabs>
+          <w:tab w:pos="9071" w:val="center"/>
+        </w:tabs>
         <w:spacing w:line="240" w:lineRule="auto" w:after="0"/>
-        <w:ind w:firstLine="0" w:left="0"/>
+        <w:ind w:firstLine="0" w:left="0" w:right="0"/>
       </w:pPr>
       <w:r>
         <w:rPr>
@@ -1546,13 +2221,18 @@
           <w:i w:val="0"/>
           <w:sz w:val="22"/>
         </w:rPr>
-        <w:t>ПЕРЕЧЕНЬ СОКРАЩЕНИЙ И ОБОЗНАЧЕНИЙ ................................................. 2</w:t>
-      </w:r>
-    </w:p>
-    <w:p>
-      <w:pPr>
+        <w:t>ПЕРЕЧЕНЬ СОКРАЩЕНИЙ И ОБОЗНАЧЕНИЙ</w:t>
+        <w:tab/>
+        <w:t>2</w:t>
+      </w:r>
+    </w:p>
+    <w:p>
+      <w:pPr>
+        <w:tabs>
+          <w:tab w:pos="9071" w:val="center"/>
+        </w:tabs>
         <w:spacing w:line="240" w:lineRule="auto" w:after="0"/>
-        <w:ind w:firstLine="0" w:left="0"/>
+        <w:ind w:firstLine="0" w:left="0" w:right="0"/>
       </w:pPr>
       <w:r>
         <w:rPr>
@@ -1561,13 +2241,18 @@
           <w:i w:val="0"/>
           <w:sz w:val="22"/>
         </w:rPr>
-        <w:t>ВВЕДЕНИЕ .......................................................................... 3</w:t>
-      </w:r>
-    </w:p>
-    <w:p>
-      <w:pPr>
+        <w:t>ВВЕДЕНИЕ</w:t>
+        <w:tab/>
+        <w:t>3</w:t>
+      </w:r>
+    </w:p>
+    <w:p>
+      <w:pPr>
+        <w:tabs>
+          <w:tab w:pos="9071" w:val="center"/>
+        </w:tabs>
         <w:spacing w:line="240" w:lineRule="auto" w:after="0"/>
-        <w:ind w:firstLine="0" w:left="0"/>
+        <w:ind w:firstLine="0" w:left="0" w:right="0"/>
       </w:pPr>
       <w:r>
         <w:rPr>
@@ -1576,13 +2261,18 @@
           <w:i w:val="0"/>
           <w:sz w:val="22"/>
         </w:rPr>
-        <w:t>1. Анализ предметной области и существующих подходов .............................. 7</w:t>
-      </w:r>
-    </w:p>
-    <w:p>
-      <w:pPr>
+        <w:t>1. Анализ предметной области и существующих подходов</w:t>
+        <w:tab/>
+        <w:t>6</w:t>
+      </w:r>
+    </w:p>
+    <w:p>
+      <w:pPr>
+        <w:tabs>
+          <w:tab w:pos="9071" w:val="center"/>
+        </w:tabs>
         <w:spacing w:line="240" w:lineRule="auto" w:after="0"/>
-        <w:ind w:firstLine="0" w:left="425"/>
+        <w:ind w:firstLine="0" w:left="425" w:right="0"/>
       </w:pPr>
       <w:r>
         <w:rPr>
@@ -1591,13 +2281,18 @@
           <w:i w:val="0"/>
           <w:sz w:val="22"/>
         </w:rPr>
-        <w:t>1.1 Real-time взаимодействие в системах отслеживания задач .................. 7</w:t>
-      </w:r>
-    </w:p>
-    <w:p>
-      <w:pPr>
+        <w:t>1.1 Real-time взаимодействие в системах отслеживания задач</w:t>
+        <w:tab/>
+        <w:t>6</w:t>
+      </w:r>
+    </w:p>
+    <w:p>
+      <w:pPr>
+        <w:tabs>
+          <w:tab w:pos="9071" w:val="center"/>
+        </w:tabs>
         <w:spacing w:line="240" w:lineRule="auto" w:after="0"/>
-        <w:ind w:firstLine="0" w:left="425"/>
+        <w:ind w:firstLine="0" w:left="425" w:right="0"/>
       </w:pPr>
       <w:r>
         <w:rPr>
@@ -1606,13 +2301,18 @@
           <w:i w:val="0"/>
           <w:sz w:val="22"/>
         </w:rPr>
-        <w:t>1.2 WebSocket и SignalR как основа real-time контура ........................ 8</w:t>
-      </w:r>
-    </w:p>
-    <w:p>
-      <w:pPr>
+        <w:t>1.2 WebSocket и SignalR как основа real-time контура</w:t>
+        <w:tab/>
+        <w:t>6</w:t>
+      </w:r>
+    </w:p>
+    <w:p>
+      <w:pPr>
+        <w:tabs>
+          <w:tab w:pos="9071" w:val="center"/>
+        </w:tabs>
         <w:spacing w:line="240" w:lineRule="auto" w:after="0"/>
-        <w:ind w:firstLine="0" w:left="425"/>
+        <w:ind w:firstLine="0" w:left="425" w:right="0"/>
       </w:pPr>
       <w:r>
         <w:rPr>
@@ -1621,13 +2321,18 @@
           <w:i w:val="0"/>
           <w:sz w:val="22"/>
         </w:rPr>
-        <w:t>1.3 Ограничение single-node WebSocket-архитектуры ........................... 8</w:t>
-      </w:r>
-    </w:p>
-    <w:p>
-      <w:pPr>
+        <w:t>1.3 Ограничение single-node WebSocket-архитектуры</w:t>
+        <w:tab/>
+        <w:t>7</w:t>
+      </w:r>
+    </w:p>
+    <w:p>
+      <w:pPr>
+        <w:tabs>
+          <w:tab w:pos="9071" w:val="center"/>
+        </w:tabs>
         <w:spacing w:line="240" w:lineRule="auto" w:after="0"/>
-        <w:ind w:firstLine="0" w:left="425"/>
+        <w:ind w:firstLine="0" w:left="425" w:right="0"/>
       </w:pPr>
       <w:r>
         <w:rPr>
@@ -1636,13 +2341,18 @@
           <w:i w:val="0"/>
           <w:sz w:val="22"/>
         </w:rPr>
-        <w:t>1.4 Сравнение подходов к масштабированию .................................... 9</w:t>
-      </w:r>
-    </w:p>
-    <w:p>
-      <w:pPr>
+        <w:t>1.4 Сравнение подходов к масштабированию</w:t>
+        <w:tab/>
+        <w:t>8</w:t>
+      </w:r>
+    </w:p>
+    <w:p>
+      <w:pPr>
+        <w:tabs>
+          <w:tab w:pos="9071" w:val="center"/>
+        </w:tabs>
         <w:spacing w:line="240" w:lineRule="auto" w:after="0"/>
-        <w:ind w:firstLine="0" w:left="425"/>
+        <w:ind w:firstLine="0" w:left="425" w:right="0"/>
       </w:pPr>
       <w:r>
         <w:rPr>
@@ -1651,13 +2361,18 @@
           <w:i w:val="0"/>
           <w:sz w:val="22"/>
         </w:rPr>
-        <w:t>1.5 Вывод по главе .......................................................... 10</w:t>
-      </w:r>
-    </w:p>
-    <w:p>
-      <w:pPr>
+        <w:t>1.5 Вывод по главе</w:t>
+        <w:tab/>
+        <w:t>9</w:t>
+      </w:r>
+    </w:p>
+    <w:p>
+      <w:pPr>
+        <w:tabs>
+          <w:tab w:pos="9071" w:val="center"/>
+        </w:tabs>
         <w:spacing w:line="240" w:lineRule="auto" w:after="0"/>
-        <w:ind w:firstLine="0" w:left="0"/>
+        <w:ind w:firstLine="0" w:left="0" w:right="0"/>
       </w:pPr>
       <w:r>
         <w:rPr>
@@ -1666,13 +2381,18 @@
           <w:i w:val="0"/>
           <w:sz w:val="22"/>
         </w:rPr>
-        <w:t>2. Анализ целевой системы и постановка задачи практики ............................ 11</w:t>
-      </w:r>
-    </w:p>
-    <w:p>
-      <w:pPr>
+        <w:t>2. Анализ целевой системы и постановка задачи практики</w:t>
+        <w:tab/>
+        <w:t>10</w:t>
+      </w:r>
+    </w:p>
+    <w:p>
+      <w:pPr>
+        <w:tabs>
+          <w:tab w:pos="9071" w:val="center"/>
+        </w:tabs>
         <w:spacing w:line="240" w:lineRule="auto" w:after="0"/>
-        <w:ind w:firstLine="0" w:left="425"/>
+        <w:ind w:firstLine="0" w:left="425" w:right="0"/>
       </w:pPr>
       <w:r>
         <w:rPr>
@@ -1681,13 +2401,18 @@
           <w:i w:val="0"/>
           <w:sz w:val="22"/>
         </w:rPr>
-        <w:t>2.1 Характеристика целевой системы .......................................... 11</w:t>
-      </w:r>
-    </w:p>
-    <w:p>
-      <w:pPr>
+        <w:t>2.1 Характеристика целевой системы</w:t>
+        <w:tab/>
+        <w:t>10</w:t>
+      </w:r>
+    </w:p>
+    <w:p>
+      <w:pPr>
+        <w:tabs>
+          <w:tab w:pos="9071" w:val="center"/>
+        </w:tabs>
         <w:spacing w:line="240" w:lineRule="auto" w:after="0"/>
-        <w:ind w:firstLine="0" w:left="425"/>
+        <w:ind w:firstLine="0" w:left="425" w:right="0"/>
       </w:pPr>
       <w:r>
         <w:rPr>
@@ -1696,13 +2421,18 @@
           <w:i w:val="0"/>
           <w:sz w:val="22"/>
         </w:rPr>
-        <w:t>2.2 Исходная реализация real-time взаимодействия ............................ 11</w:t>
-      </w:r>
-    </w:p>
-    <w:p>
-      <w:pPr>
+        <w:t>2.2 Исходная реализация real-time взаимодействия</w:t>
+        <w:tab/>
+        <w:t>10</w:t>
+      </w:r>
+    </w:p>
+    <w:p>
+      <w:pPr>
+        <w:tabs>
+          <w:tab w:pos="9071" w:val="center"/>
+        </w:tabs>
         <w:spacing w:line="240" w:lineRule="auto" w:after="0"/>
-        <w:ind w:firstLine="0" w:left="425"/>
+        <w:ind w:firstLine="0" w:left="425" w:right="0"/>
       </w:pPr>
       <w:r>
         <w:rPr>
@@ -1711,13 +2441,18 @@
           <w:i w:val="0"/>
           <w:sz w:val="22"/>
         </w:rPr>
-        <w:t>2.3 Требования к разрабатываемому решению ................................... 12</w:t>
-      </w:r>
-    </w:p>
-    <w:p>
-      <w:pPr>
+        <w:t>2.3 Требования к разрабатываемому решению</w:t>
+        <w:tab/>
+        <w:t>11</w:t>
+      </w:r>
+    </w:p>
+    <w:p>
+      <w:pPr>
+        <w:tabs>
+          <w:tab w:pos="9071" w:val="center"/>
+        </w:tabs>
         <w:spacing w:line="240" w:lineRule="auto" w:after="0"/>
-        <w:ind w:firstLine="0" w:left="425"/>
+        <w:ind w:firstLine="0" w:left="425" w:right="0"/>
       </w:pPr>
       <w:r>
         <w:rPr>
@@ -1726,13 +2461,18 @@
           <w:i w:val="0"/>
           <w:sz w:val="22"/>
         </w:rPr>
-        <w:t>2.4 Постановка задачи ....................................................... 13</w:t>
-      </w:r>
-    </w:p>
-    <w:p>
-      <w:pPr>
+        <w:t>2.4 Постановка задачи</w:t>
+        <w:tab/>
+        <w:t>12</w:t>
+      </w:r>
+    </w:p>
+    <w:p>
+      <w:pPr>
+        <w:tabs>
+          <w:tab w:pos="9071" w:val="center"/>
+        </w:tabs>
         <w:spacing w:line="240" w:lineRule="auto" w:after="0"/>
-        <w:ind w:firstLine="0" w:left="0"/>
+        <w:ind w:firstLine="0" w:left="0" w:right="0"/>
       </w:pPr>
       <w:r>
         <w:rPr>
@@ -1741,13 +2481,18 @@
           <w:i w:val="0"/>
           <w:sz w:val="22"/>
         </w:rPr>
-        <w:t>3. Проектирование масштабируемого real-time контура ............................... 14</w:t>
-      </w:r>
-    </w:p>
-    <w:p>
-      <w:pPr>
+        <w:t>3. Проектирование масштабируемого real-time контура</w:t>
+        <w:tab/>
+        <w:t>13</w:t>
+      </w:r>
+    </w:p>
+    <w:p>
+      <w:pPr>
+        <w:tabs>
+          <w:tab w:pos="9071" w:val="center"/>
+        </w:tabs>
         <w:spacing w:line="240" w:lineRule="auto" w:after="0"/>
-        <w:ind w:firstLine="0" w:left="425"/>
+        <w:ind w:firstLine="0" w:left="425" w:right="0"/>
       </w:pPr>
       <w:r>
         <w:rPr>
@@ -1756,13 +2501,18 @@
           <w:i w:val="0"/>
           <w:sz w:val="22"/>
         </w:rPr>
-        <w:t>3.1 Исходная архитектура .................................................... 14</w:t>
-      </w:r>
-    </w:p>
-    <w:p>
-      <w:pPr>
+        <w:t>3.1 Исходная архитектура</w:t>
+        <w:tab/>
+        <w:t>13</w:t>
+      </w:r>
+    </w:p>
+    <w:p>
+      <w:pPr>
+        <w:tabs>
+          <w:tab w:pos="9071" w:val="center"/>
+        </w:tabs>
         <w:spacing w:line="240" w:lineRule="auto" w:after="0"/>
-        <w:ind w:firstLine="0" w:left="425"/>
+        <w:ind w:firstLine="0" w:left="425" w:right="0"/>
       </w:pPr>
       <w:r>
         <w:rPr>
@@ -1771,13 +2521,18 @@
           <w:i w:val="0"/>
           <w:sz w:val="22"/>
         </w:rPr>
-        <w:t>3.2 Целевая архитектура ..................................................... 14</w:t>
-      </w:r>
-    </w:p>
-    <w:p>
-      <w:pPr>
+        <w:t>3.2 Целевая архитектура</w:t>
+        <w:tab/>
+        <w:t>13</w:t>
+      </w:r>
+    </w:p>
+    <w:p>
+      <w:pPr>
+        <w:tabs>
+          <w:tab w:pos="9071" w:val="center"/>
+        </w:tabs>
         <w:spacing w:line="240" w:lineRule="auto" w:after="0"/>
-        <w:ind w:firstLine="0" w:left="425"/>
+        <w:ind w:firstLine="0" w:left="425" w:right="0"/>
       </w:pPr>
       <w:r>
         <w:rPr>
@@ -1786,13 +2541,18 @@
           <w:i w:val="0"/>
           <w:sz w:val="22"/>
         </w:rPr>
-        <w:t>3.3 Поток real-time события ................................................. 15</w:t>
-      </w:r>
-    </w:p>
-    <w:p>
-      <w:pPr>
+        <w:t>3.3 Поток real-time события</w:t>
+        <w:tab/>
+        <w:t>14</w:t>
+      </w:r>
+    </w:p>
+    <w:p>
+      <w:pPr>
+        <w:tabs>
+          <w:tab w:pos="9071" w:val="center"/>
+        </w:tabs>
         <w:spacing w:line="240" w:lineRule="auto" w:after="0"/>
-        <w:ind w:firstLine="0" w:left="425"/>
+        <w:ind w:firstLine="0" w:left="425" w:right="0"/>
       </w:pPr>
       <w:r>
         <w:rPr>
@@ -1801,13 +2561,18 @@
           <w:i w:val="0"/>
           <w:sz w:val="22"/>
         </w:rPr>
-        <w:t>3.4 Модель групп и повторной подписки ....................................... 16</w:t>
-      </w:r>
-    </w:p>
-    <w:p>
-      <w:pPr>
+        <w:t>3.4 Модель групп и повторной подписки</w:t>
+        <w:tab/>
+        <w:t>15</w:t>
+      </w:r>
+    </w:p>
+    <w:p>
+      <w:pPr>
+        <w:tabs>
+          <w:tab w:pos="9071" w:val="center"/>
+        </w:tabs>
         <w:spacing w:line="240" w:lineRule="auto" w:after="0"/>
-        <w:ind w:firstLine="0" w:left="425"/>
+        <w:ind w:firstLine="0" w:left="425" w:right="0"/>
       </w:pPr>
       <w:r>
         <w:rPr>
@@ -1816,13 +2581,18 @@
           <w:i w:val="0"/>
           <w:sz w:val="22"/>
         </w:rPr>
-        <w:t>3.5 Диагностический контур .................................................. 17</w:t>
-      </w:r>
-    </w:p>
-    <w:p>
-      <w:pPr>
+        <w:t>3.5 Диагностический контур</w:t>
+        <w:tab/>
+        <w:t>16</w:t>
+      </w:r>
+    </w:p>
+    <w:p>
+      <w:pPr>
+        <w:tabs>
+          <w:tab w:pos="9071" w:val="center"/>
+        </w:tabs>
         <w:spacing w:line="240" w:lineRule="auto" w:after="0"/>
-        <w:ind w:firstLine="0" w:left="0"/>
+        <w:ind w:firstLine="0" w:left="0" w:right="0"/>
       </w:pPr>
       <w:r>
         <w:rPr>
@@ -1831,13 +2601,18 @@
           <w:i w:val="0"/>
           <w:sz w:val="22"/>
         </w:rPr>
-        <w:t>4. Выполнение индивидуального задания ............................................. 18</w:t>
-      </w:r>
-    </w:p>
-    <w:p>
-      <w:pPr>
+        <w:t>4. Выполнение индивидуального задания</w:t>
+        <w:tab/>
+        <w:t>17</w:t>
+      </w:r>
+    </w:p>
+    <w:p>
+      <w:pPr>
+        <w:tabs>
+          <w:tab w:pos="9071" w:val="center"/>
+        </w:tabs>
         <w:spacing w:line="240" w:lineRule="auto" w:after="0"/>
-        <w:ind w:firstLine="0" w:left="425"/>
+        <w:ind w:firstLine="0" w:left="425" w:right="0"/>
       </w:pPr>
       <w:r>
         <w:rPr>
@@ -1846,13 +2621,18 @@
           <w:i w:val="0"/>
           <w:sz w:val="22"/>
         </w:rPr>
-        <w:t>4.1 Организация работ ....................................................... 18</w:t>
-      </w:r>
-    </w:p>
-    <w:p>
-      <w:pPr>
+        <w:t>4.1 Организация работ</w:t>
+        <w:tab/>
+        <w:t>17</w:t>
+      </w:r>
+    </w:p>
+    <w:p>
+      <w:pPr>
+        <w:tabs>
+          <w:tab w:pos="9071" w:val="center"/>
+        </w:tabs>
         <w:spacing w:line="240" w:lineRule="auto" w:after="0"/>
-        <w:ind w:firstLine="0" w:left="425"/>
+        <w:ind w:firstLine="0" w:left="425" w:right="0"/>
       </w:pPr>
       <w:r>
         <w:rPr>
@@ -1861,13 +2641,18 @@
           <w:i w:val="0"/>
           <w:sz w:val="22"/>
         </w:rPr>
-        <w:t>4.2 Изменения backend ....................................................... 18</w:t>
-      </w:r>
-    </w:p>
-    <w:p>
-      <w:pPr>
+        <w:t>4.2 Изменения backend</w:t>
+        <w:tab/>
+        <w:t>17</w:t>
+      </w:r>
+    </w:p>
+    <w:p>
+      <w:pPr>
+        <w:tabs>
+          <w:tab w:pos="9071" w:val="center"/>
+        </w:tabs>
         <w:spacing w:line="240" w:lineRule="auto" w:after="0"/>
-        <w:ind w:firstLine="0" w:left="425"/>
+        <w:ind w:firstLine="0" w:left="425" w:right="0"/>
       </w:pPr>
       <w:r>
         <w:rPr>
@@ -1876,13 +2661,18 @@
           <w:i w:val="0"/>
           <w:sz w:val="22"/>
         </w:rPr>
-        <w:t>4.3 Проверочный клиент ...................................................... 19</w:t>
-      </w:r>
-    </w:p>
-    <w:p>
-      <w:pPr>
+        <w:t>4.3 Проверочный клиент</w:t>
+        <w:tab/>
+        <w:t>18</w:t>
+      </w:r>
+    </w:p>
+    <w:p>
+      <w:pPr>
+        <w:tabs>
+          <w:tab w:pos="9071" w:val="center"/>
+        </w:tabs>
         <w:spacing w:line="240" w:lineRule="auto" w:after="0"/>
-        <w:ind w:firstLine="0" w:left="425"/>
+        <w:ind w:firstLine="0" w:left="425" w:right="0"/>
       </w:pPr>
       <w:r>
         <w:rPr>
@@ -1891,13 +2681,18 @@
           <w:i w:val="0"/>
           <w:sz w:val="22"/>
         </w:rPr>
-        <w:t>4.4 Инфраструктурные изменения .............................................. 19</w:t>
-      </w:r>
-    </w:p>
-    <w:p>
-      <w:pPr>
+        <w:t>4.4 Инфраструктурные изменения</w:t>
+        <w:tab/>
+        <w:t>18</w:t>
+      </w:r>
+    </w:p>
+    <w:p>
+      <w:pPr>
+        <w:tabs>
+          <w:tab w:pos="9071" w:val="center"/>
+        </w:tabs>
         <w:spacing w:line="240" w:lineRule="auto" w:after="0"/>
-        <w:ind w:firstLine="0" w:left="425"/>
+        <w:ind w:firstLine="0" w:left="425" w:right="0"/>
       </w:pPr>
       <w:r>
         <w:rPr>
@@ -1906,13 +2701,18 @@
           <w:i w:val="0"/>
           <w:sz w:val="22"/>
         </w:rPr>
-        <w:t>4.5 Автоматизированный сценарий проверки .................................... 20</w:t>
-      </w:r>
-    </w:p>
-    <w:p>
-      <w:pPr>
+        <w:t>4.5 Автоматизированный сценарий проверки</w:t>
+        <w:tab/>
+        <w:t>19</w:t>
+      </w:r>
+    </w:p>
+    <w:p>
+      <w:pPr>
+        <w:tabs>
+          <w:tab w:pos="9071" w:val="center"/>
+        </w:tabs>
         <w:spacing w:line="240" w:lineRule="auto" w:after="0"/>
-        <w:ind w:firstLine="0" w:left="0"/>
+        <w:ind w:firstLine="0" w:left="0" w:right="0"/>
       </w:pPr>
       <w:r>
         <w:rPr>
@@ -1921,13 +2721,18 @@
           <w:i w:val="0"/>
           <w:sz w:val="22"/>
         </w:rPr>
-        <w:t>5. Результаты практики и оценка решения ........................................... 22</w:t>
-      </w:r>
-    </w:p>
-    <w:p>
-      <w:pPr>
+        <w:t>5. Результаты практики и оценка решения</w:t>
+        <w:tab/>
+        <w:t>21</w:t>
+      </w:r>
+    </w:p>
+    <w:p>
+      <w:pPr>
+        <w:tabs>
+          <w:tab w:pos="9071" w:val="center"/>
+        </w:tabs>
         <w:spacing w:line="240" w:lineRule="auto" w:after="0"/>
-        <w:ind w:firstLine="0" w:left="425"/>
+        <w:ind w:firstLine="0" w:left="425" w:right="0"/>
       </w:pPr>
       <w:r>
         <w:rPr>
@@ -1936,13 +2741,18 @@
           <w:i w:val="0"/>
           <w:sz w:val="22"/>
         </w:rPr>
-        <w:t>5.1 Цель и программа испытаний .............................................. 22</w:t>
-      </w:r>
-    </w:p>
-    <w:p>
-      <w:pPr>
+        <w:t>5.1 Цель и программа испытаний</w:t>
+        <w:tab/>
+        <w:t>21</w:t>
+      </w:r>
+    </w:p>
+    <w:p>
+      <w:pPr>
+        <w:tabs>
+          <w:tab w:pos="9071" w:val="center"/>
+        </w:tabs>
         <w:spacing w:line="240" w:lineRule="auto" w:after="0"/>
-        <w:ind w:firstLine="0" w:left="425"/>
+        <w:ind w:firstLine="0" w:left="425" w:right="0"/>
       </w:pPr>
       <w:r>
         <w:rPr>
@@ -1951,13 +2761,18 @@
           <w:i w:val="0"/>
           <w:sz w:val="22"/>
         </w:rPr>
-        <w:t>5.2 Стенд испытаний ......................................................... 22</w:t>
-      </w:r>
-    </w:p>
-    <w:p>
-      <w:pPr>
+        <w:t>5.2 Стенд испытаний</w:t>
+        <w:tab/>
+        <w:t>21</w:t>
+      </w:r>
+    </w:p>
+    <w:p>
+      <w:pPr>
+        <w:tabs>
+          <w:tab w:pos="9071" w:val="center"/>
+        </w:tabs>
         <w:spacing w:line="240" w:lineRule="auto" w:after="0"/>
-        <w:ind w:firstLine="0" w:left="425"/>
+        <w:ind w:firstLine="0" w:left="425" w:right="0"/>
       </w:pPr>
       <w:r>
         <w:rPr>
@@ -1966,13 +2781,18 @@
           <w:i w:val="0"/>
           <w:sz w:val="22"/>
         </w:rPr>
-        <w:t>5.3 Результат без Redis backplane ........................................... 23</w:t>
-      </w:r>
-    </w:p>
-    <w:p>
-      <w:pPr>
+        <w:t>5.3 Результат без Redis backplane</w:t>
+        <w:tab/>
+        <w:t>22</w:t>
+      </w:r>
+    </w:p>
+    <w:p>
+      <w:pPr>
+        <w:tabs>
+          <w:tab w:pos="9071" w:val="center"/>
+        </w:tabs>
         <w:spacing w:line="240" w:lineRule="auto" w:after="0"/>
-        <w:ind w:firstLine="0" w:left="425"/>
+        <w:ind w:firstLine="0" w:left="425" w:right="0"/>
       </w:pPr>
       <w:r>
         <w:rPr>
@@ -1981,13 +2801,18 @@
           <w:i w:val="0"/>
           <w:sz w:val="22"/>
         </w:rPr>
-        <w:t>5.4 Результат с Redis backplane ............................................. 23</w:t>
-      </w:r>
-    </w:p>
-    <w:p>
-      <w:pPr>
+        <w:t>5.4 Результат с Redis backplane</w:t>
+        <w:tab/>
+        <w:t>22</w:t>
+      </w:r>
+    </w:p>
+    <w:p>
+      <w:pPr>
+        <w:tabs>
+          <w:tab w:pos="9071" w:val="center"/>
+        </w:tabs>
         <w:spacing w:line="240" w:lineRule="auto" w:after="0"/>
-        <w:ind w:firstLine="0" w:left="425"/>
+        <w:ind w:firstLine="0" w:left="425" w:right="0"/>
       </w:pPr>
       <w:r>
         <w:rPr>
@@ -1996,13 +2821,18 @@
           <w:i w:val="0"/>
           <w:sz w:val="22"/>
         </w:rPr>
-        <w:t>5.5 Серийная проверка и задержка доставки ................................... 24</w:t>
-      </w:r>
-    </w:p>
-    <w:p>
-      <w:pPr>
+        <w:t>5.5 Серийная проверка и задержка доставки</w:t>
+        <w:tab/>
+        <w:t>23</w:t>
+      </w:r>
+    </w:p>
+    <w:p>
+      <w:pPr>
+        <w:tabs>
+          <w:tab w:pos="9071" w:val="center"/>
+        </w:tabs>
         <w:spacing w:line="240" w:lineRule="auto" w:after="0"/>
-        <w:ind w:firstLine="0" w:left="425"/>
+        <w:ind w:firstLine="0" w:left="425" w:right="0"/>
       </w:pPr>
       <w:r>
         <w:rPr>
@@ -2011,13 +2841,18 @@
           <w:i w:val="0"/>
           <w:sz w:val="22"/>
         </w:rPr>
-        <w:t>5.6 Проверка восстановления соединения и отказа узла ........................ 24</w:t>
-      </w:r>
-    </w:p>
-    <w:p>
-      <w:pPr>
+        <w:t>5.6 Проверка восстановления соединения и отказа узла</w:t>
+        <w:tab/>
+        <w:t>24</w:t>
+      </w:r>
+    </w:p>
+    <w:p>
+      <w:pPr>
+        <w:tabs>
+          <w:tab w:pos="9071" w:val="center"/>
+        </w:tabs>
         <w:spacing w:line="240" w:lineRule="auto" w:after="0"/>
-        <w:ind w:firstLine="0" w:left="425"/>
+        <w:ind w:firstLine="0" w:left="425" w:right="0"/>
       </w:pPr>
       <w:r>
         <w:rPr>
@@ -2026,13 +2861,18 @@
           <w:i w:val="0"/>
           <w:sz w:val="22"/>
         </w:rPr>
-        <w:t>5.7 Сравнительная таблица результатов ....................................... 26</w:t>
-      </w:r>
-    </w:p>
-    <w:p>
-      <w:pPr>
+        <w:t>5.7 Сравнительная таблица результатов</w:t>
+        <w:tab/>
+        <w:t>25</w:t>
+      </w:r>
+    </w:p>
+    <w:p>
+      <w:pPr>
+        <w:tabs>
+          <w:tab w:pos="9071" w:val="center"/>
+        </w:tabs>
         <w:spacing w:line="240" w:lineRule="auto" w:after="0"/>
-        <w:ind w:firstLine="0" w:left="425"/>
+        <w:ind w:firstLine="0" w:left="425" w:right="0"/>
       </w:pPr>
       <w:r>
         <w:rPr>
@@ -2041,13 +2881,18 @@
           <w:i w:val="0"/>
           <w:sz w:val="22"/>
         </w:rPr>
-        <w:t>5.8 Проверка входной точки стенда ........................................... 27</w:t>
-      </w:r>
-    </w:p>
-    <w:p>
-      <w:pPr>
+        <w:t>5.8 Проверка входной точки стенда</w:t>
+        <w:tab/>
+        <w:t>25</w:t>
+      </w:r>
+    </w:p>
+    <w:p>
+      <w:pPr>
+        <w:tabs>
+          <w:tab w:pos="9071" w:val="center"/>
+        </w:tabs>
         <w:spacing w:line="240" w:lineRule="auto" w:after="0"/>
-        <w:ind w:firstLine="0" w:left="425"/>
+        <w:ind w:firstLine="0" w:left="425" w:right="0"/>
       </w:pPr>
       <w:r>
         <w:rPr>
@@ -2056,13 +2901,18 @@
           <w:i w:val="0"/>
           <w:sz w:val="22"/>
         </w:rPr>
-        <w:t>5.9 Ограничения эксперимента ................................................ 27</w:t>
-      </w:r>
-    </w:p>
-    <w:p>
-      <w:pPr>
+        <w:t>5.9 Оценка достоверности результатов</w:t>
+        <w:tab/>
+        <w:t>25</w:t>
+      </w:r>
+    </w:p>
+    <w:p>
+      <w:pPr>
+        <w:tabs>
+          <w:tab w:pos="9071" w:val="center"/>
+        </w:tabs>
         <w:spacing w:line="240" w:lineRule="auto" w:after="0"/>
-        <w:ind w:firstLine="0" w:left="425"/>
+        <w:ind w:firstLine="0" w:left="425" w:right="0"/>
       </w:pPr>
       <w:r>
         <w:rPr>
@@ -2071,13 +2921,18 @@
           <w:i w:val="0"/>
           <w:sz w:val="22"/>
         </w:rPr>
-        <w:t>5.10 Вывод по испытаниям .................................................... 27</w:t>
-      </w:r>
-    </w:p>
-    <w:p>
-      <w:pPr>
+        <w:t>5.10 Вывод по испытаниям</w:t>
+        <w:tab/>
+        <w:t>26</w:t>
+      </w:r>
+    </w:p>
+    <w:p>
+      <w:pPr>
+        <w:tabs>
+          <w:tab w:pos="9071" w:val="center"/>
+        </w:tabs>
         <w:spacing w:line="240" w:lineRule="auto" w:after="0"/>
-        <w:ind w:firstLine="0" w:left="0"/>
+        <w:ind w:firstLine="0" w:left="0" w:right="0"/>
       </w:pPr>
       <w:r>
         <w:rPr>
@@ -2086,13 +2941,18 @@
           <w:i w:val="0"/>
           <w:sz w:val="22"/>
         </w:rPr>
-        <w:t>ЗАКЛЮЧЕНИЕ ........................................................................ 27</w:t>
-      </w:r>
-    </w:p>
-    <w:p>
-      <w:pPr>
+        <w:t>ЗАКЛЮЧЕНИЕ</w:t>
+        <w:tab/>
+        <w:t>26</w:t>
+      </w:r>
+    </w:p>
+    <w:p>
+      <w:pPr>
+        <w:tabs>
+          <w:tab w:pos="9071" w:val="center"/>
+        </w:tabs>
         <w:spacing w:line="240" w:lineRule="auto" w:after="0"/>
-        <w:ind w:firstLine="0" w:left="0"/>
+        <w:ind w:firstLine="0" w:left="0" w:right="0"/>
       </w:pPr>
       <w:r>
         <w:rPr>
@@ -2101,13 +2961,18 @@
           <w:i w:val="0"/>
           <w:sz w:val="22"/>
         </w:rPr>
-        <w:t>СПИСОК ИСПОЛЬЗОВАННЫХ ИСТОЧНИКОВ .................................................. 29</w:t>
-      </w:r>
-    </w:p>
-    <w:p>
-      <w:pPr>
+        <w:t>СПИСОК ИСПОЛЬЗОВАННЫХ ИСТОЧНИКОВ</w:t>
+        <w:tab/>
+        <w:t>28</w:t>
+      </w:r>
+    </w:p>
+    <w:p>
+      <w:pPr>
+        <w:tabs>
+          <w:tab w:pos="9071" w:val="center"/>
+        </w:tabs>
         <w:spacing w:line="240" w:lineRule="auto" w:after="0"/>
-        <w:ind w:firstLine="0" w:left="0"/>
+        <w:ind w:firstLine="0" w:left="0" w:right="0"/>
       </w:pPr>
       <w:r>
         <w:rPr>
@@ -2116,7 +2981,9 @@
           <w:i w:val="0"/>
           <w:sz w:val="22"/>
         </w:rPr>
-        <w:t>ПРИЛОЖЕНИЕ А ...................................................................... 31</w:t>
+        <w:t>ПРИЛОЖЕНИЕ А</w:t>
+        <w:tab/>
+        <w:t>30</w:t>
       </w:r>
     </w:p>
     <w:p>
@@ -3024,7 +3891,7 @@
           <w:i w:val="0"/>
           <w:sz w:val="28"/>
         </w:rPr>
-        <w:t>Реализовать выбранное решение в отдельной ветке проекта.</w:t>
+        <w:t>Реализовать выбранное решение в целевой системе.</w:t>
       </w:r>
     </w:p>
     <w:p>
@@ -3105,22 +3972,6 @@
           <w:sz w:val="28"/>
         </w:rPr>
         <w:t>Практическая значимость результатов практики состоит в создании прототипа масштабируемого real-time контура, который может быть использован как основа для дальнейшего развития системы отслеживания задач. Подготовленные конфигурации, диагностические средства и сценарии испытаний позволяют воспроизводимо демонстрировать переход от single-node реализации к multi-instance режиму с корректной межузловой доставкой событий.</w:t>
-      </w:r>
-    </w:p>
-    <w:p>
-      <w:pPr>
-        <w:spacing w:line="360" w:lineRule="auto"/>
-        <w:ind w:firstLine="709"/>
-        <w:jc w:val="both"/>
-      </w:pPr>
-      <w:r>
-        <w:rPr>
-          <w:rFonts w:ascii="Times New Roman" w:hAnsi="Times New Roman" w:eastAsia="Times New Roman"/>
-          <w:b w:val="0"/>
-          <w:i w:val="0"/>
-          <w:sz w:val="28"/>
-        </w:rPr>
-        <w:t>Оформление текстовой части, списка использованных источников и версии отчета по преддипломной практике выполняется с учетом требований ГОСТ 7.32-2017, ГОСТ Р 7.0.100-2018 и методических рекомендаций кафедры [11], [12], [13].</w:t>
       </w:r>
     </w:p>
     <w:p>
@@ -3387,16 +4238,15 @@
         <w:tblLook w:firstColumn="1" w:firstRow="1" w:lastColumn="0" w:lastRow="0" w:noHBand="0" w:noVBand="1" w:val="04A0"/>
       </w:tblPr>
       <w:tblGrid>
-        <w:gridCol w:w="1938"/>
-        <w:gridCol w:w="1938"/>
-        <w:gridCol w:w="1938"/>
-        <w:gridCol w:w="1938"/>
-        <w:gridCol w:w="1938"/>
+        <w:gridCol w:w="2422"/>
+        <w:gridCol w:w="2422"/>
+        <w:gridCol w:w="2422"/>
+        <w:gridCol w:w="2422"/>
       </w:tblGrid>
       <w:tr>
         <w:tc>
           <w:tcPr>
-            <w:tcW w:type="dxa" w:w="1938"/>
+            <w:tcW w:type="dxa" w:w="2422"/>
             <w:vAlign w:val="center"/>
           </w:tcPr>
           <w:p>
@@ -3418,7 +4268,7 @@
         </w:tc>
         <w:tc>
           <w:tcPr>
-            <w:tcW w:type="dxa" w:w="1938"/>
+            <w:tcW w:type="dxa" w:w="2422"/>
             <w:vAlign w:val="center"/>
           </w:tcPr>
           <w:p>
@@ -3440,7 +4290,7 @@
         </w:tc>
         <w:tc>
           <w:tcPr>
-            <w:tcW w:type="dxa" w:w="1938"/>
+            <w:tcW w:type="dxa" w:w="2422"/>
             <w:vAlign w:val="center"/>
           </w:tcPr>
           <w:p>
@@ -3462,29 +4312,7 @@
         </w:tc>
         <w:tc>
           <w:tcPr>
-            <w:tcW w:type="dxa" w:w="1938"/>
-            <w:vAlign w:val="center"/>
-          </w:tcPr>
-          <w:p>
-            <w:pPr>
-              <w:spacing w:line="240" w:lineRule="auto" w:before="0" w:after="0"/>
-              <w:ind w:firstLine="0"/>
-              <w:jc w:val="center"/>
-            </w:pPr>
-            <w:r/>
-            <w:r>
-              <w:rPr>
-                <w:rFonts w:ascii="Times New Roman" w:hAnsi="Times New Roman" w:eastAsia="Times New Roman"/>
-                <w:b/>
-                <w:sz w:val="22"/>
-              </w:rPr>
-              <w:t>Применимость для ВКР</w:t>
-            </w:r>
-          </w:p>
-        </w:tc>
-        <w:tc>
-          <w:tcPr>
-            <w:tcW w:type="dxa" w:w="1938"/>
+            <w:tcW w:type="dxa" w:w="2422"/>
             <w:vAlign w:val="center"/>
           </w:tcPr>
           <w:p>
@@ -3508,7 +4336,7 @@
       <w:tr>
         <w:tc>
           <w:tcPr>
-            <w:tcW w:type="dxa" w:w="1938"/>
+            <w:tcW w:type="dxa" w:w="2422"/>
             <w:vAlign w:val="center"/>
           </w:tcPr>
           <w:p>
@@ -3530,7 +4358,7 @@
         </w:tc>
         <w:tc>
           <w:tcPr>
-            <w:tcW w:type="dxa" w:w="1938"/>
+            <w:tcW w:type="dxa" w:w="2422"/>
             <w:vAlign w:val="center"/>
           </w:tcPr>
           <w:p>
@@ -3552,7 +4380,7 @@
         </w:tc>
         <w:tc>
           <w:tcPr>
-            <w:tcW w:type="dxa" w:w="1938"/>
+            <w:tcW w:type="dxa" w:w="2422"/>
             <w:vAlign w:val="center"/>
           </w:tcPr>
           <w:p>
@@ -3574,29 +4402,7 @@
         </w:tc>
         <w:tc>
           <w:tcPr>
-            <w:tcW w:type="dxa" w:w="1938"/>
-            <w:vAlign w:val="center"/>
-          </w:tcPr>
-          <w:p>
-            <w:pPr>
-              <w:spacing w:line="240" w:lineRule="auto" w:before="0" w:after="0"/>
-              <w:ind w:firstLine="0"/>
-              <w:jc w:val="left"/>
-            </w:pPr>
-            <w:r/>
-            <w:r>
-              <w:rPr>
-                <w:rFonts w:ascii="Times New Roman" w:hAnsi="Times New Roman" w:eastAsia="Times New Roman"/>
-                <w:b w:val="0"/>
-                <w:sz w:val="22"/>
-              </w:rPr>
-              <w:t>Подходит только как baseline</w:t>
-            </w:r>
-          </w:p>
-        </w:tc>
-        <w:tc>
-          <w:tcPr>
-            <w:tcW w:type="dxa" w:w="1938"/>
+            <w:tcW w:type="dxa" w:w="2422"/>
             <w:vAlign w:val="center"/>
           </w:tcPr>
           <w:p>
@@ -3620,7 +4426,7 @@
       <w:tr>
         <w:tc>
           <w:tcPr>
-            <w:tcW w:type="dxa" w:w="1938"/>
+            <w:tcW w:type="dxa" w:w="2422"/>
             <w:vAlign w:val="center"/>
           </w:tcPr>
           <w:p>
@@ -3642,7 +4448,7 @@
         </w:tc>
         <w:tc>
           <w:tcPr>
-            <w:tcW w:type="dxa" w:w="1938"/>
+            <w:tcW w:type="dxa" w:w="2422"/>
             <w:vAlign w:val="center"/>
           </w:tcPr>
           <w:p>
@@ -3664,7 +4470,7 @@
         </w:tc>
         <w:tc>
           <w:tcPr>
-            <w:tcW w:type="dxa" w:w="1938"/>
+            <w:tcW w:type="dxa" w:w="2422"/>
             <w:vAlign w:val="center"/>
           </w:tcPr>
           <w:p>
@@ -3686,29 +4492,7 @@
         </w:tc>
         <w:tc>
           <w:tcPr>
-            <w:tcW w:type="dxa" w:w="1938"/>
-            <w:vAlign w:val="center"/>
-          </w:tcPr>
-          <w:p>
-            <w:pPr>
-              <w:spacing w:line="240" w:lineRule="auto" w:before="0" w:after="0"/>
-              <w:ind w:firstLine="0"/>
-              <w:jc w:val="left"/>
-            </w:pPr>
-            <w:r/>
-            <w:r>
-              <w:rPr>
-                <w:rFonts w:ascii="Times New Roman" w:hAnsi="Times New Roman" w:eastAsia="Times New Roman"/>
-                <w:b w:val="0"/>
-                <w:sz w:val="22"/>
-              </w:rPr>
-              <w:t>Хорошо показывает проблему</w:t>
-            </w:r>
-          </w:p>
-        </w:tc>
-        <w:tc>
-          <w:tcPr>
-            <w:tcW w:type="dxa" w:w="1938"/>
+            <w:tcW w:type="dxa" w:w="2422"/>
             <w:vAlign w:val="center"/>
           </w:tcPr>
           <w:p>
@@ -3732,7 +4516,7 @@
       <w:tr>
         <w:tc>
           <w:tcPr>
-            <w:tcW w:type="dxa" w:w="1938"/>
+            <w:tcW w:type="dxa" w:w="2422"/>
             <w:vAlign w:val="center"/>
           </w:tcPr>
           <w:p>
@@ -3754,7 +4538,7 @@
         </w:tc>
         <w:tc>
           <w:tcPr>
-            <w:tcW w:type="dxa" w:w="1938"/>
+            <w:tcW w:type="dxa" w:w="2422"/>
             <w:vAlign w:val="center"/>
           </w:tcPr>
           <w:p>
@@ -3776,7 +4560,7 @@
         </w:tc>
         <w:tc>
           <w:tcPr>
-            <w:tcW w:type="dxa" w:w="1938"/>
+            <w:tcW w:type="dxa" w:w="2422"/>
             <w:vAlign w:val="center"/>
           </w:tcPr>
           <w:p>
@@ -3798,29 +4582,7 @@
         </w:tc>
         <w:tc>
           <w:tcPr>
-            <w:tcW w:type="dxa" w:w="1938"/>
-            <w:vAlign w:val="center"/>
-          </w:tcPr>
-          <w:p>
-            <w:pPr>
-              <w:spacing w:line="240" w:lineRule="auto" w:before="0" w:after="0"/>
-              <w:ind w:firstLine="0"/>
-              <w:jc w:val="left"/>
-            </w:pPr>
-            <w:r/>
-            <w:r>
-              <w:rPr>
-                <w:rFonts w:ascii="Times New Roman" w:hAnsi="Times New Roman" w:eastAsia="Times New Roman"/>
-                <w:b w:val="0"/>
-                <w:sz w:val="22"/>
-              </w:rPr>
-              <w:t>Может использоваться как часть инфраструктуры</w:t>
-            </w:r>
-          </w:p>
-        </w:tc>
-        <w:tc>
-          <w:tcPr>
-            <w:tcW w:type="dxa" w:w="1938"/>
+            <w:tcW w:type="dxa" w:w="2422"/>
             <w:vAlign w:val="center"/>
           </w:tcPr>
           <w:p>
@@ -3844,7 +4606,7 @@
       <w:tr>
         <w:tc>
           <w:tcPr>
-            <w:tcW w:type="dxa" w:w="1938"/>
+            <w:tcW w:type="dxa" w:w="2422"/>
             <w:vAlign w:val="center"/>
           </w:tcPr>
           <w:p>
@@ -3866,7 +4628,7 @@
         </w:tc>
         <w:tc>
           <w:tcPr>
-            <w:tcW w:type="dxa" w:w="1938"/>
+            <w:tcW w:type="dxa" w:w="2422"/>
             <w:vAlign w:val="center"/>
           </w:tcPr>
           <w:p>
@@ -3888,7 +4650,7 @@
         </w:tc>
         <w:tc>
           <w:tcPr>
-            <w:tcW w:type="dxa" w:w="1938"/>
+            <w:tcW w:type="dxa" w:w="2422"/>
             <w:vAlign w:val="center"/>
           </w:tcPr>
           <w:p>
@@ -3910,29 +4672,7 @@
         </w:tc>
         <w:tc>
           <w:tcPr>
-            <w:tcW w:type="dxa" w:w="1938"/>
-            <w:vAlign w:val="center"/>
-          </w:tcPr>
-          <w:p>
-            <w:pPr>
-              <w:spacing w:line="240" w:lineRule="auto" w:before="0" w:after="0"/>
-              <w:ind w:firstLine="0"/>
-              <w:jc w:val="left"/>
-            </w:pPr>
-            <w:r/>
-            <w:r>
-              <w:rPr>
-                <w:rFonts w:ascii="Times New Roman" w:hAnsi="Times New Roman" w:eastAsia="Times New Roman"/>
-                <w:b w:val="0"/>
-                <w:sz w:val="22"/>
-              </w:rPr>
-              <w:t>Оптимален для self-hosted стенда</w:t>
-            </w:r>
-          </w:p>
-        </w:tc>
-        <w:tc>
-          <w:tcPr>
-            <w:tcW w:type="dxa" w:w="1938"/>
+            <w:tcW w:type="dxa" w:w="2422"/>
             <w:vAlign w:val="center"/>
           </w:tcPr>
           <w:p>
@@ -3956,7 +4696,7 @@
       <w:tr>
         <w:tc>
           <w:tcPr>
-            <w:tcW w:type="dxa" w:w="1938"/>
+            <w:tcW w:type="dxa" w:w="2422"/>
             <w:vAlign w:val="center"/>
           </w:tcPr>
           <w:p>
@@ -3978,7 +4718,7 @@
         </w:tc>
         <w:tc>
           <w:tcPr>
-            <w:tcW w:type="dxa" w:w="1938"/>
+            <w:tcW w:type="dxa" w:w="2422"/>
             <w:vAlign w:val="center"/>
           </w:tcPr>
           <w:p>
@@ -4000,7 +4740,7 @@
         </w:tc>
         <w:tc>
           <w:tcPr>
-            <w:tcW w:type="dxa" w:w="1938"/>
+            <w:tcW w:type="dxa" w:w="2422"/>
             <w:vAlign w:val="center"/>
           </w:tcPr>
           <w:p>
@@ -4022,29 +4762,7 @@
         </w:tc>
         <w:tc>
           <w:tcPr>
-            <w:tcW w:type="dxa" w:w="1938"/>
-            <w:vAlign w:val="center"/>
-          </w:tcPr>
-          <w:p>
-            <w:pPr>
-              <w:spacing w:line="240" w:lineRule="auto" w:before="0" w:after="0"/>
-              <w:ind w:firstLine="0"/>
-              <w:jc w:val="left"/>
-            </w:pPr>
-            <w:r/>
-            <w:r>
-              <w:rPr>
-                <w:rFonts w:ascii="Times New Roman" w:hAnsi="Times New Roman" w:eastAsia="Times New Roman"/>
-                <w:b w:val="0"/>
-                <w:sz w:val="22"/>
-              </w:rPr>
-              <w:t>Избыточен для минимального стенда</w:t>
-            </w:r>
-          </w:p>
-        </w:tc>
-        <w:tc>
-          <w:tcPr>
-            <w:tcW w:type="dxa" w:w="1938"/>
+            <w:tcW w:type="dxa" w:w="2422"/>
             <w:vAlign w:val="center"/>
           </w:tcPr>
           <w:p>
@@ -4068,7 +4786,7 @@
       <w:tr>
         <w:tc>
           <w:tcPr>
-            <w:tcW w:type="dxa" w:w="1938"/>
+            <w:tcW w:type="dxa" w:w="2422"/>
             <w:vAlign w:val="center"/>
           </w:tcPr>
           <w:p>
@@ -4090,7 +4808,7 @@
         </w:tc>
         <w:tc>
           <w:tcPr>
-            <w:tcW w:type="dxa" w:w="1938"/>
+            <w:tcW w:type="dxa" w:w="2422"/>
             <w:vAlign w:val="center"/>
           </w:tcPr>
           <w:p>
@@ -4112,7 +4830,7 @@
         </w:tc>
         <w:tc>
           <w:tcPr>
-            <w:tcW w:type="dxa" w:w="1938"/>
+            <w:tcW w:type="dxa" w:w="2422"/>
             <w:vAlign w:val="center"/>
           </w:tcPr>
           <w:p>
@@ -4134,7 +4852,7 @@
         </w:tc>
         <w:tc>
           <w:tcPr>
-            <w:tcW w:type="dxa" w:w="1938"/>
+            <w:tcW w:type="dxa" w:w="2422"/>
             <w:vAlign w:val="center"/>
           </w:tcPr>
           <w:p>
@@ -4150,29 +4868,7 @@
                 <w:b w:val="0"/>
                 <w:sz w:val="22"/>
               </w:rPr>
-              <w:t>Полезен для сравнения</w:t>
-            </w:r>
-          </w:p>
-        </w:tc>
-        <w:tc>
-          <w:tcPr>
-            <w:tcW w:type="dxa" w:w="1938"/>
-            <w:vAlign w:val="center"/>
-          </w:tcPr>
-          <w:p>
-            <w:pPr>
-              <w:spacing w:line="240" w:lineRule="auto" w:before="0" w:after="0"/>
-              <w:ind w:firstLine="0"/>
-              <w:jc w:val="left"/>
-            </w:pPr>
-            <w:r/>
-            <w:r>
-              <w:rPr>
-                <w:rFonts w:ascii="Times New Roman" w:hAnsi="Times New Roman" w:eastAsia="Times New Roman"/>
-                <w:b w:val="0"/>
-                <w:sz w:val="22"/>
-              </w:rPr>
-              <w:t>Уменьшает демонстрируемый вклад в построение собственного серверного контура</w:t>
+              <w:t>Уменьшает контроль над self-hosted серверным контуром</w:t>
             </w:r>
           </w:p>
         </w:tc>
@@ -4191,7 +4887,7 @@
           <w:i w:val="0"/>
           <w:sz w:val="28"/>
         </w:rPr>
-        <w:t>Для цели преддипломной практики выбран подход SignalR + Redis backplane. Он соответствует self-hosted характеру стенда, не требует радикальной перестройки доменной логики и позволяет экспериментально проверить межузловую доставку событий. При этом решение остается достаточно простым, чтобы его можно было воспроизвести в учебной работе и показать на защите [4], [9].</w:t>
+        <w:t>Для выбранной цели принят подход SignalR + Redis backplane. Он соответствует self-hosted характеру стенда, не требует радикальной перестройки доменной логики и позволяет экспериментально проверить межузловую доставку событий [4], [9].</w:t>
       </w:r>
     </w:p>
     <w:p>
@@ -4252,7 +4948,7 @@
           <w:i w:val="0"/>
           <w:sz w:val="28"/>
         </w:rPr>
-        <w:t xml:space="preserve">Целевая система представляет собой веб-систему для работы с отчетами, задачами, комментариями, вложениями и связанными сущностями. В рамках преддипломной практики рассматривается не вся продуктовая инфраструктура, а минимальный контур real-time взаимодействия: прикладной backend-сервис </w:t>
+        <w:t xml:space="preserve">Целевая система представляет собой веб-систему для работы с отчетами, задачами, комментариями, вложениями и связанными сущностями. В работе рассматривается не вся продуктовая инфраструктура, а минимальный контур real-time взаимодействия: прикладной backend-сервис </w:t>
       </w:r>
       <w:r>
         <w:rPr>
@@ -4286,25 +4982,7 @@
           <w:i w:val="0"/>
           <w:sz w:val="28"/>
         </w:rPr>
-        <w:t xml:space="preserve">Работа по индивидуальному заданию ведется в отдельной ветке </w:t>
-      </w:r>
-      <w:r>
-        <w:rPr>
-          <w:rFonts w:ascii="Courier New" w:hAnsi="Courier New" w:eastAsia="Courier New"/>
-          <w:b w:val="0"/>
-          <w:i w:val="0"/>
-          <w:sz w:val="28"/>
-        </w:rPr>
-        <w:t>thesis/realtime-scaleout</w:t>
-      </w:r>
-      <w:r>
-        <w:rPr>
-          <w:rFonts w:ascii="Times New Roman" w:hAnsi="Times New Roman" w:eastAsia="Times New Roman"/>
-          <w:b w:val="0"/>
-          <w:i w:val="0"/>
-          <w:sz w:val="28"/>
-        </w:rPr>
-        <w:t>. Это позволяет реализовать и исследовать изменения без необходимости немедленного слияния с основной веткой проекта. Такой подход важен для отчета по практике: реализация является доказательной базой, но при этом не нарушает стабильность основного продукта.</w:t>
+        <w:t>В качестве целевой системы рассматривается существующая кодовая база продукта, в которой уже реализованы backend-сервис, клиентское приложение и инфраструктурные конфигурации. Для исследования выделен контур, достаточный для проверки real-time взаимодействия: SignalR-хаб, механизм групп, reverse proxy, база данных, Redis и проверочный клиент.</w:t>
       </w:r>
     </w:p>
     <w:p>
@@ -4585,22 +5263,6 @@
           <w:sz w:val="28"/>
         </w:rPr>
         <w:t>Решение должно запускаться на минимальном локальном стенде.</w:t>
-      </w:r>
-    </w:p>
-    <w:p>
-      <w:pPr>
-        <w:pStyle w:val="ListNumber"/>
-        <w:spacing w:line="360" w:lineRule="auto"/>
-        <w:ind w:left="709" w:hanging="283"/>
-      </w:pPr>
-      <w:r>
-        <w:rPr>
-          <w:rFonts w:ascii="Times New Roman" w:hAnsi="Times New Roman" w:eastAsia="Times New Roman"/>
-          <w:b w:val="0"/>
-          <w:i w:val="0"/>
-          <w:sz w:val="28"/>
-        </w:rPr>
-        <w:t>Основной сценарий проекта не должен быть сломан изменениями под ВКР.</w:t>
       </w:r>
     </w:p>
     <w:p>
@@ -5393,7 +6055,7 @@
           <w:i w:val="0"/>
           <w:sz w:val="28"/>
         </w:rPr>
-        <w:t>Поскольку membership группы является оперативным состоянием SignalR, клиент должен повторять вступление в группу после переподключения. В проверочном клиенте и клиентском real-time слое используется автоматическое восстановление соединения и повторное присоединение к группе отчета. В рамках преддипломной практики это свойство рассматривается как часть устойчивости real-time контура [5], [6].</w:t>
+        <w:t>Поскольку membership группы является оперативным состоянием SignalR, клиент должен повторять вступление в группу после переподключения. В проверочном клиенте и клиентском real-time слое используется автоматическое восстановление соединения и повторное присоединение к группе отчета. Это свойство рассматривается как часть устойчивости real-time контура [5], [6].</w:t>
       </w:r>
     </w:p>
     <w:p>
@@ -5550,25 +6212,7 @@
           <w:i w:val="0"/>
           <w:sz w:val="28"/>
         </w:rPr>
-        <w:t xml:space="preserve">Реализация выполнена в ветке </w:t>
-      </w:r>
-      <w:r>
-        <w:rPr>
-          <w:rFonts w:ascii="Courier New" w:hAnsi="Courier New" w:eastAsia="Courier New"/>
-          <w:b w:val="0"/>
-          <w:i w:val="0"/>
-          <w:sz w:val="28"/>
-        </w:rPr>
-        <w:t>thesis/realtime-scaleout</w:t>
-      </w:r>
-      <w:r>
-        <w:rPr>
-          <w:rFonts w:ascii="Times New Roman" w:hAnsi="Times New Roman" w:eastAsia="Times New Roman"/>
-          <w:b w:val="0"/>
-          <w:i w:val="0"/>
-          <w:sz w:val="28"/>
-        </w:rPr>
-        <w:t>. Выбор отдельной ветки позволяет изолировать изменения, связанные с ВКР, от основного потока разработки. Это важно, поскольку часть артефактов имеет демонстрационный и исследовательский характер: отдельный compose-стенд, диагностические методы и проверочный скрипт.</w:t>
+        <w:t>Работы по реализации были разделены на три направления: изменение backend-конфигурации SignalR, подготовка инфраструктуры multi-instance стенда и разработка проверочного клиента для фиксации результатов испытаний.</w:t>
       </w:r>
     </w:p>
     <w:p>
@@ -5696,7 +6340,7 @@
           <w:i w:val="0"/>
           <w:sz w:val="28"/>
         </w:rPr>
-        <w:t xml:space="preserve">. Значение используется для логирования и диагностики. Если переменная не задана, сервис может использовать имя машины как fallback. На стенде ВКР экземпляры получают явные значения </w:t>
+        <w:t xml:space="preserve">. Значение используется для логирования и диагностики. Если переменная не задана, сервис может использовать имя машины как fallback. На стенде экземпляры получают явные значения </w:t>
       </w:r>
       <w:r>
         <w:rPr>
@@ -5984,7 +6628,7 @@
           <w:i w:val="0"/>
           <w:sz w:val="28"/>
         </w:rPr>
-        <w:t>Такой подход делает эксперимент независимым от полноценного пользовательского интерфейса. ВКР проверяет именно серверный real-time контур и межузловую доставку событий, а не особенности конкретного экрана клиентского приложения.</w:t>
+        <w:t>Такой подход делает эксперимент независимым от полноценного пользовательского интерфейса. Проверяется именно серверный real-time контур и межузловая доставка событий, а не особенности конкретного экрана клиентского приложения.</w:t>
       </w:r>
     </w:p>
     <w:p>
@@ -6024,7 +6668,7 @@
           <w:i w:val="0"/>
           <w:sz w:val="28"/>
         </w:rPr>
-        <w:t xml:space="preserve">Для практики подготовлен отдельный compose-стенд </w:t>
+        <w:t xml:space="preserve">Для проверки подготовлен отдельный compose-стенд </w:t>
       </w:r>
       <w:r>
         <w:rPr>
@@ -9016,7 +9660,7 @@
         <w:pStyle w:val="Heading2"/>
       </w:pPr>
       <w:r>
-        <w:t>5.9 Ограничения эксперимента</w:t>
+        <w:t>5.9 Оценка достоверности результатов</w:t>
       </w:r>
     </w:p>
     <w:p>
@@ -9032,15 +9676,17 @@
           <w:i w:val="0"/>
           <w:sz w:val="28"/>
         </w:rPr>
-        <w:t>Проведенный эксперимент является минимальным доказательным стендом, а не промышленным нагрузочным тестом. Он проверяет ключевое функциональное свойство: доставку события между клиентами, подключенными к разным серверным экземплярам. В дальнейшем программу испытаний можно расширить:</w:t>
-      </w:r>
-    </w:p>
-    <w:p>
-      <w:pPr>
-        <w:pStyle w:val="ListNumber"/>
-        <w:spacing w:line="360" w:lineRule="auto"/>
-        <w:ind w:left="709" w:hanging="283"/>
-      </w:pPr>
+        <w:t xml:space="preserve">Проведенный эксперимент проверяет ключевое функциональное свойство: доставку события между клиентами, подключенными к разным серверным экземплярам. Достоверность результата обеспечивается тем, что режимы с Redis backplane и без него запускались на одном стенде, с одним и тем же кодом приложения и одним и тем же проверочным сценарием. Единственным существенным отличием между режимами было значение </w:t>
+      </w:r>
+      <w:r>
+        <w:rPr>
+          <w:rFonts w:ascii="Courier New" w:hAnsi="Courier New" w:eastAsia="Courier New"/>
+          <w:b w:val="0"/>
+          <w:i w:val="0"/>
+          <w:sz w:val="28"/>
+        </w:rPr>
+        <w:t>REDIS_CONNECTION_STRING</w:t>
+      </w:r>
       <w:r>
         <w:rPr>
           <w:rFonts w:ascii="Times New Roman" w:hAnsi="Times New Roman" w:eastAsia="Times New Roman"/>
@@ -9048,55 +9694,7 @@
           <w:i w:val="0"/>
           <w:sz w:val="28"/>
         </w:rPr>
-        <w:t>Увеличением числа одновременных клиентов и числа событий.</w:t>
-      </w:r>
-    </w:p>
-    <w:p>
-      <w:pPr>
-        <w:pStyle w:val="ListNumber"/>
-        <w:spacing w:line="360" w:lineRule="auto"/>
-        <w:ind w:left="709" w:hanging="283"/>
-      </w:pPr>
-      <w:r>
-        <w:rPr>
-          <w:rFonts w:ascii="Times New Roman" w:hAnsi="Times New Roman" w:eastAsia="Times New Roman"/>
-          <w:b w:val="0"/>
-          <w:i w:val="0"/>
-          <w:sz w:val="28"/>
-        </w:rPr>
-        <w:t>Сравнением поведения при разных стратегиях балансировки.</w:t>
-      </w:r>
-    </w:p>
-    <w:p>
-      <w:pPr>
-        <w:pStyle w:val="ListNumber"/>
-        <w:spacing w:line="360" w:lineRule="auto"/>
-        <w:ind w:left="709" w:hanging="283"/>
-      </w:pPr>
-      <w:r>
-        <w:rPr>
-          <w:rFonts w:ascii="Times New Roman" w:hAnsi="Times New Roman" w:eastAsia="Times New Roman"/>
-          <w:b w:val="0"/>
-          <w:i w:val="0"/>
-          <w:sz w:val="28"/>
-        </w:rPr>
-        <w:t>Сбором p99 и распределения задержек на более длинной серии запусков с учетом того, что задержка влияет на качество real-time совместной работы [20].</w:t>
-      </w:r>
-    </w:p>
-    <w:p>
-      <w:pPr>
-        <w:pStyle w:val="ListNumber"/>
-        <w:spacing w:line="360" w:lineRule="auto"/>
-        <w:ind w:left="709" w:hanging="283"/>
-      </w:pPr>
-      <w:r>
-        <w:rPr>
-          <w:rFonts w:ascii="Times New Roman" w:hAnsi="Times New Roman" w:eastAsia="Times New Roman"/>
-          <w:b w:val="0"/>
-          <w:i w:val="0"/>
-          <w:sz w:val="28"/>
-        </w:rPr>
-        <w:t>Проверкой поведения при длительной недоступности Redis.</w:t>
+        <w:t>.</w:t>
       </w:r>
     </w:p>
     <w:p>
@@ -9112,7 +9710,7 @@
           <w:i w:val="0"/>
           <w:sz w:val="28"/>
         </w:rPr>
-        <w:t>Для текущей цели ВКР уже получен главный результат: режим без backplane воспроизводит проблему, а режим с Redis backplane устраняет ее на том же стенде [3], [4].</w:t>
+        <w:t>Сопоставление двух режимов показывает причинную связь между включением межузлового канала SignalR и успешной доставкой события на другой backend-экземпляр. Дополнительные сценарии rejoin и failover подтверждают, что контур сохраняет работоспособность не только при штатной доставке события, но и после восстановления клиентского подключения.</w:t>
       </w:r>
     </w:p>
     <w:p>
@@ -9231,7 +9829,7 @@
           <w:i w:val="0"/>
           <w:sz w:val="28"/>
         </w:rPr>
-        <w:t>, nginx как reverse proxy и Redis backplane для межузловой доставки SignalR-событий. При выполнении индивидуального задания в отдельной ветке проекта реализована поддержка конфигурируемого Redis backplane, добавлены идентификаторы серверных экземпляров, диагностический метод хаба, логирование real-time событий, проверочный клиент и воспроизводимый Docker Compose стенд [4], [8], [10], [14].</w:t>
+        <w:t>, nginx как reverse proxy и Redis backplane для межузловой доставки SignalR-событий. В целевой системе реализована поддержка конфигурируемого Redis backplane, добавлены идентификаторы серверных экземпляров, диагностический метод хаба, логирование real-time событий, проверочный клиент и воспроизводимый Docker Compose стенд [4], [8], [10], [14].</w:t>
       </w:r>
     </w:p>
     <w:p>
@@ -9299,7 +9897,7 @@
           <w:i w:val="0"/>
           <w:sz w:val="28"/>
         </w:rPr>
-        <w:t>Полученные в ходе практики результаты имеют практическую значимость для дальнейшего развития системы отслеживания задач, поскольку предложенное решение позволяет перейти от локального real-time механизма к масштабируемому контуру совместной работы над сущностями. В дальнейшем решение может быть расширено дополнительной трассировкой событий, более длинной серией измерений задержек, проверкой на большем числе одновременных клиентов и анализом поведения при недоступности Redis [8], [19].</w:t>
+        <w:t>Полученные в ходе практики результаты имеют практическую значимость для дальнейшего развития системы отслеживания задач, поскольку предложенное решение позволяет перейти от локального real-time механизма к масштабируемому контуру совместной работы над сущностями. Кроме масштабирования, решение повышает отказоустойчивость приложения: при наличии нескольких backend-экземпляров и повторного вступления клиента в группы система может продолжить доставку событий после потери одного узла, тогда как single-node архитектура такой возможности не предоставляет.</w:t>
       </w:r>
     </w:p>
     <w:p>
@@ -9663,7 +10261,7 @@
           <w:i w:val="0"/>
           <w:sz w:val="28"/>
         </w:rPr>
-        <w:t>Фрагменты конфигурации стенда и результаты испытаний</w:t>
+        <w:t>Конфигурация стенда</w:t>
       </w:r>
     </w:p>
     <w:p>
@@ -9679,7 +10277,215 @@
           <w:i w:val="0"/>
           <w:sz w:val="28"/>
         </w:rPr>
-        <w:t>Приложение относится к доказательной базе выполнения индивидуального задания по производственной преддипломной практике.</w:t>
+        <w:t>Ниже приведены ключевые элементы стенда, подтверждающие выполнение индивидуального задания: запуск двух экземпляров backend-сервиса, подключение Redis backplane и режим воспроизведения исходного ограничения без межузловой доставки.</w:t>
+      </w:r>
+    </w:p>
+    <w:p>
+      <w:pPr>
+        <w:spacing w:line="240" w:lineRule="auto"/>
+        <w:ind w:firstLine="0" w:left="709"/>
+      </w:pPr>
+      <w:r>
+        <w:rPr>
+          <w:rFonts w:ascii="Courier New" w:hAnsi="Courier New" w:eastAsia="Courier New"/>
+          <w:b w:val="0"/>
+          <w:i w:val="0"/>
+          <w:sz w:val="20"/>
+        </w:rPr>
+        <w:t>app-api-1:</w:t>
+      </w:r>
+    </w:p>
+    <w:p>
+      <w:pPr>
+        <w:spacing w:line="240" w:lineRule="auto"/>
+        <w:ind w:firstLine="0" w:left="709"/>
+      </w:pPr>
+      <w:r>
+        <w:rPr>
+          <w:rFonts w:ascii="Courier New" w:hAnsi="Courier New" w:eastAsia="Courier New"/>
+          <w:b w:val="0"/>
+          <w:i w:val="0"/>
+          <w:sz w:val="20"/>
+        </w:rPr>
+        <w:t xml:space="preserve">  environment:</w:t>
+      </w:r>
+    </w:p>
+    <w:p>
+      <w:pPr>
+        <w:spacing w:line="240" w:lineRule="auto"/>
+        <w:ind w:firstLine="0" w:left="709"/>
+      </w:pPr>
+      <w:r>
+        <w:rPr>
+          <w:rFonts w:ascii="Courier New" w:hAnsi="Courier New" w:eastAsia="Courier New"/>
+          <w:b w:val="0"/>
+          <w:i w:val="0"/>
+          <w:sz w:val="20"/>
+        </w:rPr>
+        <w:t xml:space="preserve">    REDIS_CONNECTION_STRING: redis:6379</w:t>
+      </w:r>
+    </w:p>
+    <w:p>
+      <w:pPr>
+        <w:spacing w:line="240" w:lineRule="auto"/>
+        <w:ind w:firstLine="0" w:left="709"/>
+      </w:pPr>
+      <w:r>
+        <w:rPr>
+          <w:rFonts w:ascii="Courier New" w:hAnsi="Courier New" w:eastAsia="Courier New"/>
+          <w:b w:val="0"/>
+          <w:i w:val="0"/>
+          <w:sz w:val="20"/>
+        </w:rPr>
+        <w:t xml:space="preserve">    SERVER_INSTANCE_ID: app-api-1</w:t>
+      </w:r>
+    </w:p>
+    <w:p>
+      <w:pPr>
+        <w:spacing w:line="240" w:lineRule="auto"/>
+        <w:ind w:firstLine="0" w:left="709"/>
+      </w:pPr>
+      <w:r>
+        <w:rPr>
+          <w:rFonts w:ascii="Courier New" w:hAnsi="Courier New" w:eastAsia="Courier New"/>
+          <w:b w:val="0"/>
+          <w:i w:val="0"/>
+          <w:sz w:val="20"/>
+        </w:rPr>
+      </w:r>
+    </w:p>
+    <w:p>
+      <w:pPr>
+        <w:spacing w:line="240" w:lineRule="auto"/>
+        <w:ind w:firstLine="0" w:left="709"/>
+      </w:pPr>
+      <w:r>
+        <w:rPr>
+          <w:rFonts w:ascii="Courier New" w:hAnsi="Courier New" w:eastAsia="Courier New"/>
+          <w:b w:val="0"/>
+          <w:i w:val="0"/>
+          <w:sz w:val="20"/>
+        </w:rPr>
+        <w:t>app-api-2:</w:t>
+      </w:r>
+    </w:p>
+    <w:p>
+      <w:pPr>
+        <w:spacing w:line="240" w:lineRule="auto"/>
+        <w:ind w:firstLine="0" w:left="709"/>
+      </w:pPr>
+      <w:r>
+        <w:rPr>
+          <w:rFonts w:ascii="Courier New" w:hAnsi="Courier New" w:eastAsia="Courier New"/>
+          <w:b w:val="0"/>
+          <w:i w:val="0"/>
+          <w:sz w:val="20"/>
+        </w:rPr>
+        <w:t xml:space="preserve">  environment:</w:t>
+      </w:r>
+    </w:p>
+    <w:p>
+      <w:pPr>
+        <w:spacing w:line="240" w:lineRule="auto"/>
+        <w:ind w:firstLine="0" w:left="709"/>
+      </w:pPr>
+      <w:r>
+        <w:rPr>
+          <w:rFonts w:ascii="Courier New" w:hAnsi="Courier New" w:eastAsia="Courier New"/>
+          <w:b w:val="0"/>
+          <w:i w:val="0"/>
+          <w:sz w:val="20"/>
+        </w:rPr>
+        <w:t xml:space="preserve">    REDIS_CONNECTION_STRING: redis:6379</w:t>
+      </w:r>
+    </w:p>
+    <w:p>
+      <w:pPr>
+        <w:spacing w:line="240" w:lineRule="auto"/>
+        <w:ind w:firstLine="0" w:left="709"/>
+      </w:pPr>
+      <w:r>
+        <w:rPr>
+          <w:rFonts w:ascii="Courier New" w:hAnsi="Courier New" w:eastAsia="Courier New"/>
+          <w:b w:val="0"/>
+          <w:i w:val="0"/>
+          <w:sz w:val="20"/>
+        </w:rPr>
+        <w:t xml:space="preserve">    SERVER_INSTANCE_ID: app-api-2</w:t>
+      </w:r>
+    </w:p>
+    <w:p>
+      <w:pPr>
+        <w:spacing w:line="240" w:lineRule="auto"/>
+        <w:ind w:firstLine="0" w:left="709"/>
+      </w:pPr>
+      <w:r>
+        <w:rPr>
+          <w:rFonts w:ascii="Courier New" w:hAnsi="Courier New" w:eastAsia="Courier New"/>
+          <w:b w:val="0"/>
+          <w:i w:val="0"/>
+          <w:sz w:val="20"/>
+        </w:rPr>
+      </w:r>
+    </w:p>
+    <w:p>
+      <w:pPr>
+        <w:spacing w:line="240" w:lineRule="auto"/>
+        <w:ind w:firstLine="0" w:left="709"/>
+      </w:pPr>
+      <w:r>
+        <w:rPr>
+          <w:rFonts w:ascii="Courier New" w:hAnsi="Courier New" w:eastAsia="Courier New"/>
+          <w:b w:val="0"/>
+          <w:i w:val="0"/>
+          <w:sz w:val="20"/>
+        </w:rPr>
+        <w:t>upstream app-api {</w:t>
+      </w:r>
+    </w:p>
+    <w:p>
+      <w:pPr>
+        <w:spacing w:line="240" w:lineRule="auto"/>
+        <w:ind w:firstLine="0" w:left="709"/>
+      </w:pPr>
+      <w:r>
+        <w:rPr>
+          <w:rFonts w:ascii="Courier New" w:hAnsi="Courier New" w:eastAsia="Courier New"/>
+          <w:b w:val="0"/>
+          <w:i w:val="0"/>
+          <w:sz w:val="20"/>
+        </w:rPr>
+        <w:t xml:space="preserve">    server app-api-1:7777;</w:t>
+      </w:r>
+    </w:p>
+    <w:p>
+      <w:pPr>
+        <w:spacing w:line="240" w:lineRule="auto"/>
+        <w:ind w:firstLine="0" w:left="709"/>
+      </w:pPr>
+      <w:r>
+        <w:rPr>
+          <w:rFonts w:ascii="Courier New" w:hAnsi="Courier New" w:eastAsia="Courier New"/>
+          <w:b w:val="0"/>
+          <w:i w:val="0"/>
+          <w:sz w:val="20"/>
+        </w:rPr>
+        <w:t xml:space="preserve">    server app-api-2:7777;</w:t>
+      </w:r>
+    </w:p>
+    <w:p>
+      <w:pPr>
+        <w:spacing w:line="240" w:lineRule="auto"/>
+        <w:ind w:firstLine="0" w:left="709"/>
+      </w:pPr>
+      <w:r>
+        <w:rPr>
+          <w:rFonts w:ascii="Courier New" w:hAnsi="Courier New" w:eastAsia="Courier New"/>
+          <w:b w:val="0"/>
+          <w:i w:val="0"/>
+          <w:sz w:val="20"/>
+        </w:rPr>
+        <w:t>}</w:t>
       </w:r>
     </w:p>
     <w:p>
@@ -9695,7 +10501,7 @@
           <w:i w:val="0"/>
           <w:sz w:val="28"/>
         </w:rPr>
-        <w:t xml:space="preserve">В приложении должны быть приведены фрагменты </w:t>
+        <w:t xml:space="preserve">Для режима без backplane используется тот же стенд, но переменная </w:t>
       </w:r>
       <w:r>
         <w:rPr>
@@ -9704,7 +10510,7 @@
           <w:i w:val="0"/>
           <w:sz w:val="28"/>
         </w:rPr>
-        <w:t>docker-compose.thesis.yml</w:t>
+        <w:t>REDIS_CONNECTION_STRING</w:t>
       </w:r>
       <w:r>
         <w:rPr>
@@ -9713,7 +10519,7 @@
           <w:i w:val="0"/>
           <w:sz w:val="28"/>
         </w:rPr>
-        <w:t xml:space="preserve">, </w:t>
+        <w:t xml:space="preserve"> задается пустой строкой для обоих экземпляров </w:t>
       </w:r>
       <w:r>
         <w:rPr>
@@ -9722,7 +10528,7 @@
           <w:i w:val="0"/>
           <w:sz w:val="28"/>
         </w:rPr>
-        <w:t>docker-compose.thesis.no-backplane.yml</w:t>
+        <w:t>app-api</w:t>
       </w:r>
       <w:r>
         <w:rPr>
@@ -9731,77 +10537,230 @@
           <w:i w:val="0"/>
           <w:sz w:val="28"/>
         </w:rPr>
-        <w:t xml:space="preserve">, </w:t>
-      </w:r>
+        <w:t>.</w:t>
+      </w:r>
+    </w:p>
+    <w:p>
+      <w:pPr>
+        <w:spacing w:line="240" w:lineRule="auto"/>
+        <w:ind w:firstLine="0" w:left="709"/>
+      </w:pPr>
       <w:r>
         <w:rPr>
           <w:rFonts w:ascii="Courier New" w:hAnsi="Courier New" w:eastAsia="Courier New"/>
           <w:b w:val="0"/>
           <w:i w:val="0"/>
-          <w:sz w:val="28"/>
-        </w:rPr>
-        <w:t>upstreams.thesis.conf</w:t>
-      </w:r>
-      <w:r>
-        <w:rPr>
-          <w:rFonts w:ascii="Times New Roman" w:hAnsi="Times New Roman" w:eastAsia="Times New Roman"/>
-          <w:b w:val="0"/>
-          <w:i w:val="0"/>
-          <w:sz w:val="28"/>
-        </w:rPr>
-        <w:t xml:space="preserve">, настройки SignalR с </w:t>
-      </w:r>
+          <w:sz w:val="20"/>
+        </w:rPr>
+        <w:t>Multi-instance без backplane:</w:t>
+      </w:r>
+    </w:p>
+    <w:p>
+      <w:pPr>
+        <w:spacing w:line="240" w:lineRule="auto"/>
+        <w:ind w:firstLine="0" w:left="709"/>
+      </w:pPr>
       <w:r>
         <w:rPr>
           <w:rFonts w:ascii="Courier New" w:hAnsi="Courier New" w:eastAsia="Courier New"/>
           <w:b w:val="0"/>
           <w:i w:val="0"/>
-          <w:sz w:val="28"/>
-        </w:rPr>
-        <w:t>AddStackExchangeRedis</w:t>
-      </w:r>
-      <w:r>
-        <w:rPr>
-          <w:rFonts w:ascii="Times New Roman" w:hAnsi="Times New Roman" w:eastAsia="Times New Roman"/>
-          <w:b w:val="0"/>
-          <w:i w:val="0"/>
-          <w:sz w:val="28"/>
-        </w:rPr>
-        <w:t xml:space="preserve">, диагностического метода </w:t>
-      </w:r>
+          <w:sz w:val="20"/>
+        </w:rPr>
+        <w:t xml:space="preserve">  Error: ReceiveReportPatch timed out after 10000ms</w:t>
+      </w:r>
+    </w:p>
+    <w:p>
+      <w:pPr>
+        <w:spacing w:line="240" w:lineRule="auto"/>
+        <w:ind w:firstLine="0" w:left="709"/>
+      </w:pPr>
       <w:r>
         <w:rPr>
           <w:rFonts w:ascii="Courier New" w:hAnsi="Courier New" w:eastAsia="Courier New"/>
           <w:b w:val="0"/>
           <w:i w:val="0"/>
-          <w:sz w:val="28"/>
-        </w:rPr>
-        <w:t>GetConnectionDiagnosticsAsync</w:t>
-      </w:r>
-      <w:r>
-        <w:rPr>
-          <w:rFonts w:ascii="Times New Roman" w:hAnsi="Times New Roman" w:eastAsia="Times New Roman"/>
-          <w:b w:val="0"/>
-          <w:i w:val="0"/>
-          <w:sz w:val="28"/>
-        </w:rPr>
-        <w:t>, минимального проверочного клиента, а также выводы автоматизированного сценария проверки.</w:t>
-      </w:r>
-    </w:p>
-    <w:p>
-      <w:pPr>
-        <w:spacing w:line="360" w:lineRule="auto"/>
-        <w:ind w:firstLine="709"/>
-        <w:jc w:val="both"/>
-      </w:pPr>
-      <w:r>
-        <w:rPr>
-          <w:rFonts w:ascii="Times New Roman" w:hAnsi="Times New Roman" w:eastAsia="Times New Roman"/>
-          <w:b w:val="0"/>
-          <w:i w:val="0"/>
-          <w:sz w:val="28"/>
-        </w:rPr>
-        <w:t>На текущем этапе приложения оставлены как структурная заготовка. Полные листинги целесообразно добавить после согласования объема основного текста.</w:t>
+          <w:sz w:val="20"/>
+        </w:rPr>
+      </w:r>
+    </w:p>
+    <w:p>
+      <w:pPr>
+        <w:spacing w:line="240" w:lineRule="auto"/>
+        <w:ind w:firstLine="0" w:left="709"/>
+      </w:pPr>
+      <w:r>
+        <w:rPr>
+          <w:rFonts w:ascii="Courier New" w:hAnsi="Courier New" w:eastAsia="Courier New"/>
+          <w:b w:val="0"/>
+          <w:i w:val="0"/>
+          <w:sz w:val="20"/>
+        </w:rPr>
+        <w:t>Multi-instance с Redis backplane:</w:t>
+      </w:r>
+    </w:p>
+    <w:p>
+      <w:pPr>
+        <w:spacing w:line="240" w:lineRule="auto"/>
+        <w:ind w:firstLine="0" w:left="709"/>
+      </w:pPr>
+      <w:r>
+        <w:rPr>
+          <w:rFonts w:ascii="Courier New" w:hAnsi="Courier New" w:eastAsia="Courier New"/>
+          <w:b w:val="0"/>
+          <w:i w:val="0"/>
+          <w:sz w:val="20"/>
+        </w:rPr>
+        <w:t xml:space="preserve">  ok: true</w:t>
+      </w:r>
+    </w:p>
+    <w:p>
+      <w:pPr>
+        <w:spacing w:line="240" w:lineRule="auto"/>
+        <w:ind w:firstLine="0" w:left="709"/>
+      </w:pPr>
+      <w:r>
+        <w:rPr>
+          <w:rFonts w:ascii="Courier New" w:hAnsi="Courier New" w:eastAsia="Courier New"/>
+          <w:b w:val="0"/>
+          <w:i w:val="0"/>
+          <w:sz w:val="20"/>
+        </w:rPr>
+        <w:t xml:space="preserve">  nodeA.serverInstanceId: app-api-1</w:t>
+      </w:r>
+    </w:p>
+    <w:p>
+      <w:pPr>
+        <w:spacing w:line="240" w:lineRule="auto"/>
+        <w:ind w:firstLine="0" w:left="709"/>
+      </w:pPr>
+      <w:r>
+        <w:rPr>
+          <w:rFonts w:ascii="Courier New" w:hAnsi="Courier New" w:eastAsia="Courier New"/>
+          <w:b w:val="0"/>
+          <w:i w:val="0"/>
+          <w:sz w:val="20"/>
+        </w:rPr>
+        <w:t xml:space="preserve">  nodeB.serverInstanceId: app-api-2</w:t>
+      </w:r>
+    </w:p>
+    <w:p>
+      <w:pPr>
+        <w:spacing w:line="240" w:lineRule="auto"/>
+        <w:ind w:firstLine="0" w:left="709"/>
+      </w:pPr>
+      <w:r>
+        <w:rPr>
+          <w:rFonts w:ascii="Courier New" w:hAnsi="Courier New" w:eastAsia="Courier New"/>
+          <w:b w:val="0"/>
+          <w:i w:val="0"/>
+          <w:sz w:val="20"/>
+        </w:rPr>
+        <w:t xml:space="preserve">  deliveryLatencyMs: 9.5</w:t>
+      </w:r>
+    </w:p>
+    <w:p>
+      <w:pPr>
+        <w:spacing w:line="240" w:lineRule="auto"/>
+        <w:ind w:firstLine="0" w:left="709"/>
+      </w:pPr>
+      <w:r>
+        <w:rPr>
+          <w:rFonts w:ascii="Courier New" w:hAnsi="Courier New" w:eastAsia="Courier New"/>
+          <w:b w:val="0"/>
+          <w:i w:val="0"/>
+          <w:sz w:val="20"/>
+        </w:rPr>
+      </w:r>
+    </w:p>
+    <w:p>
+      <w:pPr>
+        <w:spacing w:line="240" w:lineRule="auto"/>
+        <w:ind w:firstLine="0" w:left="709"/>
+      </w:pPr>
+      <w:r>
+        <w:rPr>
+          <w:rFonts w:ascii="Courier New" w:hAnsi="Courier New" w:eastAsia="Courier New"/>
+          <w:b w:val="0"/>
+          <w:i w:val="0"/>
+          <w:sz w:val="20"/>
+        </w:rPr>
+        <w:t>Серийная проверка:</w:t>
+      </w:r>
+    </w:p>
+    <w:p>
+      <w:pPr>
+        <w:spacing w:line="240" w:lineRule="auto"/>
+        <w:ind w:firstLine="0" w:left="709"/>
+      </w:pPr>
+      <w:r>
+        <w:rPr>
+          <w:rFonts w:ascii="Courier New" w:hAnsi="Courier New" w:eastAsia="Courier New"/>
+          <w:b w:val="0"/>
+          <w:i w:val="0"/>
+          <w:sz w:val="20"/>
+        </w:rPr>
+        <w:t xml:space="preserve">  iterations: 5</w:t>
+      </w:r>
+    </w:p>
+    <w:p>
+      <w:pPr>
+        <w:spacing w:line="240" w:lineRule="auto"/>
+        <w:ind w:firstLine="0" w:left="709"/>
+      </w:pPr>
+      <w:r>
+        <w:rPr>
+          <w:rFonts w:ascii="Courier New" w:hAnsi="Courier New" w:eastAsia="Courier New"/>
+          <w:b w:val="0"/>
+          <w:i w:val="0"/>
+          <w:sz w:val="20"/>
+        </w:rPr>
+        <w:t xml:space="preserve">  successful: 5</w:t>
+      </w:r>
+    </w:p>
+    <w:p>
+      <w:pPr>
+        <w:spacing w:line="240" w:lineRule="auto"/>
+        <w:ind w:firstLine="0" w:left="709"/>
+      </w:pPr>
+      <w:r>
+        <w:rPr>
+          <w:rFonts w:ascii="Courier New" w:hAnsi="Courier New" w:eastAsia="Courier New"/>
+          <w:b w:val="0"/>
+          <w:i w:val="0"/>
+          <w:sz w:val="20"/>
+        </w:rPr>
+        <w:t xml:space="preserve">  failed: 0</w:t>
+      </w:r>
+    </w:p>
+    <w:p>
+      <w:pPr>
+        <w:spacing w:line="240" w:lineRule="auto"/>
+        <w:ind w:firstLine="0" w:left="709"/>
+      </w:pPr>
+      <w:r>
+        <w:rPr>
+          <w:rFonts w:ascii="Courier New" w:hAnsi="Courier New" w:eastAsia="Courier New"/>
+          <w:b w:val="0"/>
+          <w:i w:val="0"/>
+          <w:sz w:val="20"/>
+        </w:rPr>
+        <w:t xml:space="preserve">  avg: 8.4 ms</w:t>
+      </w:r>
+    </w:p>
+    <w:p>
+      <w:pPr>
+        <w:spacing w:line="240" w:lineRule="auto"/>
+        <w:ind w:firstLine="0" w:left="709"/>
+      </w:pPr>
+      <w:r>
+        <w:rPr>
+          <w:rFonts w:ascii="Courier New" w:hAnsi="Courier New" w:eastAsia="Courier New"/>
+          <w:b w:val="0"/>
+          <w:i w:val="0"/>
+          <w:sz w:val="20"/>
+        </w:rPr>
+        <w:t xml:space="preserve">  p95: 11.6 ms</w:t>
       </w:r>
     </w:p>
     <w:sectPr>

</xml_diff>

<commit_message>
Update DOCX and PPTX files for final qualifying work, including revisions to practice and defense reports, enhancements to figures and tables, and new scripts for generating presentations. Refine content in Markdown files and ensure compliance with formatting standards.
</commit_message>
<xml_diff>
--- a/build/docx/practice-report-draft-1.docx
+++ b/build/docx/practice-report-draft-1.docx
@@ -124,6 +124,7 @@
               <w:rPr>
                 <w:rFonts w:ascii="Times New Roman" w:hAnsi="Times New Roman" w:eastAsia="Times New Roman"/>
                 <w:b/>
+                <w:i w:val="0"/>
                 <w:sz w:val="22"/>
               </w:rPr>
               <w:t>ОТЧЕТ ПО ПРАКТИКЕ</w:t>
@@ -160,6 +161,7 @@
               <w:rPr>
                 <w:rFonts w:ascii="Times New Roman" w:hAnsi="Times New Roman" w:eastAsia="Times New Roman"/>
                 <w:b w:val="0"/>
+                <w:i w:val="0"/>
                 <w:sz w:val="22"/>
               </w:rPr>
               <w:t>ЗАЩИЩЕН С ОЦЕНКОЙ</w:t>
@@ -218,6 +220,7 @@
               <w:rPr>
                 <w:rFonts w:ascii="Times New Roman" w:hAnsi="Times New Roman" w:eastAsia="Times New Roman"/>
                 <w:b w:val="0"/>
+                <w:i w:val="0"/>
                 <w:sz w:val="20"/>
               </w:rPr>
               <w:t>Руководитель</w:t>
@@ -254,6 +257,7 @@
               <w:rPr>
                 <w:rFonts w:ascii="Times New Roman" w:hAnsi="Times New Roman" w:eastAsia="Times New Roman"/>
                 <w:b w:val="0"/>
+                <w:i w:val="0"/>
                 <w:sz w:val="20"/>
               </w:rPr>
               <w:t>____________________</w:t>
@@ -290,6 +294,7 @@
               <w:rPr>
                 <w:rFonts w:ascii="Times New Roman" w:hAnsi="Times New Roman" w:eastAsia="Times New Roman"/>
                 <w:b w:val="0"/>
+                <w:i w:val="0"/>
                 <w:sz w:val="20"/>
               </w:rPr>
               <w:t>С.А. Рогачев</w:t>
@@ -328,6 +333,7 @@
               <w:rPr>
                 <w:rFonts w:ascii="Times New Roman" w:hAnsi="Times New Roman" w:eastAsia="Times New Roman"/>
                 <w:b w:val="0"/>
+                <w:i w:val="0"/>
                 <w:sz w:val="14"/>
               </w:rPr>
               <w:t>ст. преподаватель</w:t>
@@ -364,6 +370,7 @@
               <w:rPr>
                 <w:rFonts w:ascii="Times New Roman" w:hAnsi="Times New Roman" w:eastAsia="Times New Roman"/>
                 <w:b w:val="0"/>
+                <w:i w:val="0"/>
                 <w:sz w:val="14"/>
               </w:rPr>
               <w:t>подпись, дата</w:t>
@@ -400,6 +407,7 @@
               <w:rPr>
                 <w:rFonts w:ascii="Times New Roman" w:hAnsi="Times New Roman" w:eastAsia="Times New Roman"/>
                 <w:b w:val="0"/>
+                <w:i w:val="0"/>
                 <w:sz w:val="14"/>
               </w:rPr>
               <w:t>инициалы, фамилия</w:t>
@@ -471,6 +479,7 @@
               <w:rPr>
                 <w:rFonts w:ascii="Times New Roman" w:hAnsi="Times New Roman" w:eastAsia="Times New Roman"/>
                 <w:b w:val="0"/>
+                <w:i w:val="0"/>
                 <w:sz w:val="20"/>
               </w:rPr>
               <w:t>вид практики</w:t>
@@ -507,6 +516,7 @@
               <w:rPr>
                 <w:rFonts w:ascii="Times New Roman" w:hAnsi="Times New Roman" w:eastAsia="Times New Roman"/>
                 <w:b w:val="0"/>
+                <w:i w:val="0"/>
                 <w:sz w:val="20"/>
               </w:rPr>
               <w:t>производственная</w:t>
@@ -539,13 +549,101 @@
               <w:jc w:val="center"/>
             </w:pPr>
             <w:r/>
+          </w:p>
+        </w:tc>
+      </w:tr>
+      <w:tr>
+        <w:tc>
+          <w:tcPr>
+            <w:tcW w:type="dxa" w:w="2948"/>
+            <w:tcBorders>
+              <w:top w:val="nil"/>
+              <w:left w:val="nil"/>
+              <w:bottom w:val="nil"/>
+              <w:right w:val="nil"/>
+              <w:insideH w:val="nil"/>
+              <w:insideV w:val="nil"/>
+            </w:tcBorders>
+            <w:tcMar>
+              <w:top w:w="0" w:type="dxa"/>
+              <w:left w:w="0" w:type="dxa"/>
+              <w:bottom w:w="0" w:type="dxa"/>
+              <w:right w:w="0" w:type="dxa"/>
+            </w:tcMar>
+            <w:vAlign w:val="center"/>
+          </w:tcPr>
+          <w:p>
+            <w:pPr>
+              <w:spacing w:line="240" w:lineRule="auto" w:before="0" w:after="0"/>
+              <w:ind w:firstLine="0"/>
+              <w:jc w:val="center"/>
+            </w:pPr>
+            <w:r/>
+          </w:p>
+        </w:tc>
+        <w:tc>
+          <w:tcPr>
+            <w:tcW w:type="dxa" w:w="2948"/>
+            <w:tcBorders>
+              <w:top w:val="nil"/>
+              <w:left w:val="nil"/>
+              <w:bottom w:val="nil"/>
+              <w:right w:val="nil"/>
+              <w:insideH w:val="nil"/>
+              <w:insideV w:val="nil"/>
+            </w:tcBorders>
+            <w:tcMar>
+              <w:top w:w="0" w:type="dxa"/>
+              <w:left w:w="0" w:type="dxa"/>
+              <w:bottom w:w="0" w:type="dxa"/>
+              <w:right w:w="0" w:type="dxa"/>
+            </w:tcMar>
+            <w:vAlign w:val="center"/>
+          </w:tcPr>
+          <w:p>
+            <w:pPr>
+              <w:spacing w:line="240" w:lineRule="auto" w:before="0" w:after="0"/>
+              <w:ind w:firstLine="0"/>
+              <w:jc w:val="center"/>
+            </w:pPr>
+            <w:r/>
             <w:r>
               <w:rPr>
                 <w:rFonts w:ascii="Times New Roman" w:hAnsi="Times New Roman" w:eastAsia="Times New Roman"/>
                 <w:b w:val="0"/>
-                <w:sz w:val="20"/>
+                <w:i w:val="0"/>
+                <w:sz w:val="14"/>
               </w:rPr>
+              <w:t>вид практики</w:t>
             </w:r>
+          </w:p>
+        </w:tc>
+        <w:tc>
+          <w:tcPr>
+            <w:tcW w:type="dxa" w:w="2948"/>
+            <w:tcBorders>
+              <w:top w:val="nil"/>
+              <w:left w:val="nil"/>
+              <w:bottom w:val="nil"/>
+              <w:right w:val="nil"/>
+              <w:insideH w:val="nil"/>
+              <w:insideV w:val="nil"/>
+            </w:tcBorders>
+            <w:tcMar>
+              <w:top w:w="0" w:type="dxa"/>
+              <w:left w:w="0" w:type="dxa"/>
+              <w:bottom w:w="0" w:type="dxa"/>
+              <w:right w:w="0" w:type="dxa"/>
+            </w:tcMar>
+            <w:vAlign w:val="center"/>
+          </w:tcPr>
+          <w:p>
+            <w:pPr>
+              <w:spacing w:line="240" w:lineRule="auto" w:before="0" w:after="0"/>
+              <w:ind w:firstLine="0"/>
+              <w:jc w:val="center"/>
+            </w:pPr>
+            <w:r/>
           </w:p>
         </w:tc>
       </w:tr>
@@ -580,114 +678,7 @@
               <w:rPr>
                 <w:rFonts w:ascii="Times New Roman" w:hAnsi="Times New Roman" w:eastAsia="Times New Roman"/>
                 <w:b w:val="0"/>
-                <w:sz w:val="14"/>
-              </w:rPr>
-            </w:r>
-          </w:p>
-        </w:tc>
-        <w:tc>
-          <w:tcPr>
-            <w:tcW w:type="dxa" w:w="2948"/>
-            <w:tcBorders>
-              <w:top w:val="nil"/>
-              <w:left w:val="nil"/>
-              <w:bottom w:val="nil"/>
-              <w:right w:val="nil"/>
-              <w:insideH w:val="nil"/>
-              <w:insideV w:val="nil"/>
-            </w:tcBorders>
-            <w:tcMar>
-              <w:top w:w="0" w:type="dxa"/>
-              <w:left w:w="0" w:type="dxa"/>
-              <w:bottom w:w="0" w:type="dxa"/>
-              <w:right w:w="0" w:type="dxa"/>
-            </w:tcMar>
-            <w:vAlign w:val="center"/>
-          </w:tcPr>
-          <w:p>
-            <w:pPr>
-              <w:spacing w:line="240" w:lineRule="auto" w:before="0" w:after="0"/>
-              <w:ind w:firstLine="0"/>
-              <w:jc w:val="center"/>
-            </w:pPr>
-            <w:r/>
-            <w:r>
-              <w:rPr>
-                <w:rFonts w:ascii="Times New Roman" w:hAnsi="Times New Roman" w:eastAsia="Times New Roman"/>
-                <w:b w:val="0"/>
-                <w:sz w:val="14"/>
-              </w:rPr>
-              <w:t>вид практики</w:t>
-            </w:r>
-          </w:p>
-        </w:tc>
-        <w:tc>
-          <w:tcPr>
-            <w:tcW w:type="dxa" w:w="2948"/>
-            <w:tcBorders>
-              <w:top w:val="nil"/>
-              <w:left w:val="nil"/>
-              <w:bottom w:val="nil"/>
-              <w:right w:val="nil"/>
-              <w:insideH w:val="nil"/>
-              <w:insideV w:val="nil"/>
-            </w:tcBorders>
-            <w:tcMar>
-              <w:top w:w="0" w:type="dxa"/>
-              <w:left w:w="0" w:type="dxa"/>
-              <w:bottom w:w="0" w:type="dxa"/>
-              <w:right w:w="0" w:type="dxa"/>
-            </w:tcMar>
-            <w:vAlign w:val="center"/>
-          </w:tcPr>
-          <w:p>
-            <w:pPr>
-              <w:spacing w:line="240" w:lineRule="auto" w:before="0" w:after="0"/>
-              <w:ind w:firstLine="0"/>
-              <w:jc w:val="center"/>
-            </w:pPr>
-            <w:r/>
-            <w:r>
-              <w:rPr>
-                <w:rFonts w:ascii="Times New Roman" w:hAnsi="Times New Roman" w:eastAsia="Times New Roman"/>
-                <w:b w:val="0"/>
-                <w:sz w:val="14"/>
-              </w:rPr>
-            </w:r>
-          </w:p>
-        </w:tc>
-      </w:tr>
-      <w:tr>
-        <w:tc>
-          <w:tcPr>
-            <w:tcW w:type="dxa" w:w="2948"/>
-            <w:tcBorders>
-              <w:top w:val="nil"/>
-              <w:left w:val="nil"/>
-              <w:bottom w:val="nil"/>
-              <w:right w:val="nil"/>
-              <w:insideH w:val="nil"/>
-              <w:insideV w:val="nil"/>
-            </w:tcBorders>
-            <w:tcMar>
-              <w:top w:w="0" w:type="dxa"/>
-              <w:left w:w="0" w:type="dxa"/>
-              <w:bottom w:w="0" w:type="dxa"/>
-              <w:right w:w="0" w:type="dxa"/>
-            </w:tcMar>
-            <w:vAlign w:val="center"/>
-          </w:tcPr>
-          <w:p>
-            <w:pPr>
-              <w:spacing w:line="240" w:lineRule="auto" w:before="0" w:after="0"/>
-              <w:ind w:firstLine="0"/>
-              <w:jc w:val="center"/>
-            </w:pPr>
-            <w:r/>
-            <w:r>
-              <w:rPr>
-                <w:rFonts w:ascii="Times New Roman" w:hAnsi="Times New Roman" w:eastAsia="Times New Roman"/>
-                <w:b w:val="0"/>
+                <w:i w:val="0"/>
                 <w:sz w:val="20"/>
               </w:rPr>
               <w:t>тип практики</w:t>
@@ -724,6 +715,7 @@
               <w:rPr>
                 <w:rFonts w:ascii="Times New Roman" w:hAnsi="Times New Roman" w:eastAsia="Times New Roman"/>
                 <w:b w:val="0"/>
+                <w:i w:val="0"/>
                 <w:sz w:val="20"/>
               </w:rPr>
               <w:t>преддипломная</w:t>
@@ -756,13 +748,101 @@
               <w:jc w:val="center"/>
             </w:pPr>
             <w:r/>
+          </w:p>
+        </w:tc>
+      </w:tr>
+      <w:tr>
+        <w:tc>
+          <w:tcPr>
+            <w:tcW w:type="dxa" w:w="2948"/>
+            <w:tcBorders>
+              <w:top w:val="nil"/>
+              <w:left w:val="nil"/>
+              <w:bottom w:val="nil"/>
+              <w:right w:val="nil"/>
+              <w:insideH w:val="nil"/>
+              <w:insideV w:val="nil"/>
+            </w:tcBorders>
+            <w:tcMar>
+              <w:top w:w="0" w:type="dxa"/>
+              <w:left w:w="0" w:type="dxa"/>
+              <w:bottom w:w="0" w:type="dxa"/>
+              <w:right w:w="0" w:type="dxa"/>
+            </w:tcMar>
+            <w:vAlign w:val="center"/>
+          </w:tcPr>
+          <w:p>
+            <w:pPr>
+              <w:spacing w:line="240" w:lineRule="auto" w:before="0" w:after="0"/>
+              <w:ind w:firstLine="0"/>
+              <w:jc w:val="center"/>
+            </w:pPr>
+            <w:r/>
+          </w:p>
+        </w:tc>
+        <w:tc>
+          <w:tcPr>
+            <w:tcW w:type="dxa" w:w="2948"/>
+            <w:tcBorders>
+              <w:top w:val="nil"/>
+              <w:left w:val="nil"/>
+              <w:bottom w:val="nil"/>
+              <w:right w:val="nil"/>
+              <w:insideH w:val="nil"/>
+              <w:insideV w:val="nil"/>
+            </w:tcBorders>
+            <w:tcMar>
+              <w:top w:w="0" w:type="dxa"/>
+              <w:left w:w="0" w:type="dxa"/>
+              <w:bottom w:w="0" w:type="dxa"/>
+              <w:right w:w="0" w:type="dxa"/>
+            </w:tcMar>
+            <w:vAlign w:val="center"/>
+          </w:tcPr>
+          <w:p>
+            <w:pPr>
+              <w:spacing w:line="240" w:lineRule="auto" w:before="0" w:after="0"/>
+              <w:ind w:firstLine="0"/>
+              <w:jc w:val="center"/>
+            </w:pPr>
+            <w:r/>
             <w:r>
               <w:rPr>
                 <w:rFonts w:ascii="Times New Roman" w:hAnsi="Times New Roman" w:eastAsia="Times New Roman"/>
                 <w:b w:val="0"/>
-                <w:sz w:val="20"/>
+                <w:i w:val="0"/>
+                <w:sz w:val="14"/>
               </w:rPr>
+              <w:t>тип практики</w:t>
             </w:r>
+          </w:p>
+        </w:tc>
+        <w:tc>
+          <w:tcPr>
+            <w:tcW w:type="dxa" w:w="2948"/>
+            <w:tcBorders>
+              <w:top w:val="nil"/>
+              <w:left w:val="nil"/>
+              <w:bottom w:val="nil"/>
+              <w:right w:val="nil"/>
+              <w:insideH w:val="nil"/>
+              <w:insideV w:val="nil"/>
+            </w:tcBorders>
+            <w:tcMar>
+              <w:top w:w="0" w:type="dxa"/>
+              <w:left w:w="0" w:type="dxa"/>
+              <w:bottom w:w="0" w:type="dxa"/>
+              <w:right w:w="0" w:type="dxa"/>
+            </w:tcMar>
+            <w:vAlign w:val="center"/>
+          </w:tcPr>
+          <w:p>
+            <w:pPr>
+              <w:spacing w:line="240" w:lineRule="auto" w:before="0" w:after="0"/>
+              <w:ind w:firstLine="0"/>
+              <w:jc w:val="center"/>
+            </w:pPr>
+            <w:r/>
           </w:p>
         </w:tc>
       </w:tr>
@@ -797,114 +877,7 @@
               <w:rPr>
                 <w:rFonts w:ascii="Times New Roman" w:hAnsi="Times New Roman" w:eastAsia="Times New Roman"/>
                 <w:b w:val="0"/>
-                <w:sz w:val="14"/>
-              </w:rPr>
-            </w:r>
-          </w:p>
-        </w:tc>
-        <w:tc>
-          <w:tcPr>
-            <w:tcW w:type="dxa" w:w="2948"/>
-            <w:tcBorders>
-              <w:top w:val="nil"/>
-              <w:left w:val="nil"/>
-              <w:bottom w:val="nil"/>
-              <w:right w:val="nil"/>
-              <w:insideH w:val="nil"/>
-              <w:insideV w:val="nil"/>
-            </w:tcBorders>
-            <w:tcMar>
-              <w:top w:w="0" w:type="dxa"/>
-              <w:left w:w="0" w:type="dxa"/>
-              <w:bottom w:w="0" w:type="dxa"/>
-              <w:right w:w="0" w:type="dxa"/>
-            </w:tcMar>
-            <w:vAlign w:val="center"/>
-          </w:tcPr>
-          <w:p>
-            <w:pPr>
-              <w:spacing w:line="240" w:lineRule="auto" w:before="0" w:after="0"/>
-              <w:ind w:firstLine="0"/>
-              <w:jc w:val="center"/>
-            </w:pPr>
-            <w:r/>
-            <w:r>
-              <w:rPr>
-                <w:rFonts w:ascii="Times New Roman" w:hAnsi="Times New Roman" w:eastAsia="Times New Roman"/>
-                <w:b w:val="0"/>
-                <w:sz w:val="14"/>
-              </w:rPr>
-              <w:t>тип практики</w:t>
-            </w:r>
-          </w:p>
-        </w:tc>
-        <w:tc>
-          <w:tcPr>
-            <w:tcW w:type="dxa" w:w="2948"/>
-            <w:tcBorders>
-              <w:top w:val="nil"/>
-              <w:left w:val="nil"/>
-              <w:bottom w:val="nil"/>
-              <w:right w:val="nil"/>
-              <w:insideH w:val="nil"/>
-              <w:insideV w:val="nil"/>
-            </w:tcBorders>
-            <w:tcMar>
-              <w:top w:w="0" w:type="dxa"/>
-              <w:left w:w="0" w:type="dxa"/>
-              <w:bottom w:w="0" w:type="dxa"/>
-              <w:right w:w="0" w:type="dxa"/>
-            </w:tcMar>
-            <w:vAlign w:val="center"/>
-          </w:tcPr>
-          <w:p>
-            <w:pPr>
-              <w:spacing w:line="240" w:lineRule="auto" w:before="0" w:after="0"/>
-              <w:ind w:firstLine="0"/>
-              <w:jc w:val="center"/>
-            </w:pPr>
-            <w:r/>
-            <w:r>
-              <w:rPr>
-                <w:rFonts w:ascii="Times New Roman" w:hAnsi="Times New Roman" w:eastAsia="Times New Roman"/>
-                <w:b w:val="0"/>
-                <w:sz w:val="14"/>
-              </w:rPr>
-            </w:r>
-          </w:p>
-        </w:tc>
-      </w:tr>
-      <w:tr>
-        <w:tc>
-          <w:tcPr>
-            <w:tcW w:type="dxa" w:w="2948"/>
-            <w:tcBorders>
-              <w:top w:val="nil"/>
-              <w:left w:val="nil"/>
-              <w:bottom w:val="nil"/>
-              <w:right w:val="nil"/>
-              <w:insideH w:val="nil"/>
-              <w:insideV w:val="nil"/>
-            </w:tcBorders>
-            <w:tcMar>
-              <w:top w:w="0" w:type="dxa"/>
-              <w:left w:w="0" w:type="dxa"/>
-              <w:bottom w:w="0" w:type="dxa"/>
-              <w:right w:w="0" w:type="dxa"/>
-            </w:tcMar>
-            <w:vAlign w:val="center"/>
-          </w:tcPr>
-          <w:p>
-            <w:pPr>
-              <w:spacing w:line="240" w:lineRule="auto" w:before="0" w:after="0"/>
-              <w:ind w:firstLine="0"/>
-              <w:jc w:val="center"/>
-            </w:pPr>
-            <w:r/>
-            <w:r>
-              <w:rPr>
-                <w:rFonts w:ascii="Times New Roman" w:hAnsi="Times New Roman" w:eastAsia="Times New Roman"/>
-                <w:b w:val="0"/>
+                <w:i w:val="0"/>
                 <w:sz w:val="20"/>
               </w:rPr>
               <w:t>на тему индивидуального задания</w:t>
@@ -942,6 +915,7 @@
               <w:rPr>
                 <w:rFonts w:ascii="Times New Roman" w:hAnsi="Times New Roman" w:eastAsia="Times New Roman"/>
                 <w:b w:val="0"/>
+                <w:i w:val="0"/>
                 <w:sz w:val="20"/>
               </w:rPr>
               <w:t>Разработка real-time интерфейса с поддержкой горизонтального масштабирования WebSocket-соединений для системы отслеживания задач</w:t>
@@ -976,13 +950,6 @@
               <w:jc w:val="center"/>
             </w:pPr>
             <w:r/>
-            <w:r>
-              <w:rPr>
-                <w:rFonts w:ascii="Times New Roman" w:hAnsi="Times New Roman" w:eastAsia="Times New Roman"/>
-                <w:b w:val="0"/>
-                <w:sz w:val="14"/>
-              </w:rPr>
-            </w:r>
           </w:p>
         </w:tc>
         <w:tc>
@@ -1015,6 +982,7 @@
               <w:rPr>
                 <w:rFonts w:ascii="Times New Roman" w:hAnsi="Times New Roman" w:eastAsia="Times New Roman"/>
                 <w:b w:val="0"/>
+                <w:i w:val="0"/>
                 <w:sz w:val="14"/>
               </w:rPr>
               <w:t>на тему индивидуального задания</w:t>
@@ -1047,13 +1015,6 @@
               <w:jc w:val="center"/>
             </w:pPr>
             <w:r/>
-            <w:r>
-              <w:rPr>
-                <w:rFonts w:ascii="Times New Roman" w:hAnsi="Times New Roman" w:eastAsia="Times New Roman"/>
-                <w:b w:val="0"/>
-                <w:sz w:val="14"/>
-              </w:rPr>
-            </w:r>
           </w:p>
         </w:tc>
       </w:tr>
@@ -1088,6 +1049,7 @@
               <w:rPr>
                 <w:rFonts w:ascii="Times New Roman" w:hAnsi="Times New Roman" w:eastAsia="Times New Roman"/>
                 <w:b w:val="0"/>
+                <w:i w:val="0"/>
                 <w:sz w:val="20"/>
               </w:rPr>
               <w:t>выполнен</w:t>
@@ -1124,6 +1086,7 @@
               <w:rPr>
                 <w:rFonts w:ascii="Times New Roman" w:hAnsi="Times New Roman" w:eastAsia="Times New Roman"/>
                 <w:b w:val="0"/>
+                <w:i w:val="0"/>
                 <w:sz w:val="20"/>
               </w:rPr>
               <w:t>Зайцевым Александром Сергеевичем</w:t>
@@ -1156,13 +1119,101 @@
               <w:jc w:val="center"/>
             </w:pPr>
             <w:r/>
+          </w:p>
+        </w:tc>
+      </w:tr>
+      <w:tr>
+        <w:tc>
+          <w:tcPr>
+            <w:tcW w:type="dxa" w:w="2948"/>
+            <w:tcBorders>
+              <w:top w:val="nil"/>
+              <w:left w:val="nil"/>
+              <w:bottom w:val="nil"/>
+              <w:right w:val="nil"/>
+              <w:insideH w:val="nil"/>
+              <w:insideV w:val="nil"/>
+            </w:tcBorders>
+            <w:tcMar>
+              <w:top w:w="0" w:type="dxa"/>
+              <w:left w:w="0" w:type="dxa"/>
+              <w:bottom w:w="0" w:type="dxa"/>
+              <w:right w:w="0" w:type="dxa"/>
+            </w:tcMar>
+            <w:vAlign w:val="center"/>
+          </w:tcPr>
+          <w:p>
+            <w:pPr>
+              <w:spacing w:line="240" w:lineRule="auto" w:before="0" w:after="0"/>
+              <w:ind w:firstLine="0"/>
+              <w:jc w:val="center"/>
+            </w:pPr>
+            <w:r/>
+          </w:p>
+        </w:tc>
+        <w:tc>
+          <w:tcPr>
+            <w:tcW w:type="dxa" w:w="2948"/>
+            <w:tcBorders>
+              <w:top w:val="nil"/>
+              <w:left w:val="nil"/>
+              <w:bottom w:val="nil"/>
+              <w:right w:val="nil"/>
+              <w:insideH w:val="nil"/>
+              <w:insideV w:val="nil"/>
+            </w:tcBorders>
+            <w:tcMar>
+              <w:top w:w="0" w:type="dxa"/>
+              <w:left w:w="0" w:type="dxa"/>
+              <w:bottom w:w="0" w:type="dxa"/>
+              <w:right w:w="0" w:type="dxa"/>
+            </w:tcMar>
+            <w:vAlign w:val="center"/>
+          </w:tcPr>
+          <w:p>
+            <w:pPr>
+              <w:spacing w:line="240" w:lineRule="auto" w:before="0" w:after="0"/>
+              <w:ind w:firstLine="0"/>
+              <w:jc w:val="center"/>
+            </w:pPr>
+            <w:r/>
             <w:r>
               <w:rPr>
                 <w:rFonts w:ascii="Times New Roman" w:hAnsi="Times New Roman" w:eastAsia="Times New Roman"/>
                 <w:b w:val="0"/>
-                <w:sz w:val="20"/>
+                <w:i w:val="0"/>
+                <w:sz w:val="14"/>
               </w:rPr>
+              <w:t>фамилия, имя, отчество обучающегося в творительном падеже</w:t>
             </w:r>
+          </w:p>
+        </w:tc>
+        <w:tc>
+          <w:tcPr>
+            <w:tcW w:type="dxa" w:w="2948"/>
+            <w:tcBorders>
+              <w:top w:val="nil"/>
+              <w:left w:val="nil"/>
+              <w:bottom w:val="nil"/>
+              <w:right w:val="nil"/>
+              <w:insideH w:val="nil"/>
+              <w:insideV w:val="nil"/>
+            </w:tcBorders>
+            <w:tcMar>
+              <w:top w:w="0" w:type="dxa"/>
+              <w:left w:w="0" w:type="dxa"/>
+              <w:bottom w:w="0" w:type="dxa"/>
+              <w:right w:w="0" w:type="dxa"/>
+            </w:tcMar>
+            <w:vAlign w:val="center"/>
+          </w:tcPr>
+          <w:p>
+            <w:pPr>
+              <w:spacing w:line="240" w:lineRule="auto" w:before="0" w:after="0"/>
+              <w:ind w:firstLine="0"/>
+              <w:jc w:val="center"/>
+            </w:pPr>
+            <w:r/>
           </w:p>
         </w:tc>
       </w:tr>
@@ -1197,114 +1248,7 @@
               <w:rPr>
                 <w:rFonts w:ascii="Times New Roman" w:hAnsi="Times New Roman" w:eastAsia="Times New Roman"/>
                 <w:b w:val="0"/>
-                <w:sz w:val="14"/>
-              </w:rPr>
-            </w:r>
-          </w:p>
-        </w:tc>
-        <w:tc>
-          <w:tcPr>
-            <w:tcW w:type="dxa" w:w="2948"/>
-            <w:tcBorders>
-              <w:top w:val="nil"/>
-              <w:left w:val="nil"/>
-              <w:bottom w:val="nil"/>
-              <w:right w:val="nil"/>
-              <w:insideH w:val="nil"/>
-              <w:insideV w:val="nil"/>
-            </w:tcBorders>
-            <w:tcMar>
-              <w:top w:w="0" w:type="dxa"/>
-              <w:left w:w="0" w:type="dxa"/>
-              <w:bottom w:w="0" w:type="dxa"/>
-              <w:right w:w="0" w:type="dxa"/>
-            </w:tcMar>
-            <w:vAlign w:val="center"/>
-          </w:tcPr>
-          <w:p>
-            <w:pPr>
-              <w:spacing w:line="240" w:lineRule="auto" w:before="0" w:after="0"/>
-              <w:ind w:firstLine="0"/>
-              <w:jc w:val="center"/>
-            </w:pPr>
-            <w:r/>
-            <w:r>
-              <w:rPr>
-                <w:rFonts w:ascii="Times New Roman" w:hAnsi="Times New Roman" w:eastAsia="Times New Roman"/>
-                <w:b w:val="0"/>
-                <w:sz w:val="14"/>
-              </w:rPr>
-              <w:t>фамилия, имя, отчество обучающегося в творительном падеже</w:t>
-            </w:r>
-          </w:p>
-        </w:tc>
-        <w:tc>
-          <w:tcPr>
-            <w:tcW w:type="dxa" w:w="2948"/>
-            <w:tcBorders>
-              <w:top w:val="nil"/>
-              <w:left w:val="nil"/>
-              <w:bottom w:val="nil"/>
-              <w:right w:val="nil"/>
-              <w:insideH w:val="nil"/>
-              <w:insideV w:val="nil"/>
-            </w:tcBorders>
-            <w:tcMar>
-              <w:top w:w="0" w:type="dxa"/>
-              <w:left w:w="0" w:type="dxa"/>
-              <w:bottom w:w="0" w:type="dxa"/>
-              <w:right w:w="0" w:type="dxa"/>
-            </w:tcMar>
-            <w:vAlign w:val="center"/>
-          </w:tcPr>
-          <w:p>
-            <w:pPr>
-              <w:spacing w:line="240" w:lineRule="auto" w:before="0" w:after="0"/>
-              <w:ind w:firstLine="0"/>
-              <w:jc w:val="center"/>
-            </w:pPr>
-            <w:r/>
-            <w:r>
-              <w:rPr>
-                <w:rFonts w:ascii="Times New Roman" w:hAnsi="Times New Roman" w:eastAsia="Times New Roman"/>
-                <w:b w:val="0"/>
-                <w:sz w:val="14"/>
-              </w:rPr>
-            </w:r>
-          </w:p>
-        </w:tc>
-      </w:tr>
-      <w:tr>
-        <w:tc>
-          <w:tcPr>
-            <w:tcW w:type="dxa" w:w="2948"/>
-            <w:tcBorders>
-              <w:top w:val="nil"/>
-              <w:left w:val="nil"/>
-              <w:bottom w:val="nil"/>
-              <w:right w:val="nil"/>
-              <w:insideH w:val="nil"/>
-              <w:insideV w:val="nil"/>
-            </w:tcBorders>
-            <w:tcMar>
-              <w:top w:w="0" w:type="dxa"/>
-              <w:left w:w="0" w:type="dxa"/>
-              <w:bottom w:w="0" w:type="dxa"/>
-              <w:right w:w="0" w:type="dxa"/>
-            </w:tcMar>
-            <w:vAlign w:val="center"/>
-          </w:tcPr>
-          <w:p>
-            <w:pPr>
-              <w:spacing w:line="240" w:lineRule="auto" w:before="0" w:after="0"/>
-              <w:ind w:firstLine="0"/>
-              <w:jc w:val="center"/>
-            </w:pPr>
-            <w:r/>
-            <w:r>
-              <w:rPr>
-                <w:rFonts w:ascii="Times New Roman" w:hAnsi="Times New Roman" w:eastAsia="Times New Roman"/>
-                <w:b w:val="0"/>
+                <w:i w:val="0"/>
                 <w:sz w:val="20"/>
               </w:rPr>
               <w:t>по направлению подготовки</w:t>
@@ -1341,6 +1285,7 @@
               <w:rPr>
                 <w:rFonts w:ascii="Times New Roman" w:hAnsi="Times New Roman" w:eastAsia="Times New Roman"/>
                 <w:b w:val="0"/>
+                <w:i w:val="0"/>
                 <w:sz w:val="20"/>
               </w:rPr>
               <w:t>09.03.04</w:t>
@@ -1377,6 +1322,7 @@
               <w:rPr>
                 <w:rFonts w:ascii="Times New Roman" w:hAnsi="Times New Roman" w:eastAsia="Times New Roman"/>
                 <w:b w:val="0"/>
+                <w:i w:val="0"/>
                 <w:sz w:val="20"/>
               </w:rPr>
               <w:t>Программная инженерия</w:t>
@@ -1411,13 +1357,6 @@
               <w:jc w:val="center"/>
             </w:pPr>
             <w:r/>
-            <w:r>
-              <w:rPr>
-                <w:rFonts w:ascii="Times New Roman" w:hAnsi="Times New Roman" w:eastAsia="Times New Roman"/>
-                <w:b w:val="0"/>
-                <w:sz w:val="14"/>
-              </w:rPr>
-            </w:r>
           </w:p>
         </w:tc>
         <w:tc>
@@ -1450,6 +1389,7 @@
               <w:rPr>
                 <w:rFonts w:ascii="Times New Roman" w:hAnsi="Times New Roman" w:eastAsia="Times New Roman"/>
                 <w:b w:val="0"/>
+                <w:i w:val="0"/>
                 <w:sz w:val="14"/>
               </w:rPr>
               <w:t>код</w:t>
@@ -1486,6 +1426,7 @@
               <w:rPr>
                 <w:rFonts w:ascii="Times New Roman" w:hAnsi="Times New Roman" w:eastAsia="Times New Roman"/>
                 <w:b w:val="0"/>
+                <w:i w:val="0"/>
                 <w:sz w:val="14"/>
               </w:rPr>
               <w:t>наименование направления</w:t>
@@ -1524,6 +1465,7 @@
               <w:rPr>
                 <w:rFonts w:ascii="Times New Roman" w:hAnsi="Times New Roman" w:eastAsia="Times New Roman"/>
                 <w:b w:val="0"/>
+                <w:i w:val="0"/>
                 <w:sz w:val="20"/>
               </w:rPr>
               <w:t>направленности</w:t>
@@ -1560,6 +1502,7 @@
               <w:rPr>
                 <w:rFonts w:ascii="Times New Roman" w:hAnsi="Times New Roman" w:eastAsia="Times New Roman"/>
                 <w:b w:val="0"/>
+                <w:i w:val="0"/>
                 <w:sz w:val="20"/>
               </w:rPr>
               <w:t>02</w:t>
@@ -1596,6 +1539,7 @@
               <w:rPr>
                 <w:rFonts w:ascii="Times New Roman" w:hAnsi="Times New Roman" w:eastAsia="Times New Roman"/>
                 <w:b w:val="0"/>
+                <w:i w:val="0"/>
                 <w:sz w:val="20"/>
               </w:rPr>
               <w:t>Проектирование программных систем</w:t>
@@ -1630,13 +1574,6 @@
               <w:jc w:val="center"/>
             </w:pPr>
             <w:r/>
-            <w:r>
-              <w:rPr>
-                <w:rFonts w:ascii="Times New Roman" w:hAnsi="Times New Roman" w:eastAsia="Times New Roman"/>
-                <w:b w:val="0"/>
-                <w:sz w:val="14"/>
-              </w:rPr>
-            </w:r>
           </w:p>
         </w:tc>
         <w:tc>
@@ -1669,6 +1606,7 @@
               <w:rPr>
                 <w:rFonts w:ascii="Times New Roman" w:hAnsi="Times New Roman" w:eastAsia="Times New Roman"/>
                 <w:b w:val="0"/>
+                <w:i w:val="0"/>
                 <w:sz w:val="14"/>
               </w:rPr>
               <w:t>код</w:t>
@@ -1705,6 +1643,7 @@
               <w:rPr>
                 <w:rFonts w:ascii="Times New Roman" w:hAnsi="Times New Roman" w:eastAsia="Times New Roman"/>
                 <w:b w:val="0"/>
+                <w:i w:val="0"/>
                 <w:sz w:val="14"/>
               </w:rPr>
               <w:t>наименование направленности</w:t>
@@ -1743,6 +1682,7 @@
               <w:rPr>
                 <w:rFonts w:ascii="Times New Roman" w:hAnsi="Times New Roman" w:eastAsia="Times New Roman"/>
                 <w:b w:val="0"/>
+                <w:i w:val="0"/>
                 <w:sz w:val="20"/>
               </w:rPr>
               <w:t>Обучающийся группы №</w:t>
@@ -1779,6 +1719,7 @@
               <w:rPr>
                 <w:rFonts w:ascii="Times New Roman" w:hAnsi="Times New Roman" w:eastAsia="Times New Roman"/>
                 <w:b w:val="0"/>
+                <w:i w:val="0"/>
                 <w:sz w:val="20"/>
               </w:rPr>
               <w:t>4131з</w:t>
@@ -1815,6 +1756,7 @@
               <w:rPr>
                 <w:rFonts w:ascii="Times New Roman" w:hAnsi="Times New Roman" w:eastAsia="Times New Roman"/>
                 <w:b w:val="0"/>
+                <w:i w:val="0"/>
                 <w:sz w:val="20"/>
               </w:rPr>
               <w:t>____________________</w:t>
@@ -1849,13 +1791,6 @@
               <w:jc w:val="center"/>
             </w:pPr>
             <w:r/>
-            <w:r>
-              <w:rPr>
-                <w:rFonts w:ascii="Times New Roman" w:hAnsi="Times New Roman" w:eastAsia="Times New Roman"/>
-                <w:b w:val="0"/>
-                <w:sz w:val="14"/>
-              </w:rPr>
-            </w:r>
           </w:p>
         </w:tc>
         <w:tc>
@@ -1888,6 +1823,7 @@
               <w:rPr>
                 <w:rFonts w:ascii="Times New Roman" w:hAnsi="Times New Roman" w:eastAsia="Times New Roman"/>
                 <w:b w:val="0"/>
+                <w:i w:val="0"/>
                 <w:sz w:val="14"/>
               </w:rPr>
               <w:t>номер</w:t>
@@ -1924,6 +1860,7 @@
               <w:rPr>
                 <w:rFonts w:ascii="Times New Roman" w:hAnsi="Times New Roman" w:eastAsia="Times New Roman"/>
                 <w:b w:val="0"/>
+                <w:i w:val="0"/>
                 <w:sz w:val="14"/>
               </w:rPr>
               <w:t>подпись, дата</w:t>
@@ -1969,13 +1906,34 @@
               <w:jc w:val="center"/>
             </w:pPr>
             <w:r/>
-            <w:r>
-              <w:rPr>
-                <w:rFonts w:ascii="Times New Roman" w:hAnsi="Times New Roman" w:eastAsia="Times New Roman"/>
-                <w:b w:val="0"/>
-                <w:sz w:val="14"/>
-              </w:rPr>
-            </w:r>
+          </w:p>
+        </w:tc>
+        <w:tc>
+          <w:tcPr>
+            <w:tcW w:type="dxa" w:w="2835"/>
+            <w:tcBorders>
+              <w:top w:val="nil"/>
+              <w:left w:val="nil"/>
+              <w:bottom w:val="nil"/>
+              <w:right w:val="nil"/>
+              <w:insideH w:val="nil"/>
+              <w:insideV w:val="nil"/>
+            </w:tcBorders>
+            <w:tcMar>
+              <w:top w:w="0" w:type="dxa"/>
+              <w:left w:w="0" w:type="dxa"/>
+              <w:bottom w:w="0" w:type="dxa"/>
+              <w:right w:w="0" w:type="dxa"/>
+            </w:tcMar>
+            <w:vAlign w:val="center"/>
+          </w:tcPr>
+          <w:p>
+            <w:pPr>
+              <w:spacing w:line="240" w:lineRule="auto" w:before="0" w:after="0"/>
+              <w:ind w:firstLine="0"/>
+              <w:jc w:val="center"/>
+            </w:pPr>
+            <w:r/>
           </w:p>
         </w:tc>
         <w:tc>
@@ -2008,41 +1966,7 @@
               <w:rPr>
                 <w:rFonts w:ascii="Times New Roman" w:hAnsi="Times New Roman" w:eastAsia="Times New Roman"/>
                 <w:b w:val="0"/>
-                <w:sz w:val="14"/>
-              </w:rPr>
-            </w:r>
-          </w:p>
-        </w:tc>
-        <w:tc>
-          <w:tcPr>
-            <w:tcW w:type="dxa" w:w="2835"/>
-            <w:tcBorders>
-              <w:top w:val="nil"/>
-              <w:left w:val="nil"/>
-              <w:bottom w:val="nil"/>
-              <w:right w:val="nil"/>
-              <w:insideH w:val="nil"/>
-              <w:insideV w:val="nil"/>
-            </w:tcBorders>
-            <w:tcMar>
-              <w:top w:w="0" w:type="dxa"/>
-              <w:left w:w="0" w:type="dxa"/>
-              <w:bottom w:w="0" w:type="dxa"/>
-              <w:right w:w="0" w:type="dxa"/>
-            </w:tcMar>
-            <w:vAlign w:val="center"/>
-          </w:tcPr>
-          <w:p>
-            <w:pPr>
-              <w:spacing w:line="240" w:lineRule="auto" w:before="0" w:after="0"/>
-              <w:ind w:firstLine="0"/>
-              <w:jc w:val="center"/>
-            </w:pPr>
-            <w:r/>
-            <w:r>
-              <w:rPr>
-                <w:rFonts w:ascii="Times New Roman" w:hAnsi="Times New Roman" w:eastAsia="Times New Roman"/>
-                <w:b w:val="0"/>
+                <w:i w:val="0"/>
                 <w:sz w:val="14"/>
               </w:rPr>
               <w:t>инициалы, фамилия</w:t>
@@ -2077,13 +2001,6 @@
               <w:jc w:val="center"/>
             </w:pPr>
             <w:r/>
-            <w:r>
-              <w:rPr>
-                <w:rFonts w:ascii="Times New Roman" w:hAnsi="Times New Roman" w:eastAsia="Times New Roman"/>
-                <w:b w:val="0"/>
-                <w:sz w:val="20"/>
-              </w:rPr>
-            </w:r>
           </w:p>
         </w:tc>
         <w:tc>
@@ -2112,13 +2029,6 @@
               <w:jc w:val="center"/>
             </w:pPr>
             <w:r/>
-            <w:r>
-              <w:rPr>
-                <w:rFonts w:ascii="Times New Roman" w:hAnsi="Times New Roman" w:eastAsia="Times New Roman"/>
-                <w:b w:val="0"/>
-                <w:sz w:val="20"/>
-              </w:rPr>
-            </w:r>
           </w:p>
         </w:tc>
         <w:tc>
@@ -2151,6 +2061,7 @@
               <w:rPr>
                 <w:rFonts w:ascii="Times New Roman" w:hAnsi="Times New Roman" w:eastAsia="Times New Roman"/>
                 <w:b w:val="0"/>
+                <w:i w:val="0"/>
                 <w:sz w:val="20"/>
               </w:rPr>
               <w:t>А.С. Зайцев</w:t>
@@ -2461,7 +2372,27 @@
           <w:i w:val="0"/>
           <w:sz w:val="22"/>
         </w:rPr>
-        <w:t>2.4 Постановка задачи</w:t>
+        <w:t>2.4 Выбор платформы и инструментальных средств</w:t>
+        <w:tab/>
+        <w:t>12</w:t>
+      </w:r>
+    </w:p>
+    <w:p>
+      <w:pPr>
+        <w:tabs>
+          <w:tab w:pos="9071" w:val="center"/>
+        </w:tabs>
+        <w:spacing w:line="240" w:lineRule="auto" w:after="0"/>
+        <w:ind w:firstLine="0" w:left="425" w:right="0"/>
+      </w:pPr>
+      <w:r>
+        <w:rPr>
+          <w:rFonts w:ascii="Times New Roman" w:hAnsi="Times New Roman" w:eastAsia="Times New Roman"/>
+          <w:b w:val="0"/>
+          <w:i w:val="0"/>
+          <w:sz w:val="22"/>
+        </w:rPr>
+        <w:t>2.5 Постановка задачи</w:t>
         <w:tab/>
         <w:t>12</w:t>
       </w:r>
@@ -3028,6 +2959,7 @@
               <w:rPr>
                 <w:rFonts w:ascii="Times New Roman" w:hAnsi="Times New Roman" w:eastAsia="Times New Roman"/>
                 <w:b/>
+                <w:i w:val="0"/>
                 <w:sz w:val="28"/>
               </w:rPr>
               <w:t>Сокращение</w:t>
@@ -3050,6 +2982,7 @@
               <w:rPr>
                 <w:rFonts w:ascii="Times New Roman" w:hAnsi="Times New Roman" w:eastAsia="Times New Roman"/>
                 <w:b/>
+                <w:i w:val="0"/>
                 <w:sz w:val="28"/>
               </w:rPr>
               <w:t>Расшифровка</w:t>
@@ -3074,6 +3007,7 @@
               <w:rPr>
                 <w:rFonts w:ascii="Times New Roman" w:hAnsi="Times New Roman" w:eastAsia="Times New Roman"/>
                 <w:b w:val="0"/>
+                <w:i w:val="0"/>
                 <w:sz w:val="28"/>
               </w:rPr>
               <w:t>API</w:t>
@@ -3096,6 +3030,7 @@
               <w:rPr>
                 <w:rFonts w:ascii="Times New Roman" w:hAnsi="Times New Roman" w:eastAsia="Times New Roman"/>
                 <w:b w:val="0"/>
+                <w:i w:val="0"/>
                 <w:sz w:val="28"/>
               </w:rPr>
               <w:t>Application Programming Interface, программный интерфейс приложения</w:t>
@@ -3120,6 +3055,7 @@
               <w:rPr>
                 <w:rFonts w:ascii="Times New Roman" w:hAnsi="Times New Roman" w:eastAsia="Times New Roman"/>
                 <w:b w:val="0"/>
+                <w:i w:val="0"/>
                 <w:sz w:val="28"/>
               </w:rPr>
               <w:t>ASP.NET Core</w:t>
@@ -3142,6 +3078,7 @@
               <w:rPr>
                 <w:rFonts w:ascii="Times New Roman" w:hAnsi="Times New Roman" w:eastAsia="Times New Roman"/>
                 <w:b w:val="0"/>
+                <w:i w:val="0"/>
                 <w:sz w:val="28"/>
               </w:rPr>
               <w:t>платформа для разработки веб-приложений на языке C#</w:t>
@@ -3166,6 +3103,7 @@
               <w:rPr>
                 <w:rFonts w:ascii="Times New Roman" w:hAnsi="Times New Roman" w:eastAsia="Times New Roman"/>
                 <w:b w:val="0"/>
+                <w:i w:val="0"/>
                 <w:sz w:val="28"/>
               </w:rPr>
               <w:t>HTTP</w:t>
@@ -3188,6 +3126,7 @@
               <w:rPr>
                 <w:rFonts w:ascii="Times New Roman" w:hAnsi="Times New Roman" w:eastAsia="Times New Roman"/>
                 <w:b w:val="0"/>
+                <w:i w:val="0"/>
                 <w:sz w:val="28"/>
               </w:rPr>
               <w:t>HyperText Transfer Protocol, протокол передачи гипертекста</w:t>
@@ -3212,6 +3151,7 @@
               <w:rPr>
                 <w:rFonts w:ascii="Times New Roman" w:hAnsi="Times New Roman" w:eastAsia="Times New Roman"/>
                 <w:b w:val="0"/>
+                <w:i w:val="0"/>
                 <w:sz w:val="28"/>
               </w:rPr>
               <w:t>JSON</w:t>
@@ -3234,6 +3174,7 @@
               <w:rPr>
                 <w:rFonts w:ascii="Times New Roman" w:hAnsi="Times New Roman" w:eastAsia="Times New Roman"/>
                 <w:b w:val="0"/>
+                <w:i w:val="0"/>
                 <w:sz w:val="28"/>
               </w:rPr>
               <w:t>JavaScript Object Notation, текстовый формат обмена данными</w:t>
@@ -3258,6 +3199,7 @@
               <w:rPr>
                 <w:rFonts w:ascii="Times New Roman" w:hAnsi="Times New Roman" w:eastAsia="Times New Roman"/>
                 <w:b w:val="0"/>
+                <w:i w:val="0"/>
                 <w:sz w:val="28"/>
               </w:rPr>
               <w:t>nginx</w:t>
@@ -3280,6 +3222,7 @@
               <w:rPr>
                 <w:rFonts w:ascii="Times New Roman" w:hAnsi="Times New Roman" w:eastAsia="Times New Roman"/>
                 <w:b w:val="0"/>
+                <w:i w:val="0"/>
                 <w:sz w:val="28"/>
               </w:rPr>
               <w:t>обратный прокси-сервер и балансировщик нагрузки</w:t>
@@ -3304,6 +3247,7 @@
               <w:rPr>
                 <w:rFonts w:ascii="Times New Roman" w:hAnsi="Times New Roman" w:eastAsia="Times New Roman"/>
                 <w:b w:val="0"/>
+                <w:i w:val="0"/>
                 <w:sz w:val="28"/>
               </w:rPr>
               <w:t>Redis</w:t>
@@ -3326,6 +3270,7 @@
               <w:rPr>
                 <w:rFonts w:ascii="Times New Roman" w:hAnsi="Times New Roman" w:eastAsia="Times New Roman"/>
                 <w:b w:val="0"/>
+                <w:i w:val="0"/>
                 <w:sz w:val="28"/>
               </w:rPr>
               <w:t>система хранения данных в памяти, используемая как backplane</w:t>
@@ -3350,6 +3295,7 @@
               <w:rPr>
                 <w:rFonts w:ascii="Times New Roman" w:hAnsi="Times New Roman" w:eastAsia="Times New Roman"/>
                 <w:b w:val="0"/>
+                <w:i w:val="0"/>
                 <w:sz w:val="28"/>
               </w:rPr>
               <w:t>SignalR</w:t>
@@ -3372,6 +3318,7 @@
               <w:rPr>
                 <w:rFonts w:ascii="Times New Roman" w:hAnsi="Times New Roman" w:eastAsia="Times New Roman"/>
                 <w:b w:val="0"/>
+                <w:i w:val="0"/>
                 <w:sz w:val="28"/>
               </w:rPr>
               <w:t>библиотека ASP.NET Core для real-time взаимодействия</w:t>
@@ -3396,6 +3343,7 @@
               <w:rPr>
                 <w:rFonts w:ascii="Times New Roman" w:hAnsi="Times New Roman" w:eastAsia="Times New Roman"/>
                 <w:b w:val="0"/>
+                <w:i w:val="0"/>
                 <w:sz w:val="28"/>
               </w:rPr>
               <w:t>UI</w:t>
@@ -3418,6 +3366,7 @@
               <w:rPr>
                 <w:rFonts w:ascii="Times New Roman" w:hAnsi="Times New Roman" w:eastAsia="Times New Roman"/>
                 <w:b w:val="0"/>
+                <w:i w:val="0"/>
                 <w:sz w:val="28"/>
               </w:rPr>
               <w:t>User Interface, пользовательский интерфейс</w:t>
@@ -3442,6 +3391,7 @@
               <w:rPr>
                 <w:rFonts w:ascii="Times New Roman" w:hAnsi="Times New Roman" w:eastAsia="Times New Roman"/>
                 <w:b w:val="0"/>
+                <w:i w:val="0"/>
                 <w:sz w:val="28"/>
               </w:rPr>
               <w:t>URL</w:t>
@@ -3464,6 +3414,7 @@
               <w:rPr>
                 <w:rFonts w:ascii="Times New Roman" w:hAnsi="Times New Roman" w:eastAsia="Times New Roman"/>
                 <w:b w:val="0"/>
+                <w:i w:val="0"/>
                 <w:sz w:val="28"/>
               </w:rPr>
               <w:t>Uniform Resource Locator, адрес ресурса</w:t>
@@ -3488,6 +3439,7 @@
               <w:rPr>
                 <w:rFonts w:ascii="Times New Roman" w:hAnsi="Times New Roman" w:eastAsia="Times New Roman"/>
                 <w:b w:val="0"/>
+                <w:i w:val="0"/>
                 <w:sz w:val="28"/>
               </w:rPr>
               <w:t>WebSocket</w:t>
@@ -3510,6 +3462,7 @@
               <w:rPr>
                 <w:rFonts w:ascii="Times New Roman" w:hAnsi="Times New Roman" w:eastAsia="Times New Roman"/>
                 <w:b w:val="0"/>
+                <w:i w:val="0"/>
                 <w:sz w:val="28"/>
               </w:rPr>
               <w:t>сетевой протокол двусторонней связи поверх одного TCP-соединения</w:t>
@@ -3534,6 +3487,7 @@
               <w:rPr>
                 <w:rFonts w:ascii="Times New Roman" w:hAnsi="Times New Roman" w:eastAsia="Times New Roman"/>
                 <w:b w:val="0"/>
+                <w:i w:val="0"/>
                 <w:sz w:val="28"/>
               </w:rPr>
               <w:t>БД</w:t>
@@ -3556,6 +3510,7 @@
               <w:rPr>
                 <w:rFonts w:ascii="Times New Roman" w:hAnsi="Times New Roman" w:eastAsia="Times New Roman"/>
                 <w:b w:val="0"/>
+                <w:i w:val="0"/>
                 <w:sz w:val="28"/>
               </w:rPr>
               <w:t>база данных</w:t>
@@ -3580,6 +3535,7 @@
               <w:rPr>
                 <w:rFonts w:ascii="Times New Roman" w:hAnsi="Times New Roman" w:eastAsia="Times New Roman"/>
                 <w:b w:val="0"/>
+                <w:i w:val="0"/>
                 <w:sz w:val="28"/>
               </w:rPr>
               <w:t>ИЗ</w:t>
@@ -3602,6 +3558,7 @@
               <w:rPr>
                 <w:rFonts w:ascii="Times New Roman" w:hAnsi="Times New Roman" w:eastAsia="Times New Roman"/>
                 <w:b w:val="0"/>
+                <w:i w:val="0"/>
                 <w:sz w:val="28"/>
               </w:rPr>
               <w:t>индивидуальное задание</w:t>
@@ -3626,6 +3583,7 @@
               <w:rPr>
                 <w:rFonts w:ascii="Times New Roman" w:hAnsi="Times New Roman" w:eastAsia="Times New Roman"/>
                 <w:b w:val="0"/>
+                <w:i w:val="0"/>
                 <w:sz w:val="28"/>
               </w:rPr>
               <w:t>ПО</w:t>
@@ -3648,6 +3606,7 @@
               <w:rPr>
                 <w:rFonts w:ascii="Times New Roman" w:hAnsi="Times New Roman" w:eastAsia="Times New Roman"/>
                 <w:b w:val="0"/>
+                <w:i w:val="0"/>
                 <w:sz w:val="28"/>
               </w:rPr>
               <w:t>программное обеспечение</w:t>
@@ -3800,9 +3759,9 @@
     </w:p>
     <w:p>
       <w:pPr>
-        <w:pStyle w:val="ListNumber"/>
-        <w:spacing w:line="360" w:lineRule="auto"/>
-        <w:ind w:left="709" w:hanging="283"/>
+        <w:spacing w:line="360" w:lineRule="auto" w:after="0"/>
+        <w:ind w:left="709" w:hanging="425"/>
+        <w:jc w:val="both"/>
       </w:pPr>
       <w:r>
         <w:rPr>
@@ -3811,14 +3770,14 @@
           <w:i w:val="0"/>
           <w:sz w:val="28"/>
         </w:rPr>
-        <w:t>Проанализировать предметную область real-time взаимодействия в системах совместной работы.</w:t>
-      </w:r>
-    </w:p>
-    <w:p>
-      <w:pPr>
-        <w:pStyle w:val="ListNumber"/>
-        <w:spacing w:line="360" w:lineRule="auto"/>
-        <w:ind w:left="709" w:hanging="283"/>
+        <w:t>1. Проанализировать предметную область real-time взаимодействия в системах совместной работы.</w:t>
+      </w:r>
+    </w:p>
+    <w:p>
+      <w:pPr>
+        <w:spacing w:line="360" w:lineRule="auto" w:after="0"/>
+        <w:ind w:left="709" w:hanging="425"/>
+        <w:jc w:val="both"/>
       </w:pPr>
       <w:r>
         <w:rPr>
@@ -3827,14 +3786,14 @@
           <w:i w:val="0"/>
           <w:sz w:val="28"/>
         </w:rPr>
-        <w:t>Рассмотреть ограничения single-node WebSocket-архитектуры при горизонтальном масштабировании.</w:t>
-      </w:r>
-    </w:p>
-    <w:p>
-      <w:pPr>
-        <w:pStyle w:val="ListNumber"/>
-        <w:spacing w:line="360" w:lineRule="auto"/>
-        <w:ind w:left="709" w:hanging="283"/>
+        <w:t>2. Рассмотреть ограничения single-node WebSocket-архитектуры при горизонтальном масштабировании.</w:t>
+      </w:r>
+    </w:p>
+    <w:p>
+      <w:pPr>
+        <w:spacing w:line="360" w:lineRule="auto" w:after="0"/>
+        <w:ind w:left="709" w:hanging="425"/>
+        <w:jc w:val="both"/>
       </w:pPr>
       <w:r>
         <w:rPr>
@@ -3843,14 +3802,14 @@
           <w:i w:val="0"/>
           <w:sz w:val="28"/>
         </w:rPr>
-        <w:t>Сравнить подходы к масштабированию real-time контура и обосновать выбор архитектуры.</w:t>
-      </w:r>
-    </w:p>
-    <w:p>
-      <w:pPr>
-        <w:pStyle w:val="ListNumber"/>
-        <w:spacing w:line="360" w:lineRule="auto"/>
-        <w:ind w:left="709" w:hanging="283"/>
+        <w:t>3. Сравнить подходы к масштабированию real-time контура и обосновать выбор архитектуры.</w:t>
+      </w:r>
+    </w:p>
+    <w:p>
+      <w:pPr>
+        <w:spacing w:line="360" w:lineRule="auto" w:after="0"/>
+        <w:ind w:left="709" w:hanging="425"/>
+        <w:jc w:val="both"/>
       </w:pPr>
       <w:r>
         <w:rPr>
@@ -3859,14 +3818,14 @@
           <w:i w:val="0"/>
           <w:sz w:val="28"/>
         </w:rPr>
-        <w:t>Проанализировать текущую реализацию real-time взаимодействия в целевой системе.</w:t>
-      </w:r>
-    </w:p>
-    <w:p>
-      <w:pPr>
-        <w:pStyle w:val="ListNumber"/>
-        <w:spacing w:line="360" w:lineRule="auto"/>
-        <w:ind w:left="709" w:hanging="283"/>
+        <w:t>4. Проанализировать текущую реализацию real-time взаимодействия в целевой системе.</w:t>
+      </w:r>
+    </w:p>
+    <w:p>
+      <w:pPr>
+        <w:spacing w:line="360" w:lineRule="auto" w:after="0"/>
+        <w:ind w:left="709" w:hanging="425"/>
+        <w:jc w:val="both"/>
       </w:pPr>
       <w:r>
         <w:rPr>
@@ -3875,14 +3834,14 @@
           <w:i w:val="0"/>
           <w:sz w:val="28"/>
         </w:rPr>
-        <w:t>Спроектировать масштабируемый real-time контур с несколькими экземплярами backend-сервиса.</w:t>
-      </w:r>
-    </w:p>
-    <w:p>
-      <w:pPr>
-        <w:pStyle w:val="ListNumber"/>
-        <w:spacing w:line="360" w:lineRule="auto"/>
-        <w:ind w:left="709" w:hanging="283"/>
+        <w:t>5. Спроектировать масштабируемый real-time контур с несколькими экземплярами backend-сервиса.</w:t>
+      </w:r>
+    </w:p>
+    <w:p>
+      <w:pPr>
+        <w:spacing w:line="360" w:lineRule="auto" w:after="0"/>
+        <w:ind w:left="709" w:hanging="425"/>
+        <w:jc w:val="both"/>
       </w:pPr>
       <w:r>
         <w:rPr>
@@ -3891,14 +3850,14 @@
           <w:i w:val="0"/>
           <w:sz w:val="28"/>
         </w:rPr>
-        <w:t>Реализовать выбранное решение в целевой системе.</w:t>
-      </w:r>
-    </w:p>
-    <w:p>
-      <w:pPr>
-        <w:pStyle w:val="ListNumber"/>
-        <w:spacing w:line="360" w:lineRule="auto"/>
-        <w:ind w:left="709" w:hanging="283"/>
+        <w:t>6. Реализовать выбранное решение в целевой системе.</w:t>
+      </w:r>
+    </w:p>
+    <w:p>
+      <w:pPr>
+        <w:spacing w:line="360" w:lineRule="auto" w:after="0"/>
+        <w:ind w:left="709" w:hanging="425"/>
+        <w:jc w:val="both"/>
       </w:pPr>
       <w:r>
         <w:rPr>
@@ -3907,14 +3866,14 @@
           <w:i w:val="0"/>
           <w:sz w:val="28"/>
         </w:rPr>
-        <w:t>Подготовить минимальный воспроизводимый стенд для проверки результата.</w:t>
-      </w:r>
-    </w:p>
-    <w:p>
-      <w:pPr>
-        <w:pStyle w:val="ListNumber"/>
-        <w:spacing w:line="360" w:lineRule="auto"/>
-        <w:ind w:left="709" w:hanging="283"/>
+        <w:t>7. Подготовить минимальный воспроизводимый стенд для проверки результата.</w:t>
+      </w:r>
+    </w:p>
+    <w:p>
+      <w:pPr>
+        <w:spacing w:line="360" w:lineRule="auto" w:after="0"/>
+        <w:ind w:left="709" w:hanging="425"/>
+        <w:jc w:val="both"/>
       </w:pPr>
       <w:r>
         <w:rPr>
@@ -3923,14 +3882,14 @@
           <w:i w:val="0"/>
           <w:sz w:val="28"/>
         </w:rPr>
-        <w:t>Провести испытания в режимах с межузловой доставкой и без нее.</w:t>
-      </w:r>
-    </w:p>
-    <w:p>
-      <w:pPr>
-        <w:pStyle w:val="ListNumber"/>
-        <w:spacing w:line="360" w:lineRule="auto"/>
-        <w:ind w:left="709" w:hanging="283"/>
+        <w:t>8. Провести испытания в режимах с межузловой доставкой и без нее.</w:t>
+      </w:r>
+    </w:p>
+    <w:p>
+      <w:pPr>
+        <w:spacing w:line="360" w:lineRule="auto" w:after="0"/>
+        <w:ind w:left="709" w:hanging="425"/>
+        <w:jc w:val="both"/>
       </w:pPr>
       <w:r>
         <w:rPr>
@@ -3939,7 +3898,7 @@
           <w:i w:val="0"/>
           <w:sz w:val="28"/>
         </w:rPr>
-        <w:t>Оценить результаты и сформулировать вывод об устранении ограничения single-node архитектуры.</w:t>
+        <w:t>9. Оценить результаты и сформулировать вывод об устранении ограничения single-node архитектуры.</w:t>
       </w:r>
     </w:p>
     <w:p>
@@ -3955,7 +3914,7 @@
           <w:i w:val="0"/>
           <w:sz w:val="28"/>
         </w:rPr>
-        <w:t>Результатом практики является в инженерно-исследовательском обосновании и экспериментальной проверке распределенного real-time контура для системы отслеживания задач. В рамках практики не разрабатывался новый сетевой протокол, но была выполнена авторская композиция архитектурного решения, включающая SignalR, несколько экземпляров backend-сервиса, балансировщик, Redis backplane, диагностический контур и воспроизводимую программу испытаний [2], [4], [8], [10].</w:t>
+        <w:t>Результатом практики является инженерно-исследовательское обоснование и экспериментальная проверка распределенного real-time контура для системы отслеживания задач. В рамках практики не разрабатывался новый сетевой протокол, но была выполнена авторская композиция архитектурного решения, включающая SignalR, несколько экземпляров backend-сервиса, балансировщик, Redis backplane, диагностический контур и воспроизводимую программу испытаний [2], [4], [8], [10].</w:t>
       </w:r>
     </w:p>
     <w:p>
@@ -3975,27 +3934,6 @@
       </w:r>
     </w:p>
     <w:p>
-      <w:r>
-        <w:br w:type="page"/>
-      </w:r>
-    </w:p>
-    <w:p>
-      <w:pPr>
-        <w:pStyle w:val="Heading1"/>
-      </w:pPr>
-      <w:r>
-        <w:t>1. Анализ предметной области и существующих подходов</w:t>
-      </w:r>
-    </w:p>
-    <w:p>
-      <w:pPr>
-        <w:pStyle w:val="Heading2"/>
-      </w:pPr>
-      <w:r>
-        <w:t>1.1 Real-time взаимодействие в системах отслеживания задач</w:t>
-      </w:r>
-    </w:p>
-    <w:p>
       <w:pPr>
         <w:spacing w:line="360" w:lineRule="auto"/>
         <w:ind w:firstLine="709"/>
@@ -4008,7 +3946,28 @@
           <w:i w:val="0"/>
           <w:sz w:val="28"/>
         </w:rPr>
-        <w:t>Системы отслеживания задач предназначены для фиксации, распределения и контроля выполнения работ. В таких системах ключевыми сущностями являются задачи, отчеты, комментарии, вложения, исполнители, статусы, команды и рабочие пространства. В отличие от статичных справочников, эти сущности часто изменяются несколькими пользователями в течение короткого времени. Один участник может изменить статус задачи, второй добавить комментарий, третий прикрепить файл или уточнить шаг воспроизведения ошибки [16], [18].</w:t>
+        <w:t>Структура отчёта и оформление выполнены с учётом ГОСТ 7.32-2017 [11] и ГОСТ Р 7.0.100-2018 [12], а также методических требований кафедры к подготовке отчёта по практике [13].</w:t>
+      </w:r>
+    </w:p>
+    <w:p>
+      <w:r>
+        <w:br w:type="page"/>
+      </w:r>
+    </w:p>
+    <w:p>
+      <w:pPr>
+        <w:pStyle w:val="Heading1"/>
+      </w:pPr>
+      <w:r>
+        <w:t>1. Анализ предметной области и существующих подходов</w:t>
+      </w:r>
+    </w:p>
+    <w:p>
+      <w:pPr>
+        <w:pStyle w:val="Heading2"/>
+      </w:pPr>
+      <w:r>
+        <w:t>1.1 Real-time взаимодействие в системах отслеживания задач</w:t>
       </w:r>
     </w:p>
     <w:p>
@@ -4024,7 +3983,7 @@
           <w:i w:val="0"/>
           <w:sz w:val="28"/>
         </w:rPr>
-        <w:t>Если изменения становятся видимыми только после ручного обновления страницы, у пользователей возникает рассогласованное представление о состоянии системы. Это приводит к дублированию действий, работе с устаревшими данными и дополнительным коммуникационным издержкам. Поэтому для систем отслеживания задач важна поддержка согласованного представления о состоянии объекта: пользователь должен понимать, что объект уже изменился, кто присоединился к работе, какие комментарии или вложения появились и какие поля были обновлены [15], [19].</w:t>
+        <w:t>Системы отслеживания задач предназначены для фиксации, распределения и контроля выполнения работ. В таких системах ключевыми сущностями являются задачи, отчеты, комментарии, вложения, исполнители, статусы, команды и рабочие пространства. В отличие от статичных справочников, эти сущности часто изменяются несколькими пользователями в течение короткого времени. Один участник может изменить статус задачи, второй добавить комментарий, третий прикрепить файл или уточнить шаг воспроизведения ошибки [16], [18].</w:t>
       </w:r>
     </w:p>
     <w:p>
@@ -4040,15 +3999,7 @@
           <w:i w:val="0"/>
           <w:sz w:val="28"/>
         </w:rPr>
-        <w:t>В контексте данной работы real-time интерфейс определяется как интерфейсный и серверный контур, обеспечивающий оперативное распространение событий изменения сущностей между клиентами. Такой контур включает клиентское WebSocket-соединение, серверный хаб, модель подписок, механизм групп, доставку событий и обработку переподключений [1], [2], [5], [6], [14].</w:t>
-      </w:r>
-    </w:p>
-    <w:p>
-      <w:pPr>
-        <w:pStyle w:val="Heading2"/>
-      </w:pPr>
-      <w:r>
-        <w:t>1.2 WebSocket и SignalR как основа real-time контура</w:t>
+        <w:t>Если изменения становятся видимыми только после ручного обновления страницы, у пользователей возникает рассогласованное представление о состоянии системы. Это приводит к дублированию действий, работе с устаревшими данными и дополнительным коммуникационным издержкам. Поэтому для систем отслеживания задач важна поддержка согласованного представления о состоянии объекта: пользователь должен понимать, что объект уже изменился, кто присоединился к работе, какие комментарии или вложения появились и какие поля были обновлены [15], [19].</w:t>
       </w:r>
     </w:p>
     <w:p>
@@ -4064,7 +4015,15 @@
           <w:i w:val="0"/>
           <w:sz w:val="28"/>
         </w:rPr>
-        <w:t>WebSocket обеспечивает двусторонний обмен данными поверх одного длительно открытого соединения. Для web-интерфейсов совместной работы это удобнее, чем периодический polling, поскольку сервер может самостоятельно отправлять клиентам события сразу после изменения состояния. В платформе ASP.NET Core над WebSocket часто используется SignalR. Он предоставляет более высокоуровневую модель: серверные хабы, клиентские методы, группы, отправку событий конкретным пользователям или всем участникам группы [1], [2].</w:t>
+        <w:t>В контексте данной работы real-time интерфейс определяется как интерфейсный и серверный контур, обеспечивающий оперативное распространение событий изменения сущностей между клиентами. Такой контур включает клиентское WebSocket-соединение, серверный хаб, модель подписок, механизм групп, доставку событий и обработку переподключений [1], [2], [5], [6], [14].</w:t>
+      </w:r>
+    </w:p>
+    <w:p>
+      <w:pPr>
+        <w:pStyle w:val="Heading2"/>
+      </w:pPr>
+      <w:r>
+        <w:t>1.2 WebSocket и SignalR как основа real-time контура</w:t>
       </w:r>
     </w:p>
     <w:p>
@@ -4080,7 +4039,7 @@
           <w:i w:val="0"/>
           <w:sz w:val="28"/>
         </w:rPr>
-        <w:t>Для системы отслеживания задач особенно полезна модель групп. Клиент может вступить в группу, соответствующую конкретному отчету или задаче, после чего сервер отправляет события изменения только заинтересованным участникам. Такой подход снижает лишний трафик и делает real-time контур предметно ориентированным: событие связано не с абстрактным каналом, а с конкретной сущностью системы [5].</w:t>
+        <w:t>WebSocket обеспечивает двусторонний обмен данными поверх одного длительно открытого соединения. Для web-интерфейсов совместной работы это удобнее, чем периодический polling, поскольку сервер может самостоятельно отправлять клиентам события сразу после изменения состояния. В платформе ASP.NET Core над WebSocket часто используется SignalR. Он предоставляет более высокоуровневую модель: серверные хабы, клиентские методы, группы, отправку событий конкретным пользователям или всем участникам группы [1], [2].</w:t>
       </w:r>
     </w:p>
     <w:p>
@@ -4096,15 +4055,7 @@
           <w:i w:val="0"/>
           <w:sz w:val="28"/>
         </w:rPr>
-        <w:t>В то же время группы SignalR являются оперативным механизмом доставки, а не долговременным источником истины. Сведения о членстве соединений в группах хранятся в памяти серверного процесса и не должны использоваться как единственная база для авторизации, аудита или долговременного учета присутствия. Это обстоятельство важно при проектировании масштабируемого контура, поскольку при переподключении клиент должен заново восстановить необходимые подписки [5], [6].</w:t>
-      </w:r>
-    </w:p>
-    <w:p>
-      <w:pPr>
-        <w:pStyle w:val="Heading2"/>
-      </w:pPr>
-      <w:r>
-        <w:t>1.3 Ограничение single-node WebSocket-архитектуры</w:t>
+        <w:t>Для системы отслеживания задач особенно полезна модель групп. Клиент может вступить в группу, соответствующую конкретному отчету или задаче, после чего сервер отправляет события изменения только заинтересованным участникам. Такой подход снижает лишний трафик и делает real-time контур предметно ориентированным: событие связано не с абстрактным каналом, а с конкретной сущностью системы [5].</w:t>
       </w:r>
     </w:p>
     <w:p>
@@ -4120,7 +4071,15 @@
           <w:i w:val="0"/>
           <w:sz w:val="28"/>
         </w:rPr>
-        <w:t>Single-node архитектура означает, что все WebSocket-соединения обслуживаются одним экземпляром backend-сервиса. Такой вариант прост в реализации и достаточен для раннего прототипа. Сервер хранит локальную таблицу активных соединений и групп, а при изменении сущности отправляет событие клиентам, подключенным к этому же процессу [3], [5].</w:t>
+        <w:t>В то же время группы SignalR являются оперативным механизмом доставки, а не долговременным источником истины. Сведения о членстве соединений в группах хранятся в памяти серверного процесса и не должны использоваться как единственная база для авторизации, аудита или долговременного учета присутствия. Это обстоятельство важно при проектировании масштабируемого контура, поскольку при переподключении клиент должен заново восстановить необходимые подписки [5], [6].</w:t>
+      </w:r>
+    </w:p>
+    <w:p>
+      <w:pPr>
+        <w:pStyle w:val="Heading2"/>
+      </w:pPr>
+      <w:r>
+        <w:t>1.3 Ограничение single-node WebSocket-архитектуры</w:t>
       </w:r>
     </w:p>
     <w:p>
@@ -4136,43 +4095,7 @@
           <w:i w:val="0"/>
           <w:sz w:val="28"/>
         </w:rPr>
-        <w:t xml:space="preserve">Проблема возникает при горизонтальном масштабировании. Если приложение запускается в нескольких экземплярах, входящий трафик распределяется между ними балансировщиком. Клиент A может оказаться подключенным к </w:t>
-      </w:r>
-      <w:r>
-        <w:rPr>
-          <w:rFonts w:ascii="Courier New" w:hAnsi="Courier New" w:eastAsia="Courier New"/>
-          <w:b w:val="0"/>
-          <w:i w:val="0"/>
-          <w:sz w:val="28"/>
-        </w:rPr>
-        <w:t>app-api-1</w:t>
-      </w:r>
-      <w:r>
-        <w:rPr>
-          <w:rFonts w:ascii="Times New Roman" w:hAnsi="Times New Roman" w:eastAsia="Times New Roman"/>
-          <w:b w:val="0"/>
-          <w:i w:val="0"/>
-          <w:sz w:val="28"/>
-        </w:rPr>
-        <w:t xml:space="preserve">, а клиент B — к </w:t>
-      </w:r>
-      <w:r>
-        <w:rPr>
-          <w:rFonts w:ascii="Courier New" w:hAnsi="Courier New" w:eastAsia="Courier New"/>
-          <w:b w:val="0"/>
-          <w:i w:val="0"/>
-          <w:sz w:val="28"/>
-        </w:rPr>
-        <w:t>app-api-2</w:t>
-      </w:r>
-      <w:r>
-        <w:rPr>
-          <w:rFonts w:ascii="Times New Roman" w:hAnsi="Times New Roman" w:eastAsia="Times New Roman"/>
-          <w:b w:val="0"/>
-          <w:i w:val="0"/>
-          <w:sz w:val="28"/>
-        </w:rPr>
-        <w:t>. Если событие изменения отчета создано на первом узле, то без межузловой синхронизации второй узел не узнает, что нужно отправить событие своим клиентам. Формально система уже имеет два backend-экземпляра, но real-time пространство фрагментируется на независимые острова [3], [10].</w:t>
+        <w:t>Single-node архитектура означает, что все WebSocket-соединения обслуживаются одним экземпляром backend-сервиса. Такой вариант прост в реализации и достаточен для раннего прототипа. Сервер хранит локальную таблицу активных соединений и групп, а при изменении сущности отправляет событие клиентам, подключенным к этому же процессу [3], [5].</w:t>
       </w:r>
     </w:p>
     <w:p>
@@ -4188,15 +4111,43 @@
           <w:i w:val="0"/>
           <w:sz w:val="28"/>
         </w:rPr>
-        <w:t>Для системы совместной работы это является функциональным дефектом. Пользователь не обязан знать, через какой серверный процесс он подключен. Ожидаемое свойство интерфейса состоит в том, что изменение сущности доставляется всем заинтересованным участникам. Следовательно, поддержка горизонтального масштабирования WebSocket-соединений должна включать не только запуск нескольких процессов, но и межузловую доставку событий [3], [15].</w:t>
-      </w:r>
-    </w:p>
-    <w:p>
-      <w:pPr>
-        <w:pStyle w:val="Heading2"/>
-      </w:pPr>
-      <w:r>
-        <w:t>1.4 Сравнение подходов к масштабированию</w:t>
+        <w:t xml:space="preserve">Проблема возникает при горизонтальном масштабировании. Если приложение запускается в нескольких экземплярах, входящий трафик распределяется между ними балансировщиком. Клиент A может оказаться подключенным к </w:t>
+      </w:r>
+      <w:r>
+        <w:rPr>
+          <w:rFonts w:ascii="Courier New" w:hAnsi="Courier New" w:eastAsia="Courier New"/>
+          <w:b w:val="0"/>
+          <w:i w:val="0"/>
+          <w:sz w:val="28"/>
+        </w:rPr>
+        <w:t>app-api-1</w:t>
+      </w:r>
+      <w:r>
+        <w:rPr>
+          <w:rFonts w:ascii="Times New Roman" w:hAnsi="Times New Roman" w:eastAsia="Times New Roman"/>
+          <w:b w:val="0"/>
+          <w:i w:val="0"/>
+          <w:sz w:val="28"/>
+        </w:rPr>
+        <w:t xml:space="preserve">, а клиент B — к </w:t>
+      </w:r>
+      <w:r>
+        <w:rPr>
+          <w:rFonts w:ascii="Courier New" w:hAnsi="Courier New" w:eastAsia="Courier New"/>
+          <w:b w:val="0"/>
+          <w:i w:val="0"/>
+          <w:sz w:val="28"/>
+        </w:rPr>
+        <w:t>app-api-2</w:t>
+      </w:r>
+      <w:r>
+        <w:rPr>
+          <w:rFonts w:ascii="Times New Roman" w:hAnsi="Times New Roman" w:eastAsia="Times New Roman"/>
+          <w:b w:val="0"/>
+          <w:i w:val="0"/>
+          <w:sz w:val="28"/>
+        </w:rPr>
+        <w:t>. Если событие изменения отчета создано на первом узле, то без межузловой синхронизации второй узел не узнает, что нужно отправить событие своим клиентам. Формально система уже имеет два backend-экземпляра, но real-time пространство фрагментируется на независимые острова [3], [10].</w:t>
       </w:r>
     </w:p>
     <w:p>
@@ -4212,11 +4163,37 @@
           <w:i w:val="0"/>
           <w:sz w:val="28"/>
         </w:rPr>
+        <w:t>Для системы совместной работы это является функциональным дефектом. Пользователь не обязан знать, через какой серверный процесс он подключен. Ожидаемое свойство интерфейса состоит в том, что изменение сущности доставляется всем заинтересованным участникам. Следовательно, поддержка горизонтального масштабирования WebSocket-соединений должна включать не только запуск нескольких процессов, но и межузловую доставку событий [3], [15].</w:t>
+      </w:r>
+    </w:p>
+    <w:p>
+      <w:pPr>
+        <w:pStyle w:val="Heading2"/>
+      </w:pPr>
+      <w:r>
+        <w:t>1.4 Сравнение подходов к масштабированию</w:t>
+      </w:r>
+    </w:p>
+    <w:p>
+      <w:pPr>
+        <w:spacing w:line="360" w:lineRule="auto"/>
+        <w:ind w:firstLine="709"/>
+        <w:jc w:val="both"/>
+      </w:pPr>
+      <w:r>
+        <w:rPr>
+          <w:rFonts w:ascii="Times New Roman" w:hAnsi="Times New Roman" w:eastAsia="Times New Roman"/>
+          <w:b w:val="0"/>
+          <w:i w:val="0"/>
+          <w:sz w:val="28"/>
+        </w:rPr>
         <w:t>В рамках работы рассматривались несколько подходов к построению масштабируемого real-time контура [3], [4], [7], [9], [10].</w:t>
       </w:r>
     </w:p>
     <w:p>
       <w:pPr>
+        <w:keepNext/>
+        <w:spacing w:after="40"/>
         <w:ind w:firstLine="0"/>
         <w:jc w:val="left"/>
       </w:pPr>
@@ -4244,6 +4221,9 @@
         <w:gridCol w:w="2422"/>
       </w:tblGrid>
       <w:tr>
+        <w:trPr>
+          <w:tblHeader w:val="true"/>
+        </w:trPr>
         <w:tc>
           <w:tcPr>
             <w:tcW w:type="dxa" w:w="2422"/>
@@ -4260,6 +4240,7 @@
               <w:rPr>
                 <w:rFonts w:ascii="Times New Roman" w:hAnsi="Times New Roman" w:eastAsia="Times New Roman"/>
                 <w:b/>
+                <w:i w:val="0"/>
                 <w:sz w:val="22"/>
               </w:rPr>
               <w:t>Подход</w:t>
@@ -4282,6 +4263,7 @@
               <w:rPr>
                 <w:rFonts w:ascii="Times New Roman" w:hAnsi="Times New Roman" w:eastAsia="Times New Roman"/>
                 <w:b/>
+                <w:i w:val="0"/>
                 <w:sz w:val="22"/>
               </w:rPr>
               <w:t>Межузловая доставка событий</w:t>
@@ -4304,6 +4286,7 @@
               <w:rPr>
                 <w:rFonts w:ascii="Times New Roman" w:hAnsi="Times New Roman" w:eastAsia="Times New Roman"/>
                 <w:b/>
+                <w:i w:val="0"/>
                 <w:sz w:val="22"/>
               </w:rPr>
               <w:t>Сложность внедрения</w:t>
@@ -4326,6 +4309,7 @@
               <w:rPr>
                 <w:rFonts w:ascii="Times New Roman" w:hAnsi="Times New Roman" w:eastAsia="Times New Roman"/>
                 <w:b/>
+                <w:i w:val="0"/>
                 <w:sz w:val="22"/>
               </w:rPr>
               <w:t>Ограничения</w:t>
@@ -4350,6 +4334,7 @@
               <w:rPr>
                 <w:rFonts w:ascii="Times New Roman" w:hAnsi="Times New Roman" w:eastAsia="Times New Roman"/>
                 <w:b w:val="0"/>
+                <w:i w:val="0"/>
                 <w:sz w:val="22"/>
               </w:rPr>
               <w:t>Один экземпляр backend-сервиса</w:t>
@@ -4372,6 +4357,7 @@
               <w:rPr>
                 <w:rFonts w:ascii="Times New Roman" w:hAnsi="Times New Roman" w:eastAsia="Times New Roman"/>
                 <w:b w:val="0"/>
+                <w:i w:val="0"/>
                 <w:sz w:val="22"/>
               </w:rPr>
               <w:t>Нет</w:t>
@@ -4394,6 +4380,7 @@
               <w:rPr>
                 <w:rFonts w:ascii="Times New Roman" w:hAnsi="Times New Roman" w:eastAsia="Times New Roman"/>
                 <w:b w:val="0"/>
+                <w:i w:val="0"/>
                 <w:sz w:val="22"/>
               </w:rPr>
               <w:t>Низкая</w:t>
@@ -4416,6 +4403,7 @@
               <w:rPr>
                 <w:rFonts w:ascii="Times New Roman" w:hAnsi="Times New Roman" w:eastAsia="Times New Roman"/>
                 <w:b w:val="0"/>
+                <w:i w:val="0"/>
                 <w:sz w:val="22"/>
               </w:rPr>
               <w:t>Нет горизонтального масштабирования, один узел является точкой отказа</w:t>
@@ -4440,6 +4428,7 @@
               <w:rPr>
                 <w:rFonts w:ascii="Times New Roman" w:hAnsi="Times New Roman" w:eastAsia="Times New Roman"/>
                 <w:b w:val="0"/>
+                <w:i w:val="0"/>
                 <w:sz w:val="22"/>
               </w:rPr>
               <w:t>Несколько экземпляров без backplane</w:t>
@@ -4462,6 +4451,7 @@
               <w:rPr>
                 <w:rFonts w:ascii="Times New Roman" w:hAnsi="Times New Roman" w:eastAsia="Times New Roman"/>
                 <w:b w:val="0"/>
+                <w:i w:val="0"/>
                 <w:sz w:val="22"/>
               </w:rPr>
               <w:t>Нет</w:t>
@@ -4484,6 +4474,7 @@
               <w:rPr>
                 <w:rFonts w:ascii="Times New Roman" w:hAnsi="Times New Roman" w:eastAsia="Times New Roman"/>
                 <w:b w:val="0"/>
+                <w:i w:val="0"/>
                 <w:sz w:val="22"/>
               </w:rPr>
               <w:t>Низкая или средняя</w:t>
@@ -4506,6 +4497,7 @@
               <w:rPr>
                 <w:rFonts w:ascii="Times New Roman" w:hAnsi="Times New Roman" w:eastAsia="Times New Roman"/>
                 <w:b w:val="0"/>
+                <w:i w:val="0"/>
                 <w:sz w:val="22"/>
               </w:rPr>
               <w:t>Real-time пространство фрагментируется по узлам</w:t>
@@ -4530,6 +4522,7 @@
               <w:rPr>
                 <w:rFonts w:ascii="Times New Roman" w:hAnsi="Times New Roman" w:eastAsia="Times New Roman"/>
                 <w:b w:val="0"/>
+                <w:i w:val="0"/>
                 <w:sz w:val="22"/>
               </w:rPr>
               <w:t>Sticky sessions</w:t>
@@ -4552,6 +4545,7 @@
               <w:rPr>
                 <w:rFonts w:ascii="Times New Roman" w:hAnsi="Times New Roman" w:eastAsia="Times New Roman"/>
                 <w:b w:val="0"/>
+                <w:i w:val="0"/>
                 <w:sz w:val="22"/>
               </w:rPr>
               <w:t>Нет, если нет отдельной синхронизации</w:t>
@@ -4574,6 +4568,7 @@
               <w:rPr>
                 <w:rFonts w:ascii="Times New Roman" w:hAnsi="Times New Roman" w:eastAsia="Times New Roman"/>
                 <w:b w:val="0"/>
+                <w:i w:val="0"/>
                 <w:sz w:val="22"/>
               </w:rPr>
               <w:t>Средняя</w:t>
@@ -4596,6 +4591,7 @@
               <w:rPr>
                 <w:rFonts w:ascii="Times New Roman" w:hAnsi="Times New Roman" w:eastAsia="Times New Roman"/>
                 <w:b w:val="0"/>
+                <w:i w:val="0"/>
                 <w:sz w:val="22"/>
               </w:rPr>
               <w:t>Удерживает клиента на узле, но не доставляет события другим узлам</w:t>
@@ -4620,6 +4616,7 @@
               <w:rPr>
                 <w:rFonts w:ascii="Times New Roman" w:hAnsi="Times New Roman" w:eastAsia="Times New Roman"/>
                 <w:b w:val="0"/>
+                <w:i w:val="0"/>
                 <w:sz w:val="22"/>
               </w:rPr>
               <w:t>Redis backplane для SignalR</w:t>
@@ -4642,6 +4639,7 @@
               <w:rPr>
                 <w:rFonts w:ascii="Times New Roman" w:hAnsi="Times New Roman" w:eastAsia="Times New Roman"/>
                 <w:b w:val="0"/>
+                <w:i w:val="0"/>
                 <w:sz w:val="22"/>
               </w:rPr>
               <w:t>Да</w:t>
@@ -4664,6 +4662,7 @@
               <w:rPr>
                 <w:rFonts w:ascii="Times New Roman" w:hAnsi="Times New Roman" w:eastAsia="Times New Roman"/>
                 <w:b w:val="0"/>
+                <w:i w:val="0"/>
                 <w:sz w:val="22"/>
               </w:rPr>
               <w:t>Средняя</w:t>
@@ -4686,6 +4685,7 @@
               <w:rPr>
                 <w:rFonts w:ascii="Times New Roman" w:hAnsi="Times New Roman" w:eastAsia="Times New Roman"/>
                 <w:b w:val="0"/>
+                <w:i w:val="0"/>
                 <w:sz w:val="22"/>
               </w:rPr>
               <w:t>Подходит для transient UI-событий, зависит от Redis и сетевой задержки</w:t>
@@ -4710,6 +4710,7 @@
               <w:rPr>
                 <w:rFonts w:ascii="Times New Roman" w:hAnsi="Times New Roman" w:eastAsia="Times New Roman"/>
                 <w:b w:val="0"/>
+                <w:i w:val="0"/>
                 <w:sz w:val="22"/>
               </w:rPr>
               <w:t>Broker/event bus</w:t>
@@ -4732,6 +4733,7 @@
               <w:rPr>
                 <w:rFonts w:ascii="Times New Roman" w:hAnsi="Times New Roman" w:eastAsia="Times New Roman"/>
                 <w:b w:val="0"/>
+                <w:i w:val="0"/>
                 <w:sz w:val="22"/>
               </w:rPr>
               <w:t>Да</w:t>
@@ -4754,6 +4756,7 @@
               <w:rPr>
                 <w:rFonts w:ascii="Times New Roman" w:hAnsi="Times New Roman" w:eastAsia="Times New Roman"/>
                 <w:b w:val="0"/>
+                <w:i w:val="0"/>
                 <w:sz w:val="22"/>
               </w:rPr>
               <w:t>Высокая</w:t>
@@ -4776,6 +4779,7 @@
               <w:rPr>
                 <w:rFonts w:ascii="Times New Roman" w:hAnsi="Times New Roman" w:eastAsia="Times New Roman"/>
                 <w:b w:val="0"/>
+                <w:i w:val="0"/>
                 <w:sz w:val="22"/>
               </w:rPr>
               <w:t>Требует проектирования схем событий, persistence и consumer-групп</w:t>
@@ -4800,6 +4804,7 @@
               <w:rPr>
                 <w:rFonts w:ascii="Times New Roman" w:hAnsi="Times New Roman" w:eastAsia="Times New Roman"/>
                 <w:b w:val="0"/>
+                <w:i w:val="0"/>
                 <w:sz w:val="22"/>
               </w:rPr>
               <w:t>Managed real-time service</w:t>
@@ -4822,6 +4827,7 @@
               <w:rPr>
                 <w:rFonts w:ascii="Times New Roman" w:hAnsi="Times New Roman" w:eastAsia="Times New Roman"/>
                 <w:b w:val="0"/>
+                <w:i w:val="0"/>
                 <w:sz w:val="22"/>
               </w:rPr>
               <w:t>Да</w:t>
@@ -4844,6 +4850,7 @@
               <w:rPr>
                 <w:rFonts w:ascii="Times New Roman" w:hAnsi="Times New Roman" w:eastAsia="Times New Roman"/>
                 <w:b w:val="0"/>
+                <w:i w:val="0"/>
                 <w:sz w:val="22"/>
               </w:rPr>
               <w:t>Средняя</w:t>
@@ -4866,6 +4873,7 @@
               <w:rPr>
                 <w:rFonts w:ascii="Times New Roman" w:hAnsi="Times New Roman" w:eastAsia="Times New Roman"/>
                 <w:b w:val="0"/>
+                <w:i w:val="0"/>
                 <w:sz w:val="22"/>
               </w:rPr>
               <w:t>Уменьшает контроль над self-hosted серверным контуром</w:t>
@@ -5139,9 +5147,9 @@
     </w:p>
     <w:p>
       <w:pPr>
-        <w:pStyle w:val="ListNumber"/>
-        <w:spacing w:line="360" w:lineRule="auto"/>
-        <w:ind w:left="709" w:hanging="283"/>
+        <w:spacing w:line="360" w:lineRule="auto" w:after="0"/>
+        <w:ind w:left="709" w:hanging="425"/>
+        <w:jc w:val="both"/>
       </w:pPr>
       <w:r>
         <w:rPr>
@@ -5150,14 +5158,14 @@
           <w:i w:val="0"/>
           <w:sz w:val="28"/>
         </w:rPr>
-        <w:t>Система должна поддерживать подключение клиентов к SignalR-хабу через reverse proxy.</w:t>
-      </w:r>
-    </w:p>
-    <w:p>
-      <w:pPr>
-        <w:pStyle w:val="ListNumber"/>
-        <w:spacing w:line="360" w:lineRule="auto"/>
-        <w:ind w:left="709" w:hanging="283"/>
+        <w:t>1. Система должна поддерживать подключение клиентов к SignalR-хабу через reverse proxy.</w:t>
+      </w:r>
+    </w:p>
+    <w:p>
+      <w:pPr>
+        <w:spacing w:line="360" w:lineRule="auto" w:after="0"/>
+        <w:ind w:left="709" w:hanging="425"/>
+        <w:jc w:val="both"/>
       </w:pPr>
       <w:r>
         <w:rPr>
@@ -5166,14 +5174,14 @@
           <w:i w:val="0"/>
           <w:sz w:val="28"/>
         </w:rPr>
-        <w:t>Клиент должен иметь возможность вступить в группу, соответствующую отчету.</w:t>
-      </w:r>
-    </w:p>
-    <w:p>
-      <w:pPr>
-        <w:pStyle w:val="ListNumber"/>
-        <w:spacing w:line="360" w:lineRule="auto"/>
-        <w:ind w:left="709" w:hanging="283"/>
+        <w:t>2. Клиент должен иметь возможность вступить в группу, соответствующую отчету.</w:t>
+      </w:r>
+    </w:p>
+    <w:p>
+      <w:pPr>
+        <w:spacing w:line="360" w:lineRule="auto" w:after="0"/>
+        <w:ind w:left="709" w:hanging="425"/>
+        <w:jc w:val="both"/>
       </w:pPr>
       <w:r>
         <w:rPr>
@@ -5182,14 +5190,14 @@
           <w:i w:val="0"/>
           <w:sz w:val="28"/>
         </w:rPr>
-        <w:t>Изменения сущностей отчета должны доставляться всем клиентам, подписанным на группу.</w:t>
-      </w:r>
-    </w:p>
-    <w:p>
-      <w:pPr>
-        <w:pStyle w:val="ListNumber"/>
-        <w:spacing w:line="360" w:lineRule="auto"/>
-        <w:ind w:left="709" w:hanging="283"/>
+        <w:t>3. Изменения сущностей отчета должны доставляться всем клиентам, подписанным на группу.</w:t>
+      </w:r>
+    </w:p>
+    <w:p>
+      <w:pPr>
+        <w:spacing w:line="360" w:lineRule="auto" w:after="0"/>
+        <w:ind w:left="709" w:hanging="425"/>
+        <w:jc w:val="both"/>
       </w:pPr>
       <w:r>
         <w:rPr>
@@ -5198,14 +5206,14 @@
           <w:i w:val="0"/>
           <w:sz w:val="28"/>
         </w:rPr>
-        <w:t>Клиенты, подключенные к разным экземплярам backend-сервиса, должны получать одно и то же real-time событие.</w:t>
-      </w:r>
-    </w:p>
-    <w:p>
-      <w:pPr>
-        <w:pStyle w:val="ListNumber"/>
-        <w:spacing w:line="360" w:lineRule="auto"/>
-        <w:ind w:left="709" w:hanging="283"/>
+        <w:t>4. Клиенты, подключенные к разным экземплярам backend-сервиса, должны получать одно и то же real-time событие.</w:t>
+      </w:r>
+    </w:p>
+    <w:p>
+      <w:pPr>
+        <w:spacing w:line="360" w:lineRule="auto" w:after="0"/>
+        <w:ind w:left="709" w:hanging="425"/>
+        <w:jc w:val="both"/>
       </w:pPr>
       <w:r>
         <w:rPr>
@@ -5214,14 +5222,14 @@
           <w:i w:val="0"/>
           <w:sz w:val="28"/>
         </w:rPr>
-        <w:t>Клиент должен восстанавливать соединение после разрыва и повторно вступать в необходимые группы.</w:t>
-      </w:r>
-    </w:p>
-    <w:p>
-      <w:pPr>
-        <w:pStyle w:val="ListNumber"/>
-        <w:spacing w:line="360" w:lineRule="auto"/>
-        <w:ind w:left="709" w:hanging="283"/>
+        <w:t>5. Клиент должен восстанавливать соединение после разрыва и повторно вступать в необходимые группы.</w:t>
+      </w:r>
+    </w:p>
+    <w:p>
+      <w:pPr>
+        <w:spacing w:line="360" w:lineRule="auto" w:after="0"/>
+        <w:ind w:left="709" w:hanging="425"/>
+        <w:jc w:val="both"/>
       </w:pPr>
       <w:r>
         <w:rPr>
@@ -5230,7 +5238,43 @@
           <w:i w:val="0"/>
           <w:sz w:val="28"/>
         </w:rPr>
-        <w:t>Для демонстрации должен быть доступен диагностический способ определить `serverInstanceId` и `connectionId`.</w:t>
+        <w:t xml:space="preserve">6. Для демонстрации должен быть доступен диагностический способ определить </w:t>
+      </w:r>
+      <w:r>
+        <w:rPr>
+          <w:rFonts w:ascii="Courier New" w:hAnsi="Courier New" w:eastAsia="Courier New"/>
+          <w:b w:val="0"/>
+          <w:i w:val="0"/>
+          <w:sz w:val="28"/>
+        </w:rPr>
+        <w:t>serverInstanceId</w:t>
+      </w:r>
+      <w:r>
+        <w:rPr>
+          <w:rFonts w:ascii="Times New Roman" w:hAnsi="Times New Roman" w:eastAsia="Times New Roman"/>
+          <w:b w:val="0"/>
+          <w:i w:val="0"/>
+          <w:sz w:val="28"/>
+        </w:rPr>
+        <w:t xml:space="preserve"> и </w:t>
+      </w:r>
+      <w:r>
+        <w:rPr>
+          <w:rFonts w:ascii="Courier New" w:hAnsi="Courier New" w:eastAsia="Courier New"/>
+          <w:b w:val="0"/>
+          <w:i w:val="0"/>
+          <w:sz w:val="28"/>
+        </w:rPr>
+        <w:t>connectionId</w:t>
+      </w:r>
+      <w:r>
+        <w:rPr>
+          <w:rFonts w:ascii="Times New Roman" w:hAnsi="Times New Roman" w:eastAsia="Times New Roman"/>
+          <w:b w:val="0"/>
+          <w:i w:val="0"/>
+          <w:sz w:val="28"/>
+        </w:rPr>
+        <w:t>.</w:t>
       </w:r>
     </w:p>
     <w:p>
@@ -5251,9 +5295,9 @@
     </w:p>
     <w:p>
       <w:pPr>
-        <w:pStyle w:val="ListNumber"/>
-        <w:spacing w:line="360" w:lineRule="auto"/>
-        <w:ind w:left="709" w:hanging="283"/>
+        <w:spacing w:line="360" w:lineRule="auto" w:after="0"/>
+        <w:ind w:left="709" w:hanging="425"/>
+        <w:jc w:val="both"/>
       </w:pPr>
       <w:r>
         <w:rPr>
@@ -5262,14 +5306,14 @@
           <w:i w:val="0"/>
           <w:sz w:val="28"/>
         </w:rPr>
-        <w:t>Решение должно запускаться на минимальном локальном стенде.</w:t>
-      </w:r>
-    </w:p>
-    <w:p>
-      <w:pPr>
-        <w:pStyle w:val="ListNumber"/>
-        <w:spacing w:line="360" w:lineRule="auto"/>
-        <w:ind w:left="709" w:hanging="283"/>
+        <w:t>1. Решение должно запускаться на минимальном локальном стенде.</w:t>
+      </w:r>
+    </w:p>
+    <w:p>
+      <w:pPr>
+        <w:spacing w:line="360" w:lineRule="auto" w:after="0"/>
+        <w:ind w:left="709" w:hanging="425"/>
+        <w:jc w:val="both"/>
       </w:pPr>
       <w:r>
         <w:rPr>
@@ -5278,14 +5322,14 @@
           <w:i w:val="0"/>
           <w:sz w:val="28"/>
         </w:rPr>
-        <w:t>Подключение Redis backplane должно быть конфигурируемым через переменную окружения.</w:t>
-      </w:r>
-    </w:p>
-    <w:p>
-      <w:pPr>
-        <w:pStyle w:val="ListNumber"/>
-        <w:spacing w:line="360" w:lineRule="auto"/>
-        <w:ind w:left="709" w:hanging="283"/>
+        <w:t>2. Подключение Redis backplane должно быть конфигурируемым через переменную окружения.</w:t>
+      </w:r>
+    </w:p>
+    <w:p>
+      <w:pPr>
+        <w:spacing w:line="360" w:lineRule="auto" w:after="0"/>
+        <w:ind w:left="709" w:hanging="425"/>
+        <w:jc w:val="both"/>
       </w:pPr>
       <w:r>
         <w:rPr>
@@ -5294,14 +5338,14 @@
           <w:i w:val="0"/>
           <w:sz w:val="28"/>
         </w:rPr>
-        <w:t>Реализация должна сохранять совместимость существующих payload'ов real-time событий.</w:t>
-      </w:r>
-    </w:p>
-    <w:p>
-      <w:pPr>
-        <w:pStyle w:val="ListNumber"/>
-        <w:spacing w:line="360" w:lineRule="auto"/>
-        <w:ind w:left="709" w:hanging="283"/>
+        <w:t>3. Реализация должна сохранять совместимость существующих payload'ов real-time событий.</w:t>
+      </w:r>
+    </w:p>
+    <w:p>
+      <w:pPr>
+        <w:spacing w:line="360" w:lineRule="auto" w:after="0"/>
+        <w:ind w:left="709" w:hanging="425"/>
+        <w:jc w:val="both"/>
       </w:pPr>
       <w:r>
         <w:rPr>
@@ -5310,7 +5354,7 @@
           <w:i w:val="0"/>
           <w:sz w:val="28"/>
         </w:rPr>
-        <w:t>Доказательная база должна включать воспроизводимые сценарии испытаний.</w:t>
+        <w:t>4. Доказательная база должна включать воспроизводимые сценарии испытаний.</w:t>
       </w:r>
     </w:p>
     <w:p>
@@ -5318,7 +5362,7 @@
         <w:pStyle w:val="Heading2"/>
       </w:pPr>
       <w:r>
-        <w:t>2.4 Постановка задачи</w:t>
+        <w:t>2.4 Выбор платформы и инструментальных средств</w:t>
       </w:r>
     </w:p>
     <w:p>
@@ -5334,14 +5378,38 @@
           <w:i w:val="0"/>
           <w:sz w:val="28"/>
         </w:rPr>
+        <w:t>Для реализации масштабируемого real-time контура выбран следующий стек инструментальных средств. Серверный real-time слой строится на ASP.NET Core SignalR — стандартной библиотеке платформы для двунаправленного взаимодействия поверх WebSocket с моделью хабов и групп [2]. Для межузловой доставки событий между экземплярами серверного приложения используется Redis в роли backplane SignalR; такой подход рекомендован Microsoft и сохраняет существующую модель публикации событий в группы [4], [9]. Перед экземплярами backend-сервиса размещается nginx как reverse proxy и балансировщик HTTP- и WebSocket-трафика [10]. Воспроизводимый multi-instance стенд описывается через Docker Compose, что позволяет запускать оба исследовательских режима — с Redis backplane и без — на одном коде. Проверочный клиент реализован на Node.js: он не зависит от пользовательского интерфейса продукта и работает напрямую с серверным real-time контуром, что делает эксперимент компактным и сосредоточенным на проверяемом свойстве доставки.</w:t>
+      </w:r>
+    </w:p>
+    <w:p>
+      <w:pPr>
+        <w:pStyle w:val="Heading2"/>
+      </w:pPr>
+      <w:r>
+        <w:t>2.5 Постановка задачи</w:t>
+      </w:r>
+    </w:p>
+    <w:p>
+      <w:pPr>
+        <w:spacing w:line="360" w:lineRule="auto"/>
+        <w:ind w:firstLine="709"/>
+        <w:jc w:val="both"/>
+      </w:pPr>
+      <w:r>
+        <w:rPr>
+          <w:rFonts w:ascii="Times New Roman" w:hAnsi="Times New Roman" w:eastAsia="Times New Roman"/>
+          <w:b w:val="0"/>
+          <w:i w:val="0"/>
+          <w:sz w:val="28"/>
+        </w:rPr>
         <w:t>Необходимо разработать и проверить масштабируемый real-time контур для системы отслеживания задач. Для этого требуется:</w:t>
       </w:r>
     </w:p>
     <w:p>
       <w:pPr>
-        <w:pStyle w:val="ListNumber"/>
-        <w:spacing w:line="360" w:lineRule="auto"/>
-        <w:ind w:left="709" w:hanging="283"/>
+        <w:spacing w:line="360" w:lineRule="auto" w:after="0"/>
+        <w:ind w:left="709" w:hanging="425"/>
+        <w:jc w:val="both"/>
       </w:pPr>
       <w:r>
         <w:rPr>
@@ -5350,14 +5418,14 @@
           <w:i w:val="0"/>
           <w:sz w:val="28"/>
         </w:rPr>
-        <w:t>Добавить возможность подключения SignalR к Redis backplane.</w:t>
-      </w:r>
-    </w:p>
-    <w:p>
-      <w:pPr>
-        <w:pStyle w:val="ListNumber"/>
-        <w:spacing w:line="360" w:lineRule="auto"/>
-        <w:ind w:left="709" w:hanging="283"/>
+        <w:t>1. Добавить возможность подключения SignalR к Redis backplane.</w:t>
+      </w:r>
+    </w:p>
+    <w:p>
+      <w:pPr>
+        <w:spacing w:line="360" w:lineRule="auto" w:after="0"/>
+        <w:ind w:left="709" w:hanging="425"/>
+        <w:jc w:val="both"/>
       </w:pPr>
       <w:r>
         <w:rPr>
@@ -5366,15 +5434,17 @@
           <w:i w:val="0"/>
           <w:sz w:val="28"/>
         </w:rPr>
-        <w:t>Подготовить multi-instance стенд с двумя экземплярами `app-api`.</w:t>
-      </w:r>
-    </w:p>
-    <w:p>
-      <w:pPr>
-        <w:pStyle w:val="ListNumber"/>
-        <w:spacing w:line="360" w:lineRule="auto"/>
-        <w:ind w:left="709" w:hanging="283"/>
-      </w:pPr>
+        <w:t xml:space="preserve">2. Подготовить multi-instance стенд с двумя экземплярами </w:t>
+      </w:r>
+      <w:r>
+        <w:rPr>
+          <w:rFonts w:ascii="Courier New" w:hAnsi="Courier New" w:eastAsia="Courier New"/>
+          <w:b w:val="0"/>
+          <w:i w:val="0"/>
+          <w:sz w:val="28"/>
+        </w:rPr>
+        <w:t>app-api</w:t>
+      </w:r>
       <w:r>
         <w:rPr>
           <w:rFonts w:ascii="Times New Roman" w:hAnsi="Times New Roman" w:eastAsia="Times New Roman"/>
@@ -5382,14 +5452,14 @@
           <w:i w:val="0"/>
           <w:sz w:val="28"/>
         </w:rPr>
-        <w:t>Настроить nginx так, чтобы входящий трафик распределялся между экземплярами backend-сервиса и корректно проксировались WebSocket-соединения.</w:t>
-      </w:r>
-    </w:p>
-    <w:p>
-      <w:pPr>
-        <w:pStyle w:val="ListNumber"/>
-        <w:spacing w:line="360" w:lineRule="auto"/>
-        <w:ind w:left="709" w:hanging="283"/>
+        <w:t>.</w:t>
+      </w:r>
+    </w:p>
+    <w:p>
+      <w:pPr>
+        <w:spacing w:line="360" w:lineRule="auto" w:after="0"/>
+        <w:ind w:left="709" w:hanging="425"/>
+        <w:jc w:val="both"/>
       </w:pPr>
       <w:r>
         <w:rPr>
@@ -5398,14 +5468,14 @@
           <w:i w:val="0"/>
           <w:sz w:val="28"/>
         </w:rPr>
-        <w:t>Добавить диагностические данные, позволяющие установить, к какому узлу подключен клиент.</w:t>
-      </w:r>
-    </w:p>
-    <w:p>
-      <w:pPr>
-        <w:pStyle w:val="ListNumber"/>
-        <w:spacing w:line="360" w:lineRule="auto"/>
-        <w:ind w:left="709" w:hanging="283"/>
+        <w:t>3. Настроить nginx так, чтобы входящий трафик распределялся между экземплярами backend-сервиса и корректно проксировались WebSocket-соединения.</w:t>
+      </w:r>
+    </w:p>
+    <w:p>
+      <w:pPr>
+        <w:spacing w:line="360" w:lineRule="auto" w:after="0"/>
+        <w:ind w:left="709" w:hanging="425"/>
+        <w:jc w:val="both"/>
       </w:pPr>
       <w:r>
         <w:rPr>
@@ -5414,14 +5484,14 @@
           <w:i w:val="0"/>
           <w:sz w:val="28"/>
         </w:rPr>
-        <w:t>Подготовить простой проверочный клиент, фиксирующий серверный узел, идентификатор соединения и факт получения события.</w:t>
-      </w:r>
-    </w:p>
-    <w:p>
-      <w:pPr>
-        <w:pStyle w:val="ListNumber"/>
-        <w:spacing w:line="360" w:lineRule="auto"/>
-        <w:ind w:left="709" w:hanging="283"/>
+        <w:t>4. Добавить диагностические данные, позволяющие установить, к какому узлу подключен клиент.</w:t>
+      </w:r>
+    </w:p>
+    <w:p>
+      <w:pPr>
+        <w:spacing w:line="360" w:lineRule="auto" w:after="0"/>
+        <w:ind w:left="709" w:hanging="425"/>
+        <w:jc w:val="both"/>
       </w:pPr>
       <w:r>
         <w:rPr>
@@ -5430,14 +5500,14 @@
           <w:i w:val="0"/>
           <w:sz w:val="28"/>
         </w:rPr>
-        <w:t>Реализовать автоматизированный сценарий проверки cross-node delivery.</w:t>
-      </w:r>
-    </w:p>
-    <w:p>
-      <w:pPr>
-        <w:pStyle w:val="ListNumber"/>
-        <w:spacing w:line="360" w:lineRule="auto"/>
-        <w:ind w:left="709" w:hanging="283"/>
+        <w:t>5. Подготовить простой проверочный клиент, фиксирующий серверный узел, идентификатор соединения и факт получения события.</w:t>
+      </w:r>
+    </w:p>
+    <w:p>
+      <w:pPr>
+        <w:spacing w:line="360" w:lineRule="auto" w:after="0"/>
+        <w:ind w:left="709" w:hanging="425"/>
+        <w:jc w:val="both"/>
       </w:pPr>
       <w:r>
         <w:rPr>
@@ -5446,7 +5516,23 @@
           <w:i w:val="0"/>
           <w:sz w:val="28"/>
         </w:rPr>
-        <w:t>Сравнить поведение системы в режимах с Redis backplane и без него.</w:t>
+        <w:t>6. Реализовать автоматизированный сценарий проверки cross-node delivery.</w:t>
+      </w:r>
+    </w:p>
+    <w:p>
+      <w:pPr>
+        <w:spacing w:line="360" w:lineRule="auto" w:after="0"/>
+        <w:ind w:left="709" w:hanging="425"/>
+        <w:jc w:val="both"/>
+      </w:pPr>
+      <w:r>
+        <w:rPr>
+          <w:rFonts w:ascii="Times New Roman" w:hAnsi="Times New Roman" w:eastAsia="Times New Roman"/>
+          <w:b w:val="0"/>
+          <w:i w:val="0"/>
+          <w:sz w:val="28"/>
+        </w:rPr>
+        <w:t>7. Сравнить поведение системы в режимах с Redis backplane и без него.</w:t>
       </w:r>
     </w:p>
     <w:p>
@@ -5667,7 +5753,7 @@
           <w:i w:val="0"/>
           <w:sz w:val="28"/>
         </w:rPr>
-        <w:t>. Оба экземпляра подключены к общей базе данных и к Redis. SignalR использует Redis backplane для межузловой доставки событий [4], [10], [14].</w:t>
+        <w:t>. Оба экземпляра подключены к общей базе данных PostgreSQL [17] и к Redis. SignalR использует Redis backplane для межузловой доставки событий [4], [10], [14].</w:t>
       </w:r>
     </w:p>
     <w:p>
@@ -5820,9 +5906,9 @@
     </w:p>
     <w:p>
       <w:pPr>
-        <w:pStyle w:val="ListNumber"/>
-        <w:spacing w:line="360" w:lineRule="auto"/>
-        <w:ind w:left="709" w:hanging="283"/>
+        <w:spacing w:line="360" w:lineRule="auto" w:after="0"/>
+        <w:ind w:left="709" w:hanging="425"/>
+        <w:jc w:val="both"/>
       </w:pPr>
       <w:r>
         <w:rPr>
@@ -5831,14 +5917,14 @@
           <w:i w:val="0"/>
           <w:sz w:val="28"/>
         </w:rPr>
-        <w:t>Пользователь выполняет действие в интерфейсе, например изменяет заголовок отчета.</w:t>
-      </w:r>
-    </w:p>
-    <w:p>
-      <w:pPr>
-        <w:pStyle w:val="ListNumber"/>
-        <w:spacing w:line="360" w:lineRule="auto"/>
-        <w:ind w:left="709" w:hanging="283"/>
+        <w:t>1. Пользователь выполняет действие в интерфейсе, например изменяет заголовок отчета.</w:t>
+      </w:r>
+    </w:p>
+    <w:p>
+      <w:pPr>
+        <w:spacing w:line="360" w:lineRule="auto" w:after="0"/>
+        <w:ind w:left="709" w:hanging="425"/>
+        <w:jc w:val="both"/>
       </w:pPr>
       <w:r>
         <w:rPr>
@@ -5847,14 +5933,14 @@
           <w:i w:val="0"/>
           <w:sz w:val="28"/>
         </w:rPr>
-        <w:t>HTTP-запрос попадает через nginx на один из экземпляров backend-сервиса.</w:t>
-      </w:r>
-    </w:p>
-    <w:p>
-      <w:pPr>
-        <w:pStyle w:val="ListNumber"/>
-        <w:spacing w:line="360" w:lineRule="auto"/>
-        <w:ind w:left="709" w:hanging="283"/>
+        <w:t>2. HTTP-запрос попадает через nginx на один из экземпляров backend-сервиса.</w:t>
+      </w:r>
+    </w:p>
+    <w:p>
+      <w:pPr>
+        <w:spacing w:line="360" w:lineRule="auto" w:after="0"/>
+        <w:ind w:left="709" w:hanging="425"/>
+        <w:jc w:val="both"/>
       </w:pPr>
       <w:r>
         <w:rPr>
@@ -5863,14 +5949,14 @@
           <w:i w:val="0"/>
           <w:sz w:val="28"/>
         </w:rPr>
-        <w:t>Backend изменяет прикладное состояние в базе данных.</w:t>
-      </w:r>
-    </w:p>
-    <w:p>
-      <w:pPr>
-        <w:pStyle w:val="ListNumber"/>
-        <w:spacing w:line="360" w:lineRule="auto"/>
-        <w:ind w:left="709" w:hanging="283"/>
+        <w:t>3. Backend изменяет прикладное состояние в базе данных.</w:t>
+      </w:r>
+    </w:p>
+    <w:p>
+      <w:pPr>
+        <w:spacing w:line="360" w:lineRule="auto" w:after="0"/>
+        <w:ind w:left="709" w:hanging="425"/>
+        <w:jc w:val="both"/>
       </w:pPr>
       <w:r>
         <w:rPr>
@@ -5879,15 +5965,17 @@
           <w:i w:val="0"/>
           <w:sz w:val="28"/>
         </w:rPr>
-        <w:t>`ReportPageHubClient` формирует real-time событие для группы отчета.</w:t>
-      </w:r>
-    </w:p>
-    <w:p>
-      <w:pPr>
-        <w:pStyle w:val="ListNumber"/>
-        <w:spacing w:line="360" w:lineRule="auto"/>
-        <w:ind w:left="709" w:hanging="283"/>
-      </w:pPr>
+        <w:t xml:space="preserve">4. </w:t>
+      </w:r>
+      <w:r>
+        <w:rPr>
+          <w:rFonts w:ascii="Courier New" w:hAnsi="Courier New" w:eastAsia="Courier New"/>
+          <w:b w:val="0"/>
+          <w:i w:val="0"/>
+          <w:sz w:val="28"/>
+        </w:rPr>
+        <w:t>ReportPageHubClient</w:t>
+      </w:r>
       <w:r>
         <w:rPr>
           <w:rFonts w:ascii="Times New Roman" w:hAnsi="Times New Roman" w:eastAsia="Times New Roman"/>
@@ -5895,14 +5983,14 @@
           <w:i w:val="0"/>
           <w:sz w:val="28"/>
         </w:rPr>
-        <w:t>SignalR отправляет событие локальным клиентам текущего узла.</w:t>
-      </w:r>
-    </w:p>
-    <w:p>
-      <w:pPr>
-        <w:pStyle w:val="ListNumber"/>
-        <w:spacing w:line="360" w:lineRule="auto"/>
-        <w:ind w:left="709" w:hanging="283"/>
+        <w:t xml:space="preserve"> формирует real-time событие для группы отчета.</w:t>
+      </w:r>
+    </w:p>
+    <w:p>
+      <w:pPr>
+        <w:spacing w:line="360" w:lineRule="auto" w:after="0"/>
+        <w:ind w:left="709" w:hanging="425"/>
+        <w:jc w:val="both"/>
       </w:pPr>
       <w:r>
         <w:rPr>
@@ -5911,14 +5999,14 @@
           <w:i w:val="0"/>
           <w:sz w:val="28"/>
         </w:rPr>
-        <w:t>Через Redis backplane событие становится доступным другим экземплярам `app-api`.</w:t>
-      </w:r>
-    </w:p>
-    <w:p>
-      <w:pPr>
-        <w:pStyle w:val="ListNumber"/>
-        <w:spacing w:line="360" w:lineRule="auto"/>
-        <w:ind w:left="709" w:hanging="283"/>
+        <w:t>5. SignalR отправляет событие локальным клиентам текущего узла.</w:t>
+      </w:r>
+    </w:p>
+    <w:p>
+      <w:pPr>
+        <w:spacing w:line="360" w:lineRule="auto" w:after="0"/>
+        <w:ind w:left="709" w:hanging="425"/>
+        <w:jc w:val="both"/>
       </w:pPr>
       <w:r>
         <w:rPr>
@@ -5927,15 +6015,17 @@
           <w:i w:val="0"/>
           <w:sz w:val="28"/>
         </w:rPr>
-        <w:t>Другой экземпляр доставляет событие своим клиентам, состоящим в той же группе.</w:t>
-      </w:r>
-    </w:p>
-    <w:p>
-      <w:pPr>
-        <w:pStyle w:val="ListNumber"/>
-        <w:spacing w:line="360" w:lineRule="auto"/>
-        <w:ind w:left="709" w:hanging="283"/>
-      </w:pPr>
+        <w:t xml:space="preserve">6. Через Redis backplane событие становится доступным другим экземплярам </w:t>
+      </w:r>
+      <w:r>
+        <w:rPr>
+          <w:rFonts w:ascii="Courier New" w:hAnsi="Courier New" w:eastAsia="Courier New"/>
+          <w:b w:val="0"/>
+          <w:i w:val="0"/>
+          <w:sz w:val="28"/>
+        </w:rPr>
+        <w:t>app-api</w:t>
+      </w:r>
       <w:r>
         <w:rPr>
           <w:rFonts w:ascii="Times New Roman" w:hAnsi="Times New Roman" w:eastAsia="Times New Roman"/>
@@ -5943,7 +6033,39 @@
           <w:i w:val="0"/>
           <w:sz w:val="28"/>
         </w:rPr>
-        <w:t>Проверочный клиент получает событие и фиксирует результат доставки.</w:t>
+        <w:t>.</w:t>
+      </w:r>
+    </w:p>
+    <w:p>
+      <w:pPr>
+        <w:spacing w:line="360" w:lineRule="auto" w:after="0"/>
+        <w:ind w:left="709" w:hanging="425"/>
+        <w:jc w:val="both"/>
+      </w:pPr>
+      <w:r>
+        <w:rPr>
+          <w:rFonts w:ascii="Times New Roman" w:hAnsi="Times New Roman" w:eastAsia="Times New Roman"/>
+          <w:b w:val="0"/>
+          <w:i w:val="0"/>
+          <w:sz w:val="28"/>
+        </w:rPr>
+        <w:t>7. Другой экземпляр доставляет событие своим клиентам, состоящим в той же группе.</w:t>
+      </w:r>
+    </w:p>
+    <w:p>
+      <w:pPr>
+        <w:spacing w:line="360" w:lineRule="auto" w:after="0"/>
+        <w:ind w:left="709" w:hanging="425"/>
+        <w:jc w:val="both"/>
+      </w:pPr>
+      <w:r>
+        <w:rPr>
+          <w:rFonts w:ascii="Times New Roman" w:hAnsi="Times New Roman" w:eastAsia="Times New Roman"/>
+          <w:b w:val="0"/>
+          <w:i w:val="0"/>
+          <w:sz w:val="28"/>
+        </w:rPr>
+        <w:t>8. Проверочный клиент получает событие и фиксирует результат доставки.</w:t>
       </w:r>
     </w:p>
     <w:p>
@@ -6084,9 +6206,9 @@
     </w:p>
     <w:p>
       <w:pPr>
-        <w:pStyle w:val="ListNumber"/>
-        <w:spacing w:line="360" w:lineRule="auto"/>
-        <w:ind w:left="709" w:hanging="283"/>
+        <w:spacing w:line="360" w:lineRule="auto" w:after="0"/>
+        <w:ind w:left="709" w:hanging="425"/>
+        <w:jc w:val="both"/>
       </w:pPr>
       <w:r>
         <w:rPr>
@@ -6095,15 +6217,17 @@
           <w:i w:val="0"/>
           <w:sz w:val="28"/>
         </w:rPr>
-        <w:t>`SERVER_INSTANCE_ID` задает идентификатор экземпляра сервиса.</w:t>
-      </w:r>
-    </w:p>
-    <w:p>
-      <w:pPr>
-        <w:pStyle w:val="ListNumber"/>
-        <w:spacing w:line="360" w:lineRule="auto"/>
-        <w:ind w:left="709" w:hanging="283"/>
-      </w:pPr>
+        <w:t xml:space="preserve">1. </w:t>
+      </w:r>
+      <w:r>
+        <w:rPr>
+          <w:rFonts w:ascii="Courier New" w:hAnsi="Courier New" w:eastAsia="Courier New"/>
+          <w:b w:val="0"/>
+          <w:i w:val="0"/>
+          <w:sz w:val="28"/>
+        </w:rPr>
+        <w:t>SERVER_INSTANCE_ID</w:t>
+      </w:r>
       <w:r>
         <w:rPr>
           <w:rFonts w:ascii="Times New Roman" w:hAnsi="Times New Roman" w:eastAsia="Times New Roman"/>
@@ -6111,14 +6235,14 @@
           <w:i w:val="0"/>
           <w:sz w:val="28"/>
         </w:rPr>
-        <w:t>`ServerInstanceInfo` предоставляет идентификатор экземпляра и имя машины.</w:t>
-      </w:r>
-    </w:p>
-    <w:p>
-      <w:pPr>
-        <w:pStyle w:val="ListNumber"/>
-        <w:spacing w:line="360" w:lineRule="auto"/>
-        <w:ind w:left="709" w:hanging="283"/>
+        <w:t xml:space="preserve"> задает идентификатор экземпляра сервиса.</w:t>
+      </w:r>
+    </w:p>
+    <w:p>
+      <w:pPr>
+        <w:spacing w:line="360" w:lineRule="auto" w:after="0"/>
+        <w:ind w:left="709" w:hanging="425"/>
+        <w:jc w:val="both"/>
       </w:pPr>
       <w:r>
         <w:rPr>
@@ -6127,15 +6251,17 @@
           <w:i w:val="0"/>
           <w:sz w:val="28"/>
         </w:rPr>
-        <w:t>`ReportPageHub.GetConnectionDiagnosticsAsync()` возвращает клиенту `serverInstanceId`, `machineName`, `connectionId` и `userIdentifier`.</w:t>
-      </w:r>
-    </w:p>
-    <w:p>
-      <w:pPr>
-        <w:pStyle w:val="ListNumber"/>
-        <w:spacing w:line="360" w:lineRule="auto"/>
-        <w:ind w:left="709" w:hanging="283"/>
-      </w:pPr>
+        <w:t xml:space="preserve">2. </w:t>
+      </w:r>
+      <w:r>
+        <w:rPr>
+          <w:rFonts w:ascii="Courier New" w:hAnsi="Courier New" w:eastAsia="Courier New"/>
+          <w:b w:val="0"/>
+          <w:i w:val="0"/>
+          <w:sz w:val="28"/>
+        </w:rPr>
+        <w:t>ServerInstanceInfo</w:t>
+      </w:r>
       <w:r>
         <w:rPr>
           <w:rFonts w:ascii="Times New Roman" w:hAnsi="Times New Roman" w:eastAsia="Times New Roman"/>
@@ -6143,14 +6269,14 @@
           <w:i w:val="0"/>
           <w:sz w:val="28"/>
         </w:rPr>
-        <w:t>Backend логирует подключение, вступление в группу, выход из группы, отключение и отправку real-time события.</w:t>
-      </w:r>
-    </w:p>
-    <w:p>
-      <w:pPr>
-        <w:pStyle w:val="ListNumber"/>
-        <w:spacing w:line="360" w:lineRule="auto"/>
-        <w:ind w:left="709" w:hanging="283"/>
+        <w:t xml:space="preserve"> предоставляет идентификатор экземпляра и имя машины.</w:t>
+      </w:r>
+    </w:p>
+    <w:p>
+      <w:pPr>
+        <w:spacing w:line="360" w:lineRule="auto" w:after="0"/>
+        <w:ind w:left="709" w:hanging="425"/>
+        <w:jc w:val="both"/>
       </w:pPr>
       <w:r>
         <w:rPr>
@@ -6159,7 +6285,129 @@
           <w:i w:val="0"/>
           <w:sz w:val="28"/>
         </w:rPr>
-        <w:t>Проверочный клиент выводит diagnostics в JSON-результате эксперимента.</w:t>
+        <w:t xml:space="preserve">3. </w:t>
+      </w:r>
+      <w:r>
+        <w:rPr>
+          <w:rFonts w:ascii="Courier New" w:hAnsi="Courier New" w:eastAsia="Courier New"/>
+          <w:b w:val="0"/>
+          <w:i w:val="0"/>
+          <w:sz w:val="28"/>
+        </w:rPr>
+        <w:t>ReportPageHub.GetConnectionDiagnosticsAsync()</w:t>
+      </w:r>
+      <w:r>
+        <w:rPr>
+          <w:rFonts w:ascii="Times New Roman" w:hAnsi="Times New Roman" w:eastAsia="Times New Roman"/>
+          <w:b w:val="0"/>
+          <w:i w:val="0"/>
+          <w:sz w:val="28"/>
+        </w:rPr>
+        <w:t xml:space="preserve"> возвращает клиенту </w:t>
+      </w:r>
+      <w:r>
+        <w:rPr>
+          <w:rFonts w:ascii="Courier New" w:hAnsi="Courier New" w:eastAsia="Courier New"/>
+          <w:b w:val="0"/>
+          <w:i w:val="0"/>
+          <w:sz w:val="28"/>
+        </w:rPr>
+        <w:t>serverInstanceId</w:t>
+      </w:r>
+      <w:r>
+        <w:rPr>
+          <w:rFonts w:ascii="Times New Roman" w:hAnsi="Times New Roman" w:eastAsia="Times New Roman"/>
+          <w:b w:val="0"/>
+          <w:i w:val="0"/>
+          <w:sz w:val="28"/>
+        </w:rPr>
+        <w:t xml:space="preserve">, </w:t>
+      </w:r>
+      <w:r>
+        <w:rPr>
+          <w:rFonts w:ascii="Courier New" w:hAnsi="Courier New" w:eastAsia="Courier New"/>
+          <w:b w:val="0"/>
+          <w:i w:val="0"/>
+          <w:sz w:val="28"/>
+        </w:rPr>
+        <w:t>machineName</w:t>
+      </w:r>
+      <w:r>
+        <w:rPr>
+          <w:rFonts w:ascii="Times New Roman" w:hAnsi="Times New Roman" w:eastAsia="Times New Roman"/>
+          <w:b w:val="0"/>
+          <w:i w:val="0"/>
+          <w:sz w:val="28"/>
+        </w:rPr>
+        <w:t xml:space="preserve">, </w:t>
+      </w:r>
+      <w:r>
+        <w:rPr>
+          <w:rFonts w:ascii="Courier New" w:hAnsi="Courier New" w:eastAsia="Courier New"/>
+          <w:b w:val="0"/>
+          <w:i w:val="0"/>
+          <w:sz w:val="28"/>
+        </w:rPr>
+        <w:t>connectionId</w:t>
+      </w:r>
+      <w:r>
+        <w:rPr>
+          <w:rFonts w:ascii="Times New Roman" w:hAnsi="Times New Roman" w:eastAsia="Times New Roman"/>
+          <w:b w:val="0"/>
+          <w:i w:val="0"/>
+          <w:sz w:val="28"/>
+        </w:rPr>
+        <w:t xml:space="preserve"> и </w:t>
+      </w:r>
+      <w:r>
+        <w:rPr>
+          <w:rFonts w:ascii="Courier New" w:hAnsi="Courier New" w:eastAsia="Courier New"/>
+          <w:b w:val="0"/>
+          <w:i w:val="0"/>
+          <w:sz w:val="28"/>
+        </w:rPr>
+        <w:t>userIdentifier</w:t>
+      </w:r>
+      <w:r>
+        <w:rPr>
+          <w:rFonts w:ascii="Times New Roman" w:hAnsi="Times New Roman" w:eastAsia="Times New Roman"/>
+          <w:b w:val="0"/>
+          <w:i w:val="0"/>
+          <w:sz w:val="28"/>
+        </w:rPr>
+        <w:t>.</w:t>
+      </w:r>
+    </w:p>
+    <w:p>
+      <w:pPr>
+        <w:spacing w:line="360" w:lineRule="auto" w:after="0"/>
+        <w:ind w:left="709" w:hanging="425"/>
+        <w:jc w:val="both"/>
+      </w:pPr>
+      <w:r>
+        <w:rPr>
+          <w:rFonts w:ascii="Times New Roman" w:hAnsi="Times New Roman" w:eastAsia="Times New Roman"/>
+          <w:b w:val="0"/>
+          <w:i w:val="0"/>
+          <w:sz w:val="28"/>
+        </w:rPr>
+        <w:t>4. Backend логирует подключение, вступление в группу, выход из группы, отключение и отправку real-time события.</w:t>
+      </w:r>
+    </w:p>
+    <w:p>
+      <w:pPr>
+        <w:spacing w:line="360" w:lineRule="auto" w:after="0"/>
+        <w:ind w:left="709" w:hanging="425"/>
+        <w:jc w:val="both"/>
+      </w:pPr>
+      <w:r>
+        <w:rPr>
+          <w:rFonts w:ascii="Times New Roman" w:hAnsi="Times New Roman" w:eastAsia="Times New Roman"/>
+          <w:b w:val="0"/>
+          <w:i w:val="0"/>
+          <w:sz w:val="28"/>
+        </w:rPr>
+        <w:t>5. Проверочный клиент выводит diagnostics в JSON-результате эксперимента.</w:t>
       </w:r>
     </w:p>
     <w:p>
@@ -6691,9 +6939,9 @@
     </w:p>
     <w:p>
       <w:pPr>
-        <w:pStyle w:val="ListNumber"/>
-        <w:spacing w:line="360" w:lineRule="auto"/>
-        <w:ind w:left="709" w:hanging="283"/>
+        <w:spacing w:line="360" w:lineRule="auto" w:after="0"/>
+        <w:ind w:left="709" w:hanging="425"/>
+        <w:jc w:val="both"/>
       </w:pPr>
       <w:r>
         <w:rPr>
@@ -6702,15 +6950,17 @@
           <w:i w:val="0"/>
           <w:sz w:val="28"/>
         </w:rPr>
-        <w:t>`postgres_app_thesis`;</w:t>
-      </w:r>
-    </w:p>
-    <w:p>
-      <w:pPr>
-        <w:pStyle w:val="ListNumber"/>
-        <w:spacing w:line="360" w:lineRule="auto"/>
-        <w:ind w:left="709" w:hanging="283"/>
-      </w:pPr>
+        <w:t xml:space="preserve">1. </w:t>
+      </w:r>
+      <w:r>
+        <w:rPr>
+          <w:rFonts w:ascii="Courier New" w:hAnsi="Courier New" w:eastAsia="Courier New"/>
+          <w:b w:val="0"/>
+          <w:i w:val="0"/>
+          <w:sz w:val="28"/>
+        </w:rPr>
+        <w:t>postgres_app_thesis</w:t>
+      </w:r>
       <w:r>
         <w:rPr>
           <w:rFonts w:ascii="Times New Roman" w:hAnsi="Times New Roman" w:eastAsia="Times New Roman"/>
@@ -6718,14 +6968,14 @@
           <w:i w:val="0"/>
           <w:sz w:val="28"/>
         </w:rPr>
-        <w:t>`redis_app_thesis`;</w:t>
-      </w:r>
-    </w:p>
-    <w:p>
-      <w:pPr>
-        <w:pStyle w:val="ListNumber"/>
-        <w:spacing w:line="360" w:lineRule="auto"/>
-        <w:ind w:left="709" w:hanging="283"/>
+        <w:t>;</w:t>
+      </w:r>
+    </w:p>
+    <w:p>
+      <w:pPr>
+        <w:spacing w:line="360" w:lineRule="auto" w:after="0"/>
+        <w:ind w:left="709" w:hanging="425"/>
+        <w:jc w:val="both"/>
       </w:pPr>
       <w:r>
         <w:rPr>
@@ -6734,15 +6984,17 @@
           <w:i w:val="0"/>
           <w:sz w:val="28"/>
         </w:rPr>
-        <w:t>`app-api-1`;</w:t>
-      </w:r>
-    </w:p>
-    <w:p>
-      <w:pPr>
-        <w:pStyle w:val="ListNumber"/>
-        <w:spacing w:line="360" w:lineRule="auto"/>
-        <w:ind w:left="709" w:hanging="283"/>
-      </w:pPr>
+        <w:t xml:space="preserve">2. </w:t>
+      </w:r>
+      <w:r>
+        <w:rPr>
+          <w:rFonts w:ascii="Courier New" w:hAnsi="Courier New" w:eastAsia="Courier New"/>
+          <w:b w:val="0"/>
+          <w:i w:val="0"/>
+          <w:sz w:val="28"/>
+        </w:rPr>
+        <w:t>redis_app_thesis</w:t>
+      </w:r>
       <w:r>
         <w:rPr>
           <w:rFonts w:ascii="Times New Roman" w:hAnsi="Times New Roman" w:eastAsia="Times New Roman"/>
@@ -6750,14 +7002,14 @@
           <w:i w:val="0"/>
           <w:sz w:val="28"/>
         </w:rPr>
-        <w:t>`app-api-2`;</w:t>
-      </w:r>
-    </w:p>
-    <w:p>
-      <w:pPr>
-        <w:pStyle w:val="ListNumber"/>
-        <w:spacing w:line="360" w:lineRule="auto"/>
-        <w:ind w:left="709" w:hanging="283"/>
+        <w:t>;</w:t>
+      </w:r>
+    </w:p>
+    <w:p>
+      <w:pPr>
+        <w:spacing w:line="360" w:lineRule="auto" w:after="0"/>
+        <w:ind w:left="709" w:hanging="425"/>
+        <w:jc w:val="both"/>
       </w:pPr>
       <w:r>
         <w:rPr>
@@ -6766,7 +7018,93 @@
           <w:i w:val="0"/>
           <w:sz w:val="28"/>
         </w:rPr>
-        <w:t>`nginx_app_thesis`.</w:t>
+        <w:t xml:space="preserve">3. </w:t>
+      </w:r>
+      <w:r>
+        <w:rPr>
+          <w:rFonts w:ascii="Courier New" w:hAnsi="Courier New" w:eastAsia="Courier New"/>
+          <w:b w:val="0"/>
+          <w:i w:val="0"/>
+          <w:sz w:val="28"/>
+        </w:rPr>
+        <w:t>app-api-1</w:t>
+      </w:r>
+      <w:r>
+        <w:rPr>
+          <w:rFonts w:ascii="Times New Roman" w:hAnsi="Times New Roman" w:eastAsia="Times New Roman"/>
+          <w:b w:val="0"/>
+          <w:i w:val="0"/>
+          <w:sz w:val="28"/>
+        </w:rPr>
+        <w:t>;</w:t>
+      </w:r>
+    </w:p>
+    <w:p>
+      <w:pPr>
+        <w:spacing w:line="360" w:lineRule="auto" w:after="0"/>
+        <w:ind w:left="709" w:hanging="425"/>
+        <w:jc w:val="both"/>
+      </w:pPr>
+      <w:r>
+        <w:rPr>
+          <w:rFonts w:ascii="Times New Roman" w:hAnsi="Times New Roman" w:eastAsia="Times New Roman"/>
+          <w:b w:val="0"/>
+          <w:i w:val="0"/>
+          <w:sz w:val="28"/>
+        </w:rPr>
+        <w:t xml:space="preserve">4. </w:t>
+      </w:r>
+      <w:r>
+        <w:rPr>
+          <w:rFonts w:ascii="Courier New" w:hAnsi="Courier New" w:eastAsia="Courier New"/>
+          <w:b w:val="0"/>
+          <w:i w:val="0"/>
+          <w:sz w:val="28"/>
+        </w:rPr>
+        <w:t>app-api-2</w:t>
+      </w:r>
+      <w:r>
+        <w:rPr>
+          <w:rFonts w:ascii="Times New Roman" w:hAnsi="Times New Roman" w:eastAsia="Times New Roman"/>
+          <w:b w:val="0"/>
+          <w:i w:val="0"/>
+          <w:sz w:val="28"/>
+        </w:rPr>
+        <w:t>;</w:t>
+      </w:r>
+    </w:p>
+    <w:p>
+      <w:pPr>
+        <w:spacing w:line="360" w:lineRule="auto" w:after="0"/>
+        <w:ind w:left="709" w:hanging="425"/>
+        <w:jc w:val="both"/>
+      </w:pPr>
+      <w:r>
+        <w:rPr>
+          <w:rFonts w:ascii="Times New Roman" w:hAnsi="Times New Roman" w:eastAsia="Times New Roman"/>
+          <w:b w:val="0"/>
+          <w:i w:val="0"/>
+          <w:sz w:val="28"/>
+        </w:rPr>
+        <w:t xml:space="preserve">5. </w:t>
+      </w:r>
+      <w:r>
+        <w:rPr>
+          <w:rFonts w:ascii="Courier New" w:hAnsi="Courier New" w:eastAsia="Courier New"/>
+          <w:b w:val="0"/>
+          <w:i w:val="0"/>
+          <w:sz w:val="28"/>
+        </w:rPr>
+        <w:t>nginx_app_thesis</w:t>
+      </w:r>
+      <w:r>
+        <w:rPr>
+          <w:rFonts w:ascii="Times New Roman" w:hAnsi="Times New Roman" w:eastAsia="Times New Roman"/>
+          <w:b w:val="0"/>
+          <w:i w:val="0"/>
+          <w:sz w:val="28"/>
+        </w:rPr>
+        <w:t>.</w:t>
       </w:r>
     </w:p>
     <w:p>
@@ -6854,7 +7192,7 @@
           <w:i w:val="0"/>
           <w:sz w:val="28"/>
         </w:rPr>
-        <w:t xml:space="preserve"> в пустую строку для обоих экземпляров [17].</w:t>
+        <w:t xml:space="preserve"> в пустую строку для обоих экземпляров.</w:t>
       </w:r>
     </w:p>
     <w:p>
@@ -7044,9 +7382,9 @@
     </w:p>
     <w:p>
       <w:pPr>
-        <w:pStyle w:val="ListNumber"/>
-        <w:spacing w:line="360" w:lineRule="auto"/>
-        <w:ind w:left="709" w:hanging="283"/>
+        <w:spacing w:line="360" w:lineRule="auto" w:after="0"/>
+        <w:ind w:left="709" w:hanging="425"/>
+        <w:jc w:val="both"/>
       </w:pPr>
       <w:r>
         <w:rPr>
@@ -7055,15 +7393,17 @@
           <w:i w:val="0"/>
           <w:sz w:val="28"/>
         </w:rPr>
-        <w:t>Создает отчет через `app-api-1`.</w:t>
-      </w:r>
-    </w:p>
-    <w:p>
-      <w:pPr>
-        <w:pStyle w:val="ListNumber"/>
-        <w:spacing w:line="360" w:lineRule="auto"/>
-        <w:ind w:left="709" w:hanging="283"/>
-      </w:pPr>
+        <w:t xml:space="preserve">1. Создает отчет через </w:t>
+      </w:r>
+      <w:r>
+        <w:rPr>
+          <w:rFonts w:ascii="Courier New" w:hAnsi="Courier New" w:eastAsia="Courier New"/>
+          <w:b w:val="0"/>
+          <w:i w:val="0"/>
+          <w:sz w:val="28"/>
+        </w:rPr>
+        <w:t>app-api-1</w:t>
+      </w:r>
       <w:r>
         <w:rPr>
           <w:rFonts w:ascii="Times New Roman" w:hAnsi="Times New Roman" w:eastAsia="Times New Roman"/>
@@ -7071,14 +7411,14 @@
           <w:i w:val="0"/>
           <w:sz w:val="28"/>
         </w:rPr>
-        <w:t>Подключает SignalR-клиент A к `app-api-1`.</w:t>
-      </w:r>
-    </w:p>
-    <w:p>
-      <w:pPr>
-        <w:pStyle w:val="ListNumber"/>
-        <w:spacing w:line="360" w:lineRule="auto"/>
-        <w:ind w:left="709" w:hanging="283"/>
+        <w:t>.</w:t>
+      </w:r>
+    </w:p>
+    <w:p>
+      <w:pPr>
+        <w:spacing w:line="360" w:lineRule="auto" w:after="0"/>
+        <w:ind w:left="709" w:hanging="425"/>
+        <w:jc w:val="both"/>
       </w:pPr>
       <w:r>
         <w:rPr>
@@ -7087,15 +7427,17 @@
           <w:i w:val="0"/>
           <w:sz w:val="28"/>
         </w:rPr>
-        <w:t>Подключает SignalR-клиент B к `app-api-2`.</w:t>
-      </w:r>
-    </w:p>
-    <w:p>
-      <w:pPr>
-        <w:pStyle w:val="ListNumber"/>
-        <w:spacing w:line="360" w:lineRule="auto"/>
-        <w:ind w:left="709" w:hanging="283"/>
-      </w:pPr>
+        <w:t xml:space="preserve">2. Подключает SignalR-клиент A к </w:t>
+      </w:r>
+      <w:r>
+        <w:rPr>
+          <w:rFonts w:ascii="Courier New" w:hAnsi="Courier New" w:eastAsia="Courier New"/>
+          <w:b w:val="0"/>
+          <w:i w:val="0"/>
+          <w:sz w:val="28"/>
+        </w:rPr>
+        <w:t>app-api-1</w:t>
+      </w:r>
       <w:r>
         <w:rPr>
           <w:rFonts w:ascii="Times New Roman" w:hAnsi="Times New Roman" w:eastAsia="Times New Roman"/>
@@ -7103,14 +7445,14 @@
           <w:i w:val="0"/>
           <w:sz w:val="28"/>
         </w:rPr>
-        <w:t>Подписывает оба клиента на группу созданного отчета.</w:t>
-      </w:r>
-    </w:p>
-    <w:p>
-      <w:pPr>
-        <w:pStyle w:val="ListNumber"/>
-        <w:spacing w:line="360" w:lineRule="auto"/>
-        <w:ind w:left="709" w:hanging="283"/>
+        <w:t>.</w:t>
+      </w:r>
+    </w:p>
+    <w:p>
+      <w:pPr>
+        <w:spacing w:line="360" w:lineRule="auto" w:after="0"/>
+        <w:ind w:left="709" w:hanging="425"/>
+        <w:jc w:val="both"/>
       </w:pPr>
       <w:r>
         <w:rPr>
@@ -7119,15 +7461,17 @@
           <w:i w:val="0"/>
           <w:sz w:val="28"/>
         </w:rPr>
-        <w:t>Изменяет заголовок отчета через `app-api-1`.</w:t>
-      </w:r>
-    </w:p>
-    <w:p>
-      <w:pPr>
-        <w:pStyle w:val="ListNumber"/>
-        <w:spacing w:line="360" w:lineRule="auto"/>
-        <w:ind w:left="709" w:hanging="283"/>
-      </w:pPr>
+        <w:t xml:space="preserve">3. Подключает SignalR-клиент B к </w:t>
+      </w:r>
+      <w:r>
+        <w:rPr>
+          <w:rFonts w:ascii="Courier New" w:hAnsi="Courier New" w:eastAsia="Courier New"/>
+          <w:b w:val="0"/>
+          <w:i w:val="0"/>
+          <w:sz w:val="28"/>
+        </w:rPr>
+        <w:t>app-api-2</w:t>
+      </w:r>
       <w:r>
         <w:rPr>
           <w:rFonts w:ascii="Times New Roman" w:hAnsi="Times New Roman" w:eastAsia="Times New Roman"/>
@@ -7135,14 +7479,14 @@
           <w:i w:val="0"/>
           <w:sz w:val="28"/>
         </w:rPr>
-        <w:t>Ожидает событие `ReceiveReportPatch` на клиенте B.</w:t>
-      </w:r>
-    </w:p>
-    <w:p>
-      <w:pPr>
-        <w:pStyle w:val="ListNumber"/>
-        <w:spacing w:line="360" w:lineRule="auto"/>
-        <w:ind w:left="709" w:hanging="283"/>
+        <w:t>.</w:t>
+      </w:r>
+    </w:p>
+    <w:p>
+      <w:pPr>
+        <w:spacing w:line="360" w:lineRule="auto" w:after="0"/>
+        <w:ind w:left="709" w:hanging="425"/>
+        <w:jc w:val="both"/>
       </w:pPr>
       <w:r>
         <w:rPr>
@@ -7151,14 +7495,14 @@
           <w:i w:val="0"/>
           <w:sz w:val="28"/>
         </w:rPr>
-        <w:t>Измеряет задержку от отправки PATCH-запроса до получения события на клиенте B.</w:t>
-      </w:r>
-    </w:p>
-    <w:p>
-      <w:pPr>
-        <w:pStyle w:val="ListNumber"/>
-        <w:spacing w:line="360" w:lineRule="auto"/>
-        <w:ind w:left="709" w:hanging="283"/>
+        <w:t>4. Подписывает оба клиента на группу созданного отчета.</w:t>
+      </w:r>
+    </w:p>
+    <w:p>
+      <w:pPr>
+        <w:spacing w:line="360" w:lineRule="auto" w:after="0"/>
+        <w:ind w:left="709" w:hanging="425"/>
+        <w:jc w:val="both"/>
       </w:pPr>
       <w:r>
         <w:rPr>
@@ -7167,7 +7511,91 @@
           <w:i w:val="0"/>
           <w:sz w:val="28"/>
         </w:rPr>
-        <w:t>Выводит diagnostics обоих клиентов, полученный payload события и метрики доставки.</w:t>
+        <w:t xml:space="preserve">5. Изменяет заголовок отчета через </w:t>
+      </w:r>
+      <w:r>
+        <w:rPr>
+          <w:rFonts w:ascii="Courier New" w:hAnsi="Courier New" w:eastAsia="Courier New"/>
+          <w:b w:val="0"/>
+          <w:i w:val="0"/>
+          <w:sz w:val="28"/>
+        </w:rPr>
+        <w:t>app-api-1</w:t>
+      </w:r>
+      <w:r>
+        <w:rPr>
+          <w:rFonts w:ascii="Times New Roman" w:hAnsi="Times New Roman" w:eastAsia="Times New Roman"/>
+          <w:b w:val="0"/>
+          <w:i w:val="0"/>
+          <w:sz w:val="28"/>
+        </w:rPr>
+        <w:t>.</w:t>
+      </w:r>
+    </w:p>
+    <w:p>
+      <w:pPr>
+        <w:spacing w:line="360" w:lineRule="auto" w:after="0"/>
+        <w:ind w:left="709" w:hanging="425"/>
+        <w:jc w:val="both"/>
+      </w:pPr>
+      <w:r>
+        <w:rPr>
+          <w:rFonts w:ascii="Times New Roman" w:hAnsi="Times New Roman" w:eastAsia="Times New Roman"/>
+          <w:b w:val="0"/>
+          <w:i w:val="0"/>
+          <w:sz w:val="28"/>
+        </w:rPr>
+        <w:t xml:space="preserve">6. Ожидает событие </w:t>
+      </w:r>
+      <w:r>
+        <w:rPr>
+          <w:rFonts w:ascii="Courier New" w:hAnsi="Courier New" w:eastAsia="Courier New"/>
+          <w:b w:val="0"/>
+          <w:i w:val="0"/>
+          <w:sz w:val="28"/>
+        </w:rPr>
+        <w:t>ReceiveReportPatch</w:t>
+      </w:r>
+      <w:r>
+        <w:rPr>
+          <w:rFonts w:ascii="Times New Roman" w:hAnsi="Times New Roman" w:eastAsia="Times New Roman"/>
+          <w:b w:val="0"/>
+          <w:i w:val="0"/>
+          <w:sz w:val="28"/>
+        </w:rPr>
+        <w:t xml:space="preserve"> на клиенте B.</w:t>
+      </w:r>
+    </w:p>
+    <w:p>
+      <w:pPr>
+        <w:spacing w:line="360" w:lineRule="auto" w:after="0"/>
+        <w:ind w:left="709" w:hanging="425"/>
+        <w:jc w:val="both"/>
+      </w:pPr>
+      <w:r>
+        <w:rPr>
+          <w:rFonts w:ascii="Times New Roman" w:hAnsi="Times New Roman" w:eastAsia="Times New Roman"/>
+          <w:b w:val="0"/>
+          <w:i w:val="0"/>
+          <w:sz w:val="28"/>
+        </w:rPr>
+        <w:t>7. Измеряет задержку от отправки PATCH-запроса до получения события на клиенте B.</w:t>
+      </w:r>
+    </w:p>
+    <w:p>
+      <w:pPr>
+        <w:spacing w:line="360" w:lineRule="auto" w:after="0"/>
+        <w:ind w:left="709" w:hanging="425"/>
+        <w:jc w:val="both"/>
+      </w:pPr>
+      <w:r>
+        <w:rPr>
+          <w:rFonts w:ascii="Times New Roman" w:hAnsi="Times New Roman" w:eastAsia="Times New Roman"/>
+          <w:b w:val="0"/>
+          <w:i w:val="0"/>
+          <w:sz w:val="28"/>
+        </w:rPr>
+        <w:t>8. Выводит diagnostics обоих клиентов, полученный payload события и метрики доставки.</w:t>
       </w:r>
     </w:p>
     <w:p>
@@ -7329,9 +7757,9 @@
     </w:p>
     <w:p>
       <w:pPr>
-        <w:pStyle w:val="ListNumber"/>
-        <w:spacing w:line="360" w:lineRule="auto"/>
-        <w:ind w:left="709" w:hanging="283"/>
+        <w:spacing w:line="360" w:lineRule="auto" w:after="0"/>
+        <w:ind w:left="709" w:hanging="425"/>
+        <w:jc w:val="both"/>
       </w:pPr>
       <w:r>
         <w:rPr>
@@ -7340,14 +7768,14 @@
           <w:i w:val="0"/>
           <w:sz w:val="28"/>
         </w:rPr>
-        <w:t>Multi-instance без Redis backplane.</w:t>
-      </w:r>
-    </w:p>
-    <w:p>
-      <w:pPr>
-        <w:pStyle w:val="ListNumber"/>
-        <w:spacing w:line="360" w:lineRule="auto"/>
-        <w:ind w:left="709" w:hanging="283"/>
+        <w:t>1. Multi-instance без Redis backplane.</w:t>
+      </w:r>
+    </w:p>
+    <w:p>
+      <w:pPr>
+        <w:spacing w:line="360" w:lineRule="auto" w:after="0"/>
+        <w:ind w:left="709" w:hanging="425"/>
+        <w:jc w:val="both"/>
       </w:pPr>
       <w:r>
         <w:rPr>
@@ -7356,7 +7784,7 @@
           <w:i w:val="0"/>
           <w:sz w:val="28"/>
         </w:rPr>
-        <w:t>Multi-instance с Redis backplane.</w:t>
+        <w:t>2. Multi-instance с Redis backplane.</w:t>
       </w:r>
     </w:p>
     <w:p>
@@ -7390,7 +7818,7 @@
           <w:i w:val="0"/>
           <w:sz w:val="28"/>
         </w:rPr>
-        <w:t>.</w:t>
+        <w:t>. Программа испытаний построена с учётом базовых принципов проверки программного обеспечения [20]: два сопоставимых режима, повторяемость запусков и фиксация результатов в форме, пригодной для последующего анализа.</w:t>
       </w:r>
     </w:p>
     <w:p>
@@ -8744,6 +9172,20 @@
     </w:p>
     <w:p>
       <w:pPr>
+        <w:sectPr>
+          <w:footerReference w:type="default" r:id="rId10"/>
+          <w:pgSz w:w="12240" w:h="15840"/>
+          <w:pgMar w:top="1134" w:right="850" w:bottom="1134" w:left="1701" w:header="720" w:footer="720" w:gutter="0"/>
+          <w:cols w:space="720"/>
+          <w:docGrid w:linePitch="360"/>
+          <w:pgNumType w:start="1"/>
+        </w:sectPr>
+      </w:pPr>
+    </w:p>
+    <w:p>
+      <w:pPr>
+        <w:keepNext/>
+        <w:spacing w:after="40"/>
         <w:ind w:firstLine="0"/>
         <w:jc w:val="left"/>
       </w:pPr>
@@ -8765,17 +9207,20 @@
         <w:tblLook w:firstColumn="1" w:firstRow="1" w:lastColumn="0" w:lastRow="0" w:noHBand="0" w:noVBand="1" w:val="04A0"/>
       </w:tblPr>
       <w:tblGrid>
-        <w:gridCol w:w="1615"/>
-        <w:gridCol w:w="1615"/>
-        <w:gridCol w:w="1615"/>
-        <w:gridCol w:w="1615"/>
-        <w:gridCol w:w="1615"/>
-        <w:gridCol w:w="1615"/>
+        <w:gridCol w:w="2377"/>
+        <w:gridCol w:w="1782"/>
+        <w:gridCol w:w="1485"/>
+        <w:gridCol w:w="2971"/>
+        <w:gridCol w:w="3565"/>
+        <w:gridCol w:w="2674"/>
       </w:tblGrid>
       <w:tr>
+        <w:trPr>
+          <w:tblHeader w:val="true"/>
+        </w:trPr>
         <w:tc>
           <w:tcPr>
-            <w:tcW w:type="dxa" w:w="1615"/>
+            <w:tcW w:type="dxa" w:w="2377"/>
             <w:vAlign w:val="center"/>
           </w:tcPr>
           <w:p>
@@ -8789,7 +9234,8 @@
               <w:rPr>
                 <w:rFonts w:ascii="Times New Roman" w:hAnsi="Times New Roman" w:eastAsia="Times New Roman"/>
                 <w:b/>
-                <w:sz w:val="22"/>
+                <w:i w:val="0"/>
+                <w:sz w:val="20"/>
               </w:rPr>
               <w:t>Режим</w:t>
             </w:r>
@@ -8797,7 +9243,7 @@
         </w:tc>
         <w:tc>
           <w:tcPr>
-            <w:tcW w:type="dxa" w:w="1615"/>
+            <w:tcW w:type="dxa" w:w="1782"/>
             <w:vAlign w:val="center"/>
           </w:tcPr>
           <w:p>
@@ -8811,7 +9257,8 @@
               <w:rPr>
                 <w:rFonts w:ascii="Times New Roman" w:hAnsi="Times New Roman" w:eastAsia="Times New Roman"/>
                 <w:b/>
-                <w:sz w:val="22"/>
+                <w:i w:val="0"/>
+                <w:sz w:val="20"/>
               </w:rPr>
               <w:t>Клиенты на разных узлах</w:t>
             </w:r>
@@ -8819,7 +9266,7 @@
         </w:tc>
         <w:tc>
           <w:tcPr>
-            <w:tcW w:type="dxa" w:w="1615"/>
+            <w:tcW w:type="dxa" w:w="1485"/>
             <w:vAlign w:val="center"/>
           </w:tcPr>
           <w:p>
@@ -8833,7 +9280,8 @@
               <w:rPr>
                 <w:rFonts w:ascii="Times New Roman" w:hAnsi="Times New Roman" w:eastAsia="Times New Roman"/>
                 <w:b/>
-                <w:sz w:val="22"/>
+                <w:i w:val="0"/>
+                <w:sz w:val="20"/>
               </w:rPr>
               <w:t>Redis backplane</w:t>
             </w:r>
@@ -8841,7 +9289,7 @@
         </w:tc>
         <w:tc>
           <w:tcPr>
-            <w:tcW w:type="dxa" w:w="1615"/>
+            <w:tcW w:type="dxa" w:w="2971"/>
             <w:vAlign w:val="center"/>
           </w:tcPr>
           <w:p>
@@ -8855,7 +9303,8 @@
               <w:rPr>
                 <w:rFonts w:ascii="Times New Roman" w:hAnsi="Times New Roman" w:eastAsia="Times New Roman"/>
                 <w:b/>
-                <w:sz w:val="22"/>
+                <w:i w:val="0"/>
+                <w:sz w:val="20"/>
               </w:rPr>
               <w:t>Ожидаемый результат</w:t>
             </w:r>
@@ -8863,7 +9312,7 @@
         </w:tc>
         <w:tc>
           <w:tcPr>
-            <w:tcW w:type="dxa" w:w="1615"/>
+            <w:tcW w:type="dxa" w:w="3565"/>
             <w:vAlign w:val="center"/>
           </w:tcPr>
           <w:p>
@@ -8877,7 +9326,8 @@
               <w:rPr>
                 <w:rFonts w:ascii="Times New Roman" w:hAnsi="Times New Roman" w:eastAsia="Times New Roman"/>
                 <w:b/>
-                <w:sz w:val="22"/>
+                <w:i w:val="0"/>
+                <w:sz w:val="20"/>
               </w:rPr>
               <w:t>Фактический результат</w:t>
             </w:r>
@@ -8885,7 +9335,7 @@
         </w:tc>
         <w:tc>
           <w:tcPr>
-            <w:tcW w:type="dxa" w:w="1615"/>
+            <w:tcW w:type="dxa" w:w="2674"/>
             <w:vAlign w:val="center"/>
           </w:tcPr>
           <w:p>
@@ -8899,7 +9349,8 @@
               <w:rPr>
                 <w:rFonts w:ascii="Times New Roman" w:hAnsi="Times New Roman" w:eastAsia="Times New Roman"/>
                 <w:b/>
-                <w:sz w:val="22"/>
+                <w:i w:val="0"/>
+                <w:sz w:val="20"/>
               </w:rPr>
               <w:t>Вывод</w:t>
             </w:r>
@@ -8909,7 +9360,7 @@
       <w:tr>
         <w:tc>
           <w:tcPr>
-            <w:tcW w:type="dxa" w:w="1615"/>
+            <w:tcW w:type="dxa" w:w="2377"/>
             <w:vAlign w:val="center"/>
           </w:tcPr>
           <w:p>
@@ -8923,7 +9374,8 @@
               <w:rPr>
                 <w:rFonts w:ascii="Times New Roman" w:hAnsi="Times New Roman" w:eastAsia="Times New Roman"/>
                 <w:b w:val="0"/>
-                <w:sz w:val="22"/>
+                <w:i w:val="0"/>
+                <w:sz w:val="20"/>
               </w:rPr>
               <w:t>Multi-instance без backplane</w:t>
             </w:r>
@@ -8931,7 +9383,7 @@
         </w:tc>
         <w:tc>
           <w:tcPr>
-            <w:tcW w:type="dxa" w:w="1615"/>
+            <w:tcW w:type="dxa" w:w="1782"/>
             <w:vAlign w:val="center"/>
           </w:tcPr>
           <w:p>
@@ -8945,7 +9397,8 @@
               <w:rPr>
                 <w:rFonts w:ascii="Times New Roman" w:hAnsi="Times New Roman" w:eastAsia="Times New Roman"/>
                 <w:b w:val="0"/>
-                <w:sz w:val="22"/>
+                <w:i w:val="0"/>
+                <w:sz w:val="20"/>
               </w:rPr>
               <w:t>Да</w:t>
             </w:r>
@@ -8953,7 +9406,7 @@
         </w:tc>
         <w:tc>
           <w:tcPr>
-            <w:tcW w:type="dxa" w:w="1615"/>
+            <w:tcW w:type="dxa" w:w="1485"/>
             <w:vAlign w:val="center"/>
           </w:tcPr>
           <w:p>
@@ -8967,7 +9420,8 @@
               <w:rPr>
                 <w:rFonts w:ascii="Times New Roman" w:hAnsi="Times New Roman" w:eastAsia="Times New Roman"/>
                 <w:b w:val="0"/>
-                <w:sz w:val="22"/>
+                <w:i w:val="0"/>
+                <w:sz w:val="20"/>
               </w:rPr>
               <w:t>Нет</w:t>
             </w:r>
@@ -8975,7 +9429,7 @@
         </w:tc>
         <w:tc>
           <w:tcPr>
-            <w:tcW w:type="dxa" w:w="1615"/>
+            <w:tcW w:type="dxa" w:w="2971"/>
             <w:vAlign w:val="center"/>
           </w:tcPr>
           <w:p>
@@ -8989,7 +9443,8 @@
               <w:rPr>
                 <w:rFonts w:ascii="Times New Roman" w:hAnsi="Times New Roman" w:eastAsia="Times New Roman"/>
                 <w:b w:val="0"/>
-                <w:sz w:val="22"/>
+                <w:i w:val="0"/>
+                <w:sz w:val="20"/>
               </w:rPr>
               <w:t>Событие не доставляется между узлами</w:t>
             </w:r>
@@ -8997,7 +9452,7 @@
         </w:tc>
         <w:tc>
           <w:tcPr>
-            <w:tcW w:type="dxa" w:w="1615"/>
+            <w:tcW w:type="dxa" w:w="3565"/>
             <w:vAlign w:val="center"/>
           </w:tcPr>
           <w:p>
@@ -9011,7 +9466,8 @@
               <w:rPr>
                 <w:rFonts w:ascii="Times New Roman" w:hAnsi="Times New Roman" w:eastAsia="Times New Roman"/>
                 <w:b w:val="0"/>
-                <w:sz w:val="22"/>
+                <w:i w:val="0"/>
+                <w:sz w:val="20"/>
               </w:rPr>
               <w:t>Timeout после 10000 мс</w:t>
             </w:r>
@@ -9019,7 +9475,7 @@
         </w:tc>
         <w:tc>
           <w:tcPr>
-            <w:tcW w:type="dxa" w:w="1615"/>
+            <w:tcW w:type="dxa" w:w="2674"/>
             <w:vAlign w:val="center"/>
           </w:tcPr>
           <w:p>
@@ -9033,7 +9489,8 @@
               <w:rPr>
                 <w:rFonts w:ascii="Times New Roman" w:hAnsi="Times New Roman" w:eastAsia="Times New Roman"/>
                 <w:b w:val="0"/>
-                <w:sz w:val="22"/>
+                <w:i w:val="0"/>
+                <w:sz w:val="20"/>
               </w:rPr>
               <w:t>Исходное ограничение воспроизведено</w:t>
             </w:r>
@@ -9043,7 +9500,7 @@
       <w:tr>
         <w:tc>
           <w:tcPr>
-            <w:tcW w:type="dxa" w:w="1615"/>
+            <w:tcW w:type="dxa" w:w="2377"/>
             <w:vAlign w:val="center"/>
           </w:tcPr>
           <w:p>
@@ -9057,7 +9514,8 @@
               <w:rPr>
                 <w:rFonts w:ascii="Times New Roman" w:hAnsi="Times New Roman" w:eastAsia="Times New Roman"/>
                 <w:b w:val="0"/>
-                <w:sz w:val="22"/>
+                <w:i w:val="0"/>
+                <w:sz w:val="20"/>
               </w:rPr>
               <w:t>Multi-instance с backplane, одиночный запуск</w:t>
             </w:r>
@@ -9065,7 +9523,7 @@
         </w:tc>
         <w:tc>
           <w:tcPr>
-            <w:tcW w:type="dxa" w:w="1615"/>
+            <w:tcW w:type="dxa" w:w="1782"/>
             <w:vAlign w:val="center"/>
           </w:tcPr>
           <w:p>
@@ -9079,7 +9537,8 @@
               <w:rPr>
                 <w:rFonts w:ascii="Times New Roman" w:hAnsi="Times New Roman" w:eastAsia="Times New Roman"/>
                 <w:b w:val="0"/>
-                <w:sz w:val="22"/>
+                <w:i w:val="0"/>
+                <w:sz w:val="20"/>
               </w:rPr>
               <w:t>Да</w:t>
             </w:r>
@@ -9087,7 +9546,7 @@
         </w:tc>
         <w:tc>
           <w:tcPr>
-            <w:tcW w:type="dxa" w:w="1615"/>
+            <w:tcW w:type="dxa" w:w="1485"/>
             <w:vAlign w:val="center"/>
           </w:tcPr>
           <w:p>
@@ -9101,7 +9560,8 @@
               <w:rPr>
                 <w:rFonts w:ascii="Times New Roman" w:hAnsi="Times New Roman" w:eastAsia="Times New Roman"/>
                 <w:b w:val="0"/>
-                <w:sz w:val="22"/>
+                <w:i w:val="0"/>
+                <w:sz w:val="20"/>
               </w:rPr>
               <w:t>Да</w:t>
             </w:r>
@@ -9109,7 +9569,7 @@
         </w:tc>
         <w:tc>
           <w:tcPr>
-            <w:tcW w:type="dxa" w:w="1615"/>
+            <w:tcW w:type="dxa" w:w="2971"/>
             <w:vAlign w:val="center"/>
           </w:tcPr>
           <w:p>
@@ -9123,7 +9583,8 @@
               <w:rPr>
                 <w:rFonts w:ascii="Times New Roman" w:hAnsi="Times New Roman" w:eastAsia="Times New Roman"/>
                 <w:b w:val="0"/>
-                <w:sz w:val="22"/>
+                <w:i w:val="0"/>
+                <w:sz w:val="20"/>
               </w:rPr>
               <w:t>Событие доставляется между узлами</w:t>
             </w:r>
@@ -9131,7 +9592,48 @@
         </w:tc>
         <w:tc>
           <w:tcPr>
-            <w:tcW w:type="dxa" w:w="1615"/>
+            <w:tcW w:type="dxa" w:w="3565"/>
+            <w:vAlign w:val="center"/>
+          </w:tcPr>
+          <w:p>
+            <w:pPr>
+              <w:spacing w:line="240" w:lineRule="auto" w:before="0" w:after="0"/>
+              <w:ind w:firstLine="0"/>
+              <w:jc w:val="left"/>
+            </w:pPr>
+            <w:r/>
+            <w:r>
+              <w:rPr>
+                <w:rFonts w:ascii="Courier New" w:hAnsi="Courier New" w:eastAsia="Courier New"/>
+                <w:b w:val="0"/>
+                <w:i w:val="0"/>
+                <w:sz w:val="20"/>
+              </w:rPr>
+              <w:t>ok: true</w:t>
+            </w:r>
+            <w:r>
+              <w:rPr>
+                <w:rFonts w:ascii="Times New Roman" w:hAnsi="Times New Roman" w:eastAsia="Times New Roman"/>
+                <w:b w:val="0"/>
+                <w:i w:val="0"/>
+                <w:sz w:val="20"/>
+              </w:rPr>
+              <w:t xml:space="preserve">, получен </w:t>
+            </w:r>
+            <w:r>
+              <w:rPr>
+                <w:rFonts w:ascii="Courier New" w:hAnsi="Courier New" w:eastAsia="Courier New"/>
+                <w:b w:val="0"/>
+                <w:i w:val="0"/>
+                <w:sz w:val="20"/>
+              </w:rPr>
+              <w:t>ReceiveReportPatch</w:t>
+            </w:r>
+          </w:p>
+        </w:tc>
+        <w:tc>
+          <w:tcPr>
+            <w:tcW w:type="dxa" w:w="2674"/>
             <w:vAlign w:val="center"/>
           </w:tcPr>
           <w:p>
@@ -9145,15 +9647,18 @@
               <w:rPr>
                 <w:rFonts w:ascii="Times New Roman" w:hAnsi="Times New Roman" w:eastAsia="Times New Roman"/>
                 <w:b w:val="0"/>
-                <w:sz w:val="22"/>
+                <w:i w:val="0"/>
+                <w:sz w:val="20"/>
               </w:rPr>
-              <w:t>`ok: true`, получен `ReceiveReportPatch`</w:t>
+              <w:t>Ограничение устранено</w:t>
             </w:r>
           </w:p>
         </w:tc>
+      </w:tr>
+      <w:tr>
         <w:tc>
           <w:tcPr>
-            <w:tcW w:type="dxa" w:w="1615"/>
+            <w:tcW w:type="dxa" w:w="2377"/>
             <w:vAlign w:val="center"/>
           </w:tcPr>
           <w:p>
@@ -9167,17 +9672,16 @@
               <w:rPr>
                 <w:rFonts w:ascii="Times New Roman" w:hAnsi="Times New Roman" w:eastAsia="Times New Roman"/>
                 <w:b w:val="0"/>
-                <w:sz w:val="22"/>
+                <w:i w:val="0"/>
+                <w:sz w:val="20"/>
               </w:rPr>
-              <w:t>Ограничение устранено</w:t>
+              <w:t>Multi-instance с backplane, 5 итераций</w:t>
             </w:r>
           </w:p>
         </w:tc>
-      </w:tr>
-      <w:tr>
         <w:tc>
           <w:tcPr>
-            <w:tcW w:type="dxa" w:w="1615"/>
+            <w:tcW w:type="dxa" w:w="1782"/>
             <w:vAlign w:val="center"/>
           </w:tcPr>
           <w:p>
@@ -9191,15 +9695,16 @@
               <w:rPr>
                 <w:rFonts w:ascii="Times New Roman" w:hAnsi="Times New Roman" w:eastAsia="Times New Roman"/>
                 <w:b w:val="0"/>
-                <w:sz w:val="22"/>
+                <w:i w:val="0"/>
+                <w:sz w:val="20"/>
               </w:rPr>
-              <w:t>Multi-instance с backplane, 5 итераций</w:t>
+              <w:t>Да</w:t>
             </w:r>
           </w:p>
         </w:tc>
         <w:tc>
           <w:tcPr>
-            <w:tcW w:type="dxa" w:w="1615"/>
+            <w:tcW w:type="dxa" w:w="1485"/>
             <w:vAlign w:val="center"/>
           </w:tcPr>
           <w:p>
@@ -9213,7 +9718,8 @@
               <w:rPr>
                 <w:rFonts w:ascii="Times New Roman" w:hAnsi="Times New Roman" w:eastAsia="Times New Roman"/>
                 <w:b w:val="0"/>
-                <w:sz w:val="22"/>
+                <w:i w:val="0"/>
+                <w:sz w:val="20"/>
               </w:rPr>
               <w:t>Да</w:t>
             </w:r>
@@ -9221,7 +9727,7 @@
         </w:tc>
         <w:tc>
           <w:tcPr>
-            <w:tcW w:type="dxa" w:w="1615"/>
+            <w:tcW w:type="dxa" w:w="2971"/>
             <w:vAlign w:val="center"/>
           </w:tcPr>
           <w:p>
@@ -9235,15 +9741,16 @@
               <w:rPr>
                 <w:rFonts w:ascii="Times New Roman" w:hAnsi="Times New Roman" w:eastAsia="Times New Roman"/>
                 <w:b w:val="0"/>
-                <w:sz w:val="22"/>
+                <w:i w:val="0"/>
+                <w:sz w:val="20"/>
               </w:rPr>
-              <w:t>Да</w:t>
+              <w:t>Все события доставляются между узлами</w:t>
             </w:r>
           </w:p>
         </w:tc>
         <w:tc>
           <w:tcPr>
-            <w:tcW w:type="dxa" w:w="1615"/>
+            <w:tcW w:type="dxa" w:w="3565"/>
             <w:vAlign w:val="center"/>
           </w:tcPr>
           <w:p>
@@ -9257,15 +9764,16 @@
               <w:rPr>
                 <w:rFonts w:ascii="Times New Roman" w:hAnsi="Times New Roman" w:eastAsia="Times New Roman"/>
                 <w:b w:val="0"/>
-                <w:sz w:val="22"/>
+                <w:i w:val="0"/>
+                <w:sz w:val="20"/>
               </w:rPr>
-              <w:t>Все события доставляются между узлами</w:t>
+              <w:t>5 из 5 успешно, p95 = 11,6 мс</w:t>
             </w:r>
           </w:p>
         </w:tc>
         <w:tc>
           <w:tcPr>
-            <w:tcW w:type="dxa" w:w="1615"/>
+            <w:tcW w:type="dxa" w:w="2674"/>
             <w:vAlign w:val="center"/>
           </w:tcPr>
           <w:p>
@@ -9279,15 +9787,18 @@
               <w:rPr>
                 <w:rFonts w:ascii="Times New Roman" w:hAnsi="Times New Roman" w:eastAsia="Times New Roman"/>
                 <w:b w:val="0"/>
-                <w:sz w:val="22"/>
+                <w:i w:val="0"/>
+                <w:sz w:val="20"/>
               </w:rPr>
-              <w:t>5 из 5 успешно, p95 = 11,6 мс</w:t>
+              <w:t>Подтверждена повторяемость результата</w:t>
             </w:r>
           </w:p>
         </w:tc>
+      </w:tr>
+      <w:tr>
         <w:tc>
           <w:tcPr>
-            <w:tcW w:type="dxa" w:w="1615"/>
+            <w:tcW w:type="dxa" w:w="2377"/>
             <w:vAlign w:val="center"/>
           </w:tcPr>
           <w:p>
@@ -9301,17 +9812,16 @@
               <w:rPr>
                 <w:rFonts w:ascii="Times New Roman" w:hAnsi="Times New Roman" w:eastAsia="Times New Roman"/>
                 <w:b w:val="0"/>
-                <w:sz w:val="22"/>
+                <w:i w:val="0"/>
+                <w:sz w:val="20"/>
               </w:rPr>
-              <w:t>Подтверждена повторяемость результата</w:t>
+              <w:t>Rejoin после разрыва</w:t>
             </w:r>
           </w:p>
         </w:tc>
-      </w:tr>
-      <w:tr>
         <w:tc>
           <w:tcPr>
-            <w:tcW w:type="dxa" w:w="1615"/>
+            <w:tcW w:type="dxa" w:w="1782"/>
             <w:vAlign w:val="center"/>
           </w:tcPr>
           <w:p>
@@ -9325,15 +9835,16 @@
               <w:rPr>
                 <w:rFonts w:ascii="Times New Roman" w:hAnsi="Times New Roman" w:eastAsia="Times New Roman"/>
                 <w:b w:val="0"/>
-                <w:sz w:val="22"/>
+                <w:i w:val="0"/>
+                <w:sz w:val="20"/>
               </w:rPr>
-              <w:t>Rejoin после разрыва</w:t>
+              <w:t>Да</w:t>
             </w:r>
           </w:p>
         </w:tc>
         <w:tc>
           <w:tcPr>
-            <w:tcW w:type="dxa" w:w="1615"/>
+            <w:tcW w:type="dxa" w:w="1485"/>
             <w:vAlign w:val="center"/>
           </w:tcPr>
           <w:p>
@@ -9347,7 +9858,8 @@
               <w:rPr>
                 <w:rFonts w:ascii="Times New Roman" w:hAnsi="Times New Roman" w:eastAsia="Times New Roman"/>
                 <w:b w:val="0"/>
-                <w:sz w:val="22"/>
+                <w:i w:val="0"/>
+                <w:sz w:val="20"/>
               </w:rPr>
               <w:t>Да</w:t>
             </w:r>
@@ -9355,7 +9867,7 @@
         </w:tc>
         <w:tc>
           <w:tcPr>
-            <w:tcW w:type="dxa" w:w="1615"/>
+            <w:tcW w:type="dxa" w:w="2971"/>
             <w:vAlign w:val="center"/>
           </w:tcPr>
           <w:p>
@@ -9369,15 +9881,16 @@
               <w:rPr>
                 <w:rFonts w:ascii="Times New Roman" w:hAnsi="Times New Roman" w:eastAsia="Times New Roman"/>
                 <w:b w:val="0"/>
-                <w:sz w:val="22"/>
+                <w:i w:val="0"/>
+                <w:sz w:val="20"/>
               </w:rPr>
-              <w:t>Да</w:t>
+              <w:t>После нового подключения клиент повторно вступает в группу</w:t>
             </w:r>
           </w:p>
         </w:tc>
         <w:tc>
           <w:tcPr>
-            <w:tcW w:type="dxa" w:w="1615"/>
+            <w:tcW w:type="dxa" w:w="3565"/>
             <w:vAlign w:val="center"/>
           </w:tcPr>
           <w:p>
@@ -9391,15 +9904,16 @@
               <w:rPr>
                 <w:rFonts w:ascii="Times New Roman" w:hAnsi="Times New Roman" w:eastAsia="Times New Roman"/>
                 <w:b w:val="0"/>
-                <w:sz w:val="22"/>
+                <w:i w:val="0"/>
+                <w:sz w:val="20"/>
               </w:rPr>
-              <w:t>После нового подключения клиент повторно вступает в группу</w:t>
+              <w:t>Событие после rejoin получено, 6,6 мс</w:t>
             </w:r>
           </w:p>
         </w:tc>
         <w:tc>
           <w:tcPr>
-            <w:tcW w:type="dxa" w:w="1615"/>
+            <w:tcW w:type="dxa" w:w="2674"/>
             <w:vAlign w:val="center"/>
           </w:tcPr>
           <w:p>
@@ -9413,15 +9927,18 @@
               <w:rPr>
                 <w:rFonts w:ascii="Times New Roman" w:hAnsi="Times New Roman" w:eastAsia="Times New Roman"/>
                 <w:b w:val="0"/>
-                <w:sz w:val="22"/>
+                <w:i w:val="0"/>
+                <w:sz w:val="20"/>
               </w:rPr>
-              <w:t>Событие после rejoin получено, 6,6 мс</w:t>
+              <w:t>Подтверждена повторная подписка</w:t>
             </w:r>
           </w:p>
         </w:tc>
+      </w:tr>
+      <w:tr>
         <w:tc>
           <w:tcPr>
-            <w:tcW w:type="dxa" w:w="1615"/>
+            <w:tcW w:type="dxa" w:w="2377"/>
             <w:vAlign w:val="center"/>
           </w:tcPr>
           <w:p>
@@ -9435,17 +9952,16 @@
               <w:rPr>
                 <w:rFonts w:ascii="Times New Roman" w:hAnsi="Times New Roman" w:eastAsia="Times New Roman"/>
                 <w:b w:val="0"/>
-                <w:sz w:val="22"/>
+                <w:i w:val="0"/>
+                <w:sz w:val="20"/>
               </w:rPr>
-              <w:t>Подтверждена повторная подписка</w:t>
+              <w:t>Failover одного узла</w:t>
             </w:r>
           </w:p>
         </w:tc>
-      </w:tr>
-      <w:tr>
         <w:tc>
           <w:tcPr>
-            <w:tcW w:type="dxa" w:w="1615"/>
+            <w:tcW w:type="dxa" w:w="1782"/>
             <w:vAlign w:val="center"/>
           </w:tcPr>
           <w:p>
@@ -9459,15 +9975,16 @@
               <w:rPr>
                 <w:rFonts w:ascii="Times New Roman" w:hAnsi="Times New Roman" w:eastAsia="Times New Roman"/>
                 <w:b w:val="0"/>
-                <w:sz w:val="22"/>
+                <w:i w:val="0"/>
+                <w:sz w:val="20"/>
               </w:rPr>
-              <w:t>Failover одного узла</w:t>
+              <w:t>Да</w:t>
             </w:r>
           </w:p>
         </w:tc>
         <w:tc>
           <w:tcPr>
-            <w:tcW w:type="dxa" w:w="1615"/>
+            <w:tcW w:type="dxa" w:w="1485"/>
             <w:vAlign w:val="center"/>
           </w:tcPr>
           <w:p>
@@ -9481,7 +9998,8 @@
               <w:rPr>
                 <w:rFonts w:ascii="Times New Roman" w:hAnsi="Times New Roman" w:eastAsia="Times New Roman"/>
                 <w:b w:val="0"/>
-                <w:sz w:val="22"/>
+                <w:i w:val="0"/>
+                <w:sz w:val="20"/>
               </w:rPr>
               <w:t>Да</w:t>
             </w:r>
@@ -9489,7 +10007,7 @@
         </w:tc>
         <w:tc>
           <w:tcPr>
-            <w:tcW w:type="dxa" w:w="1615"/>
+            <w:tcW w:type="dxa" w:w="2971"/>
             <w:vAlign w:val="center"/>
           </w:tcPr>
           <w:p>
@@ -9503,15 +10021,66 @@
               <w:rPr>
                 <w:rFonts w:ascii="Times New Roman" w:hAnsi="Times New Roman" w:eastAsia="Times New Roman"/>
                 <w:b w:val="0"/>
-                <w:sz w:val="22"/>
+                <w:i w:val="0"/>
+                <w:sz w:val="20"/>
               </w:rPr>
-              <w:t>Да</w:t>
+              <w:t>Клиент переподключается через nginx к доступному узлу</w:t>
             </w:r>
           </w:p>
         </w:tc>
         <w:tc>
           <w:tcPr>
-            <w:tcW w:type="dxa" w:w="1615"/>
+            <w:tcW w:type="dxa" w:w="3565"/>
+            <w:vAlign w:val="center"/>
+          </w:tcPr>
+          <w:p>
+            <w:pPr>
+              <w:spacing w:line="240" w:lineRule="auto" w:before="0" w:after="0"/>
+              <w:ind w:firstLine="0"/>
+              <w:jc w:val="left"/>
+            </w:pPr>
+            <w:r/>
+            <w:r>
+              <w:rPr>
+                <w:rFonts w:ascii="Courier New" w:hAnsi="Courier New" w:eastAsia="Courier New"/>
+                <w:b w:val="0"/>
+                <w:i w:val="0"/>
+                <w:sz w:val="20"/>
+              </w:rPr>
+              <w:t>app-api-2</w:t>
+            </w:r>
+            <w:r>
+              <w:rPr>
+                <w:rFonts w:ascii="Times New Roman" w:hAnsi="Times New Roman" w:eastAsia="Times New Roman"/>
+                <w:b w:val="0"/>
+                <w:i w:val="0"/>
+                <w:sz w:val="20"/>
+              </w:rPr>
+              <w:t xml:space="preserve"> -&gt; </w:t>
+            </w:r>
+            <w:r>
+              <w:rPr>
+                <w:rFonts w:ascii="Courier New" w:hAnsi="Courier New" w:eastAsia="Courier New"/>
+                <w:b w:val="0"/>
+                <w:i w:val="0"/>
+                <w:sz w:val="20"/>
+              </w:rPr>
+              <w:t>app-api-1</w:t>
+            </w:r>
+            <w:r>
+              <w:rPr>
+                <w:rFonts w:ascii="Times New Roman" w:hAnsi="Times New Roman" w:eastAsia="Times New Roman"/>
+                <w:b w:val="0"/>
+                <w:i w:val="0"/>
+                <w:sz w:val="20"/>
+              </w:rPr>
+              <w:t>, событие получено</w:t>
+            </w:r>
+          </w:p>
+        </w:tc>
+        <w:tc>
+          <w:tcPr>
+            <w:tcW w:type="dxa" w:w="2674"/>
             <w:vAlign w:val="center"/>
           </w:tcPr>
           <w:p>
@@ -9525,51 +10094,8 @@
               <w:rPr>
                 <w:rFonts w:ascii="Times New Roman" w:hAnsi="Times New Roman" w:eastAsia="Times New Roman"/>
                 <w:b w:val="0"/>
-                <w:sz w:val="22"/>
-              </w:rPr>
-              <w:t>Клиент переподключается через nginx к доступному узлу</w:t>
-            </w:r>
-          </w:p>
-        </w:tc>
-        <w:tc>
-          <w:tcPr>
-            <w:tcW w:type="dxa" w:w="1615"/>
-            <w:vAlign w:val="center"/>
-          </w:tcPr>
-          <w:p>
-            <w:pPr>
-              <w:spacing w:line="240" w:lineRule="auto" w:before="0" w:after="0"/>
-              <w:ind w:firstLine="0"/>
-              <w:jc w:val="left"/>
-            </w:pPr>
-            <w:r/>
-            <w:r>
-              <w:rPr>
-                <w:rFonts w:ascii="Times New Roman" w:hAnsi="Times New Roman" w:eastAsia="Times New Roman"/>
-                <w:b w:val="0"/>
-                <w:sz w:val="22"/>
-              </w:rPr>
-              <w:t>`app-api-2` -&gt; `app-api-1`, событие получено</w:t>
-            </w:r>
-          </w:p>
-        </w:tc>
-        <w:tc>
-          <w:tcPr>
-            <w:tcW w:type="dxa" w:w="1615"/>
-            <w:vAlign w:val="center"/>
-          </w:tcPr>
-          <w:p>
-            <w:pPr>
-              <w:spacing w:line="240" w:lineRule="auto" w:before="0" w:after="0"/>
-              <w:ind w:firstLine="0"/>
-              <w:jc w:val="left"/>
-            </w:pPr>
-            <w:r/>
-            <w:r>
-              <w:rPr>
-                <w:rFonts w:ascii="Times New Roman" w:hAnsi="Times New Roman" w:eastAsia="Times New Roman"/>
-                <w:b w:val="0"/>
-                <w:sz w:val="22"/>
+                <w:i w:val="0"/>
+                <w:sz w:val="20"/>
               </w:rPr>
               <w:t>Подтверждено восстановление после отказа</w:t>
             </w:r>
@@ -9579,6 +10105,17 @@
     </w:tbl>
     <w:p>
       <w:pPr>
+        <w:sectPr>
+          <w:footerReference w:type="default" r:id="rId14"/>
+          <w:pgSz w:w="16838" w:h="11906" w:orient="landscape"/>
+          <w:pgMar w:top="1134" w:right="850" w:bottom="1134" w:left="1134" w:header="720" w:footer="720" w:gutter="0"/>
+          <w:cols w:space="720"/>
+          <w:docGrid w:linePitch="360"/>
+        </w:sectPr>
+      </w:pPr>
+    </w:p>
+    <w:p>
+      <w:pPr>
         <w:pStyle w:val="Heading2"/>
       </w:pPr>
       <w:r>
@@ -10764,12 +11301,11 @@
       </w:r>
     </w:p>
     <w:sectPr>
-      <w:footerReference w:type="default" r:id="rId10"/>
-      <w:pgSz w:w="12240" w:h="15840"/>
+      <w:footerReference w:type="default" r:id="rId15"/>
+      <w:pgSz w:w="11906" w:h="16838"/>
       <w:pgMar w:top="1134" w:right="850" w:bottom="1134" w:left="1701" w:header="720" w:footer="720" w:gutter="0"/>
       <w:cols w:space="720"/>
       <w:docGrid w:linePitch="360"/>
-      <w:pgNumType w:start="1"/>
     </w:sectPr>
   </w:body>
 </w:document>
@@ -10786,6 +11322,50 @@
 </file>
 
 <file path=word/footer2.xml><?xml version="1.0" encoding="utf-8"?>
+<w:ftr xmlns:m="http://schemas.openxmlformats.org/officeDocument/2006/math" xmlns:mc="http://schemas.openxmlformats.org/markup-compatibility/2006" xmlns:mo="http://schemas.microsoft.com/office/mac/office/2008/main" xmlns:mv="urn:schemas-microsoft-com:mac:vml" xmlns:o="urn:schemas-microsoft-com:office:office" xmlns:r="http://schemas.openxmlformats.org/officeDocument/2006/relationships" xmlns:v="urn:schemas-microsoft-com:vml" xmlns:w10="urn:schemas-microsoft-com:office:word" xmlns:w14="http://schemas.microsoft.com/office/word/2010/wordml" xmlns:w="http://schemas.openxmlformats.org/wordprocessingml/2006/main" xmlns:wne="http://schemas.microsoft.com/office/word/2006/wordml" xmlns:wp14="http://schemas.microsoft.com/office/word/2010/wordprocessingDrawing" xmlns:wp="http://schemas.openxmlformats.org/drawingml/2006/wordprocessingDrawing" xmlns:wpc="http://schemas.microsoft.com/office/word/2010/wordprocessingCanvas" xmlns:wpg="http://schemas.microsoft.com/office/word/2010/wordprocessingGroup" xmlns:wpi="http://schemas.microsoft.com/office/word/2010/wordprocessingInk" xmlns:wps="http://schemas.microsoft.com/office/word/2010/wordprocessingShape" mc:Ignorable="w14 wp14">
+  <w:p>
+    <w:pPr>
+      <w:pStyle w:val="Footer"/>
+      <w:jc w:val="center"/>
+    </w:pPr>
+    <w:r>
+      <w:rPr>
+        <w:rFonts w:ascii="Times New Roman" w:hAnsi="Times New Roman" w:eastAsia="Times New Roman"/>
+        <w:b w:val="0"/>
+        <w:i w:val="0"/>
+        <w:sz w:val="24"/>
+      </w:rPr>
+      <w:fldChar w:fldCharType="begin"/>
+      <w:instrText xml:space="preserve">PAGE</w:instrText>
+      <w:fldChar w:fldCharType="end"/>
+    </w:r>
+  </w:p>
+</w:ftr>
+</file>
+
+<file path=word/footer3.xml><?xml version="1.0" encoding="utf-8"?>
+<w:ftr xmlns:m="http://schemas.openxmlformats.org/officeDocument/2006/math" xmlns:mc="http://schemas.openxmlformats.org/markup-compatibility/2006" xmlns:mo="http://schemas.microsoft.com/office/mac/office/2008/main" xmlns:mv="urn:schemas-microsoft-com:mac:vml" xmlns:o="urn:schemas-microsoft-com:office:office" xmlns:r="http://schemas.openxmlformats.org/officeDocument/2006/relationships" xmlns:v="urn:schemas-microsoft-com:vml" xmlns:w10="urn:schemas-microsoft-com:office:word" xmlns:w14="http://schemas.microsoft.com/office/word/2010/wordml" xmlns:w="http://schemas.openxmlformats.org/wordprocessingml/2006/main" xmlns:wne="http://schemas.microsoft.com/office/word/2006/wordml" xmlns:wp14="http://schemas.microsoft.com/office/word/2010/wordprocessingDrawing" xmlns:wp="http://schemas.openxmlformats.org/drawingml/2006/wordprocessingDrawing" xmlns:wpc="http://schemas.microsoft.com/office/word/2010/wordprocessingCanvas" xmlns:wpg="http://schemas.microsoft.com/office/word/2010/wordprocessingGroup" xmlns:wpi="http://schemas.microsoft.com/office/word/2010/wordprocessingInk" xmlns:wps="http://schemas.microsoft.com/office/word/2010/wordprocessingShape" mc:Ignorable="w14 wp14">
+  <w:p>
+    <w:pPr>
+      <w:pStyle w:val="Footer"/>
+      <w:jc w:val="center"/>
+    </w:pPr>
+    <w:r>
+      <w:rPr>
+        <w:rFonts w:ascii="Times New Roman" w:hAnsi="Times New Roman" w:eastAsia="Times New Roman"/>
+        <w:b w:val="0"/>
+        <w:i w:val="0"/>
+        <w:sz w:val="24"/>
+      </w:rPr>
+      <w:fldChar w:fldCharType="begin"/>
+      <w:instrText xml:space="preserve">PAGE</w:instrText>
+      <w:fldChar w:fldCharType="end"/>
+    </w:r>
+  </w:p>
+</w:ftr>
+</file>
+
+<file path=word/footer4.xml><?xml version="1.0" encoding="utf-8"?>
 <w:ftr xmlns:m="http://schemas.openxmlformats.org/officeDocument/2006/math" xmlns:mc="http://schemas.openxmlformats.org/markup-compatibility/2006" xmlns:mo="http://schemas.microsoft.com/office/mac/office/2008/main" xmlns:mv="urn:schemas-microsoft-com:mac:vml" xmlns:o="urn:schemas-microsoft-com:office:office" xmlns:r="http://schemas.openxmlformats.org/officeDocument/2006/relationships" xmlns:v="urn:schemas-microsoft-com:vml" xmlns:w10="urn:schemas-microsoft-com:office:word" xmlns:w14="http://schemas.microsoft.com/office/word/2010/wordml" xmlns:w="http://schemas.openxmlformats.org/wordprocessingml/2006/main" xmlns:wne="http://schemas.microsoft.com/office/word/2006/wordml" xmlns:wp14="http://schemas.microsoft.com/office/word/2010/wordprocessingDrawing" xmlns:wp="http://schemas.openxmlformats.org/drawingml/2006/wordprocessingDrawing" xmlns:wpc="http://schemas.microsoft.com/office/word/2010/wordprocessingCanvas" xmlns:wpg="http://schemas.microsoft.com/office/word/2010/wordprocessingGroup" xmlns:wpi="http://schemas.microsoft.com/office/word/2010/wordprocessingInk" xmlns:wps="http://schemas.microsoft.com/office/word/2010/wordprocessingShape" mc:Ignorable="w14 wp14">
   <w:p>
     <w:pPr>

</xml_diff>

<commit_message>
Update DOCX and PPTX files for final qualifying work, including revisions to practice and defense reports, enhancements to figures and tables, and updates to Markdown content. Refactor report generation scripts to improve layout and formatting, ensuring compliance with project standards.
</commit_message>
<xml_diff>
--- a/build/docx/practice-report-draft-1.docx
+++ b/build/docx/practice-report-draft-1.docx
@@ -3950,13 +3950,9 @@
       </w:r>
     </w:p>
     <w:p>
-      <w:r>
-        <w:br w:type="page"/>
-      </w:r>
-    </w:p>
-    <w:p>
       <w:pPr>
         <w:pStyle w:val="Heading1"/>
+        <w:pageBreakBefore/>
       </w:pPr>
       <w:r>
         <w:t>1. Анализ предметной области и существующих подходов</w:t>
@@ -4923,13 +4919,9 @@
       </w:r>
     </w:p>
     <w:p>
-      <w:r>
-        <w:br w:type="page"/>
-      </w:r>
-    </w:p>
-    <w:p>
       <w:pPr>
         <w:pStyle w:val="Heading1"/>
+        <w:pageBreakBefore/>
       </w:pPr>
       <w:r>
         <w:t>2. Анализ целевой системы и постановка задачи практики</w:t>
@@ -5536,13 +5528,9 @@
       </w:r>
     </w:p>
     <w:p>
-      <w:r>
-        <w:br w:type="page"/>
-      </w:r>
-    </w:p>
-    <w:p>
       <w:pPr>
         <w:pStyle w:val="Heading1"/>
+        <w:pageBreakBefore/>
       </w:pPr>
       <w:r>
         <w:t>3. Проектирование масштабируемого real-time контура</w:t>
@@ -6427,13 +6415,9 @@
       </w:r>
     </w:p>
     <w:p>
-      <w:r>
-        <w:br w:type="page"/>
-      </w:r>
-    </w:p>
-    <w:p>
       <w:pPr>
         <w:pStyle w:val="Heading1"/>
+        <w:pageBreakBefore/>
       </w:pPr>
       <w:r>
         <w:t>4. Выполнение индивидуального задания</w:t>
@@ -7703,13 +7687,9 @@
       </w:r>
     </w:p>
     <w:p>
-      <w:r>
-        <w:br w:type="page"/>
-      </w:r>
-    </w:p>
-    <w:p>
       <w:pPr>
         <w:pStyle w:val="Heading1"/>
+        <w:pageBreakBefore/>
       </w:pPr>
       <w:r>
         <w:t>5. Результаты практики и оценка решения</w:t>
@@ -9158,29 +9138,12 @@
       </w:r>
     </w:p>
     <w:p>
-      <w:r>
-        <w:br w:type="page"/>
-      </w:r>
-    </w:p>
-    <w:p>
       <w:pPr>
         <w:pStyle w:val="Heading2"/>
       </w:pPr>
       <w:r>
         <w:t>5.7 Сравнительная таблица результатов</w:t>
       </w:r>
-    </w:p>
-    <w:p>
-      <w:pPr>
-        <w:sectPr>
-          <w:footerReference w:type="default" r:id="rId10"/>
-          <w:pgSz w:w="12240" w:h="15840"/>
-          <w:pgMar w:top="1134" w:right="850" w:bottom="1134" w:left="1701" w:header="720" w:footer="720" w:gutter="0"/>
-          <w:cols w:space="720"/>
-          <w:docGrid w:linePitch="360"/>
-          <w:pgNumType w:start="1"/>
-        </w:sectPr>
-      </w:pPr>
     </w:p>
     <w:p>
       <w:pPr>
@@ -9207,12 +9170,11 @@
         <w:tblLook w:firstColumn="1" w:firstRow="1" w:lastColumn="0" w:lastRow="0" w:noHBand="0" w:noVBand="1" w:val="04A0"/>
       </w:tblPr>
       <w:tblGrid>
-        <w:gridCol w:w="2377"/>
-        <w:gridCol w:w="1782"/>
-        <w:gridCol w:w="1485"/>
-        <w:gridCol w:w="2971"/>
-        <w:gridCol w:w="3565"/>
-        <w:gridCol w:w="2674"/>
+        <w:gridCol w:w="2079"/>
+        <w:gridCol w:w="866"/>
+        <w:gridCol w:w="2252"/>
+        <w:gridCol w:w="2252"/>
+        <w:gridCol w:w="1906"/>
       </w:tblGrid>
       <w:tr>
         <w:trPr>
@@ -9220,7 +9182,7 @@
         </w:trPr>
         <w:tc>
           <w:tcPr>
-            <w:tcW w:type="dxa" w:w="2377"/>
+            <w:tcW w:type="dxa" w:w="2079"/>
             <w:vAlign w:val="center"/>
           </w:tcPr>
           <w:p>
@@ -9243,7 +9205,7 @@
         </w:tc>
         <w:tc>
           <w:tcPr>
-            <w:tcW w:type="dxa" w:w="1782"/>
+            <w:tcW w:type="dxa" w:w="866"/>
             <w:vAlign w:val="center"/>
           </w:tcPr>
           <w:p>
@@ -9260,36 +9222,13 @@
                 <w:i w:val="0"/>
                 <w:sz w:val="20"/>
               </w:rPr>
-              <w:t>Клиенты на разных узлах</w:t>
+              <w:t>Backplane</w:t>
             </w:r>
           </w:p>
         </w:tc>
         <w:tc>
           <w:tcPr>
-            <w:tcW w:type="dxa" w:w="1485"/>
-            <w:vAlign w:val="center"/>
-          </w:tcPr>
-          <w:p>
-            <w:pPr>
-              <w:spacing w:line="240" w:lineRule="auto" w:before="0" w:after="0"/>
-              <w:ind w:firstLine="0"/>
-              <w:jc w:val="center"/>
-            </w:pPr>
-            <w:r/>
-            <w:r>
-              <w:rPr>
-                <w:rFonts w:ascii="Times New Roman" w:hAnsi="Times New Roman" w:eastAsia="Times New Roman"/>
-                <w:b/>
-                <w:i w:val="0"/>
-                <w:sz w:val="20"/>
-              </w:rPr>
-              <w:t>Redis backplane</w:t>
-            </w:r>
-          </w:p>
-        </w:tc>
-        <w:tc>
-          <w:tcPr>
-            <w:tcW w:type="dxa" w:w="2971"/>
+            <w:tcW w:type="dxa" w:w="2252"/>
             <w:vAlign w:val="center"/>
           </w:tcPr>
           <w:p>
@@ -9312,7 +9251,7 @@
         </w:tc>
         <w:tc>
           <w:tcPr>
-            <w:tcW w:type="dxa" w:w="3565"/>
+            <w:tcW w:type="dxa" w:w="2252"/>
             <w:vAlign w:val="center"/>
           </w:tcPr>
           <w:p>
@@ -9335,7 +9274,7 @@
         </w:tc>
         <w:tc>
           <w:tcPr>
-            <w:tcW w:type="dxa" w:w="2674"/>
+            <w:tcW w:type="dxa" w:w="1906"/>
             <w:vAlign w:val="center"/>
           </w:tcPr>
           <w:p>
@@ -9360,7 +9299,7 @@
       <w:tr>
         <w:tc>
           <w:tcPr>
-            <w:tcW w:type="dxa" w:w="2377"/>
+            <w:tcW w:type="dxa" w:w="2079"/>
             <w:vAlign w:val="center"/>
           </w:tcPr>
           <w:p>
@@ -9383,7 +9322,124 @@
         </w:tc>
         <w:tc>
           <w:tcPr>
-            <w:tcW w:type="dxa" w:w="1782"/>
+            <w:tcW w:type="dxa" w:w="866"/>
+            <w:vAlign w:val="center"/>
+          </w:tcPr>
+          <w:p>
+            <w:pPr>
+              <w:spacing w:line="240" w:lineRule="auto" w:before="0" w:after="0"/>
+              <w:ind w:firstLine="0"/>
+              <w:jc w:val="left"/>
+            </w:pPr>
+            <w:r/>
+            <w:r>
+              <w:rPr>
+                <w:rFonts w:ascii="Times New Roman" w:hAnsi="Times New Roman" w:eastAsia="Times New Roman"/>
+                <w:b w:val="0"/>
+                <w:i w:val="0"/>
+                <w:sz w:val="20"/>
+              </w:rPr>
+              <w:t>Нет</w:t>
+            </w:r>
+          </w:p>
+        </w:tc>
+        <w:tc>
+          <w:tcPr>
+            <w:tcW w:type="dxa" w:w="2252"/>
+            <w:vAlign w:val="center"/>
+          </w:tcPr>
+          <w:p>
+            <w:pPr>
+              <w:spacing w:line="240" w:lineRule="auto" w:before="0" w:after="0"/>
+              <w:ind w:firstLine="0"/>
+              <w:jc w:val="left"/>
+            </w:pPr>
+            <w:r/>
+            <w:r>
+              <w:rPr>
+                <w:rFonts w:ascii="Times New Roman" w:hAnsi="Times New Roman" w:eastAsia="Times New Roman"/>
+                <w:b w:val="0"/>
+                <w:i w:val="0"/>
+                <w:sz w:val="20"/>
+              </w:rPr>
+              <w:t>Событие не доставляется на другой узел</w:t>
+            </w:r>
+          </w:p>
+        </w:tc>
+        <w:tc>
+          <w:tcPr>
+            <w:tcW w:type="dxa" w:w="2252"/>
+            <w:vAlign w:val="center"/>
+          </w:tcPr>
+          <w:p>
+            <w:pPr>
+              <w:spacing w:line="240" w:lineRule="auto" w:before="0" w:after="0"/>
+              <w:ind w:firstLine="0"/>
+              <w:jc w:val="left"/>
+            </w:pPr>
+            <w:r/>
+            <w:r>
+              <w:rPr>
+                <w:rFonts w:ascii="Times New Roman" w:hAnsi="Times New Roman" w:eastAsia="Times New Roman"/>
+                <w:b w:val="0"/>
+                <w:i w:val="0"/>
+                <w:sz w:val="20"/>
+              </w:rPr>
+              <w:t>Timeout 10 000 мс</w:t>
+            </w:r>
+          </w:p>
+        </w:tc>
+        <w:tc>
+          <w:tcPr>
+            <w:tcW w:type="dxa" w:w="1906"/>
+            <w:vAlign w:val="center"/>
+          </w:tcPr>
+          <w:p>
+            <w:pPr>
+              <w:spacing w:line="240" w:lineRule="auto" w:before="0" w:after="0"/>
+              <w:ind w:firstLine="0"/>
+              <w:jc w:val="left"/>
+            </w:pPr>
+            <w:r/>
+            <w:r>
+              <w:rPr>
+                <w:rFonts w:ascii="Times New Roman" w:hAnsi="Times New Roman" w:eastAsia="Times New Roman"/>
+                <w:b w:val="0"/>
+                <w:i w:val="0"/>
+                <w:sz w:val="20"/>
+              </w:rPr>
+              <w:t>Ограничение воспроизведено</w:t>
+            </w:r>
+          </w:p>
+        </w:tc>
+      </w:tr>
+      <w:tr>
+        <w:tc>
+          <w:tcPr>
+            <w:tcW w:type="dxa" w:w="2079"/>
+            <w:vAlign w:val="center"/>
+          </w:tcPr>
+          <w:p>
+            <w:pPr>
+              <w:spacing w:line="240" w:lineRule="auto" w:before="0" w:after="0"/>
+              <w:ind w:firstLine="0"/>
+              <w:jc w:val="left"/>
+            </w:pPr>
+            <w:r/>
+            <w:r>
+              <w:rPr>
+                <w:rFonts w:ascii="Times New Roman" w:hAnsi="Times New Roman" w:eastAsia="Times New Roman"/>
+                <w:b w:val="0"/>
+                <w:i w:val="0"/>
+                <w:sz w:val="20"/>
+              </w:rPr>
+              <w:t>Multi-instance с backplane</w:t>
+            </w:r>
+          </w:p>
+        </w:tc>
+        <w:tc>
+          <w:tcPr>
+            <w:tcW w:type="dxa" w:w="866"/>
             <w:vAlign w:val="center"/>
           </w:tcPr>
           <w:p>
@@ -9406,7 +9462,7 @@
         </w:tc>
         <w:tc>
           <w:tcPr>
-            <w:tcW w:type="dxa" w:w="1485"/>
+            <w:tcW w:type="dxa" w:w="2252"/>
             <w:vAlign w:val="center"/>
           </w:tcPr>
           <w:p>
@@ -9423,176 +9479,13 @@
                 <w:i w:val="0"/>
                 <w:sz w:val="20"/>
               </w:rPr>
-              <w:t>Нет</w:t>
+              <w:t>Событие доставлено между узлами</w:t>
             </w:r>
           </w:p>
         </w:tc>
         <w:tc>
           <w:tcPr>
-            <w:tcW w:type="dxa" w:w="2971"/>
-            <w:vAlign w:val="center"/>
-          </w:tcPr>
-          <w:p>
-            <w:pPr>
-              <w:spacing w:line="240" w:lineRule="auto" w:before="0" w:after="0"/>
-              <w:ind w:firstLine="0"/>
-              <w:jc w:val="left"/>
-            </w:pPr>
-            <w:r/>
-            <w:r>
-              <w:rPr>
-                <w:rFonts w:ascii="Times New Roman" w:hAnsi="Times New Roman" w:eastAsia="Times New Roman"/>
-                <w:b w:val="0"/>
-                <w:i w:val="0"/>
-                <w:sz w:val="20"/>
-              </w:rPr>
-              <w:t>Событие не доставляется между узлами</w:t>
-            </w:r>
-          </w:p>
-        </w:tc>
-        <w:tc>
-          <w:tcPr>
-            <w:tcW w:type="dxa" w:w="3565"/>
-            <w:vAlign w:val="center"/>
-          </w:tcPr>
-          <w:p>
-            <w:pPr>
-              <w:spacing w:line="240" w:lineRule="auto" w:before="0" w:after="0"/>
-              <w:ind w:firstLine="0"/>
-              <w:jc w:val="left"/>
-            </w:pPr>
-            <w:r/>
-            <w:r>
-              <w:rPr>
-                <w:rFonts w:ascii="Times New Roman" w:hAnsi="Times New Roman" w:eastAsia="Times New Roman"/>
-                <w:b w:val="0"/>
-                <w:i w:val="0"/>
-                <w:sz w:val="20"/>
-              </w:rPr>
-              <w:t>Timeout после 10000 мс</w:t>
-            </w:r>
-          </w:p>
-        </w:tc>
-        <w:tc>
-          <w:tcPr>
-            <w:tcW w:type="dxa" w:w="2674"/>
-            <w:vAlign w:val="center"/>
-          </w:tcPr>
-          <w:p>
-            <w:pPr>
-              <w:spacing w:line="240" w:lineRule="auto" w:before="0" w:after="0"/>
-              <w:ind w:firstLine="0"/>
-              <w:jc w:val="left"/>
-            </w:pPr>
-            <w:r/>
-            <w:r>
-              <w:rPr>
-                <w:rFonts w:ascii="Times New Roman" w:hAnsi="Times New Roman" w:eastAsia="Times New Roman"/>
-                <w:b w:val="0"/>
-                <w:i w:val="0"/>
-                <w:sz w:val="20"/>
-              </w:rPr>
-              <w:t>Исходное ограничение воспроизведено</w:t>
-            </w:r>
-          </w:p>
-        </w:tc>
-      </w:tr>
-      <w:tr>
-        <w:tc>
-          <w:tcPr>
-            <w:tcW w:type="dxa" w:w="2377"/>
-            <w:vAlign w:val="center"/>
-          </w:tcPr>
-          <w:p>
-            <w:pPr>
-              <w:spacing w:line="240" w:lineRule="auto" w:before="0" w:after="0"/>
-              <w:ind w:firstLine="0"/>
-              <w:jc w:val="left"/>
-            </w:pPr>
-            <w:r/>
-            <w:r>
-              <w:rPr>
-                <w:rFonts w:ascii="Times New Roman" w:hAnsi="Times New Roman" w:eastAsia="Times New Roman"/>
-                <w:b w:val="0"/>
-                <w:i w:val="0"/>
-                <w:sz w:val="20"/>
-              </w:rPr>
-              <w:t>Multi-instance с backplane, одиночный запуск</w:t>
-            </w:r>
-          </w:p>
-        </w:tc>
-        <w:tc>
-          <w:tcPr>
-            <w:tcW w:type="dxa" w:w="1782"/>
-            <w:vAlign w:val="center"/>
-          </w:tcPr>
-          <w:p>
-            <w:pPr>
-              <w:spacing w:line="240" w:lineRule="auto" w:before="0" w:after="0"/>
-              <w:ind w:firstLine="0"/>
-              <w:jc w:val="left"/>
-            </w:pPr>
-            <w:r/>
-            <w:r>
-              <w:rPr>
-                <w:rFonts w:ascii="Times New Roman" w:hAnsi="Times New Roman" w:eastAsia="Times New Roman"/>
-                <w:b w:val="0"/>
-                <w:i w:val="0"/>
-                <w:sz w:val="20"/>
-              </w:rPr>
-              <w:t>Да</w:t>
-            </w:r>
-          </w:p>
-        </w:tc>
-        <w:tc>
-          <w:tcPr>
-            <w:tcW w:type="dxa" w:w="1485"/>
-            <w:vAlign w:val="center"/>
-          </w:tcPr>
-          <w:p>
-            <w:pPr>
-              <w:spacing w:line="240" w:lineRule="auto" w:before="0" w:after="0"/>
-              <w:ind w:firstLine="0"/>
-              <w:jc w:val="left"/>
-            </w:pPr>
-            <w:r/>
-            <w:r>
-              <w:rPr>
-                <w:rFonts w:ascii="Times New Roman" w:hAnsi="Times New Roman" w:eastAsia="Times New Roman"/>
-                <w:b w:val="0"/>
-                <w:i w:val="0"/>
-                <w:sz w:val="20"/>
-              </w:rPr>
-              <w:t>Да</w:t>
-            </w:r>
-          </w:p>
-        </w:tc>
-        <w:tc>
-          <w:tcPr>
-            <w:tcW w:type="dxa" w:w="2971"/>
-            <w:vAlign w:val="center"/>
-          </w:tcPr>
-          <w:p>
-            <w:pPr>
-              <w:spacing w:line="240" w:lineRule="auto" w:before="0" w:after="0"/>
-              <w:ind w:firstLine="0"/>
-              <w:jc w:val="left"/>
-            </w:pPr>
-            <w:r/>
-            <w:r>
-              <w:rPr>
-                <w:rFonts w:ascii="Times New Roman" w:hAnsi="Times New Roman" w:eastAsia="Times New Roman"/>
-                <w:b w:val="0"/>
-                <w:i w:val="0"/>
-                <w:sz w:val="20"/>
-              </w:rPr>
-              <w:t>Событие доставляется между узлами</w:t>
-            </w:r>
-          </w:p>
-        </w:tc>
-        <w:tc>
-          <w:tcPr>
-            <w:tcW w:type="dxa" w:w="3565"/>
+            <w:tcW w:type="dxa" w:w="2252"/>
             <w:vAlign w:val="center"/>
           </w:tcPr>
           <w:p>
@@ -9633,7 +9526,7 @@
         </w:tc>
         <w:tc>
           <w:tcPr>
-            <w:tcW w:type="dxa" w:w="2674"/>
+            <w:tcW w:type="dxa" w:w="1906"/>
             <w:vAlign w:val="center"/>
           </w:tcPr>
           <w:p>
@@ -9658,7 +9551,7 @@
       <w:tr>
         <w:tc>
           <w:tcPr>
-            <w:tcW w:type="dxa" w:w="2377"/>
+            <w:tcW w:type="dxa" w:w="2079"/>
             <w:vAlign w:val="center"/>
           </w:tcPr>
           <w:p>
@@ -9675,13 +9568,13 @@
                 <w:i w:val="0"/>
                 <w:sz w:val="20"/>
               </w:rPr>
-              <w:t>Multi-instance с backplane, 5 итераций</w:t>
+              <w:t>Серия из 5 итераций</w:t>
             </w:r>
           </w:p>
         </w:tc>
         <w:tc>
           <w:tcPr>
-            <w:tcW w:type="dxa" w:w="1782"/>
+            <w:tcW w:type="dxa" w:w="866"/>
             <w:vAlign w:val="center"/>
           </w:tcPr>
           <w:p>
@@ -9704,7 +9597,101 @@
         </w:tc>
         <w:tc>
           <w:tcPr>
-            <w:tcW w:type="dxa" w:w="1485"/>
+            <w:tcW w:type="dxa" w:w="2252"/>
+            <w:vAlign w:val="center"/>
+          </w:tcPr>
+          <w:p>
+            <w:pPr>
+              <w:spacing w:line="240" w:lineRule="auto" w:before="0" w:after="0"/>
+              <w:ind w:firstLine="0"/>
+              <w:jc w:val="left"/>
+            </w:pPr>
+            <w:r/>
+            <w:r>
+              <w:rPr>
+                <w:rFonts w:ascii="Times New Roman" w:hAnsi="Times New Roman" w:eastAsia="Times New Roman"/>
+                <w:b w:val="0"/>
+                <w:i w:val="0"/>
+                <w:sz w:val="20"/>
+              </w:rPr>
+              <w:t>Все события доставлены</w:t>
+            </w:r>
+          </w:p>
+        </w:tc>
+        <w:tc>
+          <w:tcPr>
+            <w:tcW w:type="dxa" w:w="2252"/>
+            <w:vAlign w:val="center"/>
+          </w:tcPr>
+          <w:p>
+            <w:pPr>
+              <w:spacing w:line="240" w:lineRule="auto" w:before="0" w:after="0"/>
+              <w:ind w:firstLine="0"/>
+              <w:jc w:val="left"/>
+            </w:pPr>
+            <w:r/>
+            <w:r>
+              <w:rPr>
+                <w:rFonts w:ascii="Times New Roman" w:hAnsi="Times New Roman" w:eastAsia="Times New Roman"/>
+                <w:b w:val="0"/>
+                <w:i w:val="0"/>
+                <w:sz w:val="20"/>
+              </w:rPr>
+              <w:t>5 из 5, p95 = 11,6 мс</w:t>
+            </w:r>
+          </w:p>
+        </w:tc>
+        <w:tc>
+          <w:tcPr>
+            <w:tcW w:type="dxa" w:w="1906"/>
+            <w:vAlign w:val="center"/>
+          </w:tcPr>
+          <w:p>
+            <w:pPr>
+              <w:spacing w:line="240" w:lineRule="auto" w:before="0" w:after="0"/>
+              <w:ind w:firstLine="0"/>
+              <w:jc w:val="left"/>
+            </w:pPr>
+            <w:r/>
+            <w:r>
+              <w:rPr>
+                <w:rFonts w:ascii="Times New Roman" w:hAnsi="Times New Roman" w:eastAsia="Times New Roman"/>
+                <w:b w:val="0"/>
+                <w:i w:val="0"/>
+                <w:sz w:val="20"/>
+              </w:rPr>
+              <w:t>Подтверждена повторяемость</w:t>
+            </w:r>
+          </w:p>
+        </w:tc>
+      </w:tr>
+      <w:tr>
+        <w:tc>
+          <w:tcPr>
+            <w:tcW w:type="dxa" w:w="2079"/>
+            <w:vAlign w:val="center"/>
+          </w:tcPr>
+          <w:p>
+            <w:pPr>
+              <w:spacing w:line="240" w:lineRule="auto" w:before="0" w:after="0"/>
+              <w:ind w:firstLine="0"/>
+              <w:jc w:val="left"/>
+            </w:pPr>
+            <w:r/>
+            <w:r>
+              <w:rPr>
+                <w:rFonts w:ascii="Times New Roman" w:hAnsi="Times New Roman" w:eastAsia="Times New Roman"/>
+                <w:b w:val="0"/>
+                <w:i w:val="0"/>
+                <w:sz w:val="20"/>
+              </w:rPr>
+              <w:t>Rejoin после разрыва</w:t>
+            </w:r>
+          </w:p>
+        </w:tc>
+        <w:tc>
+          <w:tcPr>
+            <w:tcW w:type="dxa" w:w="866"/>
             <w:vAlign w:val="center"/>
           </w:tcPr>
           <w:p>
@@ -9727,7 +9714,7 @@
         </w:tc>
         <w:tc>
           <w:tcPr>
-            <w:tcW w:type="dxa" w:w="2971"/>
+            <w:tcW w:type="dxa" w:w="2252"/>
             <w:vAlign w:val="center"/>
           </w:tcPr>
           <w:p>
@@ -9744,153 +9731,13 @@
                 <w:i w:val="0"/>
                 <w:sz w:val="20"/>
               </w:rPr>
-              <w:t>Все события доставляются между узлами</w:t>
+              <w:t>Клиент повторно подписывается</w:t>
             </w:r>
           </w:p>
         </w:tc>
         <w:tc>
           <w:tcPr>
-            <w:tcW w:type="dxa" w:w="3565"/>
-            <w:vAlign w:val="center"/>
-          </w:tcPr>
-          <w:p>
-            <w:pPr>
-              <w:spacing w:line="240" w:lineRule="auto" w:before="0" w:after="0"/>
-              <w:ind w:firstLine="0"/>
-              <w:jc w:val="left"/>
-            </w:pPr>
-            <w:r/>
-            <w:r>
-              <w:rPr>
-                <w:rFonts w:ascii="Times New Roman" w:hAnsi="Times New Roman" w:eastAsia="Times New Roman"/>
-                <w:b w:val="0"/>
-                <w:i w:val="0"/>
-                <w:sz w:val="20"/>
-              </w:rPr>
-              <w:t>5 из 5 успешно, p95 = 11,6 мс</w:t>
-            </w:r>
-          </w:p>
-        </w:tc>
-        <w:tc>
-          <w:tcPr>
-            <w:tcW w:type="dxa" w:w="2674"/>
-            <w:vAlign w:val="center"/>
-          </w:tcPr>
-          <w:p>
-            <w:pPr>
-              <w:spacing w:line="240" w:lineRule="auto" w:before="0" w:after="0"/>
-              <w:ind w:firstLine="0"/>
-              <w:jc w:val="left"/>
-            </w:pPr>
-            <w:r/>
-            <w:r>
-              <w:rPr>
-                <w:rFonts w:ascii="Times New Roman" w:hAnsi="Times New Roman" w:eastAsia="Times New Roman"/>
-                <w:b w:val="0"/>
-                <w:i w:val="0"/>
-                <w:sz w:val="20"/>
-              </w:rPr>
-              <w:t>Подтверждена повторяемость результата</w:t>
-            </w:r>
-          </w:p>
-        </w:tc>
-      </w:tr>
-      <w:tr>
-        <w:tc>
-          <w:tcPr>
-            <w:tcW w:type="dxa" w:w="2377"/>
-            <w:vAlign w:val="center"/>
-          </w:tcPr>
-          <w:p>
-            <w:pPr>
-              <w:spacing w:line="240" w:lineRule="auto" w:before="0" w:after="0"/>
-              <w:ind w:firstLine="0"/>
-              <w:jc w:val="left"/>
-            </w:pPr>
-            <w:r/>
-            <w:r>
-              <w:rPr>
-                <w:rFonts w:ascii="Times New Roman" w:hAnsi="Times New Roman" w:eastAsia="Times New Roman"/>
-                <w:b w:val="0"/>
-                <w:i w:val="0"/>
-                <w:sz w:val="20"/>
-              </w:rPr>
-              <w:t>Rejoin после разрыва</w:t>
-            </w:r>
-          </w:p>
-        </w:tc>
-        <w:tc>
-          <w:tcPr>
-            <w:tcW w:type="dxa" w:w="1782"/>
-            <w:vAlign w:val="center"/>
-          </w:tcPr>
-          <w:p>
-            <w:pPr>
-              <w:spacing w:line="240" w:lineRule="auto" w:before="0" w:after="0"/>
-              <w:ind w:firstLine="0"/>
-              <w:jc w:val="left"/>
-            </w:pPr>
-            <w:r/>
-            <w:r>
-              <w:rPr>
-                <w:rFonts w:ascii="Times New Roman" w:hAnsi="Times New Roman" w:eastAsia="Times New Roman"/>
-                <w:b w:val="0"/>
-                <w:i w:val="0"/>
-                <w:sz w:val="20"/>
-              </w:rPr>
-              <w:t>Да</w:t>
-            </w:r>
-          </w:p>
-        </w:tc>
-        <w:tc>
-          <w:tcPr>
-            <w:tcW w:type="dxa" w:w="1485"/>
-            <w:vAlign w:val="center"/>
-          </w:tcPr>
-          <w:p>
-            <w:pPr>
-              <w:spacing w:line="240" w:lineRule="auto" w:before="0" w:after="0"/>
-              <w:ind w:firstLine="0"/>
-              <w:jc w:val="left"/>
-            </w:pPr>
-            <w:r/>
-            <w:r>
-              <w:rPr>
-                <w:rFonts w:ascii="Times New Roman" w:hAnsi="Times New Roman" w:eastAsia="Times New Roman"/>
-                <w:b w:val="0"/>
-                <w:i w:val="0"/>
-                <w:sz w:val="20"/>
-              </w:rPr>
-              <w:t>Да</w:t>
-            </w:r>
-          </w:p>
-        </w:tc>
-        <w:tc>
-          <w:tcPr>
-            <w:tcW w:type="dxa" w:w="2971"/>
-            <w:vAlign w:val="center"/>
-          </w:tcPr>
-          <w:p>
-            <w:pPr>
-              <w:spacing w:line="240" w:lineRule="auto" w:before="0" w:after="0"/>
-              <w:ind w:firstLine="0"/>
-              <w:jc w:val="left"/>
-            </w:pPr>
-            <w:r/>
-            <w:r>
-              <w:rPr>
-                <w:rFonts w:ascii="Times New Roman" w:hAnsi="Times New Roman" w:eastAsia="Times New Roman"/>
-                <w:b w:val="0"/>
-                <w:i w:val="0"/>
-                <w:sz w:val="20"/>
-              </w:rPr>
-              <w:t>После нового подключения клиент повторно вступает в группу</w:t>
-            </w:r>
-          </w:p>
-        </w:tc>
-        <w:tc>
-          <w:tcPr>
-            <w:tcW w:type="dxa" w:w="3565"/>
+            <w:tcW w:type="dxa" w:w="2252"/>
             <w:vAlign w:val="center"/>
           </w:tcPr>
           <w:p>
@@ -9913,7 +9760,7 @@
         </w:tc>
         <w:tc>
           <w:tcPr>
-            <w:tcW w:type="dxa" w:w="2674"/>
+            <w:tcW w:type="dxa" w:w="1906"/>
             <w:vAlign w:val="center"/>
           </w:tcPr>
           <w:p>
@@ -9938,7 +9785,7 @@
       <w:tr>
         <w:tc>
           <w:tcPr>
-            <w:tcW w:type="dxa" w:w="2377"/>
+            <w:tcW w:type="dxa" w:w="2079"/>
             <w:vAlign w:val="center"/>
           </w:tcPr>
           <w:p>
@@ -9955,13 +9802,13 @@
                 <w:i w:val="0"/>
                 <w:sz w:val="20"/>
               </w:rPr>
-              <w:t>Failover одного узла</w:t>
+              <w:t>Failover узла</w:t>
             </w:r>
           </w:p>
         </w:tc>
         <w:tc>
           <w:tcPr>
-            <w:tcW w:type="dxa" w:w="1782"/>
+            <w:tcW w:type="dxa" w:w="866"/>
             <w:vAlign w:val="center"/>
           </w:tcPr>
           <w:p>
@@ -9984,7 +9831,7 @@
         </w:tc>
         <w:tc>
           <w:tcPr>
-            <w:tcW w:type="dxa" w:w="1485"/>
+            <w:tcW w:type="dxa" w:w="2252"/>
             <w:vAlign w:val="center"/>
           </w:tcPr>
           <w:p>
@@ -10001,36 +9848,13 @@
                 <w:i w:val="0"/>
                 <w:sz w:val="20"/>
               </w:rPr>
-              <w:t>Да</w:t>
+              <w:t>Клиент переключается через nginx</w:t>
             </w:r>
           </w:p>
         </w:tc>
         <w:tc>
           <w:tcPr>
-            <w:tcW w:type="dxa" w:w="2971"/>
-            <w:vAlign w:val="center"/>
-          </w:tcPr>
-          <w:p>
-            <w:pPr>
-              <w:spacing w:line="240" w:lineRule="auto" w:before="0" w:after="0"/>
-              <w:ind w:firstLine="0"/>
-              <w:jc w:val="left"/>
-            </w:pPr>
-            <w:r/>
-            <w:r>
-              <w:rPr>
-                <w:rFonts w:ascii="Times New Roman" w:hAnsi="Times New Roman" w:eastAsia="Times New Roman"/>
-                <w:b w:val="0"/>
-                <w:i w:val="0"/>
-                <w:sz w:val="20"/>
-              </w:rPr>
-              <w:t>Клиент переподключается через nginx к доступному узлу</w:t>
-            </w:r>
-          </w:p>
-        </w:tc>
-        <w:tc>
-          <w:tcPr>
-            <w:tcW w:type="dxa" w:w="3565"/>
+            <w:tcW w:type="dxa" w:w="2252"/>
             <w:vAlign w:val="center"/>
           </w:tcPr>
           <w:p>
@@ -10056,7 +9880,7 @@
                 <w:i w:val="0"/>
                 <w:sz w:val="20"/>
               </w:rPr>
-              <w:t xml:space="preserve"> -&gt; </w:t>
+              <w:t xml:space="preserve"> → </w:t>
             </w:r>
             <w:r>
               <w:rPr>
@@ -10080,7 +9904,7 @@
         </w:tc>
         <w:tc>
           <w:tcPr>
-            <w:tcW w:type="dxa" w:w="2674"/>
+            <w:tcW w:type="dxa" w:w="1906"/>
             <w:vAlign w:val="center"/>
           </w:tcPr>
           <w:p>
@@ -10097,7 +9921,7 @@
                 <w:i w:val="0"/>
                 <w:sz w:val="20"/>
               </w:rPr>
-              <w:t>Подтверждено восстановление после отказа</w:t>
+              <w:t>Восстановление после отказа</w:t>
             </w:r>
           </w:p>
         </w:tc>
@@ -10105,17 +9929,6 @@
     </w:tbl>
     <w:p>
       <w:pPr>
-        <w:sectPr>
-          <w:footerReference w:type="default" r:id="rId14"/>
-          <w:pgSz w:w="16838" w:h="11906" w:orient="landscape"/>
-          <w:pgMar w:top="1134" w:right="850" w:bottom="1134" w:left="1134" w:header="720" w:footer="720" w:gutter="0"/>
-          <w:cols w:space="720"/>
-          <w:docGrid w:linePitch="360"/>
-        </w:sectPr>
-      </w:pPr>
-    </w:p>
-    <w:p>
-      <w:pPr>
         <w:pStyle w:val="Heading2"/>
       </w:pPr>
       <w:r>
@@ -11301,11 +11114,12 @@
       </w:r>
     </w:p>
     <w:sectPr>
-      <w:footerReference w:type="default" r:id="rId15"/>
-      <w:pgSz w:w="11906" w:h="16838"/>
+      <w:footerReference w:type="default" r:id="rId10"/>
+      <w:pgSz w:w="12240" w:h="15840"/>
       <w:pgMar w:top="1134" w:right="850" w:bottom="1134" w:left="1701" w:header="720" w:footer="720" w:gutter="0"/>
       <w:cols w:space="720"/>
       <w:docGrid w:linePitch="360"/>
+      <w:pgNumType w:start="1"/>
     </w:sectPr>
   </w:body>
 </w:document>
@@ -11322,50 +11136,6 @@
 </file>
 
 <file path=word/footer2.xml><?xml version="1.0" encoding="utf-8"?>
-<w:ftr xmlns:m="http://schemas.openxmlformats.org/officeDocument/2006/math" xmlns:mc="http://schemas.openxmlformats.org/markup-compatibility/2006" xmlns:mo="http://schemas.microsoft.com/office/mac/office/2008/main" xmlns:mv="urn:schemas-microsoft-com:mac:vml" xmlns:o="urn:schemas-microsoft-com:office:office" xmlns:r="http://schemas.openxmlformats.org/officeDocument/2006/relationships" xmlns:v="urn:schemas-microsoft-com:vml" xmlns:w10="urn:schemas-microsoft-com:office:word" xmlns:w14="http://schemas.microsoft.com/office/word/2010/wordml" xmlns:w="http://schemas.openxmlformats.org/wordprocessingml/2006/main" xmlns:wne="http://schemas.microsoft.com/office/word/2006/wordml" xmlns:wp14="http://schemas.microsoft.com/office/word/2010/wordprocessingDrawing" xmlns:wp="http://schemas.openxmlformats.org/drawingml/2006/wordprocessingDrawing" xmlns:wpc="http://schemas.microsoft.com/office/word/2010/wordprocessingCanvas" xmlns:wpg="http://schemas.microsoft.com/office/word/2010/wordprocessingGroup" xmlns:wpi="http://schemas.microsoft.com/office/word/2010/wordprocessingInk" xmlns:wps="http://schemas.microsoft.com/office/word/2010/wordprocessingShape" mc:Ignorable="w14 wp14">
-  <w:p>
-    <w:pPr>
-      <w:pStyle w:val="Footer"/>
-      <w:jc w:val="center"/>
-    </w:pPr>
-    <w:r>
-      <w:rPr>
-        <w:rFonts w:ascii="Times New Roman" w:hAnsi="Times New Roman" w:eastAsia="Times New Roman"/>
-        <w:b w:val="0"/>
-        <w:i w:val="0"/>
-        <w:sz w:val="24"/>
-      </w:rPr>
-      <w:fldChar w:fldCharType="begin"/>
-      <w:instrText xml:space="preserve">PAGE</w:instrText>
-      <w:fldChar w:fldCharType="end"/>
-    </w:r>
-  </w:p>
-</w:ftr>
-</file>
-
-<file path=word/footer3.xml><?xml version="1.0" encoding="utf-8"?>
-<w:ftr xmlns:m="http://schemas.openxmlformats.org/officeDocument/2006/math" xmlns:mc="http://schemas.openxmlformats.org/markup-compatibility/2006" xmlns:mo="http://schemas.microsoft.com/office/mac/office/2008/main" xmlns:mv="urn:schemas-microsoft-com:mac:vml" xmlns:o="urn:schemas-microsoft-com:office:office" xmlns:r="http://schemas.openxmlformats.org/officeDocument/2006/relationships" xmlns:v="urn:schemas-microsoft-com:vml" xmlns:w10="urn:schemas-microsoft-com:office:word" xmlns:w14="http://schemas.microsoft.com/office/word/2010/wordml" xmlns:w="http://schemas.openxmlformats.org/wordprocessingml/2006/main" xmlns:wne="http://schemas.microsoft.com/office/word/2006/wordml" xmlns:wp14="http://schemas.microsoft.com/office/word/2010/wordprocessingDrawing" xmlns:wp="http://schemas.openxmlformats.org/drawingml/2006/wordprocessingDrawing" xmlns:wpc="http://schemas.microsoft.com/office/word/2010/wordprocessingCanvas" xmlns:wpg="http://schemas.microsoft.com/office/word/2010/wordprocessingGroup" xmlns:wpi="http://schemas.microsoft.com/office/word/2010/wordprocessingInk" xmlns:wps="http://schemas.microsoft.com/office/word/2010/wordprocessingShape" mc:Ignorable="w14 wp14">
-  <w:p>
-    <w:pPr>
-      <w:pStyle w:val="Footer"/>
-      <w:jc w:val="center"/>
-    </w:pPr>
-    <w:r>
-      <w:rPr>
-        <w:rFonts w:ascii="Times New Roman" w:hAnsi="Times New Roman" w:eastAsia="Times New Roman"/>
-        <w:b w:val="0"/>
-        <w:i w:val="0"/>
-        <w:sz w:val="24"/>
-      </w:rPr>
-      <w:fldChar w:fldCharType="begin"/>
-      <w:instrText xml:space="preserve">PAGE</w:instrText>
-      <w:fldChar w:fldCharType="end"/>
-    </w:r>
-  </w:p>
-</w:ftr>
-</file>
-
-<file path=word/footer4.xml><?xml version="1.0" encoding="utf-8"?>
 <w:ftr xmlns:m="http://schemas.openxmlformats.org/officeDocument/2006/math" xmlns:mc="http://schemas.openxmlformats.org/markup-compatibility/2006" xmlns:mo="http://schemas.microsoft.com/office/mac/office/2008/main" xmlns:mv="urn:schemas-microsoft-com:mac:vml" xmlns:o="urn:schemas-microsoft-com:office:office" xmlns:r="http://schemas.openxmlformats.org/officeDocument/2006/relationships" xmlns:v="urn:schemas-microsoft-com:vml" xmlns:w10="urn:schemas-microsoft-com:office:word" xmlns:w14="http://schemas.microsoft.com/office/word/2010/wordml" xmlns:w="http://schemas.openxmlformats.org/wordprocessingml/2006/main" xmlns:wne="http://schemas.microsoft.com/office/word/2006/wordml" xmlns:wp14="http://schemas.microsoft.com/office/word/2010/wordprocessingDrawing" xmlns:wp="http://schemas.openxmlformats.org/drawingml/2006/wordprocessingDrawing" xmlns:wpc="http://schemas.microsoft.com/office/word/2010/wordprocessingCanvas" xmlns:wpg="http://schemas.microsoft.com/office/word/2010/wordprocessingGroup" xmlns:wpi="http://schemas.microsoft.com/office/word/2010/wordprocessingInk" xmlns:wps="http://schemas.microsoft.com/office/word/2010/wordprocessingShape" mc:Ignorable="w14 wp14">
   <w:p>
     <w:pPr>

</xml_diff>

<commit_message>
Update README.md to include the new improvement plan for the final qualifying work. Modify various DOCX and image files to reflect recent changes and enhancements in the practice report and defense drafts. Add new rendered images and refine existing content for better clarity and presentation. Ensure compliance with project standards and improve overall documentation quality.
</commit_message>
<xml_diff>
--- a/build/docx/practice-report-draft-1.docx
+++ b/build/docx/practice-report-draft-1.docx
@@ -47,45 +47,92 @@
           <w:i w:val="0"/>
           <w:sz w:val="22"/>
         </w:rPr>
-        <w:t>«Санкт-Петербургский государственный университет</w:t>
+        <w:t>«Санкт–Петербургский государственный университет</w:t>
+      </w:r>
+    </w:p>
+    <w:p>
+      <w:pPr>
+        <w:spacing w:line="276" w:lineRule="auto" w:after="320"/>
+        <w:ind w:firstLine="0"/>
+        <w:jc w:val="center"/>
+      </w:pPr>
+      <w:r>
+        <w:rPr>
+          <w:rFonts w:ascii="Times New Roman" w:hAnsi="Times New Roman" w:eastAsia="Times New Roman"/>
+          <w:b w:val="0"/>
+          <w:i w:val="0"/>
+          <w:sz w:val="22"/>
+        </w:rPr>
+        <w:t>аэрокосмического приборостроения»</w:t>
+      </w:r>
+    </w:p>
+    <w:p>
+      <w:pPr>
+        <w:spacing w:line="276" w:lineRule="auto" w:after="320"/>
+        <w:ind w:firstLine="0"/>
+        <w:jc w:val="center"/>
+      </w:pPr>
+      <w:r>
+        <w:rPr>
+          <w:rFonts w:ascii="Times New Roman" w:hAnsi="Times New Roman" w:eastAsia="Times New Roman"/>
+          <w:b w:val="0"/>
+          <w:i w:val="0"/>
+          <w:sz w:val="22"/>
+        </w:rPr>
+        <w:t>Кафедра №43 «Компьютерных технологий и программной инженерии»</w:t>
       </w:r>
     </w:p>
     <w:p>
       <w:pPr>
         <w:spacing w:line="276" w:lineRule="auto" w:after="0"/>
         <w:ind w:firstLine="0"/>
-        <w:jc w:val="center"/>
+        <w:jc w:val="left"/>
       </w:pPr>
       <w:r>
         <w:rPr>
           <w:rFonts w:ascii="Times New Roman" w:hAnsi="Times New Roman" w:eastAsia="Times New Roman"/>
-          <w:b w:val="0"/>
-          <w:i w:val="0"/>
-          <w:sz w:val="22"/>
-        </w:rPr>
-        <w:t>аэрокосмического приборостроения»</w:t>
-      </w:r>
-    </w:p>
-    <w:p>
-      <w:pPr>
-        <w:spacing w:line="276" w:lineRule="auto" w:after="360"/>
+          <w:b/>
+          <w:i w:val="0"/>
+          <w:sz w:val="24"/>
+        </w:rPr>
+        <w:t>ОТЧЁТ ПО ПРАКТИКЕ</w:t>
+      </w:r>
+    </w:p>
+    <w:p>
+      <w:pPr>
+        <w:spacing w:line="276" w:lineRule="auto" w:after="0"/>
         <w:ind w:firstLine="0"/>
-        <w:jc w:val="center"/>
+        <w:jc w:val="left"/>
       </w:pPr>
       <w:r>
         <w:rPr>
           <w:rFonts w:ascii="Times New Roman" w:hAnsi="Times New Roman" w:eastAsia="Times New Roman"/>
           <w:b w:val="0"/>
           <w:i w:val="0"/>
-          <w:sz w:val="22"/>
-        </w:rPr>
-        <w:t>Кафедра № 43 «Компьютерных технологий и программной инженерии»</w:t>
+          <w:sz w:val="24"/>
+        </w:rPr>
+        <w:t>ЗАЩИЩЁН С ОЦЕНКОЙ</w:t>
+      </w:r>
+    </w:p>
+    <w:p>
+      <w:pPr>
+        <w:spacing w:line="276" w:lineRule="auto" w:after="40"/>
+        <w:ind w:firstLine="0"/>
+        <w:jc w:val="left"/>
+      </w:pPr>
+      <w:r>
+        <w:rPr>
+          <w:rFonts w:ascii="Times New Roman" w:hAnsi="Times New Roman" w:eastAsia="Times New Roman"/>
+          <w:b w:val="0"/>
+          <w:i w:val="0"/>
+          <w:sz w:val="24"/>
+        </w:rPr>
+        <w:t>РУКОВОДИТЕЛЬ</w:t>
       </w:r>
     </w:p>
     <w:tbl>
       <w:tblPr>
         <w:tblW w:type="auto" w:w="0"/>
-        <w:jc w:val="center"/>
         <w:tblLook w:firstColumn="1" w:firstRow="1" w:lastColumn="0" w:lastRow="0" w:noHBand="0" w:noVBand="1" w:val="04A0"/>
       </w:tblPr>
       <w:tblGrid>
@@ -96,48 +143,11 @@
       <w:tr>
         <w:tc>
           <w:tcPr>
-            <w:tcW w:type="dxa" w:w="3969"/>
+            <w:tcW w:type="dxa" w:w="3175"/>
             <w:tcBorders>
               <w:top w:val="nil"/>
               <w:left w:val="nil"/>
-              <w:bottom w:val="nil"/>
-              <w:right w:val="nil"/>
-              <w:insideH w:val="nil"/>
-              <w:insideV w:val="nil"/>
-            </w:tcBorders>
-            <w:tcMar>
-              <w:top w:w="0" w:type="dxa"/>
-              <w:left w:w="0" w:type="dxa"/>
-              <w:bottom w:w="0" w:type="dxa"/>
-              <w:right w:w="0" w:type="dxa"/>
-            </w:tcMar>
-            <w:vAlign w:val="center"/>
-          </w:tcPr>
-          <w:p>
-            <w:pPr>
-              <w:spacing w:line="240" w:lineRule="auto" w:before="0" w:after="0"/>
-              <w:ind w:firstLine="0"/>
-              <w:jc w:val="left"/>
-            </w:pPr>
-            <w:r/>
-            <w:r>
-              <w:rPr>
-                <w:rFonts w:ascii="Times New Roman" w:hAnsi="Times New Roman" w:eastAsia="Times New Roman"/>
-                <w:b/>
-                <w:i w:val="0"/>
-                <w:sz w:val="22"/>
-              </w:rPr>
-              <w:t>ОТЧЕТ ПО ПРАКТИКЕ</w:t>
-            </w:r>
-          </w:p>
-        </w:tc>
-        <w:tc>
-          <w:tcPr>
-            <w:tcW w:type="dxa" w:w="2268"/>
-            <w:tcBorders>
-              <w:top w:val="nil"/>
-              <w:left w:val="nil"/>
-              <w:bottom w:val="nil"/>
+              <w:bottom w:val="single" w:sz="6" w:space="0" w:color="000000"/>
               <w:right w:val="nil"/>
               <w:insideH w:val="nil"/>
               <w:insideV w:val="nil"/>
@@ -164,39 +174,17 @@
                 <w:i w:val="0"/>
                 <w:sz w:val="22"/>
               </w:rPr>
-              <w:t>ЗАЩИЩЕН С ОЦЕНКОЙ</w:t>
+              <w:t>Ст. преподаватель</w:t>
             </w:r>
           </w:p>
         </w:tc>
         <w:tc>
           <w:tcPr>
-            <w:tcW w:type="dxa" w:w="2835"/>
+            <w:tcW w:type="dxa" w:w="2154"/>
             <w:tcBorders>
               <w:top w:val="nil"/>
               <w:left w:val="nil"/>
-              <w:bottom w:val="nil"/>
-              <w:right w:val="nil"/>
-              <w:insideH w:val="nil"/>
-              <w:insideV w:val="nil"/>
-            </w:tcBorders>
-            <w:tcMar>
-              <w:top w:w="0" w:type="dxa"/>
-              <w:left w:w="0" w:type="dxa"/>
-              <w:bottom w:w="0" w:type="dxa"/>
-              <w:right w:w="0" w:type="dxa"/>
-            </w:tcMar>
-          </w:tcPr>
-          <w:p/>
-        </w:tc>
-      </w:tr>
-      <w:tr>
-        <w:tc>
-          <w:tcPr>
-            <w:tcW w:type="dxa" w:w="3969"/>
-            <w:tcBorders>
-              <w:top w:val="nil"/>
-              <w:left w:val="nil"/>
-              <w:bottom w:val="nil"/>
+              <w:bottom w:val="single" w:sz="6" w:space="0" w:color="000000"/>
               <w:right w:val="nil"/>
               <w:insideH w:val="nil"/>
               <w:insideV w:val="nil"/>
@@ -213,27 +201,18 @@
             <w:pPr>
               <w:spacing w:line="240" w:lineRule="auto" w:before="0" w:after="0"/>
               <w:ind w:firstLine="0"/>
-              <w:jc w:val="left"/>
+              <w:jc w:val="center"/>
             </w:pPr>
             <w:r/>
-            <w:r>
-              <w:rPr>
-                <w:rFonts w:ascii="Times New Roman" w:hAnsi="Times New Roman" w:eastAsia="Times New Roman"/>
-                <w:b w:val="0"/>
-                <w:i w:val="0"/>
-                <w:sz w:val="20"/>
-              </w:rPr>
-              <w:t>Руководитель</w:t>
-            </w:r>
           </w:p>
         </w:tc>
         <w:tc>
           <w:tcPr>
-            <w:tcW w:type="dxa" w:w="2268"/>
+            <w:tcW w:type="dxa" w:w="2721"/>
             <w:tcBorders>
               <w:top w:val="nil"/>
               <w:left w:val="nil"/>
-              <w:bottom w:val="nil"/>
+              <w:bottom w:val="single" w:sz="6" w:space="0" w:color="000000"/>
               <w:right w:val="nil"/>
               <w:insideH w:val="nil"/>
               <w:insideV w:val="nil"/>
@@ -258,44 +237,7 @@
                 <w:rFonts w:ascii="Times New Roman" w:hAnsi="Times New Roman" w:eastAsia="Times New Roman"/>
                 <w:b w:val="0"/>
                 <w:i w:val="0"/>
-                <w:sz w:val="20"/>
-              </w:rPr>
-              <w:t>____________________</w:t>
-            </w:r>
-          </w:p>
-        </w:tc>
-        <w:tc>
-          <w:tcPr>
-            <w:tcW w:type="dxa" w:w="2835"/>
-            <w:tcBorders>
-              <w:top w:val="nil"/>
-              <w:left w:val="nil"/>
-              <w:bottom w:val="nil"/>
-              <w:right w:val="nil"/>
-              <w:insideH w:val="nil"/>
-              <w:insideV w:val="nil"/>
-            </w:tcBorders>
-            <w:tcMar>
-              <w:top w:w="0" w:type="dxa"/>
-              <w:left w:w="0" w:type="dxa"/>
-              <w:bottom w:w="0" w:type="dxa"/>
-              <w:right w:w="0" w:type="dxa"/>
-            </w:tcMar>
-            <w:vAlign w:val="center"/>
-          </w:tcPr>
-          <w:p>
-            <w:pPr>
-              <w:spacing w:line="240" w:lineRule="auto" w:before="0" w:after="0"/>
-              <w:ind w:firstLine="0"/>
-              <w:jc w:val="center"/>
-            </w:pPr>
-            <w:r/>
-            <w:r>
-              <w:rPr>
-                <w:rFonts w:ascii="Times New Roman" w:hAnsi="Times New Roman" w:eastAsia="Times New Roman"/>
-                <w:b w:val="0"/>
-                <w:i w:val="0"/>
-                <w:sz w:val="20"/>
+                <w:sz w:val="22"/>
               </w:rPr>
               <w:t>С.А. Рогачев</w:t>
             </w:r>
@@ -305,7 +247,7 @@
       <w:tr>
         <w:tc>
           <w:tcPr>
-            <w:tcW w:type="dxa" w:w="3969"/>
+            <w:tcW w:type="dxa" w:w="3175"/>
             <w:tcBorders>
               <w:top w:val="nil"/>
               <w:left w:val="nil"/>
@@ -336,13 +278,13 @@
                 <w:i w:val="0"/>
                 <w:sz w:val="14"/>
               </w:rPr>
-              <w:t>ст. преподаватель</w:t>
+              <w:t>должность, уч. степень, звание</w:t>
             </w:r>
           </w:p>
         </w:tc>
         <w:tc>
           <w:tcPr>
-            <w:tcW w:type="dxa" w:w="2268"/>
+            <w:tcW w:type="dxa" w:w="2154"/>
             <w:tcBorders>
               <w:top w:val="nil"/>
               <w:left w:val="nil"/>
@@ -379,7 +321,7 @@
         </w:tc>
         <w:tc>
           <w:tcPr>
-            <w:tcW w:type="dxa" w:w="2835"/>
+            <w:tcW w:type="dxa" w:w="2721"/>
             <w:tcBorders>
               <w:top w:val="nil"/>
               <w:left w:val="nil"/>
@@ -418,7 +360,7 @@
     </w:tbl>
     <w:p>
       <w:pPr>
-        <w:spacing w:line="240" w:lineRule="auto" w:before="0" w:after="480"/>
+        <w:spacing w:line="240" w:lineRule="auto" w:before="0" w:after="240"/>
         <w:ind w:firstLine="0"/>
       </w:pPr>
     </w:p>
@@ -435,7 +377,7 @@
           <w:i w:val="0"/>
           <w:sz w:val="28"/>
         </w:rPr>
-        <w:t>ОТЧЕТ ПО ПРАКТИКЕ</w:t>
+        <w:t>ОТЧЁТ ПО ПРАКТИКЕ</w:t>
       </w:r>
     </w:p>
     <w:tbl>
@@ -2089,7 +2031,7 @@
           <w:i w:val="0"/>
           <w:sz w:val="20"/>
         </w:rPr>
-        <w:t>Санкт-Петербург 2026</w:t>
+        <w:t>Санкт–Петербург 2026</w:t>
       </w:r>
     </w:p>
     <w:p>
@@ -2192,7 +2134,7 @@
           <w:i w:val="0"/>
           <w:sz w:val="22"/>
         </w:rPr>
-        <w:t>1.1 Real-time взаимодействие в системах отслеживания задач</w:t>
+        <w:t>1.1 Описание использованной литературы</w:t>
         <w:tab/>
         <w:t>6</w:t>
       </w:r>
@@ -2212,9 +2154,9 @@
           <w:i w:val="0"/>
           <w:sz w:val="22"/>
         </w:rPr>
-        <w:t>1.2 WebSocket и SignalR как основа real-time контура</w:t>
+        <w:t>1.2 Real-time взаимодействие в системах отслеживания задач</w:t>
         <w:tab/>
-        <w:t>6</w:t>
+        <w:t>8</w:t>
       </w:r>
     </w:p>
     <w:p>
@@ -2232,9 +2174,9 @@
           <w:i w:val="0"/>
           <w:sz w:val="22"/>
         </w:rPr>
-        <w:t>1.3 Ограничение single-node WebSocket-архитектуры</w:t>
+        <w:t>1.3 WebSocket и SignalR как основа real-time контура</w:t>
         <w:tab/>
-        <w:t>7</w:t>
+        <w:t>9</w:t>
       </w:r>
     </w:p>
     <w:p>
@@ -2252,9 +2194,9 @@
           <w:i w:val="0"/>
           <w:sz w:val="22"/>
         </w:rPr>
-        <w:t>1.4 Сравнение подходов к масштабированию</w:t>
+        <w:t>1.4 Ограничение single-node WebSocket-архитектуры</w:t>
         <w:tab/>
-        <w:t>8</w:t>
+        <w:t>10</w:t>
       </w:r>
     </w:p>
     <w:p>
@@ -2272,9 +2214,29 @@
           <w:i w:val="0"/>
           <w:sz w:val="22"/>
         </w:rPr>
-        <w:t>1.5 Вывод по главе</w:t>
+        <w:t>1.5 Сравнение подходов к масштабированию</w:t>
         <w:tab/>
-        <w:t>9</w:t>
+        <w:t>11</w:t>
+      </w:r>
+    </w:p>
+    <w:p>
+      <w:pPr>
+        <w:tabs>
+          <w:tab w:pos="9071" w:val="center"/>
+        </w:tabs>
+        <w:spacing w:line="240" w:lineRule="auto" w:after="0"/>
+        <w:ind w:firstLine="0" w:left="425" w:right="0"/>
+      </w:pPr>
+      <w:r>
+        <w:rPr>
+          <w:rFonts w:ascii="Times New Roman" w:hAnsi="Times New Roman" w:eastAsia="Times New Roman"/>
+          <w:b w:val="0"/>
+          <w:i w:val="0"/>
+          <w:sz w:val="22"/>
+        </w:rPr>
+        <w:t>1.6 Вывод по главе</w:t>
+        <w:tab/>
+        <w:t>11</w:t>
       </w:r>
     </w:p>
     <w:p>
@@ -2294,7 +2256,7 @@
         </w:rPr>
         <w:t>2. Анализ целевой системы и постановка задачи практики</w:t>
         <w:tab/>
-        <w:t>10</w:t>
+        <w:t>13</w:t>
       </w:r>
     </w:p>
     <w:p>
@@ -2314,7 +2276,7 @@
         </w:rPr>
         <w:t>2.1 Характеристика целевой системы</w:t>
         <w:tab/>
-        <w:t>10</w:t>
+        <w:t>13</w:t>
       </w:r>
     </w:p>
     <w:p>
@@ -2334,7 +2296,7 @@
         </w:rPr>
         <w:t>2.2 Исходная реализация real-time взаимодействия</w:t>
         <w:tab/>
-        <w:t>10</w:t>
+        <w:t>13</w:t>
       </w:r>
     </w:p>
     <w:p>
@@ -2354,7 +2316,7 @@
         </w:rPr>
         <w:t>2.3 Требования к разрабатываемому решению</w:t>
         <w:tab/>
-        <w:t>11</w:t>
+        <w:t>14</w:t>
       </w:r>
     </w:p>
     <w:p>
@@ -2374,7 +2336,7 @@
         </w:rPr>
         <w:t>2.4 Выбор платформы и инструментальных средств</w:t>
         <w:tab/>
-        <w:t>12</w:t>
+        <w:t>15</w:t>
       </w:r>
     </w:p>
     <w:p>
@@ -2394,7 +2356,7 @@
         </w:rPr>
         <w:t>2.5 Постановка задачи</w:t>
         <w:tab/>
-        <w:t>12</w:t>
+        <w:t>15</w:t>
       </w:r>
     </w:p>
     <w:p>
@@ -2414,7 +2376,7 @@
         </w:rPr>
         <w:t>3. Проектирование масштабируемого real-time контура</w:t>
         <w:tab/>
-        <w:t>13</w:t>
+        <w:t>17</w:t>
       </w:r>
     </w:p>
     <w:p>
@@ -2434,7 +2396,7 @@
         </w:rPr>
         <w:t>3.1 Исходная архитектура</w:t>
         <w:tab/>
-        <w:t>13</w:t>
+        <w:t>17</w:t>
       </w:r>
     </w:p>
     <w:p>
@@ -2454,7 +2416,7 @@
         </w:rPr>
         <w:t>3.2 Целевая архитектура</w:t>
         <w:tab/>
-        <w:t>13</w:t>
+        <w:t>17</w:t>
       </w:r>
     </w:p>
     <w:p>
@@ -2474,7 +2436,7 @@
         </w:rPr>
         <w:t>3.3 Поток real-time события</w:t>
         <w:tab/>
-        <w:t>14</w:t>
+        <w:t>18</w:t>
       </w:r>
     </w:p>
     <w:p>
@@ -2494,7 +2456,7 @@
         </w:rPr>
         <w:t>3.4 Модель групп и повторной подписки</w:t>
         <w:tab/>
-        <w:t>15</w:t>
+        <w:t>19</w:t>
       </w:r>
     </w:p>
     <w:p>
@@ -2514,7 +2476,7 @@
         </w:rPr>
         <w:t>3.5 Диагностический контур</w:t>
         <w:tab/>
-        <w:t>16</w:t>
+        <w:t>20</w:t>
       </w:r>
     </w:p>
     <w:p>
@@ -2534,7 +2496,7 @@
         </w:rPr>
         <w:t>4. Выполнение индивидуального задания</w:t>
         <w:tab/>
-        <w:t>17</w:t>
+        <w:t>21</w:t>
       </w:r>
     </w:p>
     <w:p>
@@ -2554,7 +2516,7 @@
         </w:rPr>
         <w:t>4.1 Организация работ</w:t>
         <w:tab/>
-        <w:t>17</w:t>
+        <w:t>21</w:t>
       </w:r>
     </w:p>
     <w:p>
@@ -2574,7 +2536,7 @@
         </w:rPr>
         <w:t>4.2 Изменения backend</w:t>
         <w:tab/>
-        <w:t>17</w:t>
+        <w:t>21</w:t>
       </w:r>
     </w:p>
     <w:p>
@@ -2594,7 +2556,7 @@
         </w:rPr>
         <w:t>4.3 Проверочный клиент</w:t>
         <w:tab/>
-        <w:t>18</w:t>
+        <w:t>22</w:t>
       </w:r>
     </w:p>
     <w:p>
@@ -2614,7 +2576,7 @@
         </w:rPr>
         <w:t>4.4 Инфраструктурные изменения</w:t>
         <w:tab/>
-        <w:t>18</w:t>
+        <w:t>22</w:t>
       </w:r>
     </w:p>
     <w:p>
@@ -2634,7 +2596,7 @@
         </w:rPr>
         <w:t>4.5 Автоматизированный сценарий проверки</w:t>
         <w:tab/>
-        <w:t>19</w:t>
+        <w:t>23</w:t>
       </w:r>
     </w:p>
     <w:p>
@@ -2654,7 +2616,7 @@
         </w:rPr>
         <w:t>5. Результаты практики и оценка решения</w:t>
         <w:tab/>
-        <w:t>21</w:t>
+        <w:t>25</w:t>
       </w:r>
     </w:p>
     <w:p>
@@ -2674,7 +2636,7 @@
         </w:rPr>
         <w:t>5.1 Цель и программа испытаний</w:t>
         <w:tab/>
-        <w:t>21</w:t>
+        <w:t>25</w:t>
       </w:r>
     </w:p>
     <w:p>
@@ -2694,7 +2656,7 @@
         </w:rPr>
         <w:t>5.2 Стенд испытаний</w:t>
         <w:tab/>
-        <w:t>21</w:t>
+        <w:t>25</w:t>
       </w:r>
     </w:p>
     <w:p>
@@ -2714,7 +2676,7 @@
         </w:rPr>
         <w:t>5.3 Результат без Redis backplane</w:t>
         <w:tab/>
-        <w:t>22</w:t>
+        <w:t>26</w:t>
       </w:r>
     </w:p>
     <w:p>
@@ -2734,7 +2696,7 @@
         </w:rPr>
         <w:t>5.4 Результат с Redis backplane</w:t>
         <w:tab/>
-        <w:t>22</w:t>
+        <w:t>26</w:t>
       </w:r>
     </w:p>
     <w:p>
@@ -2754,7 +2716,7 @@
         </w:rPr>
         <w:t>5.5 Серийная проверка и задержка доставки</w:t>
         <w:tab/>
-        <w:t>23</w:t>
+        <w:t>27</w:t>
       </w:r>
     </w:p>
     <w:p>
@@ -2774,7 +2736,7 @@
         </w:rPr>
         <w:t>5.6 Проверка восстановления соединения и отказа узла</w:t>
         <w:tab/>
-        <w:t>24</w:t>
+        <w:t>28</w:t>
       </w:r>
     </w:p>
     <w:p>
@@ -2794,7 +2756,7 @@
         </w:rPr>
         <w:t>5.7 Сравнительная таблица результатов</w:t>
         <w:tab/>
-        <w:t>25</w:t>
+        <w:t>28</w:t>
       </w:r>
     </w:p>
     <w:p>
@@ -2814,7 +2776,7 @@
         </w:rPr>
         <w:t>5.8 Проверка входной точки стенда</w:t>
         <w:tab/>
-        <w:t>25</w:t>
+        <w:t>29</w:t>
       </w:r>
     </w:p>
     <w:p>
@@ -2834,7 +2796,7 @@
         </w:rPr>
         <w:t>5.9 Оценка достоверности результатов</w:t>
         <w:tab/>
-        <w:t>25</w:t>
+        <w:t>29</w:t>
       </w:r>
     </w:p>
     <w:p>
@@ -2854,7 +2816,7 @@
         </w:rPr>
         <w:t>5.10 Вывод по испытаниям</w:t>
         <w:tab/>
-        <w:t>26</w:t>
+        <w:t>30</w:t>
       </w:r>
     </w:p>
     <w:p>
@@ -2874,7 +2836,7 @@
         </w:rPr>
         <w:t>ЗАКЛЮЧЕНИЕ</w:t>
         <w:tab/>
-        <w:t>26</w:t>
+        <w:t>30</w:t>
       </w:r>
     </w:p>
     <w:p>
@@ -2894,7 +2856,7 @@
         </w:rPr>
         <w:t>СПИСОК ИСПОЛЬЗОВАННЫХ ИСТОЧНИКОВ</w:t>
         <w:tab/>
-        <w:t>28</w:t>
+        <w:t>32</w:t>
       </w:r>
     </w:p>
     <w:p>
@@ -2914,7 +2876,7 @@
         </w:rPr>
         <w:t>ПРИЛОЖЕНИЕ А</w:t>
         <w:tab/>
-        <w:t>30</w:t>
+        <w:t>34</w:t>
       </w:r>
     </w:p>
     <w:p>
@@ -3963,7 +3925,7 @@
         <w:pStyle w:val="Heading2"/>
       </w:pPr>
       <w:r>
-        <w:t>1.1 Real-time взаимодействие в системах отслеживания задач</w:t>
+        <w:t>1.1 Описание использованной литературы</w:t>
       </w:r>
     </w:p>
     <w:p>
@@ -3979,7 +3941,327 @@
           <w:i w:val="0"/>
           <w:sz w:val="28"/>
         </w:rPr>
-        <w:t>Системы отслеживания задач предназначены для фиксации, распределения и контроля выполнения работ. В таких системах ключевыми сущностями являются задачи, отчеты, комментарии, вложения, исполнители, статусы, команды и рабочие пространства. В отличие от статичных справочников, эти сущности часто изменяются несколькими пользователями в течение короткого времени. Один участник может изменить статус задачи, второй добавить комментарий, третий прикрепить файл или уточнить шаг воспроизведения ошибки [16], [18].</w:t>
+        <w:t>При подготовке отчета использовались нормативные документы, официальная техническая документация и учебные издания по программной инженерии, сетевым технологиям, базам данных и тестированию. Источники подбирались так, чтобы обосновать как предметную часть работы, так и выбранный способ реализации масштабируемого real-time контура.</w:t>
+      </w:r>
+    </w:p>
+    <w:p>
+      <w:pPr>
+        <w:spacing w:line="360" w:lineRule="auto" w:after="0"/>
+        <w:ind w:left="709" w:hanging="425"/>
+        <w:jc w:val="both"/>
+      </w:pPr>
+      <w:r>
+        <w:rPr>
+          <w:rFonts w:ascii="Times New Roman" w:hAnsi="Times New Roman" w:eastAsia="Times New Roman"/>
+          <w:b w:val="0"/>
+          <w:i w:val="0"/>
+          <w:sz w:val="28"/>
+        </w:rPr>
+        <w:t>1. RFC 6455 описывает протокол WebSocket и используется как базовый источник по сетевому механизму двустороннего обмена данными между клиентом и сервером.</w:t>
+      </w:r>
+    </w:p>
+    <w:p>
+      <w:pPr>
+        <w:spacing w:line="360" w:lineRule="auto" w:after="0"/>
+        <w:ind w:left="709" w:hanging="425"/>
+        <w:jc w:val="both"/>
+      </w:pPr>
+      <w:r>
+        <w:rPr>
+          <w:rFonts w:ascii="Times New Roman" w:hAnsi="Times New Roman" w:eastAsia="Times New Roman"/>
+          <w:b w:val="0"/>
+          <w:i w:val="0"/>
+          <w:sz w:val="28"/>
+        </w:rPr>
+        <w:t>2. Документация Microsoft по ASP.NET Core SignalR применяется для описания хабов, клиентских событий, групп и общей модели real-time взаимодействия.</w:t>
+      </w:r>
+    </w:p>
+    <w:p>
+      <w:pPr>
+        <w:spacing w:line="360" w:lineRule="auto" w:after="0"/>
+        <w:ind w:left="709" w:hanging="425"/>
+        <w:jc w:val="both"/>
+      </w:pPr>
+      <w:r>
+        <w:rPr>
+          <w:rFonts w:ascii="Times New Roman" w:hAnsi="Times New Roman" w:eastAsia="Times New Roman"/>
+          <w:b w:val="0"/>
+          <w:i w:val="0"/>
+          <w:sz w:val="28"/>
+        </w:rPr>
+        <w:t>3. Документация Microsoft по размещению и масштабированию SignalR используется при рассмотрении ограничений single-node архитектуры и условий работы в многосерверной конфигурации.</w:t>
+      </w:r>
+    </w:p>
+    <w:p>
+      <w:pPr>
+        <w:spacing w:line="360" w:lineRule="auto" w:after="0"/>
+        <w:ind w:left="709" w:hanging="425"/>
+        <w:jc w:val="both"/>
+      </w:pPr>
+      <w:r>
+        <w:rPr>
+          <w:rFonts w:ascii="Times New Roman" w:hAnsi="Times New Roman" w:eastAsia="Times New Roman"/>
+          <w:b w:val="0"/>
+          <w:i w:val="0"/>
+          <w:sz w:val="28"/>
+        </w:rPr>
+        <w:t>4. Документация Microsoft по Redis backplane для SignalR является основным источником при обосновании выбранного подхода к межузловой доставке событий.</w:t>
+      </w:r>
+    </w:p>
+    <w:p>
+      <w:pPr>
+        <w:spacing w:line="360" w:lineRule="auto" w:after="0"/>
+        <w:ind w:left="709" w:hanging="425"/>
+        <w:jc w:val="both"/>
+      </w:pPr>
+      <w:r>
+        <w:rPr>
+          <w:rFonts w:ascii="Times New Roman" w:hAnsi="Times New Roman" w:eastAsia="Times New Roman"/>
+          <w:b w:val="0"/>
+          <w:i w:val="0"/>
+          <w:sz w:val="28"/>
+        </w:rPr>
+        <w:t>5. Документация Microsoft по пользователям и группам SignalR применяется для описания модели подписки клиента на группу отчета и необходимости повторного вступления в группу после переподключения.</w:t>
+      </w:r>
+    </w:p>
+    <w:p>
+      <w:pPr>
+        <w:spacing w:line="360" w:lineRule="auto" w:after="0"/>
+        <w:ind w:left="709" w:hanging="425"/>
+        <w:jc w:val="both"/>
+      </w:pPr>
+      <w:r>
+        <w:rPr>
+          <w:rFonts w:ascii="Times New Roman" w:hAnsi="Times New Roman" w:eastAsia="Times New Roman"/>
+          <w:b w:val="0"/>
+          <w:i w:val="0"/>
+          <w:sz w:val="28"/>
+        </w:rPr>
+        <w:t>6. Документация Microsoft по JavaScript-клиенту SignalR используется при описании проверочного клиента, WebSocket-подключения и автоматического восстановления соединения.</w:t>
+      </w:r>
+    </w:p>
+    <w:p>
+      <w:pPr>
+        <w:spacing w:line="360" w:lineRule="auto" w:after="0"/>
+        <w:ind w:left="709" w:hanging="425"/>
+        <w:jc w:val="both"/>
+      </w:pPr>
+      <w:r>
+        <w:rPr>
+          <w:rFonts w:ascii="Times New Roman" w:hAnsi="Times New Roman" w:eastAsia="Times New Roman"/>
+          <w:b w:val="0"/>
+          <w:i w:val="0"/>
+          <w:sz w:val="28"/>
+        </w:rPr>
+        <w:t>7. Документация Microsoft по конфигурации SignalR применяется при описании настроек транспорта, подключения клиента и параметров, влияющих на проверочный стенд.</w:t>
+      </w:r>
+    </w:p>
+    <w:p>
+      <w:pPr>
+        <w:spacing w:line="360" w:lineRule="auto" w:after="0"/>
+        <w:ind w:left="709" w:hanging="425"/>
+        <w:jc w:val="both"/>
+      </w:pPr>
+      <w:r>
+        <w:rPr>
+          <w:rFonts w:ascii="Times New Roman" w:hAnsi="Times New Roman" w:eastAsia="Times New Roman"/>
+          <w:b w:val="0"/>
+          <w:i w:val="0"/>
+          <w:sz w:val="28"/>
+        </w:rPr>
+        <w:t>8. Документация Microsoft по диагностике SignalR используется для обоснования добавленного диагностического контура, логирования и фиксации идентификаторов соединений.</w:t>
+      </w:r>
+    </w:p>
+    <w:p>
+      <w:pPr>
+        <w:spacing w:line="360" w:lineRule="auto" w:after="0"/>
+        <w:ind w:left="709" w:hanging="425"/>
+        <w:jc w:val="both"/>
+      </w:pPr>
+      <w:r>
+        <w:rPr>
+          <w:rFonts w:ascii="Times New Roman" w:hAnsi="Times New Roman" w:eastAsia="Times New Roman"/>
+          <w:b w:val="0"/>
+          <w:i w:val="0"/>
+          <w:sz w:val="28"/>
+        </w:rPr>
+        <w:t>9. Документация Redis Pub/Sub используется для понимания роли Redis как механизма публикации и подписки при межузловой доставке transient UI-событий.</w:t>
+      </w:r>
+    </w:p>
+    <w:p>
+      <w:pPr>
+        <w:spacing w:line="360" w:lineRule="auto" w:after="0"/>
+        <w:ind w:left="709" w:hanging="425"/>
+        <w:jc w:val="both"/>
+      </w:pPr>
+      <w:r>
+        <w:rPr>
+          <w:rFonts w:ascii="Times New Roman" w:hAnsi="Times New Roman" w:eastAsia="Times New Roman"/>
+          <w:b w:val="0"/>
+          <w:i w:val="0"/>
+          <w:sz w:val="28"/>
+        </w:rPr>
+        <w:t>10. Документация nginx по WebSocket proxying применяется при описании reverse proxy, передачи заголовков Upgrade и балансировки WebSocket-трафика.</w:t>
+      </w:r>
+    </w:p>
+    <w:p>
+      <w:pPr>
+        <w:spacing w:line="360" w:lineRule="auto" w:after="0"/>
+        <w:ind w:left="709" w:hanging="425"/>
+        <w:jc w:val="both"/>
+      </w:pPr>
+      <w:r>
+        <w:rPr>
+          <w:rFonts w:ascii="Times New Roman" w:hAnsi="Times New Roman" w:eastAsia="Times New Roman"/>
+          <w:b w:val="0"/>
+          <w:i w:val="0"/>
+          <w:sz w:val="28"/>
+        </w:rPr>
+        <w:t>11. ГОСТ 7.32-2017 используется как нормативная основа структуры и оформления отчета.</w:t>
+      </w:r>
+    </w:p>
+    <w:p>
+      <w:pPr>
+        <w:spacing w:line="360" w:lineRule="auto" w:after="0"/>
+        <w:ind w:left="709" w:hanging="425"/>
+        <w:jc w:val="both"/>
+      </w:pPr>
+      <w:r>
+        <w:rPr>
+          <w:rFonts w:ascii="Times New Roman" w:hAnsi="Times New Roman" w:eastAsia="Times New Roman"/>
+          <w:b w:val="0"/>
+          <w:i w:val="0"/>
+          <w:sz w:val="28"/>
+        </w:rPr>
+        <w:t>12. ГОСТ Р 7.0.100-2018 используется как нормативная основа оформления библиографического списка.</w:t>
+      </w:r>
+    </w:p>
+    <w:p>
+      <w:pPr>
+        <w:spacing w:line="360" w:lineRule="auto" w:after="0"/>
+        <w:ind w:left="709" w:hanging="425"/>
+        <w:jc w:val="both"/>
+      </w:pPr>
+      <w:r>
+        <w:rPr>
+          <w:rFonts w:ascii="Times New Roman" w:hAnsi="Times New Roman" w:eastAsia="Times New Roman"/>
+          <w:b w:val="0"/>
+          <w:i w:val="0"/>
+          <w:sz w:val="28"/>
+        </w:rPr>
+        <w:t>13. Учебно-методическое пособие С.А. Рогачева и Ю. Бабюк используется для учета требований кафедры к отчету по преддипломной практике.</w:t>
+      </w:r>
+    </w:p>
+    <w:p>
+      <w:pPr>
+        <w:spacing w:line="360" w:lineRule="auto" w:after="0"/>
+        <w:ind w:left="709" w:hanging="425"/>
+        <w:jc w:val="both"/>
+      </w:pPr>
+      <w:r>
+        <w:rPr>
+          <w:rFonts w:ascii="Times New Roman" w:hAnsi="Times New Roman" w:eastAsia="Times New Roman"/>
+          <w:b w:val="0"/>
+          <w:i w:val="0"/>
+          <w:sz w:val="28"/>
+        </w:rPr>
+        <w:t>14. Учебник В.Г. Олифера и Н.А. Олифера применяется для общей сетевой терминологии и понимания принципов взаимодействия сетевых приложений.</w:t>
+      </w:r>
+    </w:p>
+    <w:p>
+      <w:pPr>
+        <w:spacing w:line="360" w:lineRule="auto" w:after="0"/>
+        <w:ind w:left="709" w:hanging="425"/>
+        <w:jc w:val="both"/>
+      </w:pPr>
+      <w:r>
+        <w:rPr>
+          <w:rFonts w:ascii="Times New Roman" w:hAnsi="Times New Roman" w:eastAsia="Times New Roman"/>
+          <w:b w:val="0"/>
+          <w:i w:val="0"/>
+          <w:sz w:val="28"/>
+        </w:rPr>
+        <w:t>15. Учебник С.А. Орлова используется для связи практической разработки с понятиями программной инженерии и жизненного цикла программного продукта.</w:t>
+      </w:r>
+    </w:p>
+    <w:p>
+      <w:pPr>
+        <w:spacing w:line="360" w:lineRule="auto" w:after="0"/>
+        <w:ind w:left="709" w:hanging="425"/>
+        <w:jc w:val="both"/>
+      </w:pPr>
+      <w:r>
+        <w:rPr>
+          <w:rFonts w:ascii="Times New Roman" w:hAnsi="Times New Roman" w:eastAsia="Times New Roman"/>
+          <w:b w:val="0"/>
+          <w:i w:val="0"/>
+          <w:sz w:val="28"/>
+        </w:rPr>
+        <w:t>16. Учебное пособие Л.Г. Гагариной, Е.В. Кокоревой и В.Д. Виснадул применяется при описании разработки программного обеспечения и фиксации требований.</w:t>
+      </w:r>
+    </w:p>
+    <w:p>
+      <w:pPr>
+        <w:spacing w:line="360" w:lineRule="auto" w:after="0"/>
+        <w:ind w:left="709" w:hanging="425"/>
+        <w:jc w:val="both"/>
+      </w:pPr>
+      <w:r>
+        <w:rPr>
+          <w:rFonts w:ascii="Times New Roman" w:hAnsi="Times New Roman" w:eastAsia="Times New Roman"/>
+          <w:b w:val="0"/>
+          <w:i w:val="0"/>
+          <w:sz w:val="28"/>
+        </w:rPr>
+        <w:t>17. Учебник Б.Я. Советова, В.В. Цехановского и В.Д. Чертовского используется как источник по роли базы данных в составе информационной системы.</w:t>
+      </w:r>
+    </w:p>
+    <w:p>
+      <w:pPr>
+        <w:spacing w:line="360" w:lineRule="auto" w:after="0"/>
+        <w:ind w:left="709" w:hanging="425"/>
+        <w:jc w:val="both"/>
+      </w:pPr>
+      <w:r>
+        <w:rPr>
+          <w:rFonts w:ascii="Times New Roman" w:hAnsi="Times New Roman" w:eastAsia="Times New Roman"/>
+          <w:b w:val="0"/>
+          <w:i w:val="0"/>
+          <w:sz w:val="28"/>
+        </w:rPr>
+        <w:t>18. Учебник В.А. Гвоздевой и Б.А. Баллода применяется при описании систем отслеживания задач как разновидности автоматизированной информационной системы.</w:t>
+      </w:r>
+    </w:p>
+    <w:p>
+      <w:pPr>
+        <w:spacing w:line="360" w:lineRule="auto" w:after="0"/>
+        <w:ind w:left="709" w:hanging="425"/>
+        <w:jc w:val="both"/>
+      </w:pPr>
+      <w:r>
+        <w:rPr>
+          <w:rFonts w:ascii="Times New Roman" w:hAnsi="Times New Roman" w:eastAsia="Times New Roman"/>
+          <w:b w:val="0"/>
+          <w:i w:val="0"/>
+          <w:sz w:val="28"/>
+        </w:rPr>
+        <w:t>19. Учебник В.В. Липаева используется для обоснования инженерного подхода к разработке, сопровождению и качеству программных систем.</w:t>
+      </w:r>
+    </w:p>
+    <w:p>
+      <w:pPr>
+        <w:spacing w:line="360" w:lineRule="auto" w:after="0"/>
+        <w:ind w:left="709" w:hanging="425"/>
+        <w:jc w:val="both"/>
+      </w:pPr>
+      <w:r>
+        <w:rPr>
+          <w:rFonts w:ascii="Times New Roman" w:hAnsi="Times New Roman" w:eastAsia="Times New Roman"/>
+          <w:b w:val="0"/>
+          <w:i w:val="0"/>
+          <w:sz w:val="28"/>
+        </w:rPr>
+        <w:t>20. Книга С.С. Куликова используется при описании проверки результата, тестовых сценариев и интерпретации результатов испытаний.</w:t>
       </w:r>
     </w:p>
     <w:p>
@@ -3995,7 +4277,15 @@
           <w:i w:val="0"/>
           <w:sz w:val="28"/>
         </w:rPr>
-        <w:t>Если изменения становятся видимыми только после ручного обновления страницы, у пользователей возникает рассогласованное представление о состоянии системы. Это приводит к дублированию действий, работе с устаревшими данными и дополнительным коммуникационным издержкам. Поэтому для систем отслеживания задач важна поддержка согласованного представления о состоянии объекта: пользователь должен понимать, что объект уже изменился, кто присоединился к работе, какие комментарии или вложения появились и какие поля были обновлены [15], [19].</w:t>
+        <w:t>Таким образом, использованная литература покрывает четыре смысловые группы: нормативные требования к отчету, теорию WebSocket и SignalR, инфраструктурные средства масштабирования и общие положения программной инженерии. Это позволяет рассматривать выполненную работу не только как настройку стенда, но и как инженерную разработку, связанную с архитектурой, реализацией и проверкой программной системы.</w:t>
+      </w:r>
+    </w:p>
+    <w:p>
+      <w:pPr>
+        <w:pStyle w:val="Heading2"/>
+      </w:pPr>
+      <w:r>
+        <w:t>1.2 Real-time взаимодействие в системах отслеживания задач</w:t>
       </w:r>
     </w:p>
     <w:p>
@@ -4011,15 +4301,7 @@
           <w:i w:val="0"/>
           <w:sz w:val="28"/>
         </w:rPr>
-        <w:t>В контексте данной работы real-time интерфейс определяется как интерфейсный и серверный контур, обеспечивающий оперативное распространение событий изменения сущностей между клиентами. Такой контур включает клиентское WebSocket-соединение, серверный хаб, модель подписок, механизм групп, доставку событий и обработку переподключений [1], [2], [5], [6], [14].</w:t>
-      </w:r>
-    </w:p>
-    <w:p>
-      <w:pPr>
-        <w:pStyle w:val="Heading2"/>
-      </w:pPr>
-      <w:r>
-        <w:t>1.2 WebSocket и SignalR как основа real-time контура</w:t>
+        <w:t>Системы отслеживания задач предназначены для фиксации, распределения и контроля выполнения работ. В таких системах ключевыми сущностями являются задачи, отчеты, комментарии, вложения, исполнители, статусы, команды и рабочие пространства. В отличие от статичных справочников, эти сущности часто изменяются несколькими пользователями в течение короткого времени. Один участник может изменить статус задачи, второй добавить комментарий, третий прикрепить файл или уточнить шаг воспроизведения ошибки [16], [18].</w:t>
       </w:r>
     </w:p>
     <w:p>
@@ -4035,7 +4317,7 @@
           <w:i w:val="0"/>
           <w:sz w:val="28"/>
         </w:rPr>
-        <w:t>WebSocket обеспечивает двусторонний обмен данными поверх одного длительно открытого соединения. Для web-интерфейсов совместной работы это удобнее, чем периодический polling, поскольку сервер может самостоятельно отправлять клиентам события сразу после изменения состояния. В платформе ASP.NET Core над WebSocket часто используется SignalR. Он предоставляет более высокоуровневую модель: серверные хабы, клиентские методы, группы, отправку событий конкретным пользователям или всем участникам группы [1], [2].</w:t>
+        <w:t>Если изменения становятся видимыми только после ручного обновления страницы, у пользователей возникает рассогласованное представление о состоянии системы. Это приводит к дублированию действий, работе с устаревшими данными и дополнительным коммуникационным издержкам. Поэтому для систем отслеживания задач важна поддержка согласованного представления о состоянии объекта: пользователь должен понимать, что объект уже изменился, кто присоединился к работе, какие комментарии или вложения появились и какие поля были обновлены [15], [19].</w:t>
       </w:r>
     </w:p>
     <w:p>
@@ -4051,7 +4333,15 @@
           <w:i w:val="0"/>
           <w:sz w:val="28"/>
         </w:rPr>
-        <w:t>Для системы отслеживания задач особенно полезна модель групп. Клиент может вступить в группу, соответствующую конкретному отчету или задаче, после чего сервер отправляет события изменения только заинтересованным участникам. Такой подход снижает лишний трафик и делает real-time контур предметно ориентированным: событие связано не с абстрактным каналом, а с конкретной сущностью системы [5].</w:t>
+        <w:t>В контексте данной работы real-time интерфейс определяется как интерфейсный и серверный контур, обеспечивающий оперативное распространение событий изменения сущностей между клиентами. Такой контур включает клиентское WebSocket-соединение, серверный хаб, модель подписок, механизм групп, доставку событий и обработку переподключений [1], [2], [5], [6], [14].</w:t>
+      </w:r>
+    </w:p>
+    <w:p>
+      <w:pPr>
+        <w:pStyle w:val="Heading2"/>
+      </w:pPr>
+      <w:r>
+        <w:t>1.3 WebSocket и SignalR как основа real-time контура</w:t>
       </w:r>
     </w:p>
     <w:p>
@@ -4067,15 +4357,7 @@
           <w:i w:val="0"/>
           <w:sz w:val="28"/>
         </w:rPr>
-        <w:t>В то же время группы SignalR являются оперативным механизмом доставки, а не долговременным источником истины. Сведения о членстве соединений в группах хранятся в памяти серверного процесса и не должны использоваться как единственная база для авторизации, аудита или долговременного учета присутствия. Это обстоятельство важно при проектировании масштабируемого контура, поскольку при переподключении клиент должен заново восстановить необходимые подписки [5], [6].</w:t>
-      </w:r>
-    </w:p>
-    <w:p>
-      <w:pPr>
-        <w:pStyle w:val="Heading2"/>
-      </w:pPr>
-      <w:r>
-        <w:t>1.3 Ограничение single-node WebSocket-архитектуры</w:t>
+        <w:t>WebSocket обеспечивает двусторонний обмен данными поверх одного длительно открытого соединения. Для web-интерфейсов совместной работы это удобнее, чем периодический polling, поскольку сервер может самостоятельно отправлять клиентам события сразу после изменения состояния. В платформе ASP.NET Core над WebSocket часто используется SignalR. Он предоставляет более высокоуровневую модель: серверные хабы, клиентские методы, группы, отправку событий конкретным пользователям или всем участникам группы [1], [2].</w:t>
       </w:r>
     </w:p>
     <w:p>
@@ -4091,7 +4373,7 @@
           <w:i w:val="0"/>
           <w:sz w:val="28"/>
         </w:rPr>
-        <w:t>Single-node архитектура означает, что все WebSocket-соединения обслуживаются одним экземпляром backend-сервиса. Такой вариант прост в реализации и достаточен для раннего прототипа. Сервер хранит локальную таблицу активных соединений и групп, а при изменении сущности отправляет событие клиентам, подключенным к этому же процессу [3], [5].</w:t>
+        <w:t>Для системы отслеживания задач особенно полезна модель групп. Клиент может вступить в группу, соответствующую конкретному отчету или задаче, после чего сервер отправляет события изменения только заинтересованным участникам. Такой подход снижает лишний трафик и делает real-time контур предметно ориентированным: событие связано не с абстрактным каналом, а с конкретной сущностью системы [5].</w:t>
       </w:r>
     </w:p>
     <w:p>
@@ -4107,43 +4389,15 @@
           <w:i w:val="0"/>
           <w:sz w:val="28"/>
         </w:rPr>
-        <w:t xml:space="preserve">Проблема возникает при горизонтальном масштабировании. Если приложение запускается в нескольких экземплярах, входящий трафик распределяется между ними балансировщиком. Клиент A может оказаться подключенным к </w:t>
-      </w:r>
-      <w:r>
-        <w:rPr>
-          <w:rFonts w:ascii="Courier New" w:hAnsi="Courier New" w:eastAsia="Courier New"/>
-          <w:b w:val="0"/>
-          <w:i w:val="0"/>
-          <w:sz w:val="28"/>
-        </w:rPr>
-        <w:t>app-api-1</w:t>
-      </w:r>
-      <w:r>
-        <w:rPr>
-          <w:rFonts w:ascii="Times New Roman" w:hAnsi="Times New Roman" w:eastAsia="Times New Roman"/>
-          <w:b w:val="0"/>
-          <w:i w:val="0"/>
-          <w:sz w:val="28"/>
-        </w:rPr>
-        <w:t xml:space="preserve">, а клиент B — к </w:t>
-      </w:r>
-      <w:r>
-        <w:rPr>
-          <w:rFonts w:ascii="Courier New" w:hAnsi="Courier New" w:eastAsia="Courier New"/>
-          <w:b w:val="0"/>
-          <w:i w:val="0"/>
-          <w:sz w:val="28"/>
-        </w:rPr>
-        <w:t>app-api-2</w:t>
-      </w:r>
-      <w:r>
-        <w:rPr>
-          <w:rFonts w:ascii="Times New Roman" w:hAnsi="Times New Roman" w:eastAsia="Times New Roman"/>
-          <w:b w:val="0"/>
-          <w:i w:val="0"/>
-          <w:sz w:val="28"/>
-        </w:rPr>
-        <w:t>. Если событие изменения отчета создано на первом узле, то без межузловой синхронизации второй узел не узнает, что нужно отправить событие своим клиентам. Формально система уже имеет два backend-экземпляра, но real-time пространство фрагментируется на независимые острова [3], [10].</w:t>
+        <w:t>В то же время группы SignalR являются оперативным механизмом доставки, а не долговременным источником истины. Сведения о членстве соединений в группах хранятся в памяти серверного процесса и не должны использоваться как единственная база для авторизации, аудита или долговременного учета присутствия. Это обстоятельство важно при проектировании масштабируемого контура, поскольку при переподключении клиент должен заново восстановить необходимые подписки [5], [6].</w:t>
+      </w:r>
+    </w:p>
+    <w:p>
+      <w:pPr>
+        <w:pStyle w:val="Heading2"/>
+      </w:pPr>
+      <w:r>
+        <w:t>1.4 Ограничение single-node WebSocket-архитектуры</w:t>
       </w:r>
     </w:p>
     <w:p>
@@ -4159,6 +4413,74 @@
           <w:i w:val="0"/>
           <w:sz w:val="28"/>
         </w:rPr>
+        <w:t>Single-node архитектура означает, что все WebSocket-соединения обслуживаются одним экземпляром backend-сервиса. Такой вариант прост в реализации и достаточен для раннего прототипа. Сервер хранит локальную таблицу активных соединений и групп, а при изменении сущности отправляет событие клиентам, подключенным к этому же процессу [3], [5].</w:t>
+      </w:r>
+    </w:p>
+    <w:p>
+      <w:pPr>
+        <w:spacing w:line="360" w:lineRule="auto"/>
+        <w:ind w:firstLine="709"/>
+        <w:jc w:val="both"/>
+      </w:pPr>
+      <w:r>
+        <w:rPr>
+          <w:rFonts w:ascii="Times New Roman" w:hAnsi="Times New Roman" w:eastAsia="Times New Roman"/>
+          <w:b w:val="0"/>
+          <w:i w:val="0"/>
+          <w:sz w:val="28"/>
+        </w:rPr>
+        <w:t xml:space="preserve">Проблема возникает при горизонтальном масштабировании. Если приложение запускается в нескольких экземплярах, входящий трафик распределяется между ними балансировщиком. Клиент A может оказаться подключенным к </w:t>
+      </w:r>
+      <w:r>
+        <w:rPr>
+          <w:rFonts w:ascii="Courier New" w:hAnsi="Courier New" w:eastAsia="Courier New"/>
+          <w:b w:val="0"/>
+          <w:i w:val="0"/>
+          <w:sz w:val="28"/>
+        </w:rPr>
+        <w:t>app-api-1</w:t>
+      </w:r>
+      <w:r>
+        <w:rPr>
+          <w:rFonts w:ascii="Times New Roman" w:hAnsi="Times New Roman" w:eastAsia="Times New Roman"/>
+          <w:b w:val="0"/>
+          <w:i w:val="0"/>
+          <w:sz w:val="28"/>
+        </w:rPr>
+        <w:t xml:space="preserve">, а клиент B — к </w:t>
+      </w:r>
+      <w:r>
+        <w:rPr>
+          <w:rFonts w:ascii="Courier New" w:hAnsi="Courier New" w:eastAsia="Courier New"/>
+          <w:b w:val="0"/>
+          <w:i w:val="0"/>
+          <w:sz w:val="28"/>
+        </w:rPr>
+        <w:t>app-api-2</w:t>
+      </w:r>
+      <w:r>
+        <w:rPr>
+          <w:rFonts w:ascii="Times New Roman" w:hAnsi="Times New Roman" w:eastAsia="Times New Roman"/>
+          <w:b w:val="0"/>
+          <w:i w:val="0"/>
+          <w:sz w:val="28"/>
+        </w:rPr>
+        <w:t>. Если событие изменения отчета создано на первом узле, то без межузловой синхронизации второй узел не узнает, что нужно отправить событие своим клиентам. Формально система уже имеет два backend-экземпляра, но real-time пространство фрагментируется на независимые острова [3], [10].</w:t>
+      </w:r>
+    </w:p>
+    <w:p>
+      <w:pPr>
+        <w:spacing w:line="360" w:lineRule="auto"/>
+        <w:ind w:firstLine="709"/>
+        <w:jc w:val="both"/>
+      </w:pPr>
+      <w:r>
+        <w:rPr>
+          <w:rFonts w:ascii="Times New Roman" w:hAnsi="Times New Roman" w:eastAsia="Times New Roman"/>
+          <w:b w:val="0"/>
+          <w:i w:val="0"/>
+          <w:sz w:val="28"/>
+        </w:rPr>
         <w:t>Для системы совместной работы это является функциональным дефектом. Пользователь не обязан знать, через какой серверный процесс он подключен. Ожидаемое свойство интерфейса состоит в том, что изменение сущности доставляется всем заинтересованным участникам. Следовательно, поддержка горизонтального масштабирования WebSocket-соединений должна включать не только запуск нескольких процессов, но и межузловую доставку событий [3], [15].</w:t>
       </w:r>
     </w:p>
@@ -4167,7 +4489,7 @@
         <w:pStyle w:val="Heading2"/>
       </w:pPr>
       <w:r>
-        <w:t>1.4 Сравнение подходов к масштабированию</w:t>
+        <w:t>1.5 Сравнение подходов к масштабированию</w:t>
       </w:r>
     </w:p>
     <w:p>
@@ -4899,7 +5221,7 @@
         <w:pStyle w:val="Heading2"/>
       </w:pPr>
       <w:r>
-        <w:t>1.5 Вывод по главе</w:t>
+        <w:t>1.6 Вывод по главе</w:t>
       </w:r>
     </w:p>
     <w:p>

</xml_diff>

<commit_message>
Update practice report and rendered images for final qualifying work. Revise table of contents in the DOCX file for improved structure and clarity. Remove outdated contact sheet image and update multiple PNG files to reflect recent changes in the practice report. Ensure all documentation aligns with project standards.
</commit_message>
<xml_diff>
--- a/build/docx/practice-report-draft-1.docx
+++ b/build/docx/practice-report-draft-1.docx
@@ -2076,7 +2076,7 @@
         </w:rPr>
         <w:t>ПЕРЕЧЕНЬ СОКРАЩЕНИЙ И ОБОЗНАЧЕНИЙ</w:t>
         <w:tab/>
-        <w:t>2</w:t>
+        <w:t>3</w:t>
       </w:r>
     </w:p>
     <w:p>
@@ -2096,7 +2096,7 @@
         </w:rPr>
         <w:t>ВВЕДЕНИЕ</w:t>
         <w:tab/>
-        <w:t>3</w:t>
+        <w:t>4</w:t>
       </w:r>
     </w:p>
     <w:p>
@@ -2116,7 +2116,7 @@
         </w:rPr>
         <w:t>1. Анализ предметной области и существующих подходов</w:t>
         <w:tab/>
-        <w:t>6</w:t>
+        <w:t>7</w:t>
       </w:r>
     </w:p>
     <w:p>
@@ -2136,7 +2136,7 @@
         </w:rPr>
         <w:t>1.1 Описание использованной литературы</w:t>
         <w:tab/>
-        <w:t>6</w:t>
+        <w:t>7</w:t>
       </w:r>
     </w:p>
     <w:p>
@@ -2156,7 +2156,7 @@
         </w:rPr>
         <w:t>1.2 Real-time взаимодействие в системах отслеживания задач</w:t>
         <w:tab/>
-        <w:t>8</w:t>
+        <w:t>9</w:t>
       </w:r>
     </w:p>
     <w:p>
@@ -2176,7 +2176,7 @@
         </w:rPr>
         <w:t>1.3 WebSocket и SignalR как основа real-time контура</w:t>
         <w:tab/>
-        <w:t>9</w:t>
+        <w:t>10</w:t>
       </w:r>
     </w:p>
     <w:p>
@@ -2196,7 +2196,7 @@
         </w:rPr>
         <w:t>1.4 Ограничение single-node WebSocket-архитектуры</w:t>
         <w:tab/>
-        <w:t>10</w:t>
+        <w:t>11</w:t>
       </w:r>
     </w:p>
     <w:p>
@@ -2216,7 +2216,7 @@
         </w:rPr>
         <w:t>1.5 Сравнение подходов к масштабированию</w:t>
         <w:tab/>
-        <w:t>11</w:t>
+        <w:t>12</w:t>
       </w:r>
     </w:p>
     <w:p>
@@ -2236,7 +2236,7 @@
         </w:rPr>
         <w:t>1.6 Вывод по главе</w:t>
         <w:tab/>
-        <w:t>11</w:t>
+        <w:t>12</w:t>
       </w:r>
     </w:p>
     <w:p>
@@ -2256,7 +2256,7 @@
         </w:rPr>
         <w:t>2. Анализ целевой системы и постановка задачи практики</w:t>
         <w:tab/>
-        <w:t>13</w:t>
+        <w:t>14</w:t>
       </w:r>
     </w:p>
     <w:p>
@@ -2276,7 +2276,7 @@
         </w:rPr>
         <w:t>2.1 Характеристика целевой системы</w:t>
         <w:tab/>
-        <w:t>13</w:t>
+        <w:t>14</w:t>
       </w:r>
     </w:p>
     <w:p>
@@ -2296,7 +2296,7 @@
         </w:rPr>
         <w:t>2.2 Исходная реализация real-time взаимодействия</w:t>
         <w:tab/>
-        <w:t>13</w:t>
+        <w:t>14</w:t>
       </w:r>
     </w:p>
     <w:p>
@@ -2316,7 +2316,7 @@
         </w:rPr>
         <w:t>2.3 Требования к разрабатываемому решению</w:t>
         <w:tab/>
-        <w:t>14</w:t>
+        <w:t>15</w:t>
       </w:r>
     </w:p>
     <w:p>
@@ -2336,7 +2336,7 @@
         </w:rPr>
         <w:t>2.4 Выбор платформы и инструментальных средств</w:t>
         <w:tab/>
-        <w:t>15</w:t>
+        <w:t>16</w:t>
       </w:r>
     </w:p>
     <w:p>
@@ -2356,7 +2356,7 @@
         </w:rPr>
         <w:t>2.5 Постановка задачи</w:t>
         <w:tab/>
-        <w:t>15</w:t>
+        <w:t>16</w:t>
       </w:r>
     </w:p>
     <w:p>
@@ -2376,7 +2376,7 @@
         </w:rPr>
         <w:t>3. Проектирование масштабируемого real-time контура</w:t>
         <w:tab/>
-        <w:t>17</w:t>
+        <w:t>18</w:t>
       </w:r>
     </w:p>
     <w:p>
@@ -2396,7 +2396,7 @@
         </w:rPr>
         <w:t>3.1 Исходная архитектура</w:t>
         <w:tab/>
-        <w:t>17</w:t>
+        <w:t>18</w:t>
       </w:r>
     </w:p>
     <w:p>
@@ -2416,7 +2416,7 @@
         </w:rPr>
         <w:t>3.2 Целевая архитектура</w:t>
         <w:tab/>
-        <w:t>17</w:t>
+        <w:t>18</w:t>
       </w:r>
     </w:p>
     <w:p>
@@ -2436,7 +2436,7 @@
         </w:rPr>
         <w:t>3.3 Поток real-time события</w:t>
         <w:tab/>
-        <w:t>18</w:t>
+        <w:t>19</w:t>
       </w:r>
     </w:p>
     <w:p>
@@ -2456,7 +2456,7 @@
         </w:rPr>
         <w:t>3.4 Модель групп и повторной подписки</w:t>
         <w:tab/>
-        <w:t>19</w:t>
+        <w:t>20</w:t>
       </w:r>
     </w:p>
     <w:p>
@@ -2476,7 +2476,7 @@
         </w:rPr>
         <w:t>3.5 Диагностический контур</w:t>
         <w:tab/>
-        <w:t>20</w:t>
+        <w:t>21</w:t>
       </w:r>
     </w:p>
     <w:p>
@@ -2496,7 +2496,7 @@
         </w:rPr>
         <w:t>4. Выполнение индивидуального задания</w:t>
         <w:tab/>
-        <w:t>21</w:t>
+        <w:t>22</w:t>
       </w:r>
     </w:p>
     <w:p>
@@ -2516,7 +2516,7 @@
         </w:rPr>
         <w:t>4.1 Организация работ</w:t>
         <w:tab/>
-        <w:t>21</w:t>
+        <w:t>22</w:t>
       </w:r>
     </w:p>
     <w:p>
@@ -2536,7 +2536,7 @@
         </w:rPr>
         <w:t>4.2 Изменения backend</w:t>
         <w:tab/>
-        <w:t>21</w:t>
+        <w:t>22</w:t>
       </w:r>
     </w:p>
     <w:p>
@@ -2556,7 +2556,7 @@
         </w:rPr>
         <w:t>4.3 Проверочный клиент</w:t>
         <w:tab/>
-        <w:t>22</w:t>
+        <w:t>23</w:t>
       </w:r>
     </w:p>
     <w:p>
@@ -2576,7 +2576,7 @@
         </w:rPr>
         <w:t>4.4 Инфраструктурные изменения</w:t>
         <w:tab/>
-        <w:t>22</w:t>
+        <w:t>23</w:t>
       </w:r>
     </w:p>
     <w:p>
@@ -2596,7 +2596,7 @@
         </w:rPr>
         <w:t>4.5 Автоматизированный сценарий проверки</w:t>
         <w:tab/>
-        <w:t>23</w:t>
+        <w:t>24</w:t>
       </w:r>
     </w:p>
     <w:p>
@@ -2616,7 +2616,7 @@
         </w:rPr>
         <w:t>5. Результаты практики и оценка решения</w:t>
         <w:tab/>
-        <w:t>25</w:t>
+        <w:t>26</w:t>
       </w:r>
     </w:p>
     <w:p>
@@ -2636,7 +2636,7 @@
         </w:rPr>
         <w:t>5.1 Цель и программа испытаний</w:t>
         <w:tab/>
-        <w:t>25</w:t>
+        <w:t>26</w:t>
       </w:r>
     </w:p>
     <w:p>
@@ -2656,7 +2656,7 @@
         </w:rPr>
         <w:t>5.2 Стенд испытаний</w:t>
         <w:tab/>
-        <w:t>25</w:t>
+        <w:t>26</w:t>
       </w:r>
     </w:p>
     <w:p>
@@ -2676,7 +2676,7 @@
         </w:rPr>
         <w:t>5.3 Результат без Redis backplane</w:t>
         <w:tab/>
-        <w:t>26</w:t>
+        <w:t>27</w:t>
       </w:r>
     </w:p>
     <w:p>
@@ -2696,7 +2696,7 @@
         </w:rPr>
         <w:t>5.4 Результат с Redis backplane</w:t>
         <w:tab/>
-        <w:t>26</w:t>
+        <w:t>27</w:t>
       </w:r>
     </w:p>
     <w:p>
@@ -2716,7 +2716,7 @@
         </w:rPr>
         <w:t>5.5 Серийная проверка и задержка доставки</w:t>
         <w:tab/>
-        <w:t>27</w:t>
+        <w:t>28</w:t>
       </w:r>
     </w:p>
     <w:p>
@@ -2736,7 +2736,7 @@
         </w:rPr>
         <w:t>5.6 Проверка восстановления соединения и отказа узла</w:t>
         <w:tab/>
-        <w:t>28</w:t>
+        <w:t>29</w:t>
       </w:r>
     </w:p>
     <w:p>
@@ -2756,7 +2756,7 @@
         </w:rPr>
         <w:t>5.7 Сравнительная таблица результатов</w:t>
         <w:tab/>
-        <w:t>28</w:t>
+        <w:t>29</w:t>
       </w:r>
     </w:p>
     <w:p>
@@ -2776,7 +2776,7 @@
         </w:rPr>
         <w:t>5.8 Проверка входной точки стенда</w:t>
         <w:tab/>
-        <w:t>29</w:t>
+        <w:t>30</w:t>
       </w:r>
     </w:p>
     <w:p>
@@ -2796,7 +2796,7 @@
         </w:rPr>
         <w:t>5.9 Оценка достоверности результатов</w:t>
         <w:tab/>
-        <w:t>29</w:t>
+        <w:t>30</w:t>
       </w:r>
     </w:p>
     <w:p>
@@ -2816,7 +2816,7 @@
         </w:rPr>
         <w:t>5.10 Вывод по испытаниям</w:t>
         <w:tab/>
-        <w:t>30</w:t>
+        <w:t>31</w:t>
       </w:r>
     </w:p>
     <w:p>
@@ -2836,7 +2836,7 @@
         </w:rPr>
         <w:t>ЗАКЛЮЧЕНИЕ</w:t>
         <w:tab/>
-        <w:t>30</w:t>
+        <w:t>31</w:t>
       </w:r>
     </w:p>
     <w:p>
@@ -2856,7 +2856,7 @@
         </w:rPr>
         <w:t>СПИСОК ИСПОЛЬЗОВАННЫХ ИСТОЧНИКОВ</w:t>
         <w:tab/>
-        <w:t>32</w:t>
+        <w:t>33</w:t>
       </w:r>
     </w:p>
     <w:p>
@@ -2876,13 +2876,24 @@
         </w:rPr>
         <w:t>ПРИЛОЖЕНИЕ А</w:t>
         <w:tab/>
-        <w:t>34</w:t>
+        <w:t>35</w:t>
       </w:r>
     </w:p>
     <w:p>
       <w:r>
         <w:br w:type="page"/>
       </w:r>
+    </w:p>
+    <w:p>
+      <w:pPr>
+        <w:sectPr>
+          <w:footerReference w:type="default" r:id="rId10"/>
+          <w:pgSz w:w="12240" w:h="15840"/>
+          <w:pgMar w:top="1134" w:right="850" w:bottom="1134" w:left="1701" w:header="720" w:footer="720" w:gutter="0"/>
+          <w:cols w:space="720"/>
+          <w:docGrid w:linePitch="360"/>
+        </w:sectPr>
+      </w:pPr>
     </w:p>
     <w:p>
       <w:pPr>
@@ -5937,172 +5948,6 @@
                     <pic:cNvPicPr/>
                   </pic:nvPicPr>
                   <pic:blipFill>
-                    <a:blip r:embed="rId11"/>
-                    <a:stretch>
-                      <a:fillRect/>
-                    </a:stretch>
-                  </pic:blipFill>
-                  <pic:spPr>
-                    <a:xfrm>
-                      <a:off x="0" y="0"/>
-                      <a:ext cx="5580000" cy="3138750"/>
-                    </a:xfrm>
-                    <a:prstGeom prst="rect"/>
-                  </pic:spPr>
-                </pic:pic>
-              </a:graphicData>
-            </a:graphic>
-          </wp:inline>
-        </w:drawing>
-      </w:r>
-    </w:p>
-    <w:p>
-      <w:pPr>
-        <w:spacing w:after="120"/>
-        <w:ind w:firstLine="0"/>
-        <w:jc w:val="center"/>
-      </w:pPr>
-      <w:r>
-        <w:rPr>
-          <w:rFonts w:ascii="Times New Roman" w:hAnsi="Times New Roman" w:eastAsia="Times New Roman"/>
-          <w:b w:val="0"/>
-          <w:i/>
-          <w:sz w:val="24"/>
-        </w:rPr>
-        <w:t>Рисунок 1 — Исходная single-node архитектура real-time контура</w:t>
-      </w:r>
-    </w:p>
-    <w:p>
-      <w:pPr>
-        <w:spacing w:line="360" w:lineRule="auto"/>
-        <w:ind w:firstLine="709"/>
-        <w:jc w:val="both"/>
-      </w:pPr>
-      <w:r>
-        <w:rPr>
-          <w:rFonts w:ascii="Times New Roman" w:hAnsi="Times New Roman" w:eastAsia="Times New Roman"/>
-          <w:b w:val="0"/>
-          <w:i w:val="0"/>
-          <w:sz w:val="28"/>
-        </w:rPr>
-        <w:t xml:space="preserve">Недостаток этой архитектуры состоит в том, что она не показывает, как система должна вести себя при нескольких экземплярах </w:t>
-      </w:r>
-      <w:r>
-        <w:rPr>
-          <w:rFonts w:ascii="Courier New" w:hAnsi="Courier New" w:eastAsia="Courier New"/>
-          <w:b w:val="0"/>
-          <w:i w:val="0"/>
-          <w:sz w:val="28"/>
-        </w:rPr>
-        <w:t>app-api</w:t>
-      </w:r>
-      <w:r>
-        <w:rPr>
-          <w:rFonts w:ascii="Times New Roman" w:hAnsi="Times New Roman" w:eastAsia="Times New Roman"/>
-          <w:b w:val="0"/>
-          <w:i w:val="0"/>
-          <w:sz w:val="28"/>
-        </w:rPr>
-        <w:t>. Если просто добавить второй экземпляр без backplane, каждый процесс будет иметь собственное локальное состояние соединений [3].</w:t>
-      </w:r>
-    </w:p>
-    <w:p>
-      <w:pPr>
-        <w:pStyle w:val="Heading2"/>
-      </w:pPr>
-      <w:r>
-        <w:t>3.2 Целевая архитектура</w:t>
-      </w:r>
-    </w:p>
-    <w:p>
-      <w:pPr>
-        <w:spacing w:line="360" w:lineRule="auto"/>
-        <w:ind w:firstLine="709"/>
-        <w:jc w:val="both"/>
-      </w:pPr>
-      <w:r>
-        <w:rPr>
-          <w:rFonts w:ascii="Times New Roman" w:hAnsi="Times New Roman" w:eastAsia="Times New Roman"/>
-          <w:b w:val="0"/>
-          <w:i w:val="0"/>
-          <w:sz w:val="28"/>
-        </w:rPr>
-        <w:t xml:space="preserve">В целевой архитектуре перед backend-сервисами находится nginx, а приложение запускается в двух экземплярах: </w:t>
-      </w:r>
-      <w:r>
-        <w:rPr>
-          <w:rFonts w:ascii="Courier New" w:hAnsi="Courier New" w:eastAsia="Courier New"/>
-          <w:b w:val="0"/>
-          <w:i w:val="0"/>
-          <w:sz w:val="28"/>
-        </w:rPr>
-        <w:t>app-api-1</w:t>
-      </w:r>
-      <w:r>
-        <w:rPr>
-          <w:rFonts w:ascii="Times New Roman" w:hAnsi="Times New Roman" w:eastAsia="Times New Roman"/>
-          <w:b w:val="0"/>
-          <w:i w:val="0"/>
-          <w:sz w:val="28"/>
-        </w:rPr>
-        <w:t xml:space="preserve"> и </w:t>
-      </w:r>
-      <w:r>
-        <w:rPr>
-          <w:rFonts w:ascii="Courier New" w:hAnsi="Courier New" w:eastAsia="Courier New"/>
-          <w:b w:val="0"/>
-          <w:i w:val="0"/>
-          <w:sz w:val="28"/>
-        </w:rPr>
-        <w:t>app-api-2</w:t>
-      </w:r>
-      <w:r>
-        <w:rPr>
-          <w:rFonts w:ascii="Times New Roman" w:hAnsi="Times New Roman" w:eastAsia="Times New Roman"/>
-          <w:b w:val="0"/>
-          <w:i w:val="0"/>
-          <w:sz w:val="28"/>
-        </w:rPr>
-        <w:t>. Оба экземпляра подключены к общей базе данных PostgreSQL [17] и к Redis. SignalR использует Redis backplane для межузловой доставки событий [4], [10], [14].</w:t>
-      </w:r>
-    </w:p>
-    <w:p>
-      <w:pPr>
-        <w:spacing w:line="360" w:lineRule="auto"/>
-        <w:ind w:firstLine="709"/>
-        <w:jc w:val="both"/>
-      </w:pPr>
-      <w:r>
-        <w:rPr>
-          <w:rFonts w:ascii="Times New Roman" w:hAnsi="Times New Roman" w:eastAsia="Times New Roman"/>
-          <w:b w:val="0"/>
-          <w:i w:val="0"/>
-          <w:sz w:val="28"/>
-        </w:rPr>
-        <w:t>Схема целевой архитектуры представлена на рисунке 2.</w:t>
-      </w:r>
-    </w:p>
-    <w:p>
-      <w:pPr>
-        <w:ind w:firstLine="0"/>
-        <w:jc w:val="center"/>
-      </w:pPr>
-      <w:r>
-        <w:drawing>
-          <wp:inline xmlns:a="http://schemas.openxmlformats.org/drawingml/2006/main" xmlns:pic="http://schemas.openxmlformats.org/drawingml/2006/picture">
-            <wp:extent cx="5580000" cy="3138750"/>
-            <wp:docPr id="2" name="Picture 2"/>
-            <wp:cNvGraphicFramePr>
-              <a:graphicFrameLocks noChangeAspect="1"/>
-            </wp:cNvGraphicFramePr>
-            <a:graphic>
-              <a:graphicData uri="http://schemas.openxmlformats.org/drawingml/2006/picture">
-                <pic:pic>
-                  <pic:nvPicPr>
-                    <pic:cNvPr id="0" name="figure-2-scaleout.png"/>
-                    <pic:cNvPicPr/>
-                  </pic:nvPicPr>
-                  <pic:blipFill>
                     <a:blip r:embed="rId12"/>
                     <a:stretch>
                       <a:fillRect/>
@@ -6135,6 +5980,172 @@
           <w:i/>
           <w:sz w:val="24"/>
         </w:rPr>
+        <w:t>Рисунок 1 — Исходная single-node архитектура real-time контура</w:t>
+      </w:r>
+    </w:p>
+    <w:p>
+      <w:pPr>
+        <w:spacing w:line="360" w:lineRule="auto"/>
+        <w:ind w:firstLine="709"/>
+        <w:jc w:val="both"/>
+      </w:pPr>
+      <w:r>
+        <w:rPr>
+          <w:rFonts w:ascii="Times New Roman" w:hAnsi="Times New Roman" w:eastAsia="Times New Roman"/>
+          <w:b w:val="0"/>
+          <w:i w:val="0"/>
+          <w:sz w:val="28"/>
+        </w:rPr>
+        <w:t xml:space="preserve">Недостаток этой архитектуры состоит в том, что она не показывает, как система должна вести себя при нескольких экземплярах </w:t>
+      </w:r>
+      <w:r>
+        <w:rPr>
+          <w:rFonts w:ascii="Courier New" w:hAnsi="Courier New" w:eastAsia="Courier New"/>
+          <w:b w:val="0"/>
+          <w:i w:val="0"/>
+          <w:sz w:val="28"/>
+        </w:rPr>
+        <w:t>app-api</w:t>
+      </w:r>
+      <w:r>
+        <w:rPr>
+          <w:rFonts w:ascii="Times New Roman" w:hAnsi="Times New Roman" w:eastAsia="Times New Roman"/>
+          <w:b w:val="0"/>
+          <w:i w:val="0"/>
+          <w:sz w:val="28"/>
+        </w:rPr>
+        <w:t>. Если просто добавить второй экземпляр без backplane, каждый процесс будет иметь собственное локальное состояние соединений [3].</w:t>
+      </w:r>
+    </w:p>
+    <w:p>
+      <w:pPr>
+        <w:pStyle w:val="Heading2"/>
+      </w:pPr>
+      <w:r>
+        <w:t>3.2 Целевая архитектура</w:t>
+      </w:r>
+    </w:p>
+    <w:p>
+      <w:pPr>
+        <w:spacing w:line="360" w:lineRule="auto"/>
+        <w:ind w:firstLine="709"/>
+        <w:jc w:val="both"/>
+      </w:pPr>
+      <w:r>
+        <w:rPr>
+          <w:rFonts w:ascii="Times New Roman" w:hAnsi="Times New Roman" w:eastAsia="Times New Roman"/>
+          <w:b w:val="0"/>
+          <w:i w:val="0"/>
+          <w:sz w:val="28"/>
+        </w:rPr>
+        <w:t xml:space="preserve">В целевой архитектуре перед backend-сервисами находится nginx, а приложение запускается в двух экземплярах: </w:t>
+      </w:r>
+      <w:r>
+        <w:rPr>
+          <w:rFonts w:ascii="Courier New" w:hAnsi="Courier New" w:eastAsia="Courier New"/>
+          <w:b w:val="0"/>
+          <w:i w:val="0"/>
+          <w:sz w:val="28"/>
+        </w:rPr>
+        <w:t>app-api-1</w:t>
+      </w:r>
+      <w:r>
+        <w:rPr>
+          <w:rFonts w:ascii="Times New Roman" w:hAnsi="Times New Roman" w:eastAsia="Times New Roman"/>
+          <w:b w:val="0"/>
+          <w:i w:val="0"/>
+          <w:sz w:val="28"/>
+        </w:rPr>
+        <w:t xml:space="preserve"> и </w:t>
+      </w:r>
+      <w:r>
+        <w:rPr>
+          <w:rFonts w:ascii="Courier New" w:hAnsi="Courier New" w:eastAsia="Courier New"/>
+          <w:b w:val="0"/>
+          <w:i w:val="0"/>
+          <w:sz w:val="28"/>
+        </w:rPr>
+        <w:t>app-api-2</w:t>
+      </w:r>
+      <w:r>
+        <w:rPr>
+          <w:rFonts w:ascii="Times New Roman" w:hAnsi="Times New Roman" w:eastAsia="Times New Roman"/>
+          <w:b w:val="0"/>
+          <w:i w:val="0"/>
+          <w:sz w:val="28"/>
+        </w:rPr>
+        <w:t>. Оба экземпляра подключены к общей базе данных PostgreSQL [17] и к Redis. SignalR использует Redis backplane для межузловой доставки событий [4], [10], [14].</w:t>
+      </w:r>
+    </w:p>
+    <w:p>
+      <w:pPr>
+        <w:spacing w:line="360" w:lineRule="auto"/>
+        <w:ind w:firstLine="709"/>
+        <w:jc w:val="both"/>
+      </w:pPr>
+      <w:r>
+        <w:rPr>
+          <w:rFonts w:ascii="Times New Roman" w:hAnsi="Times New Roman" w:eastAsia="Times New Roman"/>
+          <w:b w:val="0"/>
+          <w:i w:val="0"/>
+          <w:sz w:val="28"/>
+        </w:rPr>
+        <w:t>Схема целевой архитектуры представлена на рисунке 2.</w:t>
+      </w:r>
+    </w:p>
+    <w:p>
+      <w:pPr>
+        <w:ind w:firstLine="0"/>
+        <w:jc w:val="center"/>
+      </w:pPr>
+      <w:r>
+        <w:drawing>
+          <wp:inline xmlns:a="http://schemas.openxmlformats.org/drawingml/2006/main" xmlns:pic="http://schemas.openxmlformats.org/drawingml/2006/picture">
+            <wp:extent cx="5580000" cy="3138750"/>
+            <wp:docPr id="2" name="Picture 2"/>
+            <wp:cNvGraphicFramePr>
+              <a:graphicFrameLocks noChangeAspect="1"/>
+            </wp:cNvGraphicFramePr>
+            <a:graphic>
+              <a:graphicData uri="http://schemas.openxmlformats.org/drawingml/2006/picture">
+                <pic:pic>
+                  <pic:nvPicPr>
+                    <pic:cNvPr id="0" name="figure-2-scaleout.png"/>
+                    <pic:cNvPicPr/>
+                  </pic:nvPicPr>
+                  <pic:blipFill>
+                    <a:blip r:embed="rId13"/>
+                    <a:stretch>
+                      <a:fillRect/>
+                    </a:stretch>
+                  </pic:blipFill>
+                  <pic:spPr>
+                    <a:xfrm>
+                      <a:off x="0" y="0"/>
+                      <a:ext cx="5580000" cy="3138750"/>
+                    </a:xfrm>
+                    <a:prstGeom prst="rect"/>
+                  </pic:spPr>
+                </pic:pic>
+              </a:graphicData>
+            </a:graphic>
+          </wp:inline>
+        </w:drawing>
+      </w:r>
+    </w:p>
+    <w:p>
+      <w:pPr>
+        <w:spacing w:after="120"/>
+        <w:ind w:firstLine="0"/>
+        <w:jc w:val="center"/>
+      </w:pPr>
+      <w:r>
+        <w:rPr>
+          <w:rFonts w:ascii="Times New Roman" w:hAnsi="Times New Roman" w:eastAsia="Times New Roman"/>
+          <w:b w:val="0"/>
+          <w:i/>
+          <w:sz w:val="24"/>
+        </w:rPr>
         <w:t>Рисунок 2 — Целевая multi-instance архитектура с Redis backplane</w:t>
       </w:r>
     </w:p>
@@ -6415,7 +6426,7 @@
                     <pic:cNvPicPr/>
                   </pic:nvPicPr>
                   <pic:blipFill>
-                    <a:blip r:embed="rId13"/>
+                    <a:blip r:embed="rId14"/>
                     <a:stretch>
                       <a:fillRect/>
                     </a:stretch>
@@ -11436,12 +11447,12 @@
       </w:r>
     </w:p>
     <w:sectPr>
-      <w:footerReference w:type="default" r:id="rId10"/>
+      <w:footerReference w:type="default" r:id="rId11"/>
       <w:pgSz w:w="12240" w:h="15840"/>
       <w:pgMar w:top="1134" w:right="850" w:bottom="1134" w:left="1701" w:header="720" w:footer="720" w:gutter="0"/>
       <w:cols w:space="720"/>
       <w:docGrid w:linePitch="360"/>
-      <w:pgNumType w:start="1"/>
+      <w:pgNumType w:start="3"/>
     </w:sectPr>
   </w:body>
 </w:document>
@@ -11458,6 +11469,16 @@
 </file>
 
 <file path=word/footer2.xml><?xml version="1.0" encoding="utf-8"?>
+<w:ftr xmlns:m="http://schemas.openxmlformats.org/officeDocument/2006/math" xmlns:mc="http://schemas.openxmlformats.org/markup-compatibility/2006" xmlns:mo="http://schemas.microsoft.com/office/mac/office/2008/main" xmlns:mv="urn:schemas-microsoft-com:mac:vml" xmlns:o="urn:schemas-microsoft-com:office:office" xmlns:r="http://schemas.openxmlformats.org/officeDocument/2006/relationships" xmlns:v="urn:schemas-microsoft-com:vml" xmlns:w10="urn:schemas-microsoft-com:office:word" xmlns:w14="http://schemas.microsoft.com/office/word/2010/wordml" xmlns:w="http://schemas.openxmlformats.org/wordprocessingml/2006/main" xmlns:wne="http://schemas.microsoft.com/office/word/2006/wordml" xmlns:wp14="http://schemas.microsoft.com/office/word/2010/wordprocessingDrawing" xmlns:wp="http://schemas.openxmlformats.org/drawingml/2006/wordprocessingDrawing" xmlns:wpc="http://schemas.microsoft.com/office/word/2010/wordprocessingCanvas" xmlns:wpg="http://schemas.microsoft.com/office/word/2010/wordprocessingGroup" xmlns:wpi="http://schemas.microsoft.com/office/word/2010/wordprocessingInk" xmlns:wps="http://schemas.microsoft.com/office/word/2010/wordprocessingShape" mc:Ignorable="w14 wp14">
+  <w:p>
+    <w:pPr>
+      <w:pStyle w:val="Footer"/>
+    </w:pPr>
+  </w:p>
+</w:ftr>
+</file>
+
+<file path=word/footer3.xml><?xml version="1.0" encoding="utf-8"?>
 <w:ftr xmlns:m="http://schemas.openxmlformats.org/officeDocument/2006/math" xmlns:mc="http://schemas.openxmlformats.org/markup-compatibility/2006" xmlns:mo="http://schemas.microsoft.com/office/mac/office/2008/main" xmlns:mv="urn:schemas-microsoft-com:mac:vml" xmlns:o="urn:schemas-microsoft-com:office:office" xmlns:r="http://schemas.openxmlformats.org/officeDocument/2006/relationships" xmlns:v="urn:schemas-microsoft-com:vml" xmlns:w10="urn:schemas-microsoft-com:office:word" xmlns:w14="http://schemas.microsoft.com/office/word/2010/wordml" xmlns:w="http://schemas.openxmlformats.org/wordprocessingml/2006/main" xmlns:wne="http://schemas.microsoft.com/office/word/2006/wordml" xmlns:wp14="http://schemas.microsoft.com/office/word/2010/wordprocessingDrawing" xmlns:wp="http://schemas.openxmlformats.org/drawingml/2006/wordprocessingDrawing" xmlns:wpc="http://schemas.microsoft.com/office/word/2010/wordprocessingCanvas" xmlns:wpg="http://schemas.microsoft.com/office/word/2010/wordprocessingGroup" xmlns:wpi="http://schemas.microsoft.com/office/word/2010/wordprocessingInk" xmlns:wps="http://schemas.microsoft.com/office/word/2010/wordprocessingShape" mc:Ignorable="w14 wp14">
   <w:p>
     <w:pPr>

</xml_diff>

<commit_message>
Update practice report generation script to adjust starting page number for the body section from 3 to 4. Modify the structure of the practice report DOCX file to enhance layout consistency. Update binary files accordingly.
</commit_message>
<xml_diff>
--- a/build/docx/practice-report-draft-1.docx
+++ b/build/docx/practice-report-draft-1.docx
@@ -2,2054 +2,6 @@
 <file path=word/document.xml><?xml version="1.0" encoding="utf-8"?>
 <w:document xmlns:wpc="http://schemas.microsoft.com/office/word/2010/wordprocessingCanvas" xmlns:mo="http://schemas.microsoft.com/office/mac/office/2008/main" xmlns:mc="http://schemas.openxmlformats.org/markup-compatibility/2006" xmlns:mv="urn:schemas-microsoft-com:mac:vml" xmlns:o="urn:schemas-microsoft-com:office:office" xmlns:r="http://schemas.openxmlformats.org/officeDocument/2006/relationships" xmlns:m="http://schemas.openxmlformats.org/officeDocument/2006/math" xmlns:v="urn:schemas-microsoft-com:vml" xmlns:wp14="http://schemas.microsoft.com/office/word/2010/wordprocessingDrawing" xmlns:wp="http://schemas.openxmlformats.org/drawingml/2006/wordprocessingDrawing" xmlns:w10="urn:schemas-microsoft-com:office:word" xmlns:w="http://schemas.openxmlformats.org/wordprocessingml/2006/main" xmlns:w14="http://schemas.microsoft.com/office/word/2010/wordml" xmlns:wpg="http://schemas.microsoft.com/office/word/2010/wordprocessingGroup" xmlns:wpi="http://schemas.microsoft.com/office/word/2010/wordprocessingInk" xmlns:wne="http://schemas.microsoft.com/office/word/2006/wordml" xmlns:wps="http://schemas.microsoft.com/office/word/2010/wordprocessingShape" mc:Ignorable="w14 wp14">
   <w:body>
-    <w:p>
-      <w:pPr>
-        <w:spacing w:line="276" w:lineRule="auto" w:after="0"/>
-        <w:ind w:firstLine="0"/>
-        <w:jc w:val="center"/>
-      </w:pPr>
-      <w:r>
-        <w:rPr>
-          <w:rFonts w:ascii="Times New Roman" w:hAnsi="Times New Roman" w:eastAsia="Times New Roman"/>
-          <w:b w:val="0"/>
-          <w:i w:val="0"/>
-          <w:sz w:val="22"/>
-        </w:rPr>
-        <w:t>МИНИСТЕРСТВО ОБРАЗОВАНИЯ И НАУКИ РОССИЙСКОЙ ФЕДЕРАЦИИ</w:t>
-      </w:r>
-    </w:p>
-    <w:p>
-      <w:pPr>
-        <w:spacing w:line="276" w:lineRule="auto" w:after="0"/>
-        <w:ind w:firstLine="0"/>
-        <w:jc w:val="center"/>
-      </w:pPr>
-      <w:r>
-        <w:rPr>
-          <w:rFonts w:ascii="Times New Roman" w:hAnsi="Times New Roman" w:eastAsia="Times New Roman"/>
-          <w:b w:val="0"/>
-          <w:i w:val="0"/>
-          <w:sz w:val="20"/>
-        </w:rPr>
-        <w:t>федеральное государственное автономное образовательное учреждение высшего образования</w:t>
-      </w:r>
-    </w:p>
-    <w:p>
-      <w:pPr>
-        <w:spacing w:line="276" w:lineRule="auto" w:after="0"/>
-        <w:ind w:firstLine="0"/>
-        <w:jc w:val="center"/>
-      </w:pPr>
-      <w:r>
-        <w:rPr>
-          <w:rFonts w:ascii="Times New Roman" w:hAnsi="Times New Roman" w:eastAsia="Times New Roman"/>
-          <w:b w:val="0"/>
-          <w:i w:val="0"/>
-          <w:sz w:val="22"/>
-        </w:rPr>
-        <w:t>«Санкт–Петербургский государственный университет</w:t>
-      </w:r>
-    </w:p>
-    <w:p>
-      <w:pPr>
-        <w:spacing w:line="276" w:lineRule="auto" w:after="320"/>
-        <w:ind w:firstLine="0"/>
-        <w:jc w:val="center"/>
-      </w:pPr>
-      <w:r>
-        <w:rPr>
-          <w:rFonts w:ascii="Times New Roman" w:hAnsi="Times New Roman" w:eastAsia="Times New Roman"/>
-          <w:b w:val="0"/>
-          <w:i w:val="0"/>
-          <w:sz w:val="22"/>
-        </w:rPr>
-        <w:t>аэрокосмического приборостроения»</w:t>
-      </w:r>
-    </w:p>
-    <w:p>
-      <w:pPr>
-        <w:spacing w:line="276" w:lineRule="auto" w:after="320"/>
-        <w:ind w:firstLine="0"/>
-        <w:jc w:val="center"/>
-      </w:pPr>
-      <w:r>
-        <w:rPr>
-          <w:rFonts w:ascii="Times New Roman" w:hAnsi="Times New Roman" w:eastAsia="Times New Roman"/>
-          <w:b w:val="0"/>
-          <w:i w:val="0"/>
-          <w:sz w:val="22"/>
-        </w:rPr>
-        <w:t>Кафедра №43 «Компьютерных технологий и программной инженерии»</w:t>
-      </w:r>
-    </w:p>
-    <w:p>
-      <w:pPr>
-        <w:spacing w:line="276" w:lineRule="auto" w:after="0"/>
-        <w:ind w:firstLine="0"/>
-        <w:jc w:val="left"/>
-      </w:pPr>
-      <w:r>
-        <w:rPr>
-          <w:rFonts w:ascii="Times New Roman" w:hAnsi="Times New Roman" w:eastAsia="Times New Roman"/>
-          <w:b/>
-          <w:i w:val="0"/>
-          <w:sz w:val="24"/>
-        </w:rPr>
-        <w:t>ОТЧЁТ ПО ПРАКТИКЕ</w:t>
-      </w:r>
-    </w:p>
-    <w:p>
-      <w:pPr>
-        <w:spacing w:line="276" w:lineRule="auto" w:after="0"/>
-        <w:ind w:firstLine="0"/>
-        <w:jc w:val="left"/>
-      </w:pPr>
-      <w:r>
-        <w:rPr>
-          <w:rFonts w:ascii="Times New Roman" w:hAnsi="Times New Roman" w:eastAsia="Times New Roman"/>
-          <w:b w:val="0"/>
-          <w:i w:val="0"/>
-          <w:sz w:val="24"/>
-        </w:rPr>
-        <w:t>ЗАЩИЩЁН С ОЦЕНКОЙ</w:t>
-      </w:r>
-    </w:p>
-    <w:p>
-      <w:pPr>
-        <w:spacing w:line="276" w:lineRule="auto" w:after="40"/>
-        <w:ind w:firstLine="0"/>
-        <w:jc w:val="left"/>
-      </w:pPr>
-      <w:r>
-        <w:rPr>
-          <w:rFonts w:ascii="Times New Roman" w:hAnsi="Times New Roman" w:eastAsia="Times New Roman"/>
-          <w:b w:val="0"/>
-          <w:i w:val="0"/>
-          <w:sz w:val="24"/>
-        </w:rPr>
-        <w:t>РУКОВОДИТЕЛЬ</w:t>
-      </w:r>
-    </w:p>
-    <w:tbl>
-      <w:tblPr>
-        <w:tblW w:type="auto" w:w="0"/>
-        <w:tblLook w:firstColumn="1" w:firstRow="1" w:lastColumn="0" w:lastRow="0" w:noHBand="0" w:noVBand="1" w:val="04A0"/>
-      </w:tblPr>
-      <w:tblGrid>
-        <w:gridCol w:w="3230"/>
-        <w:gridCol w:w="3230"/>
-        <w:gridCol w:w="3230"/>
-      </w:tblGrid>
-      <w:tr>
-        <w:tc>
-          <w:tcPr>
-            <w:tcW w:type="dxa" w:w="3175"/>
-            <w:tcBorders>
-              <w:top w:val="nil"/>
-              <w:left w:val="nil"/>
-              <w:bottom w:val="single" w:sz="6" w:space="0" w:color="000000"/>
-              <w:right w:val="nil"/>
-              <w:insideH w:val="nil"/>
-              <w:insideV w:val="nil"/>
-            </w:tcBorders>
-            <w:tcMar>
-              <w:top w:w="0" w:type="dxa"/>
-              <w:left w:w="0" w:type="dxa"/>
-              <w:bottom w:w="0" w:type="dxa"/>
-              <w:right w:w="0" w:type="dxa"/>
-            </w:tcMar>
-            <w:vAlign w:val="center"/>
-          </w:tcPr>
-          <w:p>
-            <w:pPr>
-              <w:spacing w:line="240" w:lineRule="auto" w:before="0" w:after="0"/>
-              <w:ind w:firstLine="0"/>
-              <w:jc w:val="center"/>
-            </w:pPr>
-            <w:r/>
-            <w:r>
-              <w:rPr>
-                <w:rFonts w:ascii="Times New Roman" w:hAnsi="Times New Roman" w:eastAsia="Times New Roman"/>
-                <w:b w:val="0"/>
-                <w:i w:val="0"/>
-                <w:sz w:val="22"/>
-              </w:rPr>
-              <w:t>Ст. преподаватель</w:t>
-            </w:r>
-          </w:p>
-        </w:tc>
-        <w:tc>
-          <w:tcPr>
-            <w:tcW w:type="dxa" w:w="2154"/>
-            <w:tcBorders>
-              <w:top w:val="nil"/>
-              <w:left w:val="nil"/>
-              <w:bottom w:val="single" w:sz="6" w:space="0" w:color="000000"/>
-              <w:right w:val="nil"/>
-              <w:insideH w:val="nil"/>
-              <w:insideV w:val="nil"/>
-            </w:tcBorders>
-            <w:tcMar>
-              <w:top w:w="0" w:type="dxa"/>
-              <w:left w:w="0" w:type="dxa"/>
-              <w:bottom w:w="0" w:type="dxa"/>
-              <w:right w:w="0" w:type="dxa"/>
-            </w:tcMar>
-            <w:vAlign w:val="center"/>
-          </w:tcPr>
-          <w:p>
-            <w:pPr>
-              <w:spacing w:line="240" w:lineRule="auto" w:before="0" w:after="0"/>
-              <w:ind w:firstLine="0"/>
-              <w:jc w:val="center"/>
-            </w:pPr>
-            <w:r/>
-          </w:p>
-        </w:tc>
-        <w:tc>
-          <w:tcPr>
-            <w:tcW w:type="dxa" w:w="2721"/>
-            <w:tcBorders>
-              <w:top w:val="nil"/>
-              <w:left w:val="nil"/>
-              <w:bottom w:val="single" w:sz="6" w:space="0" w:color="000000"/>
-              <w:right w:val="nil"/>
-              <w:insideH w:val="nil"/>
-              <w:insideV w:val="nil"/>
-            </w:tcBorders>
-            <w:tcMar>
-              <w:top w:w="0" w:type="dxa"/>
-              <w:left w:w="0" w:type="dxa"/>
-              <w:bottom w:w="0" w:type="dxa"/>
-              <w:right w:w="0" w:type="dxa"/>
-            </w:tcMar>
-            <w:vAlign w:val="center"/>
-          </w:tcPr>
-          <w:p>
-            <w:pPr>
-              <w:spacing w:line="240" w:lineRule="auto" w:before="0" w:after="0"/>
-              <w:ind w:firstLine="0"/>
-              <w:jc w:val="center"/>
-            </w:pPr>
-            <w:r/>
-            <w:r>
-              <w:rPr>
-                <w:rFonts w:ascii="Times New Roman" w:hAnsi="Times New Roman" w:eastAsia="Times New Roman"/>
-                <w:b w:val="0"/>
-                <w:i w:val="0"/>
-                <w:sz w:val="22"/>
-              </w:rPr>
-              <w:t>С.А. Рогачев</w:t>
-            </w:r>
-          </w:p>
-        </w:tc>
-      </w:tr>
-      <w:tr>
-        <w:tc>
-          <w:tcPr>
-            <w:tcW w:type="dxa" w:w="3175"/>
-            <w:tcBorders>
-              <w:top w:val="nil"/>
-              <w:left w:val="nil"/>
-              <w:bottom w:val="nil"/>
-              <w:right w:val="nil"/>
-              <w:insideH w:val="nil"/>
-              <w:insideV w:val="nil"/>
-            </w:tcBorders>
-            <w:tcMar>
-              <w:top w:w="0" w:type="dxa"/>
-              <w:left w:w="0" w:type="dxa"/>
-              <w:bottom w:w="0" w:type="dxa"/>
-              <w:right w:w="0" w:type="dxa"/>
-            </w:tcMar>
-            <w:vAlign w:val="center"/>
-          </w:tcPr>
-          <w:p>
-            <w:pPr>
-              <w:spacing w:line="240" w:lineRule="auto" w:before="0" w:after="0"/>
-              <w:ind w:firstLine="0"/>
-              <w:jc w:val="center"/>
-            </w:pPr>
-            <w:r/>
-            <w:r>
-              <w:rPr>
-                <w:rFonts w:ascii="Times New Roman" w:hAnsi="Times New Roman" w:eastAsia="Times New Roman"/>
-                <w:b w:val="0"/>
-                <w:i w:val="0"/>
-                <w:sz w:val="14"/>
-              </w:rPr>
-              <w:t>должность, уч. степень, звание</w:t>
-            </w:r>
-          </w:p>
-        </w:tc>
-        <w:tc>
-          <w:tcPr>
-            <w:tcW w:type="dxa" w:w="2154"/>
-            <w:tcBorders>
-              <w:top w:val="nil"/>
-              <w:left w:val="nil"/>
-              <w:bottom w:val="nil"/>
-              <w:right w:val="nil"/>
-              <w:insideH w:val="nil"/>
-              <w:insideV w:val="nil"/>
-            </w:tcBorders>
-            <w:tcMar>
-              <w:top w:w="0" w:type="dxa"/>
-              <w:left w:w="0" w:type="dxa"/>
-              <w:bottom w:w="0" w:type="dxa"/>
-              <w:right w:w="0" w:type="dxa"/>
-            </w:tcMar>
-            <w:vAlign w:val="center"/>
-          </w:tcPr>
-          <w:p>
-            <w:pPr>
-              <w:spacing w:line="240" w:lineRule="auto" w:before="0" w:after="0"/>
-              <w:ind w:firstLine="0"/>
-              <w:jc w:val="center"/>
-            </w:pPr>
-            <w:r/>
-            <w:r>
-              <w:rPr>
-                <w:rFonts w:ascii="Times New Roman" w:hAnsi="Times New Roman" w:eastAsia="Times New Roman"/>
-                <w:b w:val="0"/>
-                <w:i w:val="0"/>
-                <w:sz w:val="14"/>
-              </w:rPr>
-              <w:t>подпись, дата</w:t>
-            </w:r>
-          </w:p>
-        </w:tc>
-        <w:tc>
-          <w:tcPr>
-            <w:tcW w:type="dxa" w:w="2721"/>
-            <w:tcBorders>
-              <w:top w:val="nil"/>
-              <w:left w:val="nil"/>
-              <w:bottom w:val="nil"/>
-              <w:right w:val="nil"/>
-              <w:insideH w:val="nil"/>
-              <w:insideV w:val="nil"/>
-            </w:tcBorders>
-            <w:tcMar>
-              <w:top w:w="0" w:type="dxa"/>
-              <w:left w:w="0" w:type="dxa"/>
-              <w:bottom w:w="0" w:type="dxa"/>
-              <w:right w:w="0" w:type="dxa"/>
-            </w:tcMar>
-            <w:vAlign w:val="center"/>
-          </w:tcPr>
-          <w:p>
-            <w:pPr>
-              <w:spacing w:line="240" w:lineRule="auto" w:before="0" w:after="0"/>
-              <w:ind w:firstLine="0"/>
-              <w:jc w:val="center"/>
-            </w:pPr>
-            <w:r/>
-            <w:r>
-              <w:rPr>
-                <w:rFonts w:ascii="Times New Roman" w:hAnsi="Times New Roman" w:eastAsia="Times New Roman"/>
-                <w:b w:val="0"/>
-                <w:i w:val="0"/>
-                <w:sz w:val="14"/>
-              </w:rPr>
-              <w:t>инициалы, фамилия</w:t>
-            </w:r>
-          </w:p>
-        </w:tc>
-      </w:tr>
-    </w:tbl>
-    <w:p>
-      <w:pPr>
-        <w:spacing w:line="240" w:lineRule="auto" w:before="0" w:after="240"/>
-        <w:ind w:firstLine="0"/>
-      </w:pPr>
-    </w:p>
-    <w:p>
-      <w:pPr>
-        <w:spacing w:line="276" w:lineRule="auto" w:after="80"/>
-        <w:ind w:firstLine="0"/>
-        <w:jc w:val="center"/>
-      </w:pPr>
-      <w:r>
-        <w:rPr>
-          <w:rFonts w:ascii="Times New Roman" w:hAnsi="Times New Roman" w:eastAsia="Times New Roman"/>
-          <w:b/>
-          <w:i w:val="0"/>
-          <w:sz w:val="28"/>
-        </w:rPr>
-        <w:t>ОТЧЁТ ПО ПРАКТИКЕ</w:t>
-      </w:r>
-    </w:p>
-    <w:tbl>
-      <w:tblPr>
-        <w:tblW w:type="auto" w:w="0"/>
-        <w:tblLook w:firstColumn="1" w:firstRow="1" w:lastColumn="0" w:lastRow="0" w:noHBand="0" w:noVBand="1" w:val="04A0"/>
-      </w:tblPr>
-      <w:tblGrid>
-        <w:gridCol w:w="3230"/>
-        <w:gridCol w:w="3230"/>
-        <w:gridCol w:w="3230"/>
-      </w:tblGrid>
-      <w:tr>
-        <w:tc>
-          <w:tcPr>
-            <w:tcW w:type="dxa" w:w="2948"/>
-            <w:tcBorders>
-              <w:top w:val="nil"/>
-              <w:left w:val="nil"/>
-              <w:bottom w:val="nil"/>
-              <w:right w:val="nil"/>
-              <w:insideH w:val="nil"/>
-              <w:insideV w:val="nil"/>
-            </w:tcBorders>
-            <w:tcMar>
-              <w:top w:w="0" w:type="dxa"/>
-              <w:left w:w="0" w:type="dxa"/>
-              <w:bottom w:w="0" w:type="dxa"/>
-              <w:right w:w="0" w:type="dxa"/>
-            </w:tcMar>
-            <w:vAlign w:val="center"/>
-          </w:tcPr>
-          <w:p>
-            <w:pPr>
-              <w:spacing w:line="240" w:lineRule="auto" w:before="0" w:after="0"/>
-              <w:ind w:firstLine="0"/>
-              <w:jc w:val="center"/>
-            </w:pPr>
-            <w:r/>
-            <w:r>
-              <w:rPr>
-                <w:rFonts w:ascii="Times New Roman" w:hAnsi="Times New Roman" w:eastAsia="Times New Roman"/>
-                <w:b w:val="0"/>
-                <w:i w:val="0"/>
-                <w:sz w:val="20"/>
-              </w:rPr>
-              <w:t>вид практики</w:t>
-            </w:r>
-          </w:p>
-        </w:tc>
-        <w:tc>
-          <w:tcPr>
-            <w:tcW w:type="dxa" w:w="2948"/>
-            <w:tcBorders>
-              <w:top w:val="nil"/>
-              <w:left w:val="nil"/>
-              <w:bottom w:val="single" w:sz="6" w:space="0" w:color="000000"/>
-              <w:right w:val="nil"/>
-              <w:insideH w:val="nil"/>
-              <w:insideV w:val="nil"/>
-            </w:tcBorders>
-            <w:tcMar>
-              <w:top w:w="0" w:type="dxa"/>
-              <w:left w:w="0" w:type="dxa"/>
-              <w:bottom w:w="0" w:type="dxa"/>
-              <w:right w:w="0" w:type="dxa"/>
-            </w:tcMar>
-            <w:vAlign w:val="center"/>
-          </w:tcPr>
-          <w:p>
-            <w:pPr>
-              <w:spacing w:line="240" w:lineRule="auto" w:before="0" w:after="0"/>
-              <w:ind w:firstLine="0"/>
-              <w:jc w:val="center"/>
-            </w:pPr>
-            <w:r/>
-            <w:r>
-              <w:rPr>
-                <w:rFonts w:ascii="Times New Roman" w:hAnsi="Times New Roman" w:eastAsia="Times New Roman"/>
-                <w:b w:val="0"/>
-                <w:i w:val="0"/>
-                <w:sz w:val="20"/>
-              </w:rPr>
-              <w:t>производственная</w:t>
-            </w:r>
-          </w:p>
-        </w:tc>
-        <w:tc>
-          <w:tcPr>
-            <w:tcW w:type="dxa" w:w="2948"/>
-            <w:tcBorders>
-              <w:top w:val="nil"/>
-              <w:left w:val="nil"/>
-              <w:bottom w:val="single" w:sz="6" w:space="0" w:color="000000"/>
-              <w:right w:val="nil"/>
-              <w:insideH w:val="nil"/>
-              <w:insideV w:val="nil"/>
-            </w:tcBorders>
-            <w:tcMar>
-              <w:top w:w="0" w:type="dxa"/>
-              <w:left w:w="0" w:type="dxa"/>
-              <w:bottom w:w="0" w:type="dxa"/>
-              <w:right w:w="0" w:type="dxa"/>
-            </w:tcMar>
-            <w:vAlign w:val="center"/>
-          </w:tcPr>
-          <w:p>
-            <w:pPr>
-              <w:spacing w:line="240" w:lineRule="auto" w:before="0" w:after="0"/>
-              <w:ind w:firstLine="0"/>
-              <w:jc w:val="center"/>
-            </w:pPr>
-            <w:r/>
-          </w:p>
-        </w:tc>
-      </w:tr>
-      <w:tr>
-        <w:tc>
-          <w:tcPr>
-            <w:tcW w:type="dxa" w:w="2948"/>
-            <w:tcBorders>
-              <w:top w:val="nil"/>
-              <w:left w:val="nil"/>
-              <w:bottom w:val="nil"/>
-              <w:right w:val="nil"/>
-              <w:insideH w:val="nil"/>
-              <w:insideV w:val="nil"/>
-            </w:tcBorders>
-            <w:tcMar>
-              <w:top w:w="0" w:type="dxa"/>
-              <w:left w:w="0" w:type="dxa"/>
-              <w:bottom w:w="0" w:type="dxa"/>
-              <w:right w:w="0" w:type="dxa"/>
-            </w:tcMar>
-            <w:vAlign w:val="center"/>
-          </w:tcPr>
-          <w:p>
-            <w:pPr>
-              <w:spacing w:line="240" w:lineRule="auto" w:before="0" w:after="0"/>
-              <w:ind w:firstLine="0"/>
-              <w:jc w:val="center"/>
-            </w:pPr>
-            <w:r/>
-          </w:p>
-        </w:tc>
-        <w:tc>
-          <w:tcPr>
-            <w:tcW w:type="dxa" w:w="2948"/>
-            <w:tcBorders>
-              <w:top w:val="nil"/>
-              <w:left w:val="nil"/>
-              <w:bottom w:val="nil"/>
-              <w:right w:val="nil"/>
-              <w:insideH w:val="nil"/>
-              <w:insideV w:val="nil"/>
-            </w:tcBorders>
-            <w:tcMar>
-              <w:top w:w="0" w:type="dxa"/>
-              <w:left w:w="0" w:type="dxa"/>
-              <w:bottom w:w="0" w:type="dxa"/>
-              <w:right w:w="0" w:type="dxa"/>
-            </w:tcMar>
-            <w:vAlign w:val="center"/>
-          </w:tcPr>
-          <w:p>
-            <w:pPr>
-              <w:spacing w:line="240" w:lineRule="auto" w:before="0" w:after="0"/>
-              <w:ind w:firstLine="0"/>
-              <w:jc w:val="center"/>
-            </w:pPr>
-            <w:r/>
-            <w:r>
-              <w:rPr>
-                <w:rFonts w:ascii="Times New Roman" w:hAnsi="Times New Roman" w:eastAsia="Times New Roman"/>
-                <w:b w:val="0"/>
-                <w:i w:val="0"/>
-                <w:sz w:val="14"/>
-              </w:rPr>
-              <w:t>вид практики</w:t>
-            </w:r>
-          </w:p>
-        </w:tc>
-        <w:tc>
-          <w:tcPr>
-            <w:tcW w:type="dxa" w:w="2948"/>
-            <w:tcBorders>
-              <w:top w:val="nil"/>
-              <w:left w:val="nil"/>
-              <w:bottom w:val="nil"/>
-              <w:right w:val="nil"/>
-              <w:insideH w:val="nil"/>
-              <w:insideV w:val="nil"/>
-            </w:tcBorders>
-            <w:tcMar>
-              <w:top w:w="0" w:type="dxa"/>
-              <w:left w:w="0" w:type="dxa"/>
-              <w:bottom w:w="0" w:type="dxa"/>
-              <w:right w:w="0" w:type="dxa"/>
-            </w:tcMar>
-            <w:vAlign w:val="center"/>
-          </w:tcPr>
-          <w:p>
-            <w:pPr>
-              <w:spacing w:line="240" w:lineRule="auto" w:before="0" w:after="0"/>
-              <w:ind w:firstLine="0"/>
-              <w:jc w:val="center"/>
-            </w:pPr>
-            <w:r/>
-          </w:p>
-        </w:tc>
-      </w:tr>
-      <w:tr>
-        <w:tc>
-          <w:tcPr>
-            <w:tcW w:type="dxa" w:w="2948"/>
-            <w:tcBorders>
-              <w:top w:val="nil"/>
-              <w:left w:val="nil"/>
-              <w:bottom w:val="nil"/>
-              <w:right w:val="nil"/>
-              <w:insideH w:val="nil"/>
-              <w:insideV w:val="nil"/>
-            </w:tcBorders>
-            <w:tcMar>
-              <w:top w:w="0" w:type="dxa"/>
-              <w:left w:w="0" w:type="dxa"/>
-              <w:bottom w:w="0" w:type="dxa"/>
-              <w:right w:w="0" w:type="dxa"/>
-            </w:tcMar>
-            <w:vAlign w:val="center"/>
-          </w:tcPr>
-          <w:p>
-            <w:pPr>
-              <w:spacing w:line="240" w:lineRule="auto" w:before="0" w:after="0"/>
-              <w:ind w:firstLine="0"/>
-              <w:jc w:val="center"/>
-            </w:pPr>
-            <w:r/>
-            <w:r>
-              <w:rPr>
-                <w:rFonts w:ascii="Times New Roman" w:hAnsi="Times New Roman" w:eastAsia="Times New Roman"/>
-                <w:b w:val="0"/>
-                <w:i w:val="0"/>
-                <w:sz w:val="20"/>
-              </w:rPr>
-              <w:t>тип практики</w:t>
-            </w:r>
-          </w:p>
-        </w:tc>
-        <w:tc>
-          <w:tcPr>
-            <w:tcW w:type="dxa" w:w="2948"/>
-            <w:tcBorders>
-              <w:top w:val="nil"/>
-              <w:left w:val="nil"/>
-              <w:bottom w:val="single" w:sz="6" w:space="0" w:color="000000"/>
-              <w:right w:val="nil"/>
-              <w:insideH w:val="nil"/>
-              <w:insideV w:val="nil"/>
-            </w:tcBorders>
-            <w:tcMar>
-              <w:top w:w="0" w:type="dxa"/>
-              <w:left w:w="0" w:type="dxa"/>
-              <w:bottom w:w="0" w:type="dxa"/>
-              <w:right w:w="0" w:type="dxa"/>
-            </w:tcMar>
-            <w:vAlign w:val="center"/>
-          </w:tcPr>
-          <w:p>
-            <w:pPr>
-              <w:spacing w:line="240" w:lineRule="auto" w:before="0" w:after="0"/>
-              <w:ind w:firstLine="0"/>
-              <w:jc w:val="center"/>
-            </w:pPr>
-            <w:r/>
-            <w:r>
-              <w:rPr>
-                <w:rFonts w:ascii="Times New Roman" w:hAnsi="Times New Roman" w:eastAsia="Times New Roman"/>
-                <w:b w:val="0"/>
-                <w:i w:val="0"/>
-                <w:sz w:val="20"/>
-              </w:rPr>
-              <w:t>преддипломная</w:t>
-            </w:r>
-          </w:p>
-        </w:tc>
-        <w:tc>
-          <w:tcPr>
-            <w:tcW w:type="dxa" w:w="2948"/>
-            <w:tcBorders>
-              <w:top w:val="nil"/>
-              <w:left w:val="nil"/>
-              <w:bottom w:val="single" w:sz="6" w:space="0" w:color="000000"/>
-              <w:right w:val="nil"/>
-              <w:insideH w:val="nil"/>
-              <w:insideV w:val="nil"/>
-            </w:tcBorders>
-            <w:tcMar>
-              <w:top w:w="0" w:type="dxa"/>
-              <w:left w:w="0" w:type="dxa"/>
-              <w:bottom w:w="0" w:type="dxa"/>
-              <w:right w:w="0" w:type="dxa"/>
-            </w:tcMar>
-            <w:vAlign w:val="center"/>
-          </w:tcPr>
-          <w:p>
-            <w:pPr>
-              <w:spacing w:line="240" w:lineRule="auto" w:before="0" w:after="0"/>
-              <w:ind w:firstLine="0"/>
-              <w:jc w:val="center"/>
-            </w:pPr>
-            <w:r/>
-          </w:p>
-        </w:tc>
-      </w:tr>
-      <w:tr>
-        <w:tc>
-          <w:tcPr>
-            <w:tcW w:type="dxa" w:w="2948"/>
-            <w:tcBorders>
-              <w:top w:val="nil"/>
-              <w:left w:val="nil"/>
-              <w:bottom w:val="nil"/>
-              <w:right w:val="nil"/>
-              <w:insideH w:val="nil"/>
-              <w:insideV w:val="nil"/>
-            </w:tcBorders>
-            <w:tcMar>
-              <w:top w:w="0" w:type="dxa"/>
-              <w:left w:w="0" w:type="dxa"/>
-              <w:bottom w:w="0" w:type="dxa"/>
-              <w:right w:w="0" w:type="dxa"/>
-            </w:tcMar>
-            <w:vAlign w:val="center"/>
-          </w:tcPr>
-          <w:p>
-            <w:pPr>
-              <w:spacing w:line="240" w:lineRule="auto" w:before="0" w:after="0"/>
-              <w:ind w:firstLine="0"/>
-              <w:jc w:val="center"/>
-            </w:pPr>
-            <w:r/>
-          </w:p>
-        </w:tc>
-        <w:tc>
-          <w:tcPr>
-            <w:tcW w:type="dxa" w:w="2948"/>
-            <w:tcBorders>
-              <w:top w:val="nil"/>
-              <w:left w:val="nil"/>
-              <w:bottom w:val="nil"/>
-              <w:right w:val="nil"/>
-              <w:insideH w:val="nil"/>
-              <w:insideV w:val="nil"/>
-            </w:tcBorders>
-            <w:tcMar>
-              <w:top w:w="0" w:type="dxa"/>
-              <w:left w:w="0" w:type="dxa"/>
-              <w:bottom w:w="0" w:type="dxa"/>
-              <w:right w:w="0" w:type="dxa"/>
-            </w:tcMar>
-            <w:vAlign w:val="center"/>
-          </w:tcPr>
-          <w:p>
-            <w:pPr>
-              <w:spacing w:line="240" w:lineRule="auto" w:before="0" w:after="0"/>
-              <w:ind w:firstLine="0"/>
-              <w:jc w:val="center"/>
-            </w:pPr>
-            <w:r/>
-            <w:r>
-              <w:rPr>
-                <w:rFonts w:ascii="Times New Roman" w:hAnsi="Times New Roman" w:eastAsia="Times New Roman"/>
-                <w:b w:val="0"/>
-                <w:i w:val="0"/>
-                <w:sz w:val="14"/>
-              </w:rPr>
-              <w:t>тип практики</w:t>
-            </w:r>
-          </w:p>
-        </w:tc>
-        <w:tc>
-          <w:tcPr>
-            <w:tcW w:type="dxa" w:w="2948"/>
-            <w:tcBorders>
-              <w:top w:val="nil"/>
-              <w:left w:val="nil"/>
-              <w:bottom w:val="nil"/>
-              <w:right w:val="nil"/>
-              <w:insideH w:val="nil"/>
-              <w:insideV w:val="nil"/>
-            </w:tcBorders>
-            <w:tcMar>
-              <w:top w:w="0" w:type="dxa"/>
-              <w:left w:w="0" w:type="dxa"/>
-              <w:bottom w:w="0" w:type="dxa"/>
-              <w:right w:w="0" w:type="dxa"/>
-            </w:tcMar>
-            <w:vAlign w:val="center"/>
-          </w:tcPr>
-          <w:p>
-            <w:pPr>
-              <w:spacing w:line="240" w:lineRule="auto" w:before="0" w:after="0"/>
-              <w:ind w:firstLine="0"/>
-              <w:jc w:val="center"/>
-            </w:pPr>
-            <w:r/>
-          </w:p>
-        </w:tc>
-      </w:tr>
-      <w:tr>
-        <w:tc>
-          <w:tcPr>
-            <w:tcW w:type="dxa" w:w="2948"/>
-            <w:tcBorders>
-              <w:top w:val="nil"/>
-              <w:left w:val="nil"/>
-              <w:bottom w:val="nil"/>
-              <w:right w:val="nil"/>
-              <w:insideH w:val="nil"/>
-              <w:insideV w:val="nil"/>
-            </w:tcBorders>
-            <w:tcMar>
-              <w:top w:w="0" w:type="dxa"/>
-              <w:left w:w="0" w:type="dxa"/>
-              <w:bottom w:w="0" w:type="dxa"/>
-              <w:right w:w="0" w:type="dxa"/>
-            </w:tcMar>
-            <w:vAlign w:val="center"/>
-          </w:tcPr>
-          <w:p>
-            <w:pPr>
-              <w:spacing w:line="240" w:lineRule="auto" w:before="0" w:after="0"/>
-              <w:ind w:firstLine="0"/>
-              <w:jc w:val="center"/>
-            </w:pPr>
-            <w:r/>
-            <w:r>
-              <w:rPr>
-                <w:rFonts w:ascii="Times New Roman" w:hAnsi="Times New Roman" w:eastAsia="Times New Roman"/>
-                <w:b w:val="0"/>
-                <w:i w:val="0"/>
-                <w:sz w:val="20"/>
-              </w:rPr>
-              <w:t>на тему индивидуального задания</w:t>
-            </w:r>
-          </w:p>
-        </w:tc>
-        <w:tc>
-          <w:tcPr>
-            <w:tcW w:type="dxa" w:w="5896"/>
-            <w:gridSpan w:val="2"/>
-            <w:tcBorders>
-              <w:top w:val="nil"/>
-              <w:left w:val="nil"/>
-              <w:bottom w:val="single" w:sz="6" w:space="0" w:color="000000"/>
-              <w:right w:val="nil"/>
-              <w:insideH w:val="nil"/>
-              <w:insideV w:val="nil"/>
-            </w:tcBorders>
-            <w:tcMar>
-              <w:top w:w="0" w:type="dxa"/>
-              <w:left w:w="0" w:type="dxa"/>
-              <w:bottom w:w="0" w:type="dxa"/>
-              <w:right w:w="0" w:type="dxa"/>
-            </w:tcMar>
-            <w:vAlign w:val="center"/>
-          </w:tcPr>
-          <w:p>
-            <w:pPr>
-              <w:spacing w:line="240" w:lineRule="auto" w:before="0" w:after="0"/>
-              <w:ind w:firstLine="0"/>
-              <w:jc w:val="center"/>
-            </w:pPr>
-            <w:r/>
-            <w:r>
-              <w:rPr>
-                <w:rFonts w:ascii="Times New Roman" w:hAnsi="Times New Roman" w:eastAsia="Times New Roman"/>
-                <w:b w:val="0"/>
-                <w:i w:val="0"/>
-                <w:sz w:val="20"/>
-              </w:rPr>
-              <w:t>Разработка real-time интерфейса с поддержкой горизонтального масштабирования WebSocket-соединений для системы отслеживания задач</w:t>
-            </w:r>
-          </w:p>
-        </w:tc>
-      </w:tr>
-      <w:tr>
-        <w:tc>
-          <w:tcPr>
-            <w:tcW w:type="dxa" w:w="2948"/>
-            <w:tcBorders>
-              <w:top w:val="nil"/>
-              <w:left w:val="nil"/>
-              <w:bottom w:val="nil"/>
-              <w:right w:val="nil"/>
-              <w:insideH w:val="nil"/>
-              <w:insideV w:val="nil"/>
-            </w:tcBorders>
-            <w:tcMar>
-              <w:top w:w="0" w:type="dxa"/>
-              <w:left w:w="0" w:type="dxa"/>
-              <w:bottom w:w="0" w:type="dxa"/>
-              <w:right w:w="0" w:type="dxa"/>
-            </w:tcMar>
-            <w:vAlign w:val="center"/>
-          </w:tcPr>
-          <w:p>
-            <w:pPr>
-              <w:spacing w:line="240" w:lineRule="auto" w:before="0" w:after="0"/>
-              <w:ind w:firstLine="0"/>
-              <w:jc w:val="center"/>
-            </w:pPr>
-            <w:r/>
-          </w:p>
-        </w:tc>
-        <w:tc>
-          <w:tcPr>
-            <w:tcW w:type="dxa" w:w="2948"/>
-            <w:tcBorders>
-              <w:top w:val="nil"/>
-              <w:left w:val="nil"/>
-              <w:bottom w:val="nil"/>
-              <w:right w:val="nil"/>
-              <w:insideH w:val="nil"/>
-              <w:insideV w:val="nil"/>
-            </w:tcBorders>
-            <w:tcMar>
-              <w:top w:w="0" w:type="dxa"/>
-              <w:left w:w="0" w:type="dxa"/>
-              <w:bottom w:w="0" w:type="dxa"/>
-              <w:right w:w="0" w:type="dxa"/>
-            </w:tcMar>
-            <w:vAlign w:val="center"/>
-          </w:tcPr>
-          <w:p>
-            <w:pPr>
-              <w:spacing w:line="240" w:lineRule="auto" w:before="0" w:after="0"/>
-              <w:ind w:firstLine="0"/>
-              <w:jc w:val="center"/>
-            </w:pPr>
-            <w:r/>
-            <w:r>
-              <w:rPr>
-                <w:rFonts w:ascii="Times New Roman" w:hAnsi="Times New Roman" w:eastAsia="Times New Roman"/>
-                <w:b w:val="0"/>
-                <w:i w:val="0"/>
-                <w:sz w:val="14"/>
-              </w:rPr>
-              <w:t>на тему индивидуального задания</w:t>
-            </w:r>
-          </w:p>
-        </w:tc>
-        <w:tc>
-          <w:tcPr>
-            <w:tcW w:type="dxa" w:w="2948"/>
-            <w:tcBorders>
-              <w:top w:val="nil"/>
-              <w:left w:val="nil"/>
-              <w:bottom w:val="nil"/>
-              <w:right w:val="nil"/>
-              <w:insideH w:val="nil"/>
-              <w:insideV w:val="nil"/>
-            </w:tcBorders>
-            <w:tcMar>
-              <w:top w:w="0" w:type="dxa"/>
-              <w:left w:w="0" w:type="dxa"/>
-              <w:bottom w:w="0" w:type="dxa"/>
-              <w:right w:w="0" w:type="dxa"/>
-            </w:tcMar>
-            <w:vAlign w:val="center"/>
-          </w:tcPr>
-          <w:p>
-            <w:pPr>
-              <w:spacing w:line="240" w:lineRule="auto" w:before="0" w:after="0"/>
-              <w:ind w:firstLine="0"/>
-              <w:jc w:val="center"/>
-            </w:pPr>
-            <w:r/>
-          </w:p>
-        </w:tc>
-      </w:tr>
-      <w:tr>
-        <w:tc>
-          <w:tcPr>
-            <w:tcW w:type="dxa" w:w="2948"/>
-            <w:tcBorders>
-              <w:top w:val="nil"/>
-              <w:left w:val="nil"/>
-              <w:bottom w:val="nil"/>
-              <w:right w:val="nil"/>
-              <w:insideH w:val="nil"/>
-              <w:insideV w:val="nil"/>
-            </w:tcBorders>
-            <w:tcMar>
-              <w:top w:w="0" w:type="dxa"/>
-              <w:left w:w="0" w:type="dxa"/>
-              <w:bottom w:w="0" w:type="dxa"/>
-              <w:right w:w="0" w:type="dxa"/>
-            </w:tcMar>
-            <w:vAlign w:val="center"/>
-          </w:tcPr>
-          <w:p>
-            <w:pPr>
-              <w:spacing w:line="240" w:lineRule="auto" w:before="0" w:after="0"/>
-              <w:ind w:firstLine="0"/>
-              <w:jc w:val="center"/>
-            </w:pPr>
-            <w:r/>
-            <w:r>
-              <w:rPr>
-                <w:rFonts w:ascii="Times New Roman" w:hAnsi="Times New Roman" w:eastAsia="Times New Roman"/>
-                <w:b w:val="0"/>
-                <w:i w:val="0"/>
-                <w:sz w:val="20"/>
-              </w:rPr>
-              <w:t>выполнен</w:t>
-            </w:r>
-          </w:p>
-        </w:tc>
-        <w:tc>
-          <w:tcPr>
-            <w:tcW w:type="dxa" w:w="2948"/>
-            <w:tcBorders>
-              <w:top w:val="nil"/>
-              <w:left w:val="nil"/>
-              <w:bottom w:val="single" w:sz="6" w:space="0" w:color="000000"/>
-              <w:right w:val="nil"/>
-              <w:insideH w:val="nil"/>
-              <w:insideV w:val="nil"/>
-            </w:tcBorders>
-            <w:tcMar>
-              <w:top w:w="0" w:type="dxa"/>
-              <w:left w:w="0" w:type="dxa"/>
-              <w:bottom w:w="0" w:type="dxa"/>
-              <w:right w:w="0" w:type="dxa"/>
-            </w:tcMar>
-            <w:vAlign w:val="center"/>
-          </w:tcPr>
-          <w:p>
-            <w:pPr>
-              <w:spacing w:line="240" w:lineRule="auto" w:before="0" w:after="0"/>
-              <w:ind w:firstLine="0"/>
-              <w:jc w:val="center"/>
-            </w:pPr>
-            <w:r/>
-            <w:r>
-              <w:rPr>
-                <w:rFonts w:ascii="Times New Roman" w:hAnsi="Times New Roman" w:eastAsia="Times New Roman"/>
-                <w:b w:val="0"/>
-                <w:i w:val="0"/>
-                <w:sz w:val="20"/>
-              </w:rPr>
-              <w:t>Зайцевым Александром Сергеевичем</w:t>
-            </w:r>
-          </w:p>
-        </w:tc>
-        <w:tc>
-          <w:tcPr>
-            <w:tcW w:type="dxa" w:w="2948"/>
-            <w:tcBorders>
-              <w:top w:val="nil"/>
-              <w:left w:val="nil"/>
-              <w:bottom w:val="single" w:sz="6" w:space="0" w:color="000000"/>
-              <w:right w:val="nil"/>
-              <w:insideH w:val="nil"/>
-              <w:insideV w:val="nil"/>
-            </w:tcBorders>
-            <w:tcMar>
-              <w:top w:w="0" w:type="dxa"/>
-              <w:left w:w="0" w:type="dxa"/>
-              <w:bottom w:w="0" w:type="dxa"/>
-              <w:right w:w="0" w:type="dxa"/>
-            </w:tcMar>
-            <w:vAlign w:val="center"/>
-          </w:tcPr>
-          <w:p>
-            <w:pPr>
-              <w:spacing w:line="240" w:lineRule="auto" w:before="0" w:after="0"/>
-              <w:ind w:firstLine="0"/>
-              <w:jc w:val="center"/>
-            </w:pPr>
-            <w:r/>
-          </w:p>
-        </w:tc>
-      </w:tr>
-      <w:tr>
-        <w:tc>
-          <w:tcPr>
-            <w:tcW w:type="dxa" w:w="2948"/>
-            <w:tcBorders>
-              <w:top w:val="nil"/>
-              <w:left w:val="nil"/>
-              <w:bottom w:val="nil"/>
-              <w:right w:val="nil"/>
-              <w:insideH w:val="nil"/>
-              <w:insideV w:val="nil"/>
-            </w:tcBorders>
-            <w:tcMar>
-              <w:top w:w="0" w:type="dxa"/>
-              <w:left w:w="0" w:type="dxa"/>
-              <w:bottom w:w="0" w:type="dxa"/>
-              <w:right w:w="0" w:type="dxa"/>
-            </w:tcMar>
-            <w:vAlign w:val="center"/>
-          </w:tcPr>
-          <w:p>
-            <w:pPr>
-              <w:spacing w:line="240" w:lineRule="auto" w:before="0" w:after="0"/>
-              <w:ind w:firstLine="0"/>
-              <w:jc w:val="center"/>
-            </w:pPr>
-            <w:r/>
-          </w:p>
-        </w:tc>
-        <w:tc>
-          <w:tcPr>
-            <w:tcW w:type="dxa" w:w="2948"/>
-            <w:tcBorders>
-              <w:top w:val="nil"/>
-              <w:left w:val="nil"/>
-              <w:bottom w:val="nil"/>
-              <w:right w:val="nil"/>
-              <w:insideH w:val="nil"/>
-              <w:insideV w:val="nil"/>
-            </w:tcBorders>
-            <w:tcMar>
-              <w:top w:w="0" w:type="dxa"/>
-              <w:left w:w="0" w:type="dxa"/>
-              <w:bottom w:w="0" w:type="dxa"/>
-              <w:right w:w="0" w:type="dxa"/>
-            </w:tcMar>
-            <w:vAlign w:val="center"/>
-          </w:tcPr>
-          <w:p>
-            <w:pPr>
-              <w:spacing w:line="240" w:lineRule="auto" w:before="0" w:after="0"/>
-              <w:ind w:firstLine="0"/>
-              <w:jc w:val="center"/>
-            </w:pPr>
-            <w:r/>
-            <w:r>
-              <w:rPr>
-                <w:rFonts w:ascii="Times New Roman" w:hAnsi="Times New Roman" w:eastAsia="Times New Roman"/>
-                <w:b w:val="0"/>
-                <w:i w:val="0"/>
-                <w:sz w:val="14"/>
-              </w:rPr>
-              <w:t>фамилия, имя, отчество обучающегося в творительном падеже</w:t>
-            </w:r>
-          </w:p>
-        </w:tc>
-        <w:tc>
-          <w:tcPr>
-            <w:tcW w:type="dxa" w:w="2948"/>
-            <w:tcBorders>
-              <w:top w:val="nil"/>
-              <w:left w:val="nil"/>
-              <w:bottom w:val="nil"/>
-              <w:right w:val="nil"/>
-              <w:insideH w:val="nil"/>
-              <w:insideV w:val="nil"/>
-            </w:tcBorders>
-            <w:tcMar>
-              <w:top w:w="0" w:type="dxa"/>
-              <w:left w:w="0" w:type="dxa"/>
-              <w:bottom w:w="0" w:type="dxa"/>
-              <w:right w:w="0" w:type="dxa"/>
-            </w:tcMar>
-            <w:vAlign w:val="center"/>
-          </w:tcPr>
-          <w:p>
-            <w:pPr>
-              <w:spacing w:line="240" w:lineRule="auto" w:before="0" w:after="0"/>
-              <w:ind w:firstLine="0"/>
-              <w:jc w:val="center"/>
-            </w:pPr>
-            <w:r/>
-          </w:p>
-        </w:tc>
-      </w:tr>
-      <w:tr>
-        <w:tc>
-          <w:tcPr>
-            <w:tcW w:type="dxa" w:w="2948"/>
-            <w:tcBorders>
-              <w:top w:val="nil"/>
-              <w:left w:val="nil"/>
-              <w:bottom w:val="nil"/>
-              <w:right w:val="nil"/>
-              <w:insideH w:val="nil"/>
-              <w:insideV w:val="nil"/>
-            </w:tcBorders>
-            <w:tcMar>
-              <w:top w:w="0" w:type="dxa"/>
-              <w:left w:w="0" w:type="dxa"/>
-              <w:bottom w:w="0" w:type="dxa"/>
-              <w:right w:w="0" w:type="dxa"/>
-            </w:tcMar>
-            <w:vAlign w:val="center"/>
-          </w:tcPr>
-          <w:p>
-            <w:pPr>
-              <w:spacing w:line="240" w:lineRule="auto" w:before="0" w:after="0"/>
-              <w:ind w:firstLine="0"/>
-              <w:jc w:val="center"/>
-            </w:pPr>
-            <w:r/>
-            <w:r>
-              <w:rPr>
-                <w:rFonts w:ascii="Times New Roman" w:hAnsi="Times New Roman" w:eastAsia="Times New Roman"/>
-                <w:b w:val="0"/>
-                <w:i w:val="0"/>
-                <w:sz w:val="20"/>
-              </w:rPr>
-              <w:t>по направлению подготовки</w:t>
-            </w:r>
-          </w:p>
-        </w:tc>
-        <w:tc>
-          <w:tcPr>
-            <w:tcW w:type="dxa" w:w="2948"/>
-            <w:tcBorders>
-              <w:top w:val="nil"/>
-              <w:left w:val="nil"/>
-              <w:bottom w:val="single" w:sz="6" w:space="0" w:color="000000"/>
-              <w:right w:val="nil"/>
-              <w:insideH w:val="nil"/>
-              <w:insideV w:val="nil"/>
-            </w:tcBorders>
-            <w:tcMar>
-              <w:top w:w="0" w:type="dxa"/>
-              <w:left w:w="0" w:type="dxa"/>
-              <w:bottom w:w="0" w:type="dxa"/>
-              <w:right w:w="0" w:type="dxa"/>
-            </w:tcMar>
-            <w:vAlign w:val="center"/>
-          </w:tcPr>
-          <w:p>
-            <w:pPr>
-              <w:spacing w:line="240" w:lineRule="auto" w:before="0" w:after="0"/>
-              <w:ind w:firstLine="0"/>
-              <w:jc w:val="center"/>
-            </w:pPr>
-            <w:r/>
-            <w:r>
-              <w:rPr>
-                <w:rFonts w:ascii="Times New Roman" w:hAnsi="Times New Roman" w:eastAsia="Times New Roman"/>
-                <w:b w:val="0"/>
-                <w:i w:val="0"/>
-                <w:sz w:val="20"/>
-              </w:rPr>
-              <w:t>09.03.04</w:t>
-            </w:r>
-          </w:p>
-        </w:tc>
-        <w:tc>
-          <w:tcPr>
-            <w:tcW w:type="dxa" w:w="2948"/>
-            <w:tcBorders>
-              <w:top w:val="nil"/>
-              <w:left w:val="nil"/>
-              <w:bottom w:val="single" w:sz="6" w:space="0" w:color="000000"/>
-              <w:right w:val="nil"/>
-              <w:insideH w:val="nil"/>
-              <w:insideV w:val="nil"/>
-            </w:tcBorders>
-            <w:tcMar>
-              <w:top w:w="0" w:type="dxa"/>
-              <w:left w:w="0" w:type="dxa"/>
-              <w:bottom w:w="0" w:type="dxa"/>
-              <w:right w:w="0" w:type="dxa"/>
-            </w:tcMar>
-            <w:vAlign w:val="center"/>
-          </w:tcPr>
-          <w:p>
-            <w:pPr>
-              <w:spacing w:line="240" w:lineRule="auto" w:before="0" w:after="0"/>
-              <w:ind w:firstLine="0"/>
-              <w:jc w:val="center"/>
-            </w:pPr>
-            <w:r/>
-            <w:r>
-              <w:rPr>
-                <w:rFonts w:ascii="Times New Roman" w:hAnsi="Times New Roman" w:eastAsia="Times New Roman"/>
-                <w:b w:val="0"/>
-                <w:i w:val="0"/>
-                <w:sz w:val="20"/>
-              </w:rPr>
-              <w:t>Программная инженерия</w:t>
-            </w:r>
-          </w:p>
-        </w:tc>
-      </w:tr>
-      <w:tr>
-        <w:tc>
-          <w:tcPr>
-            <w:tcW w:type="dxa" w:w="2948"/>
-            <w:tcBorders>
-              <w:top w:val="nil"/>
-              <w:left w:val="nil"/>
-              <w:bottom w:val="nil"/>
-              <w:right w:val="nil"/>
-              <w:insideH w:val="nil"/>
-              <w:insideV w:val="nil"/>
-            </w:tcBorders>
-            <w:tcMar>
-              <w:top w:w="0" w:type="dxa"/>
-              <w:left w:w="0" w:type="dxa"/>
-              <w:bottom w:w="0" w:type="dxa"/>
-              <w:right w:w="0" w:type="dxa"/>
-            </w:tcMar>
-            <w:vAlign w:val="center"/>
-          </w:tcPr>
-          <w:p>
-            <w:pPr>
-              <w:spacing w:line="240" w:lineRule="auto" w:before="0" w:after="0"/>
-              <w:ind w:firstLine="0"/>
-              <w:jc w:val="center"/>
-            </w:pPr>
-            <w:r/>
-          </w:p>
-        </w:tc>
-        <w:tc>
-          <w:tcPr>
-            <w:tcW w:type="dxa" w:w="2948"/>
-            <w:tcBorders>
-              <w:top w:val="nil"/>
-              <w:left w:val="nil"/>
-              <w:bottom w:val="nil"/>
-              <w:right w:val="nil"/>
-              <w:insideH w:val="nil"/>
-              <w:insideV w:val="nil"/>
-            </w:tcBorders>
-            <w:tcMar>
-              <w:top w:w="0" w:type="dxa"/>
-              <w:left w:w="0" w:type="dxa"/>
-              <w:bottom w:w="0" w:type="dxa"/>
-              <w:right w:w="0" w:type="dxa"/>
-            </w:tcMar>
-            <w:vAlign w:val="center"/>
-          </w:tcPr>
-          <w:p>
-            <w:pPr>
-              <w:spacing w:line="240" w:lineRule="auto" w:before="0" w:after="0"/>
-              <w:ind w:firstLine="0"/>
-              <w:jc w:val="center"/>
-            </w:pPr>
-            <w:r/>
-            <w:r>
-              <w:rPr>
-                <w:rFonts w:ascii="Times New Roman" w:hAnsi="Times New Roman" w:eastAsia="Times New Roman"/>
-                <w:b w:val="0"/>
-                <w:i w:val="0"/>
-                <w:sz w:val="14"/>
-              </w:rPr>
-              <w:t>код</w:t>
-            </w:r>
-          </w:p>
-        </w:tc>
-        <w:tc>
-          <w:tcPr>
-            <w:tcW w:type="dxa" w:w="2948"/>
-            <w:tcBorders>
-              <w:top w:val="nil"/>
-              <w:left w:val="nil"/>
-              <w:bottom w:val="nil"/>
-              <w:right w:val="nil"/>
-              <w:insideH w:val="nil"/>
-              <w:insideV w:val="nil"/>
-            </w:tcBorders>
-            <w:tcMar>
-              <w:top w:w="0" w:type="dxa"/>
-              <w:left w:w="0" w:type="dxa"/>
-              <w:bottom w:w="0" w:type="dxa"/>
-              <w:right w:w="0" w:type="dxa"/>
-            </w:tcMar>
-            <w:vAlign w:val="center"/>
-          </w:tcPr>
-          <w:p>
-            <w:pPr>
-              <w:spacing w:line="240" w:lineRule="auto" w:before="0" w:after="0"/>
-              <w:ind w:firstLine="0"/>
-              <w:jc w:val="center"/>
-            </w:pPr>
-            <w:r/>
-            <w:r>
-              <w:rPr>
-                <w:rFonts w:ascii="Times New Roman" w:hAnsi="Times New Roman" w:eastAsia="Times New Roman"/>
-                <w:b w:val="0"/>
-                <w:i w:val="0"/>
-                <w:sz w:val="14"/>
-              </w:rPr>
-              <w:t>наименование направления</w:t>
-            </w:r>
-          </w:p>
-        </w:tc>
-      </w:tr>
-      <w:tr>
-        <w:tc>
-          <w:tcPr>
-            <w:tcW w:type="dxa" w:w="2948"/>
-            <w:tcBorders>
-              <w:top w:val="nil"/>
-              <w:left w:val="nil"/>
-              <w:bottom w:val="nil"/>
-              <w:right w:val="nil"/>
-              <w:insideH w:val="nil"/>
-              <w:insideV w:val="nil"/>
-            </w:tcBorders>
-            <w:tcMar>
-              <w:top w:w="0" w:type="dxa"/>
-              <w:left w:w="0" w:type="dxa"/>
-              <w:bottom w:w="0" w:type="dxa"/>
-              <w:right w:w="0" w:type="dxa"/>
-            </w:tcMar>
-            <w:vAlign w:val="center"/>
-          </w:tcPr>
-          <w:p>
-            <w:pPr>
-              <w:spacing w:line="240" w:lineRule="auto" w:before="0" w:after="0"/>
-              <w:ind w:firstLine="0"/>
-              <w:jc w:val="center"/>
-            </w:pPr>
-            <w:r/>
-            <w:r>
-              <w:rPr>
-                <w:rFonts w:ascii="Times New Roman" w:hAnsi="Times New Roman" w:eastAsia="Times New Roman"/>
-                <w:b w:val="0"/>
-                <w:i w:val="0"/>
-                <w:sz w:val="20"/>
-              </w:rPr>
-              <w:t>направленности</w:t>
-            </w:r>
-          </w:p>
-        </w:tc>
-        <w:tc>
-          <w:tcPr>
-            <w:tcW w:type="dxa" w:w="2948"/>
-            <w:tcBorders>
-              <w:top w:val="nil"/>
-              <w:left w:val="nil"/>
-              <w:bottom w:val="single" w:sz="6" w:space="0" w:color="000000"/>
-              <w:right w:val="nil"/>
-              <w:insideH w:val="nil"/>
-              <w:insideV w:val="nil"/>
-            </w:tcBorders>
-            <w:tcMar>
-              <w:top w:w="0" w:type="dxa"/>
-              <w:left w:w="0" w:type="dxa"/>
-              <w:bottom w:w="0" w:type="dxa"/>
-              <w:right w:w="0" w:type="dxa"/>
-            </w:tcMar>
-            <w:vAlign w:val="center"/>
-          </w:tcPr>
-          <w:p>
-            <w:pPr>
-              <w:spacing w:line="240" w:lineRule="auto" w:before="0" w:after="0"/>
-              <w:ind w:firstLine="0"/>
-              <w:jc w:val="center"/>
-            </w:pPr>
-            <w:r/>
-            <w:r>
-              <w:rPr>
-                <w:rFonts w:ascii="Times New Roman" w:hAnsi="Times New Roman" w:eastAsia="Times New Roman"/>
-                <w:b w:val="0"/>
-                <w:i w:val="0"/>
-                <w:sz w:val="20"/>
-              </w:rPr>
-              <w:t>02</w:t>
-            </w:r>
-          </w:p>
-        </w:tc>
-        <w:tc>
-          <w:tcPr>
-            <w:tcW w:type="dxa" w:w="2948"/>
-            <w:tcBorders>
-              <w:top w:val="nil"/>
-              <w:left w:val="nil"/>
-              <w:bottom w:val="single" w:sz="6" w:space="0" w:color="000000"/>
-              <w:right w:val="nil"/>
-              <w:insideH w:val="nil"/>
-              <w:insideV w:val="nil"/>
-            </w:tcBorders>
-            <w:tcMar>
-              <w:top w:w="0" w:type="dxa"/>
-              <w:left w:w="0" w:type="dxa"/>
-              <w:bottom w:w="0" w:type="dxa"/>
-              <w:right w:w="0" w:type="dxa"/>
-            </w:tcMar>
-            <w:vAlign w:val="center"/>
-          </w:tcPr>
-          <w:p>
-            <w:pPr>
-              <w:spacing w:line="240" w:lineRule="auto" w:before="0" w:after="0"/>
-              <w:ind w:firstLine="0"/>
-              <w:jc w:val="center"/>
-            </w:pPr>
-            <w:r/>
-            <w:r>
-              <w:rPr>
-                <w:rFonts w:ascii="Times New Roman" w:hAnsi="Times New Roman" w:eastAsia="Times New Roman"/>
-                <w:b w:val="0"/>
-                <w:i w:val="0"/>
-                <w:sz w:val="20"/>
-              </w:rPr>
-              <w:t>Проектирование программных систем</w:t>
-            </w:r>
-          </w:p>
-        </w:tc>
-      </w:tr>
-      <w:tr>
-        <w:tc>
-          <w:tcPr>
-            <w:tcW w:type="dxa" w:w="2948"/>
-            <w:tcBorders>
-              <w:top w:val="nil"/>
-              <w:left w:val="nil"/>
-              <w:bottom w:val="nil"/>
-              <w:right w:val="nil"/>
-              <w:insideH w:val="nil"/>
-              <w:insideV w:val="nil"/>
-            </w:tcBorders>
-            <w:tcMar>
-              <w:top w:w="0" w:type="dxa"/>
-              <w:left w:w="0" w:type="dxa"/>
-              <w:bottom w:w="0" w:type="dxa"/>
-              <w:right w:w="0" w:type="dxa"/>
-            </w:tcMar>
-            <w:vAlign w:val="center"/>
-          </w:tcPr>
-          <w:p>
-            <w:pPr>
-              <w:spacing w:line="240" w:lineRule="auto" w:before="0" w:after="0"/>
-              <w:ind w:firstLine="0"/>
-              <w:jc w:val="center"/>
-            </w:pPr>
-            <w:r/>
-          </w:p>
-        </w:tc>
-        <w:tc>
-          <w:tcPr>
-            <w:tcW w:type="dxa" w:w="2948"/>
-            <w:tcBorders>
-              <w:top w:val="nil"/>
-              <w:left w:val="nil"/>
-              <w:bottom w:val="nil"/>
-              <w:right w:val="nil"/>
-              <w:insideH w:val="nil"/>
-              <w:insideV w:val="nil"/>
-            </w:tcBorders>
-            <w:tcMar>
-              <w:top w:w="0" w:type="dxa"/>
-              <w:left w:w="0" w:type="dxa"/>
-              <w:bottom w:w="0" w:type="dxa"/>
-              <w:right w:w="0" w:type="dxa"/>
-            </w:tcMar>
-            <w:vAlign w:val="center"/>
-          </w:tcPr>
-          <w:p>
-            <w:pPr>
-              <w:spacing w:line="240" w:lineRule="auto" w:before="0" w:after="0"/>
-              <w:ind w:firstLine="0"/>
-              <w:jc w:val="center"/>
-            </w:pPr>
-            <w:r/>
-            <w:r>
-              <w:rPr>
-                <w:rFonts w:ascii="Times New Roman" w:hAnsi="Times New Roman" w:eastAsia="Times New Roman"/>
-                <w:b w:val="0"/>
-                <w:i w:val="0"/>
-                <w:sz w:val="14"/>
-              </w:rPr>
-              <w:t>код</w:t>
-            </w:r>
-          </w:p>
-        </w:tc>
-        <w:tc>
-          <w:tcPr>
-            <w:tcW w:type="dxa" w:w="2948"/>
-            <w:tcBorders>
-              <w:top w:val="nil"/>
-              <w:left w:val="nil"/>
-              <w:bottom w:val="nil"/>
-              <w:right w:val="nil"/>
-              <w:insideH w:val="nil"/>
-              <w:insideV w:val="nil"/>
-            </w:tcBorders>
-            <w:tcMar>
-              <w:top w:w="0" w:type="dxa"/>
-              <w:left w:w="0" w:type="dxa"/>
-              <w:bottom w:w="0" w:type="dxa"/>
-              <w:right w:w="0" w:type="dxa"/>
-            </w:tcMar>
-            <w:vAlign w:val="center"/>
-          </w:tcPr>
-          <w:p>
-            <w:pPr>
-              <w:spacing w:line="240" w:lineRule="auto" w:before="0" w:after="0"/>
-              <w:ind w:firstLine="0"/>
-              <w:jc w:val="center"/>
-            </w:pPr>
-            <w:r/>
-            <w:r>
-              <w:rPr>
-                <w:rFonts w:ascii="Times New Roman" w:hAnsi="Times New Roman" w:eastAsia="Times New Roman"/>
-                <w:b w:val="0"/>
-                <w:i w:val="0"/>
-                <w:sz w:val="14"/>
-              </w:rPr>
-              <w:t>наименование направленности</w:t>
-            </w:r>
-          </w:p>
-        </w:tc>
-      </w:tr>
-      <w:tr>
-        <w:tc>
-          <w:tcPr>
-            <w:tcW w:type="dxa" w:w="2948"/>
-            <w:tcBorders>
-              <w:top w:val="nil"/>
-              <w:left w:val="nil"/>
-              <w:bottom w:val="nil"/>
-              <w:right w:val="nil"/>
-              <w:insideH w:val="nil"/>
-              <w:insideV w:val="nil"/>
-            </w:tcBorders>
-            <w:tcMar>
-              <w:top w:w="0" w:type="dxa"/>
-              <w:left w:w="0" w:type="dxa"/>
-              <w:bottom w:w="0" w:type="dxa"/>
-              <w:right w:w="0" w:type="dxa"/>
-            </w:tcMar>
-            <w:vAlign w:val="center"/>
-          </w:tcPr>
-          <w:p>
-            <w:pPr>
-              <w:spacing w:line="240" w:lineRule="auto" w:before="0" w:after="0"/>
-              <w:ind w:firstLine="0"/>
-              <w:jc w:val="center"/>
-            </w:pPr>
-            <w:r/>
-            <w:r>
-              <w:rPr>
-                <w:rFonts w:ascii="Times New Roman" w:hAnsi="Times New Roman" w:eastAsia="Times New Roman"/>
-                <w:b w:val="0"/>
-                <w:i w:val="0"/>
-                <w:sz w:val="20"/>
-              </w:rPr>
-              <w:t>Обучающийся группы №</w:t>
-            </w:r>
-          </w:p>
-        </w:tc>
-        <w:tc>
-          <w:tcPr>
-            <w:tcW w:type="dxa" w:w="2948"/>
-            <w:tcBorders>
-              <w:top w:val="nil"/>
-              <w:left w:val="nil"/>
-              <w:bottom w:val="single" w:sz="6" w:space="0" w:color="000000"/>
-              <w:right w:val="nil"/>
-              <w:insideH w:val="nil"/>
-              <w:insideV w:val="nil"/>
-            </w:tcBorders>
-            <w:tcMar>
-              <w:top w:w="0" w:type="dxa"/>
-              <w:left w:w="0" w:type="dxa"/>
-              <w:bottom w:w="0" w:type="dxa"/>
-              <w:right w:w="0" w:type="dxa"/>
-            </w:tcMar>
-            <w:vAlign w:val="center"/>
-          </w:tcPr>
-          <w:p>
-            <w:pPr>
-              <w:spacing w:line="240" w:lineRule="auto" w:before="0" w:after="0"/>
-              <w:ind w:firstLine="0"/>
-              <w:jc w:val="center"/>
-            </w:pPr>
-            <w:r/>
-            <w:r>
-              <w:rPr>
-                <w:rFonts w:ascii="Times New Roman" w:hAnsi="Times New Roman" w:eastAsia="Times New Roman"/>
-                <w:b w:val="0"/>
-                <w:i w:val="0"/>
-                <w:sz w:val="20"/>
-              </w:rPr>
-              <w:t>4131з</w:t>
-            </w:r>
-          </w:p>
-        </w:tc>
-        <w:tc>
-          <w:tcPr>
-            <w:tcW w:type="dxa" w:w="2948"/>
-            <w:tcBorders>
-              <w:top w:val="nil"/>
-              <w:left w:val="nil"/>
-              <w:bottom w:val="single" w:sz="6" w:space="0" w:color="000000"/>
-              <w:right w:val="nil"/>
-              <w:insideH w:val="nil"/>
-              <w:insideV w:val="nil"/>
-            </w:tcBorders>
-            <w:tcMar>
-              <w:top w:w="0" w:type="dxa"/>
-              <w:left w:w="0" w:type="dxa"/>
-              <w:bottom w:w="0" w:type="dxa"/>
-              <w:right w:w="0" w:type="dxa"/>
-            </w:tcMar>
-            <w:vAlign w:val="center"/>
-          </w:tcPr>
-          <w:p>
-            <w:pPr>
-              <w:spacing w:line="240" w:lineRule="auto" w:before="0" w:after="0"/>
-              <w:ind w:firstLine="0"/>
-              <w:jc w:val="center"/>
-            </w:pPr>
-            <w:r/>
-            <w:r>
-              <w:rPr>
-                <w:rFonts w:ascii="Times New Roman" w:hAnsi="Times New Roman" w:eastAsia="Times New Roman"/>
-                <w:b w:val="0"/>
-                <w:i w:val="0"/>
-                <w:sz w:val="20"/>
-              </w:rPr>
-              <w:t>____________________</w:t>
-            </w:r>
-          </w:p>
-        </w:tc>
-      </w:tr>
-      <w:tr>
-        <w:tc>
-          <w:tcPr>
-            <w:tcW w:type="dxa" w:w="2948"/>
-            <w:tcBorders>
-              <w:top w:val="nil"/>
-              <w:left w:val="nil"/>
-              <w:bottom w:val="nil"/>
-              <w:right w:val="nil"/>
-              <w:insideH w:val="nil"/>
-              <w:insideV w:val="nil"/>
-            </w:tcBorders>
-            <w:tcMar>
-              <w:top w:w="0" w:type="dxa"/>
-              <w:left w:w="0" w:type="dxa"/>
-              <w:bottom w:w="0" w:type="dxa"/>
-              <w:right w:w="0" w:type="dxa"/>
-            </w:tcMar>
-            <w:vAlign w:val="center"/>
-          </w:tcPr>
-          <w:p>
-            <w:pPr>
-              <w:spacing w:line="240" w:lineRule="auto" w:before="0" w:after="0"/>
-              <w:ind w:firstLine="0"/>
-              <w:jc w:val="center"/>
-            </w:pPr>
-            <w:r/>
-          </w:p>
-        </w:tc>
-        <w:tc>
-          <w:tcPr>
-            <w:tcW w:type="dxa" w:w="2948"/>
-            <w:tcBorders>
-              <w:top w:val="nil"/>
-              <w:left w:val="nil"/>
-              <w:bottom w:val="nil"/>
-              <w:right w:val="nil"/>
-              <w:insideH w:val="nil"/>
-              <w:insideV w:val="nil"/>
-            </w:tcBorders>
-            <w:tcMar>
-              <w:top w:w="0" w:type="dxa"/>
-              <w:left w:w="0" w:type="dxa"/>
-              <w:bottom w:w="0" w:type="dxa"/>
-              <w:right w:w="0" w:type="dxa"/>
-            </w:tcMar>
-            <w:vAlign w:val="center"/>
-          </w:tcPr>
-          <w:p>
-            <w:pPr>
-              <w:spacing w:line="240" w:lineRule="auto" w:before="0" w:after="0"/>
-              <w:ind w:firstLine="0"/>
-              <w:jc w:val="center"/>
-            </w:pPr>
-            <w:r/>
-            <w:r>
-              <w:rPr>
-                <w:rFonts w:ascii="Times New Roman" w:hAnsi="Times New Roman" w:eastAsia="Times New Roman"/>
-                <w:b w:val="0"/>
-                <w:i w:val="0"/>
-                <w:sz w:val="14"/>
-              </w:rPr>
-              <w:t>номер</w:t>
-            </w:r>
-          </w:p>
-        </w:tc>
-        <w:tc>
-          <w:tcPr>
-            <w:tcW w:type="dxa" w:w="2948"/>
-            <w:tcBorders>
-              <w:top w:val="nil"/>
-              <w:left w:val="nil"/>
-              <w:bottom w:val="nil"/>
-              <w:right w:val="nil"/>
-              <w:insideH w:val="nil"/>
-              <w:insideV w:val="nil"/>
-            </w:tcBorders>
-            <w:tcMar>
-              <w:top w:w="0" w:type="dxa"/>
-              <w:left w:w="0" w:type="dxa"/>
-              <w:bottom w:w="0" w:type="dxa"/>
-              <w:right w:w="0" w:type="dxa"/>
-            </w:tcMar>
-            <w:vAlign w:val="center"/>
-          </w:tcPr>
-          <w:p>
-            <w:pPr>
-              <w:spacing w:line="240" w:lineRule="auto" w:before="0" w:after="0"/>
-              <w:ind w:firstLine="0"/>
-              <w:jc w:val="center"/>
-            </w:pPr>
-            <w:r/>
-            <w:r>
-              <w:rPr>
-                <w:rFonts w:ascii="Times New Roman" w:hAnsi="Times New Roman" w:eastAsia="Times New Roman"/>
-                <w:b w:val="0"/>
-                <w:i w:val="0"/>
-                <w:sz w:val="14"/>
-              </w:rPr>
-              <w:t>подпись, дата</w:t>
-            </w:r>
-          </w:p>
-        </w:tc>
-      </w:tr>
-    </w:tbl>
-    <w:tbl>
-      <w:tblPr>
-        <w:tblW w:type="auto" w:w="0"/>
-        <w:tblLook w:firstColumn="1" w:firstRow="1" w:lastColumn="0" w:lastRow="0" w:noHBand="0" w:noVBand="1" w:val="04A0"/>
-      </w:tblPr>
-      <w:tblGrid>
-        <w:gridCol w:w="3230"/>
-        <w:gridCol w:w="3230"/>
-        <w:gridCol w:w="3230"/>
-      </w:tblGrid>
-      <w:tr>
-        <w:tc>
-          <w:tcPr>
-            <w:tcW w:type="dxa" w:w="2835"/>
-            <w:tcBorders>
-              <w:top w:val="nil"/>
-              <w:left w:val="nil"/>
-              <w:bottom w:val="nil"/>
-              <w:right w:val="nil"/>
-              <w:insideH w:val="nil"/>
-              <w:insideV w:val="nil"/>
-            </w:tcBorders>
-            <w:tcMar>
-              <w:top w:w="0" w:type="dxa"/>
-              <w:left w:w="0" w:type="dxa"/>
-              <w:bottom w:w="0" w:type="dxa"/>
-              <w:right w:w="0" w:type="dxa"/>
-            </w:tcMar>
-            <w:vAlign w:val="center"/>
-          </w:tcPr>
-          <w:p>
-            <w:pPr>
-              <w:spacing w:line="240" w:lineRule="auto" w:before="0" w:after="0"/>
-              <w:ind w:firstLine="0"/>
-              <w:jc w:val="center"/>
-            </w:pPr>
-            <w:r/>
-          </w:p>
-        </w:tc>
-        <w:tc>
-          <w:tcPr>
-            <w:tcW w:type="dxa" w:w="2835"/>
-            <w:tcBorders>
-              <w:top w:val="nil"/>
-              <w:left w:val="nil"/>
-              <w:bottom w:val="nil"/>
-              <w:right w:val="nil"/>
-              <w:insideH w:val="nil"/>
-              <w:insideV w:val="nil"/>
-            </w:tcBorders>
-            <w:tcMar>
-              <w:top w:w="0" w:type="dxa"/>
-              <w:left w:w="0" w:type="dxa"/>
-              <w:bottom w:w="0" w:type="dxa"/>
-              <w:right w:w="0" w:type="dxa"/>
-            </w:tcMar>
-            <w:vAlign w:val="center"/>
-          </w:tcPr>
-          <w:p>
-            <w:pPr>
-              <w:spacing w:line="240" w:lineRule="auto" w:before="0" w:after="0"/>
-              <w:ind w:firstLine="0"/>
-              <w:jc w:val="center"/>
-            </w:pPr>
-            <w:r/>
-          </w:p>
-        </w:tc>
-        <w:tc>
-          <w:tcPr>
-            <w:tcW w:type="dxa" w:w="2835"/>
-            <w:tcBorders>
-              <w:top w:val="nil"/>
-              <w:left w:val="nil"/>
-              <w:bottom w:val="nil"/>
-              <w:right w:val="nil"/>
-              <w:insideH w:val="nil"/>
-              <w:insideV w:val="nil"/>
-            </w:tcBorders>
-            <w:tcMar>
-              <w:top w:w="0" w:type="dxa"/>
-              <w:left w:w="0" w:type="dxa"/>
-              <w:bottom w:w="0" w:type="dxa"/>
-              <w:right w:w="0" w:type="dxa"/>
-            </w:tcMar>
-            <w:vAlign w:val="center"/>
-          </w:tcPr>
-          <w:p>
-            <w:pPr>
-              <w:spacing w:line="240" w:lineRule="auto" w:before="0" w:after="0"/>
-              <w:ind w:firstLine="0"/>
-              <w:jc w:val="center"/>
-            </w:pPr>
-            <w:r/>
-            <w:r>
-              <w:rPr>
-                <w:rFonts w:ascii="Times New Roman" w:hAnsi="Times New Roman" w:eastAsia="Times New Roman"/>
-                <w:b w:val="0"/>
-                <w:i w:val="0"/>
-                <w:sz w:val="14"/>
-              </w:rPr>
-              <w:t>инициалы, фамилия</w:t>
-            </w:r>
-          </w:p>
-        </w:tc>
-      </w:tr>
-      <w:tr>
-        <w:tc>
-          <w:tcPr>
-            <w:tcW w:type="dxa" w:w="2835"/>
-            <w:tcBorders>
-              <w:top w:val="nil"/>
-              <w:left w:val="nil"/>
-              <w:bottom w:val="nil"/>
-              <w:right w:val="nil"/>
-              <w:insideH w:val="nil"/>
-              <w:insideV w:val="nil"/>
-            </w:tcBorders>
-            <w:tcMar>
-              <w:top w:w="0" w:type="dxa"/>
-              <w:left w:w="0" w:type="dxa"/>
-              <w:bottom w:w="0" w:type="dxa"/>
-              <w:right w:w="0" w:type="dxa"/>
-            </w:tcMar>
-            <w:vAlign w:val="center"/>
-          </w:tcPr>
-          <w:p>
-            <w:pPr>
-              <w:spacing w:line="240" w:lineRule="auto" w:before="0" w:after="0"/>
-              <w:ind w:firstLine="0"/>
-              <w:jc w:val="center"/>
-            </w:pPr>
-            <w:r/>
-          </w:p>
-        </w:tc>
-        <w:tc>
-          <w:tcPr>
-            <w:tcW w:type="dxa" w:w="2835"/>
-            <w:tcBorders>
-              <w:top w:val="nil"/>
-              <w:left w:val="nil"/>
-              <w:bottom w:val="nil"/>
-              <w:right w:val="nil"/>
-              <w:insideH w:val="nil"/>
-              <w:insideV w:val="nil"/>
-            </w:tcBorders>
-            <w:tcMar>
-              <w:top w:w="0" w:type="dxa"/>
-              <w:left w:w="0" w:type="dxa"/>
-              <w:bottom w:w="0" w:type="dxa"/>
-              <w:right w:w="0" w:type="dxa"/>
-            </w:tcMar>
-            <w:vAlign w:val="center"/>
-          </w:tcPr>
-          <w:p>
-            <w:pPr>
-              <w:spacing w:line="240" w:lineRule="auto" w:before="0" w:after="0"/>
-              <w:ind w:firstLine="0"/>
-              <w:jc w:val="center"/>
-            </w:pPr>
-            <w:r/>
-          </w:p>
-        </w:tc>
-        <w:tc>
-          <w:tcPr>
-            <w:tcW w:type="dxa" w:w="2835"/>
-            <w:tcBorders>
-              <w:top w:val="nil"/>
-              <w:left w:val="nil"/>
-              <w:bottom w:val="single" w:sz="6" w:space="0" w:color="000000"/>
-              <w:right w:val="nil"/>
-              <w:insideH w:val="nil"/>
-              <w:insideV w:val="nil"/>
-            </w:tcBorders>
-            <w:tcMar>
-              <w:top w:w="0" w:type="dxa"/>
-              <w:left w:w="0" w:type="dxa"/>
-              <w:bottom w:w="0" w:type="dxa"/>
-              <w:right w:w="0" w:type="dxa"/>
-            </w:tcMar>
-            <w:vAlign w:val="center"/>
-          </w:tcPr>
-          <w:p>
-            <w:pPr>
-              <w:spacing w:line="240" w:lineRule="auto" w:before="0" w:after="0"/>
-              <w:ind w:firstLine="0"/>
-              <w:jc w:val="center"/>
-            </w:pPr>
-            <w:r/>
-            <w:r>
-              <w:rPr>
-                <w:rFonts w:ascii="Times New Roman" w:hAnsi="Times New Roman" w:eastAsia="Times New Roman"/>
-                <w:b w:val="0"/>
-                <w:i w:val="0"/>
-                <w:sz w:val="20"/>
-              </w:rPr>
-              <w:t>А.С. Зайцев</w:t>
-            </w:r>
-          </w:p>
-        </w:tc>
-      </w:tr>
-    </w:tbl>
-    <w:p>
-      <w:pPr>
-        <w:spacing w:line="240" w:lineRule="auto" w:before="0" w:after="400"/>
-        <w:ind w:firstLine="0"/>
-      </w:pPr>
-    </w:p>
-    <w:p>
-      <w:pPr>
-        <w:spacing w:line="276" w:lineRule="auto" w:after="0"/>
-        <w:ind w:firstLine="0"/>
-        <w:jc w:val="center"/>
-      </w:pPr>
-      <w:r>
-        <w:rPr>
-          <w:rFonts w:ascii="Times New Roman" w:hAnsi="Times New Roman" w:eastAsia="Times New Roman"/>
-          <w:b w:val="0"/>
-          <w:i w:val="0"/>
-          <w:sz w:val="20"/>
-        </w:rPr>
-        <w:t>Санкт–Петербург 2026</w:t>
-      </w:r>
-    </w:p>
-    <w:p>
-      <w:r>
-        <w:br w:type="page"/>
-      </w:r>
-    </w:p>
-    <w:p>
-      <w:pPr>
-        <w:sectPr>
-          <w:footerReference w:type="default" r:id="rId9"/>
-          <w:pgSz w:w="12240" w:h="15840"/>
-          <w:pgMar w:top="1134" w:right="850" w:bottom="1134" w:left="1701" w:header="720" w:footer="720" w:gutter="0"/>
-          <w:cols w:space="720"/>
-          <w:docGrid w:linePitch="360"/>
-        </w:sectPr>
-      </w:pPr>
-    </w:p>
     <w:p>
       <w:pPr>
         <w:pStyle w:val="Heading1"/>
@@ -2876,7 +828,7 @@
         </w:rPr>
         <w:t>ПРИЛОЖЕНИЕ А</w:t>
         <w:tab/>
-        <w:t>35</w:t>
+        <w:t>34</w:t>
       </w:r>
     </w:p>
     <w:p>
@@ -2887,7 +839,7 @@
     <w:p>
       <w:pPr>
         <w:sectPr>
-          <w:footerReference w:type="default" r:id="rId10"/>
+          <w:footerReference w:type="default" r:id="rId9"/>
           <w:pgSz w:w="12240" w:h="15840"/>
           <w:pgMar w:top="1134" w:right="850" w:bottom="1134" w:left="1701" w:header="720" w:footer="720" w:gutter="0"/>
           <w:cols w:space="720"/>
@@ -5948,6 +3900,172 @@
                     <pic:cNvPicPr/>
                   </pic:nvPicPr>
                   <pic:blipFill>
+                    <a:blip r:embed="rId11"/>
+                    <a:stretch>
+                      <a:fillRect/>
+                    </a:stretch>
+                  </pic:blipFill>
+                  <pic:spPr>
+                    <a:xfrm>
+                      <a:off x="0" y="0"/>
+                      <a:ext cx="5580000" cy="3138750"/>
+                    </a:xfrm>
+                    <a:prstGeom prst="rect"/>
+                  </pic:spPr>
+                </pic:pic>
+              </a:graphicData>
+            </a:graphic>
+          </wp:inline>
+        </w:drawing>
+      </w:r>
+    </w:p>
+    <w:p>
+      <w:pPr>
+        <w:spacing w:after="120"/>
+        <w:ind w:firstLine="0"/>
+        <w:jc w:val="center"/>
+      </w:pPr>
+      <w:r>
+        <w:rPr>
+          <w:rFonts w:ascii="Times New Roman" w:hAnsi="Times New Roman" w:eastAsia="Times New Roman"/>
+          <w:b w:val="0"/>
+          <w:i/>
+          <w:sz w:val="24"/>
+        </w:rPr>
+        <w:t>Рисунок 1 — Исходная single-node архитектура real-time контура</w:t>
+      </w:r>
+    </w:p>
+    <w:p>
+      <w:pPr>
+        <w:spacing w:line="360" w:lineRule="auto"/>
+        <w:ind w:firstLine="709"/>
+        <w:jc w:val="both"/>
+      </w:pPr>
+      <w:r>
+        <w:rPr>
+          <w:rFonts w:ascii="Times New Roman" w:hAnsi="Times New Roman" w:eastAsia="Times New Roman"/>
+          <w:b w:val="0"/>
+          <w:i w:val="0"/>
+          <w:sz w:val="28"/>
+        </w:rPr>
+        <w:t xml:space="preserve">Недостаток этой архитектуры состоит в том, что она не показывает, как система должна вести себя при нескольких экземплярах </w:t>
+      </w:r>
+      <w:r>
+        <w:rPr>
+          <w:rFonts w:ascii="Courier New" w:hAnsi="Courier New" w:eastAsia="Courier New"/>
+          <w:b w:val="0"/>
+          <w:i w:val="0"/>
+          <w:sz w:val="28"/>
+        </w:rPr>
+        <w:t>app-api</w:t>
+      </w:r>
+      <w:r>
+        <w:rPr>
+          <w:rFonts w:ascii="Times New Roman" w:hAnsi="Times New Roman" w:eastAsia="Times New Roman"/>
+          <w:b w:val="0"/>
+          <w:i w:val="0"/>
+          <w:sz w:val="28"/>
+        </w:rPr>
+        <w:t>. Если просто добавить второй экземпляр без backplane, каждый процесс будет иметь собственное локальное состояние соединений [3].</w:t>
+      </w:r>
+    </w:p>
+    <w:p>
+      <w:pPr>
+        <w:pStyle w:val="Heading2"/>
+      </w:pPr>
+      <w:r>
+        <w:t>3.2 Целевая архитектура</w:t>
+      </w:r>
+    </w:p>
+    <w:p>
+      <w:pPr>
+        <w:spacing w:line="360" w:lineRule="auto"/>
+        <w:ind w:firstLine="709"/>
+        <w:jc w:val="both"/>
+      </w:pPr>
+      <w:r>
+        <w:rPr>
+          <w:rFonts w:ascii="Times New Roman" w:hAnsi="Times New Roman" w:eastAsia="Times New Roman"/>
+          <w:b w:val="0"/>
+          <w:i w:val="0"/>
+          <w:sz w:val="28"/>
+        </w:rPr>
+        <w:t xml:space="preserve">В целевой архитектуре перед backend-сервисами находится nginx, а приложение запускается в двух экземплярах: </w:t>
+      </w:r>
+      <w:r>
+        <w:rPr>
+          <w:rFonts w:ascii="Courier New" w:hAnsi="Courier New" w:eastAsia="Courier New"/>
+          <w:b w:val="0"/>
+          <w:i w:val="0"/>
+          <w:sz w:val="28"/>
+        </w:rPr>
+        <w:t>app-api-1</w:t>
+      </w:r>
+      <w:r>
+        <w:rPr>
+          <w:rFonts w:ascii="Times New Roman" w:hAnsi="Times New Roman" w:eastAsia="Times New Roman"/>
+          <w:b w:val="0"/>
+          <w:i w:val="0"/>
+          <w:sz w:val="28"/>
+        </w:rPr>
+        <w:t xml:space="preserve"> и </w:t>
+      </w:r>
+      <w:r>
+        <w:rPr>
+          <w:rFonts w:ascii="Courier New" w:hAnsi="Courier New" w:eastAsia="Courier New"/>
+          <w:b w:val="0"/>
+          <w:i w:val="0"/>
+          <w:sz w:val="28"/>
+        </w:rPr>
+        <w:t>app-api-2</w:t>
+      </w:r>
+      <w:r>
+        <w:rPr>
+          <w:rFonts w:ascii="Times New Roman" w:hAnsi="Times New Roman" w:eastAsia="Times New Roman"/>
+          <w:b w:val="0"/>
+          <w:i w:val="0"/>
+          <w:sz w:val="28"/>
+        </w:rPr>
+        <w:t>. Оба экземпляра подключены к общей базе данных PostgreSQL [17] и к Redis. SignalR использует Redis backplane для межузловой доставки событий [4], [10], [14].</w:t>
+      </w:r>
+    </w:p>
+    <w:p>
+      <w:pPr>
+        <w:spacing w:line="360" w:lineRule="auto"/>
+        <w:ind w:firstLine="709"/>
+        <w:jc w:val="both"/>
+      </w:pPr>
+      <w:r>
+        <w:rPr>
+          <w:rFonts w:ascii="Times New Roman" w:hAnsi="Times New Roman" w:eastAsia="Times New Roman"/>
+          <w:b w:val="0"/>
+          <w:i w:val="0"/>
+          <w:sz w:val="28"/>
+        </w:rPr>
+        <w:t>Схема целевой архитектуры представлена на рисунке 2.</w:t>
+      </w:r>
+    </w:p>
+    <w:p>
+      <w:pPr>
+        <w:ind w:firstLine="0"/>
+        <w:jc w:val="center"/>
+      </w:pPr>
+      <w:r>
+        <w:drawing>
+          <wp:inline xmlns:a="http://schemas.openxmlformats.org/drawingml/2006/main" xmlns:pic="http://schemas.openxmlformats.org/drawingml/2006/picture">
+            <wp:extent cx="5580000" cy="3138750"/>
+            <wp:docPr id="2" name="Picture 2"/>
+            <wp:cNvGraphicFramePr>
+              <a:graphicFrameLocks noChangeAspect="1"/>
+            </wp:cNvGraphicFramePr>
+            <a:graphic>
+              <a:graphicData uri="http://schemas.openxmlformats.org/drawingml/2006/picture">
+                <pic:pic>
+                  <pic:nvPicPr>
+                    <pic:cNvPr id="0" name="figure-2-scaleout.png"/>
+                    <pic:cNvPicPr/>
+                  </pic:nvPicPr>
+                  <pic:blipFill>
                     <a:blip r:embed="rId12"/>
                     <a:stretch>
                       <a:fillRect/>
@@ -5980,172 +4098,6 @@
           <w:i/>
           <w:sz w:val="24"/>
         </w:rPr>
-        <w:t>Рисунок 1 — Исходная single-node архитектура real-time контура</w:t>
-      </w:r>
-    </w:p>
-    <w:p>
-      <w:pPr>
-        <w:spacing w:line="360" w:lineRule="auto"/>
-        <w:ind w:firstLine="709"/>
-        <w:jc w:val="both"/>
-      </w:pPr>
-      <w:r>
-        <w:rPr>
-          <w:rFonts w:ascii="Times New Roman" w:hAnsi="Times New Roman" w:eastAsia="Times New Roman"/>
-          <w:b w:val="0"/>
-          <w:i w:val="0"/>
-          <w:sz w:val="28"/>
-        </w:rPr>
-        <w:t xml:space="preserve">Недостаток этой архитектуры состоит в том, что она не показывает, как система должна вести себя при нескольких экземплярах </w:t>
-      </w:r>
-      <w:r>
-        <w:rPr>
-          <w:rFonts w:ascii="Courier New" w:hAnsi="Courier New" w:eastAsia="Courier New"/>
-          <w:b w:val="0"/>
-          <w:i w:val="0"/>
-          <w:sz w:val="28"/>
-        </w:rPr>
-        <w:t>app-api</w:t>
-      </w:r>
-      <w:r>
-        <w:rPr>
-          <w:rFonts w:ascii="Times New Roman" w:hAnsi="Times New Roman" w:eastAsia="Times New Roman"/>
-          <w:b w:val="0"/>
-          <w:i w:val="0"/>
-          <w:sz w:val="28"/>
-        </w:rPr>
-        <w:t>. Если просто добавить второй экземпляр без backplane, каждый процесс будет иметь собственное локальное состояние соединений [3].</w:t>
-      </w:r>
-    </w:p>
-    <w:p>
-      <w:pPr>
-        <w:pStyle w:val="Heading2"/>
-      </w:pPr>
-      <w:r>
-        <w:t>3.2 Целевая архитектура</w:t>
-      </w:r>
-    </w:p>
-    <w:p>
-      <w:pPr>
-        <w:spacing w:line="360" w:lineRule="auto"/>
-        <w:ind w:firstLine="709"/>
-        <w:jc w:val="both"/>
-      </w:pPr>
-      <w:r>
-        <w:rPr>
-          <w:rFonts w:ascii="Times New Roman" w:hAnsi="Times New Roman" w:eastAsia="Times New Roman"/>
-          <w:b w:val="0"/>
-          <w:i w:val="0"/>
-          <w:sz w:val="28"/>
-        </w:rPr>
-        <w:t xml:space="preserve">В целевой архитектуре перед backend-сервисами находится nginx, а приложение запускается в двух экземплярах: </w:t>
-      </w:r>
-      <w:r>
-        <w:rPr>
-          <w:rFonts w:ascii="Courier New" w:hAnsi="Courier New" w:eastAsia="Courier New"/>
-          <w:b w:val="0"/>
-          <w:i w:val="0"/>
-          <w:sz w:val="28"/>
-        </w:rPr>
-        <w:t>app-api-1</w:t>
-      </w:r>
-      <w:r>
-        <w:rPr>
-          <w:rFonts w:ascii="Times New Roman" w:hAnsi="Times New Roman" w:eastAsia="Times New Roman"/>
-          <w:b w:val="0"/>
-          <w:i w:val="0"/>
-          <w:sz w:val="28"/>
-        </w:rPr>
-        <w:t xml:space="preserve"> и </w:t>
-      </w:r>
-      <w:r>
-        <w:rPr>
-          <w:rFonts w:ascii="Courier New" w:hAnsi="Courier New" w:eastAsia="Courier New"/>
-          <w:b w:val="0"/>
-          <w:i w:val="0"/>
-          <w:sz w:val="28"/>
-        </w:rPr>
-        <w:t>app-api-2</w:t>
-      </w:r>
-      <w:r>
-        <w:rPr>
-          <w:rFonts w:ascii="Times New Roman" w:hAnsi="Times New Roman" w:eastAsia="Times New Roman"/>
-          <w:b w:val="0"/>
-          <w:i w:val="0"/>
-          <w:sz w:val="28"/>
-        </w:rPr>
-        <w:t>. Оба экземпляра подключены к общей базе данных PostgreSQL [17] и к Redis. SignalR использует Redis backplane для межузловой доставки событий [4], [10], [14].</w:t>
-      </w:r>
-    </w:p>
-    <w:p>
-      <w:pPr>
-        <w:spacing w:line="360" w:lineRule="auto"/>
-        <w:ind w:firstLine="709"/>
-        <w:jc w:val="both"/>
-      </w:pPr>
-      <w:r>
-        <w:rPr>
-          <w:rFonts w:ascii="Times New Roman" w:hAnsi="Times New Roman" w:eastAsia="Times New Roman"/>
-          <w:b w:val="0"/>
-          <w:i w:val="0"/>
-          <w:sz w:val="28"/>
-        </w:rPr>
-        <w:t>Схема целевой архитектуры представлена на рисунке 2.</w:t>
-      </w:r>
-    </w:p>
-    <w:p>
-      <w:pPr>
-        <w:ind w:firstLine="0"/>
-        <w:jc w:val="center"/>
-      </w:pPr>
-      <w:r>
-        <w:drawing>
-          <wp:inline xmlns:a="http://schemas.openxmlformats.org/drawingml/2006/main" xmlns:pic="http://schemas.openxmlformats.org/drawingml/2006/picture">
-            <wp:extent cx="5580000" cy="3138750"/>
-            <wp:docPr id="2" name="Picture 2"/>
-            <wp:cNvGraphicFramePr>
-              <a:graphicFrameLocks noChangeAspect="1"/>
-            </wp:cNvGraphicFramePr>
-            <a:graphic>
-              <a:graphicData uri="http://schemas.openxmlformats.org/drawingml/2006/picture">
-                <pic:pic>
-                  <pic:nvPicPr>
-                    <pic:cNvPr id="0" name="figure-2-scaleout.png"/>
-                    <pic:cNvPicPr/>
-                  </pic:nvPicPr>
-                  <pic:blipFill>
-                    <a:blip r:embed="rId13"/>
-                    <a:stretch>
-                      <a:fillRect/>
-                    </a:stretch>
-                  </pic:blipFill>
-                  <pic:spPr>
-                    <a:xfrm>
-                      <a:off x="0" y="0"/>
-                      <a:ext cx="5580000" cy="3138750"/>
-                    </a:xfrm>
-                    <a:prstGeom prst="rect"/>
-                  </pic:spPr>
-                </pic:pic>
-              </a:graphicData>
-            </a:graphic>
-          </wp:inline>
-        </w:drawing>
-      </w:r>
-    </w:p>
-    <w:p>
-      <w:pPr>
-        <w:spacing w:after="120"/>
-        <w:ind w:firstLine="0"/>
-        <w:jc w:val="center"/>
-      </w:pPr>
-      <w:r>
-        <w:rPr>
-          <w:rFonts w:ascii="Times New Roman" w:hAnsi="Times New Roman" w:eastAsia="Times New Roman"/>
-          <w:b w:val="0"/>
-          <w:i/>
-          <w:sz w:val="24"/>
-        </w:rPr>
         <w:t>Рисунок 2 — Целевая multi-instance архитектура с Redis backplane</w:t>
       </w:r>
     </w:p>
@@ -6426,7 +4378,7 @@
                     <pic:cNvPicPr/>
                   </pic:nvPicPr>
                   <pic:blipFill>
-                    <a:blip r:embed="rId14"/>
+                    <a:blip r:embed="rId13"/>
                     <a:stretch>
                       <a:fillRect/>
                     </a:stretch>
@@ -11447,12 +9399,12 @@
       </w:r>
     </w:p>
     <w:sectPr>
-      <w:footerReference w:type="default" r:id="rId11"/>
+      <w:footerReference w:type="default" r:id="rId10"/>
       <w:pgSz w:w="12240" w:h="15840"/>
       <w:pgMar w:top="1134" w:right="850" w:bottom="1134" w:left="1701" w:header="720" w:footer="720" w:gutter="0"/>
       <w:cols w:space="720"/>
       <w:docGrid w:linePitch="360"/>
-      <w:pgNumType w:start="3"/>
+      <w:pgNumType w:start="4"/>
     </w:sectPr>
   </w:body>
 </w:document>
@@ -11469,16 +9421,6 @@
 </file>
 
 <file path=word/footer2.xml><?xml version="1.0" encoding="utf-8"?>
-<w:ftr xmlns:m="http://schemas.openxmlformats.org/officeDocument/2006/math" xmlns:mc="http://schemas.openxmlformats.org/markup-compatibility/2006" xmlns:mo="http://schemas.microsoft.com/office/mac/office/2008/main" xmlns:mv="urn:schemas-microsoft-com:mac:vml" xmlns:o="urn:schemas-microsoft-com:office:office" xmlns:r="http://schemas.openxmlformats.org/officeDocument/2006/relationships" xmlns:v="urn:schemas-microsoft-com:vml" xmlns:w10="urn:schemas-microsoft-com:office:word" xmlns:w14="http://schemas.microsoft.com/office/word/2010/wordml" xmlns:w="http://schemas.openxmlformats.org/wordprocessingml/2006/main" xmlns:wne="http://schemas.microsoft.com/office/word/2006/wordml" xmlns:wp14="http://schemas.microsoft.com/office/word/2010/wordprocessingDrawing" xmlns:wp="http://schemas.openxmlformats.org/drawingml/2006/wordprocessingDrawing" xmlns:wpc="http://schemas.microsoft.com/office/word/2010/wordprocessingCanvas" xmlns:wpg="http://schemas.microsoft.com/office/word/2010/wordprocessingGroup" xmlns:wpi="http://schemas.microsoft.com/office/word/2010/wordprocessingInk" xmlns:wps="http://schemas.microsoft.com/office/word/2010/wordprocessingShape" mc:Ignorable="w14 wp14">
-  <w:p>
-    <w:pPr>
-      <w:pStyle w:val="Footer"/>
-    </w:pPr>
-  </w:p>
-</w:ftr>
-</file>
-
-<file path=word/footer3.xml><?xml version="1.0" encoding="utf-8"?>
 <w:ftr xmlns:m="http://schemas.openxmlformats.org/officeDocument/2006/math" xmlns:mc="http://schemas.openxmlformats.org/markup-compatibility/2006" xmlns:mo="http://schemas.microsoft.com/office/mac/office/2008/main" xmlns:mv="urn:schemas-microsoft-com:mac:vml" xmlns:o="urn:schemas-microsoft-com:office:office" xmlns:r="http://schemas.openxmlformats.org/officeDocument/2006/relationships" xmlns:v="urn:schemas-microsoft-com:vml" xmlns:w10="urn:schemas-microsoft-com:office:word" xmlns:w14="http://schemas.microsoft.com/office/word/2010/wordml" xmlns:w="http://schemas.openxmlformats.org/wordprocessingml/2006/main" xmlns:wne="http://schemas.microsoft.com/office/word/2006/wordml" xmlns:wp14="http://schemas.microsoft.com/office/word/2010/wordprocessingDrawing" xmlns:wp="http://schemas.openxmlformats.org/drawingml/2006/wordprocessingDrawing" xmlns:wpc="http://schemas.microsoft.com/office/word/2010/wordprocessingCanvas" xmlns:wpg="http://schemas.microsoft.com/office/word/2010/wordprocessingGroup" xmlns:wpi="http://schemas.microsoft.com/office/word/2010/wordprocessingInk" xmlns:wps="http://schemas.microsoft.com/office/word/2010/wordprocessingShape" mc:Ignorable="w14 wp14">
   <w:p>
     <w:pPr>

</xml_diff>